<commit_message>
fr07 domain testing explaination
</commit_message>
<xml_diff>
--- a/MainReport.docx
+++ b/MainReport.docx
@@ -10433,7 +10433,6 @@
           <w:b/>
         </w:rPr>
       </w:pPr>
-      <w:bookmarkStart w:id="1" w:name="_GoBack"/>
       <w:r>
         <w:rPr>
           <w:rFonts w:ascii="Arial" w:hAnsi="Arial" w:cs="Arial"/>
@@ -10442,7 +10441,655 @@
         <w:t>Explaination</w:t>
       </w:r>
     </w:p>
-    <w:bookmarkEnd w:id="1" w:displacedByCustomXml="next"/>
+    <w:p>
+      <w:pPr>
+        <w:ind w:left="360"/>
+        <w:rPr>
+          <w:rFonts w:ascii="Arial" w:hAnsi="Arial" w:cs="Arial"/>
+          <w:b/>
+        </w:rPr>
+      </w:pPr>
+      <w:r>
+        <w:rPr>
+          <w:rFonts w:ascii="Arial" w:hAnsi="Arial" w:cs="Arial"/>
+          <w:b/>
+        </w:rPr>
+        <w:t>Bướ</w:t>
+      </w:r>
+      <w:r>
+        <w:rPr>
+          <w:rFonts w:ascii="Arial" w:hAnsi="Arial" w:cs="Arial"/>
+          <w:b/>
+        </w:rPr>
+        <w:t>c 1</w:t>
+      </w:r>
+      <w:r>
+        <w:rPr>
+          <w:rFonts w:ascii="Arial" w:hAnsi="Arial" w:cs="Arial"/>
+          <w:b/>
+        </w:rPr>
+        <w:t>: Equivalence Partitioning</w:t>
+      </w:r>
+    </w:p>
+    <w:p>
+      <w:pPr>
+        <w:spacing w:line="240" w:lineRule="auto"/>
+        <w:ind w:left="360"/>
+        <w:rPr>
+          <w:rFonts w:ascii="Arial" w:hAnsi="Arial" w:cs="Arial"/>
+          <w:sz w:val="20"/>
+          <w:szCs w:val="20"/>
+        </w:rPr>
+      </w:pPr>
+      <w:r>
+        <w:rPr>
+          <w:rFonts w:ascii="Arial" w:hAnsi="Arial" w:cs="Arial"/>
+          <w:sz w:val="20"/>
+          <w:szCs w:val="20"/>
+        </w:rPr>
+        <w:t xml:space="preserve">- </w:t>
+      </w:r>
+      <w:r>
+        <w:rPr>
+          <w:rFonts w:ascii="Arial" w:hAnsi="Arial" w:cs="Arial"/>
+          <w:sz w:val="20"/>
+          <w:szCs w:val="20"/>
+        </w:rPr>
+        <w:t xml:space="preserve">Xác </w:t>
+      </w:r>
+      <w:r>
+        <w:rPr>
+          <w:rFonts w:ascii="Arial" w:hAnsi="Arial" w:cs="Arial"/>
+          <w:sz w:val="20"/>
+          <w:szCs w:val="20"/>
+        </w:rPr>
+        <w:t>định 7 biến đầu vào chính: Quantity, Cart State, Product, Duplicate, Remove Action, Login State, Price.</w:t>
+      </w:r>
+    </w:p>
+    <w:p>
+      <w:pPr>
+        <w:spacing w:line="240" w:lineRule="auto"/>
+        <w:ind w:left="360"/>
+        <w:rPr>
+          <w:rFonts w:ascii="Arial" w:hAnsi="Arial" w:cs="Arial"/>
+          <w:sz w:val="20"/>
+          <w:szCs w:val="20"/>
+        </w:rPr>
+      </w:pPr>
+      <w:r>
+        <w:rPr>
+          <w:rFonts w:ascii="Arial" w:hAnsi="Arial" w:cs="Arial"/>
+          <w:sz w:val="20"/>
+          <w:szCs w:val="20"/>
+        </w:rPr>
+        <w:t xml:space="preserve">- </w:t>
+      </w:r>
+      <w:r>
+        <w:rPr>
+          <w:rFonts w:ascii="Arial" w:hAnsi="Arial" w:cs="Arial"/>
+          <w:sz w:val="20"/>
+          <w:szCs w:val="20"/>
+        </w:rPr>
+        <w:t>Phân vùng mỗi biế</w:t>
+      </w:r>
+      <w:r>
+        <w:rPr>
+          <w:rFonts w:ascii="Arial" w:hAnsi="Arial" w:cs="Arial"/>
+          <w:sz w:val="20"/>
+          <w:szCs w:val="20"/>
+        </w:rPr>
+        <w:t>n:</w:t>
+      </w:r>
+    </w:p>
+    <w:p>
+      <w:pPr>
+        <w:spacing w:line="240" w:lineRule="auto"/>
+        <w:ind w:left="360"/>
+        <w:rPr>
+          <w:rFonts w:ascii="Arial" w:hAnsi="Arial" w:cs="Arial"/>
+          <w:sz w:val="20"/>
+          <w:szCs w:val="20"/>
+        </w:rPr>
+      </w:pPr>
+      <w:r>
+        <w:rPr>
+          <w:rFonts w:ascii="Arial" w:hAnsi="Arial" w:cs="Arial"/>
+          <w:sz w:val="20"/>
+          <w:szCs w:val="20"/>
+        </w:rPr>
+        <w:t xml:space="preserve">  - Quantity:</w:t>
+      </w:r>
+      <w:r>
+        <w:rPr>
+          <w:rFonts w:ascii="Arial" w:hAnsi="Arial" w:cs="Arial"/>
+          <w:sz w:val="20"/>
+          <w:szCs w:val="20"/>
+        </w:rPr>
+        <w:t xml:space="preserve"> Chia thành 6 phân vùng: hợp lệ (≥1), bằng 0, âm, thập phân, chuỗi ký tự, số rất lớn</w:t>
+      </w:r>
+    </w:p>
+    <w:p>
+      <w:pPr>
+        <w:spacing w:line="240" w:lineRule="auto"/>
+        <w:ind w:left="360"/>
+        <w:rPr>
+          <w:rFonts w:ascii="Arial" w:hAnsi="Arial" w:cs="Arial"/>
+          <w:sz w:val="20"/>
+          <w:szCs w:val="20"/>
+        </w:rPr>
+      </w:pPr>
+      <w:r>
+        <w:rPr>
+          <w:rFonts w:ascii="Arial" w:hAnsi="Arial" w:cs="Arial"/>
+          <w:sz w:val="20"/>
+          <w:szCs w:val="20"/>
+        </w:rPr>
+        <w:t xml:space="preserve">  - Cart State:</w:t>
+      </w:r>
+      <w:r>
+        <w:rPr>
+          <w:rFonts w:ascii="Arial" w:hAnsi="Arial" w:cs="Arial"/>
+          <w:sz w:val="20"/>
+          <w:szCs w:val="20"/>
+        </w:rPr>
+        <w:t xml:space="preserve"> 3 phân vùng: trống, 1 SP, nhiều SP</w:t>
+      </w:r>
+    </w:p>
+    <w:p>
+      <w:pPr>
+        <w:spacing w:line="240" w:lineRule="auto"/>
+        <w:ind w:left="360"/>
+        <w:rPr>
+          <w:rFonts w:ascii="Arial" w:hAnsi="Arial" w:cs="Arial"/>
+          <w:sz w:val="20"/>
+          <w:szCs w:val="20"/>
+        </w:rPr>
+      </w:pPr>
+      <w:r>
+        <w:rPr>
+          <w:rFonts w:ascii="Arial" w:hAnsi="Arial" w:cs="Arial"/>
+          <w:sz w:val="20"/>
+          <w:szCs w:val="20"/>
+        </w:rPr>
+        <w:t xml:space="preserve">  - Product:</w:t>
+      </w:r>
+      <w:r>
+        <w:rPr>
+          <w:rFonts w:ascii="Arial" w:hAnsi="Arial" w:cs="Arial"/>
+          <w:sz w:val="20"/>
+          <w:szCs w:val="20"/>
+        </w:rPr>
+        <w:t xml:space="preserve"> 4 phân vùng: hợp lệ, thiếu id, price=0, price không phải số</w:t>
+      </w:r>
+    </w:p>
+    <w:p>
+      <w:pPr>
+        <w:spacing w:line="240" w:lineRule="auto"/>
+        <w:ind w:left="360"/>
+        <w:rPr>
+          <w:rFonts w:ascii="Arial" w:hAnsi="Arial" w:cs="Arial"/>
+          <w:sz w:val="20"/>
+          <w:szCs w:val="20"/>
+        </w:rPr>
+      </w:pPr>
+      <w:r>
+        <w:rPr>
+          <w:rFonts w:ascii="Arial" w:hAnsi="Arial" w:cs="Arial"/>
+          <w:sz w:val="20"/>
+          <w:szCs w:val="20"/>
+        </w:rPr>
+        <w:t xml:space="preserve"> </w:t>
+      </w:r>
+      <w:r>
+        <w:rPr>
+          <w:rFonts w:ascii="Arial" w:hAnsi="Arial" w:cs="Arial"/>
+          <w:sz w:val="20"/>
+          <w:szCs w:val="20"/>
+        </w:rPr>
+        <w:t xml:space="preserve"> - Duplicate:</w:t>
+      </w:r>
+      <w:r>
+        <w:rPr>
+          <w:rFonts w:ascii="Arial" w:hAnsi="Arial" w:cs="Arial"/>
+          <w:sz w:val="20"/>
+          <w:szCs w:val="20"/>
+        </w:rPr>
+        <w:t xml:space="preserve"> 2 phân vùng: SP mới, SP đã tồn tại</w:t>
+      </w:r>
+    </w:p>
+    <w:p>
+      <w:pPr>
+        <w:spacing w:line="240" w:lineRule="auto"/>
+        <w:ind w:left="360"/>
+        <w:rPr>
+          <w:rFonts w:ascii="Arial" w:hAnsi="Arial" w:cs="Arial"/>
+          <w:sz w:val="20"/>
+          <w:szCs w:val="20"/>
+        </w:rPr>
+      </w:pPr>
+      <w:r>
+        <w:rPr>
+          <w:rFonts w:ascii="Arial" w:hAnsi="Arial" w:cs="Arial"/>
+          <w:sz w:val="20"/>
+          <w:szCs w:val="20"/>
+        </w:rPr>
+        <w:t xml:space="preserve">  - Remove:</w:t>
+      </w:r>
+      <w:r>
+        <w:rPr>
+          <w:rFonts w:ascii="Arial" w:hAnsi="Arial" w:cs="Arial"/>
+          <w:sz w:val="20"/>
+          <w:szCs w:val="20"/>
+        </w:rPr>
+        <w:t xml:space="preserve"> 3 phân vùng: xác nhận OK, xác nhận Cancel, không có dialog</w:t>
+      </w:r>
+    </w:p>
+    <w:p>
+      <w:pPr>
+        <w:spacing w:line="240" w:lineRule="auto"/>
+        <w:ind w:left="360"/>
+        <w:rPr>
+          <w:rFonts w:ascii="Arial" w:hAnsi="Arial" w:cs="Arial"/>
+          <w:sz w:val="20"/>
+          <w:szCs w:val="20"/>
+        </w:rPr>
+      </w:pPr>
+      <w:r>
+        <w:rPr>
+          <w:rFonts w:ascii="Arial" w:hAnsi="Arial" w:cs="Arial"/>
+          <w:sz w:val="20"/>
+          <w:szCs w:val="20"/>
+        </w:rPr>
+        <w:t xml:space="preserve">  - Login:</w:t>
+      </w:r>
+      <w:r>
+        <w:rPr>
+          <w:rFonts w:ascii="Arial" w:hAnsi="Arial" w:cs="Arial"/>
+          <w:sz w:val="20"/>
+          <w:szCs w:val="20"/>
+        </w:rPr>
+        <w:t xml:space="preserve"> 3 phân vùng: đã đăng nhập, ch</w:t>
+      </w:r>
+      <w:r>
+        <w:rPr>
+          <w:rFonts w:ascii="Arial" w:hAnsi="Arial" w:cs="Arial" w:hint="cs"/>
+          <w:sz w:val="20"/>
+          <w:szCs w:val="20"/>
+        </w:rPr>
+        <w:t>ư</w:t>
+      </w:r>
+      <w:r>
+        <w:rPr>
+          <w:rFonts w:ascii="Arial" w:hAnsi="Arial" w:cs="Arial"/>
+          <w:sz w:val="20"/>
+          <w:szCs w:val="20"/>
+        </w:rPr>
+        <w:t>a đăng nhập, token hết hạn</w:t>
+      </w:r>
+    </w:p>
+    <w:p>
+      <w:pPr>
+        <w:spacing w:line="240" w:lineRule="auto"/>
+        <w:ind w:left="360"/>
+        <w:rPr>
+          <w:rFonts w:ascii="Arial" w:hAnsi="Arial" w:cs="Arial"/>
+          <w:sz w:val="20"/>
+          <w:szCs w:val="20"/>
+        </w:rPr>
+      </w:pPr>
+      <w:r>
+        <w:rPr>
+          <w:rFonts w:ascii="Arial" w:hAnsi="Arial" w:cs="Arial"/>
+          <w:sz w:val="20"/>
+          <w:szCs w:val="20"/>
+        </w:rPr>
+        <w:t xml:space="preserve">  - Price:</w:t>
+      </w:r>
+      <w:r>
+        <w:rPr>
+          <w:rFonts w:ascii="Arial" w:hAnsi="Arial" w:cs="Arial"/>
+          <w:sz w:val="20"/>
+          <w:szCs w:val="20"/>
+        </w:rPr>
+        <w:t xml:space="preserve"> 3 phân vùng: d</w:t>
+      </w:r>
+      <w:r>
+        <w:rPr>
+          <w:rFonts w:ascii="Arial" w:hAnsi="Arial" w:cs="Arial" w:hint="cs"/>
+          <w:sz w:val="20"/>
+          <w:szCs w:val="20"/>
+        </w:rPr>
+        <w:t>ươ</w:t>
+      </w:r>
+      <w:r>
+        <w:rPr>
+          <w:rFonts w:ascii="Arial" w:hAnsi="Arial" w:cs="Arial"/>
+          <w:sz w:val="20"/>
+          <w:szCs w:val="20"/>
+        </w:rPr>
+        <w:t>ng, 0, âm</w:t>
+      </w:r>
+    </w:p>
+    <w:p>
+      <w:pPr>
+        <w:spacing w:line="240" w:lineRule="auto"/>
+        <w:ind w:left="360"/>
+        <w:rPr>
+          <w:rFonts w:ascii="Arial" w:hAnsi="Arial" w:cs="Arial"/>
+          <w:sz w:val="20"/>
+          <w:szCs w:val="20"/>
+        </w:rPr>
+      </w:pPr>
+      <w:r>
+        <w:rPr>
+          <w:rFonts w:ascii="Arial" w:hAnsi="Arial" w:cs="Arial"/>
+          <w:sz w:val="20"/>
+          <w:szCs w:val="20"/>
+        </w:rPr>
+        <w:t xml:space="preserve">- </w:t>
+      </w:r>
+      <w:r>
+        <w:rPr>
+          <w:rFonts w:ascii="Arial" w:hAnsi="Arial" w:cs="Arial"/>
+          <w:sz w:val="20"/>
+          <w:szCs w:val="20"/>
+        </w:rPr>
+        <w:t>Chọn đại diệ</w:t>
+      </w:r>
+      <w:r>
+        <w:rPr>
+          <w:rFonts w:ascii="Arial" w:hAnsi="Arial" w:cs="Arial"/>
+          <w:sz w:val="20"/>
+          <w:szCs w:val="20"/>
+        </w:rPr>
+        <w:t>n:</w:t>
+      </w:r>
+      <w:r>
+        <w:rPr>
+          <w:rFonts w:ascii="Arial" w:hAnsi="Arial" w:cs="Arial"/>
+          <w:sz w:val="20"/>
+          <w:szCs w:val="20"/>
+        </w:rPr>
+        <w:t xml:space="preserve"> Với mỗi phân vùng, chọn 1 giá trị đại diện để kiểm thử (ví dụ: quantity=5 đại diện cho phân vùng "số nguyên d</w:t>
+      </w:r>
+      <w:r>
+        <w:rPr>
+          <w:rFonts w:ascii="Arial" w:hAnsi="Arial" w:cs="Arial" w:hint="cs"/>
+          <w:sz w:val="20"/>
+          <w:szCs w:val="20"/>
+        </w:rPr>
+        <w:t>ươ</w:t>
+      </w:r>
+      <w:r>
+        <w:rPr>
+          <w:rFonts w:ascii="Arial" w:hAnsi="Arial" w:cs="Arial"/>
+          <w:sz w:val="20"/>
+          <w:szCs w:val="20"/>
+        </w:rPr>
+        <w:t>ng hợp lệ").</w:t>
+      </w:r>
+    </w:p>
+    <w:p>
+      <w:pPr>
+        <w:ind w:left="360"/>
+        <w:rPr>
+          <w:rFonts w:ascii="Arial" w:hAnsi="Arial" w:cs="Arial"/>
+          <w:b/>
+        </w:rPr>
+      </w:pPr>
+      <w:r>
+        <w:rPr>
+          <w:rFonts w:ascii="Arial" w:hAnsi="Arial" w:cs="Arial"/>
+          <w:b/>
+        </w:rPr>
+        <w:t>Bướ</w:t>
+      </w:r>
+      <w:r>
+        <w:rPr>
+          <w:rFonts w:ascii="Arial" w:hAnsi="Arial" w:cs="Arial"/>
+          <w:b/>
+        </w:rPr>
+        <w:t>c 2</w:t>
+      </w:r>
+      <w:r>
+        <w:rPr>
+          <w:rFonts w:ascii="Arial" w:hAnsi="Arial" w:cs="Arial"/>
+          <w:b/>
+        </w:rPr>
+        <w:t xml:space="preserve">: </w:t>
+      </w:r>
+      <w:r>
+        <w:rPr>
+          <w:rFonts w:ascii="Arial" w:hAnsi="Arial" w:cs="Arial"/>
+          <w:b/>
+        </w:rPr>
+        <w:t>Combinatorial Design</w:t>
+      </w:r>
+    </w:p>
+    <w:p>
+      <w:pPr>
+        <w:spacing w:after="0" w:line="240" w:lineRule="auto"/>
+        <w:rPr>
+          <w:rFonts w:ascii="Arial" w:eastAsia="Times New Roman" w:hAnsi="Arial" w:cs="Arial"/>
+          <w:color w:val="000000" w:themeColor="text1"/>
+          <w:sz w:val="20"/>
+          <w:szCs w:val="20"/>
+        </w:rPr>
+      </w:pPr>
+      <w:r>
+        <w:rPr>
+          <w:rFonts w:ascii="Arial" w:eastAsia="Times New Roman" w:hAnsi="Arial" w:cs="Arial"/>
+          <w:b/>
+          <w:bCs/>
+          <w:color w:val="000000" w:themeColor="text1"/>
+          <w:sz w:val="20"/>
+          <w:szCs w:val="20"/>
+        </w:rPr>
+        <w:t>Nguyên tắc:</w:t>
+      </w:r>
+      <w:r>
+        <w:rPr>
+          <w:rFonts w:ascii="Arial" w:eastAsia="Times New Roman" w:hAnsi="Arial" w:cs="Arial"/>
+          <w:color w:val="000000" w:themeColor="text1"/>
+          <w:sz w:val="20"/>
+          <w:szCs w:val="20"/>
+        </w:rPr>
+        <w:t> Sử dụng </w:t>
+      </w:r>
+      <w:r>
+        <w:rPr>
+          <w:rFonts w:ascii="Arial" w:eastAsia="Times New Roman" w:hAnsi="Arial" w:cs="Arial"/>
+          <w:b/>
+          <w:bCs/>
+          <w:color w:val="000000" w:themeColor="text1"/>
+          <w:sz w:val="20"/>
+          <w:szCs w:val="20"/>
+        </w:rPr>
+        <w:t xml:space="preserve">Base Choice </w:t>
+      </w:r>
+      <w:proofErr w:type="gramStart"/>
+      <w:r>
+        <w:rPr>
+          <w:rFonts w:ascii="Arial" w:eastAsia="Times New Roman" w:hAnsi="Arial" w:cs="Arial"/>
+          <w:b/>
+          <w:bCs/>
+          <w:color w:val="000000" w:themeColor="text1"/>
+          <w:sz w:val="20"/>
+          <w:szCs w:val="20"/>
+        </w:rPr>
+        <w:t>Coverage</w:t>
+      </w:r>
+      <w:r>
+        <w:rPr>
+          <w:rFonts w:ascii="Arial" w:eastAsia="Times New Roman" w:hAnsi="Arial" w:cs="Arial"/>
+          <w:color w:val="000000" w:themeColor="text1"/>
+          <w:sz w:val="20"/>
+          <w:szCs w:val="20"/>
+        </w:rPr>
+        <w:t> </w:t>
+      </w:r>
+      <w:r>
+        <w:rPr>
+          <w:rFonts w:ascii="Arial" w:eastAsia="Times New Roman" w:hAnsi="Arial" w:cs="Arial"/>
+          <w:color w:val="000000" w:themeColor="text1"/>
+          <w:sz w:val="20"/>
+          <w:szCs w:val="20"/>
+        </w:rPr>
+        <w:t xml:space="preserve"> chọn</w:t>
+      </w:r>
+      <w:proofErr w:type="gramEnd"/>
+      <w:r>
+        <w:rPr>
+          <w:rFonts w:ascii="Arial" w:eastAsia="Times New Roman" w:hAnsi="Arial" w:cs="Arial"/>
+          <w:color w:val="000000" w:themeColor="text1"/>
+          <w:sz w:val="20"/>
+          <w:szCs w:val="20"/>
+        </w:rPr>
+        <w:t xml:space="preserve"> 1 tổ hợp base (tất cả Valid) rồi lần lượt thay đổi từng biến sang Invalid, giữ các biến còn lại ở giá trị base.</w:t>
+      </w:r>
+    </w:p>
+    <w:p>
+      <w:pPr>
+        <w:spacing w:after="0" w:line="240" w:lineRule="auto"/>
+        <w:rPr>
+          <w:rFonts w:ascii="Arial" w:eastAsia="Times New Roman" w:hAnsi="Arial" w:cs="Arial"/>
+          <w:color w:val="000000" w:themeColor="text1"/>
+          <w:sz w:val="20"/>
+          <w:szCs w:val="20"/>
+        </w:rPr>
+      </w:pPr>
+      <w:r>
+        <w:rPr>
+          <w:rFonts w:ascii="Arial" w:eastAsia="Times New Roman" w:hAnsi="Arial" w:cs="Arial"/>
+          <w:b/>
+          <w:bCs/>
+          <w:color w:val="000000" w:themeColor="text1"/>
+          <w:sz w:val="20"/>
+          <w:szCs w:val="20"/>
+        </w:rPr>
+        <w:t>Áp dụng:</w:t>
+      </w:r>
+    </w:p>
+    <w:p>
+      <w:pPr>
+        <w:numPr>
+          <w:ilvl w:val="0"/>
+          <w:numId w:val="52"/>
+        </w:numPr>
+        <w:spacing w:after="0" w:line="240" w:lineRule="auto"/>
+        <w:ind w:left="244"/>
+        <w:rPr>
+          <w:rFonts w:ascii="Arial" w:eastAsia="Times New Roman" w:hAnsi="Arial" w:cs="Arial"/>
+          <w:color w:val="000000" w:themeColor="text1"/>
+          <w:sz w:val="20"/>
+          <w:szCs w:val="20"/>
+        </w:rPr>
+      </w:pPr>
+      <w:r>
+        <w:rPr>
+          <w:rFonts w:ascii="Arial" w:eastAsia="Times New Roman" w:hAnsi="Arial" w:cs="Arial"/>
+          <w:b/>
+          <w:bCs/>
+          <w:color w:val="000000" w:themeColor="text1"/>
+          <w:sz w:val="20"/>
+          <w:szCs w:val="20"/>
+        </w:rPr>
+        <w:lastRenderedPageBreak/>
+        <w:t>Base case (TC-FR07-001):</w:t>
+      </w:r>
+      <w:r>
+        <w:rPr>
+          <w:rFonts w:ascii="Arial" w:eastAsia="Times New Roman" w:hAnsi="Arial" w:cs="Arial"/>
+          <w:color w:val="000000" w:themeColor="text1"/>
+          <w:sz w:val="20"/>
+          <w:szCs w:val="20"/>
+        </w:rPr>
+        <w:t> Tất cả biến đều Valid: quantity=1 hợp lệ, SP hợp lệ, đã đăng nhập, price&gt;0</w:t>
+      </w:r>
+    </w:p>
+    <w:p>
+      <w:pPr>
+        <w:numPr>
+          <w:ilvl w:val="0"/>
+          <w:numId w:val="52"/>
+        </w:numPr>
+        <w:spacing w:after="0" w:line="240" w:lineRule="auto"/>
+        <w:ind w:left="244"/>
+        <w:rPr>
+          <w:rFonts w:ascii="Arial" w:eastAsia="Times New Roman" w:hAnsi="Arial" w:cs="Arial"/>
+          <w:color w:val="000000" w:themeColor="text1"/>
+          <w:sz w:val="20"/>
+          <w:szCs w:val="20"/>
+        </w:rPr>
+      </w:pPr>
+      <w:bookmarkStart w:id="1" w:name="_GoBack"/>
+      <w:r>
+        <w:rPr>
+          <w:rFonts w:ascii="Arial" w:eastAsia="Times New Roman" w:hAnsi="Arial" w:cs="Arial"/>
+          <w:b/>
+          <w:bCs/>
+          <w:color w:val="000000" w:themeColor="text1"/>
+          <w:sz w:val="20"/>
+          <w:szCs w:val="20"/>
+        </w:rPr>
+        <w:t>Variation:</w:t>
+      </w:r>
+      <w:r>
+        <w:rPr>
+          <w:rFonts w:ascii="Arial" w:eastAsia="Times New Roman" w:hAnsi="Arial" w:cs="Arial"/>
+          <w:color w:val="000000" w:themeColor="text1"/>
+          <w:sz w:val="20"/>
+          <w:szCs w:val="20"/>
+        </w:rPr>
+        <w:t> Mỗi test case tiếp theo thay 1 biến thành Invalid/Edge (ví dụ: TC-007 đổi quantity=0, TC-016 đổi sang chưa đăng nhập)</w:t>
+      </w:r>
+      <w:bookmarkEnd w:id="1"/>
+    </w:p>
+    <w:p>
+      <w:pPr>
+        <w:numPr>
+          <w:ilvl w:val="0"/>
+          <w:numId w:val="52"/>
+        </w:numPr>
+        <w:spacing w:after="0" w:line="240" w:lineRule="auto"/>
+        <w:ind w:left="244"/>
+        <w:rPr>
+          <w:rFonts w:ascii="Arial" w:eastAsia="Times New Roman" w:hAnsi="Arial" w:cs="Arial"/>
+          <w:color w:val="000000" w:themeColor="text1"/>
+          <w:sz w:val="20"/>
+          <w:szCs w:val="20"/>
+        </w:rPr>
+      </w:pPr>
+      <w:r>
+        <w:rPr>
+          <w:rFonts w:ascii="Arial" w:eastAsia="Times New Roman" w:hAnsi="Arial" w:cs="Arial"/>
+          <w:b/>
+          <w:bCs/>
+          <w:color w:val="000000" w:themeColor="text1"/>
+          <w:sz w:val="20"/>
+          <w:szCs w:val="20"/>
+        </w:rPr>
+        <w:t>Bổ sung:</w:t>
+      </w:r>
+      <w:r>
+        <w:rPr>
+          <w:rFonts w:ascii="Arial" w:eastAsia="Times New Roman" w:hAnsi="Arial" w:cs="Arial"/>
+          <w:color w:val="000000" w:themeColor="text1"/>
+          <w:sz w:val="20"/>
+          <w:szCs w:val="20"/>
+        </w:rPr>
+        <w:t> Các test case kiểm tra nghiệp vụ đặc thù (gộp SP trùng, dialog xác nhận, nhãn UI, hình minh họa)</w:t>
+      </w:r>
+    </w:p>
+    <w:p>
+      <w:pPr>
+        <w:ind w:left="360"/>
+        <w:rPr>
+          <w:rFonts w:ascii="Arial" w:hAnsi="Arial" w:cs="Arial"/>
+          <w:b/>
+        </w:rPr>
+      </w:pPr>
+    </w:p>
     <w:sdt>
       <w:sdtPr>
         <w:rPr>
@@ -11302,7 +11949,6 @@
         <w:rPr>
           <w:rFonts w:ascii="Arial" w:hAnsi="Arial" w:cs="Arial"/>
         </w:rPr>
-        <w:lastRenderedPageBreak/>
         <w:t>Self-assessment</w:t>
       </w:r>
       <w:bookmarkEnd w:id="3"/>
@@ -14776,6 +15422,155 @@
     </w:lvl>
   </w:abstractNum>
   <w:abstractNum w:abstractNumId="26" w15:restartNumberingAfterBreak="0">
+    <w:nsid w:val="31B81F62"/>
+    <w:multiLevelType w:val="multilevel"/>
+    <w:tmpl w:val="5DBECC34"/>
+    <w:lvl w:ilvl="0">
+      <w:start w:val="1"/>
+      <w:numFmt w:val="bullet"/>
+      <w:lvlText w:val=""/>
+      <w:lvlJc w:val="left"/>
+      <w:pPr>
+        <w:tabs>
+          <w:tab w:val="num" w:pos="720"/>
+        </w:tabs>
+        <w:ind w:left="720" w:hanging="360"/>
+      </w:pPr>
+      <w:rPr>
+        <w:rFonts w:ascii="Symbol" w:hAnsi="Symbol" w:hint="default"/>
+        <w:sz w:val="20"/>
+      </w:rPr>
+    </w:lvl>
+    <w:lvl w:ilvl="1" w:tentative="1">
+      <w:start w:val="1"/>
+      <w:numFmt w:val="bullet"/>
+      <w:lvlText w:val=""/>
+      <w:lvlJc w:val="left"/>
+      <w:pPr>
+        <w:tabs>
+          <w:tab w:val="num" w:pos="1440"/>
+        </w:tabs>
+        <w:ind w:left="1440" w:hanging="360"/>
+      </w:pPr>
+      <w:rPr>
+        <w:rFonts w:ascii="Symbol" w:hAnsi="Symbol" w:hint="default"/>
+        <w:sz w:val="20"/>
+      </w:rPr>
+    </w:lvl>
+    <w:lvl w:ilvl="2" w:tentative="1">
+      <w:start w:val="1"/>
+      <w:numFmt w:val="bullet"/>
+      <w:lvlText w:val=""/>
+      <w:lvlJc w:val="left"/>
+      <w:pPr>
+        <w:tabs>
+          <w:tab w:val="num" w:pos="2160"/>
+        </w:tabs>
+        <w:ind w:left="2160" w:hanging="360"/>
+      </w:pPr>
+      <w:rPr>
+        <w:rFonts w:ascii="Symbol" w:hAnsi="Symbol" w:hint="default"/>
+        <w:sz w:val="20"/>
+      </w:rPr>
+    </w:lvl>
+    <w:lvl w:ilvl="3" w:tentative="1">
+      <w:start w:val="1"/>
+      <w:numFmt w:val="bullet"/>
+      <w:lvlText w:val=""/>
+      <w:lvlJc w:val="left"/>
+      <w:pPr>
+        <w:tabs>
+          <w:tab w:val="num" w:pos="2880"/>
+        </w:tabs>
+        <w:ind w:left="2880" w:hanging="360"/>
+      </w:pPr>
+      <w:rPr>
+        <w:rFonts w:ascii="Symbol" w:hAnsi="Symbol" w:hint="default"/>
+        <w:sz w:val="20"/>
+      </w:rPr>
+    </w:lvl>
+    <w:lvl w:ilvl="4" w:tentative="1">
+      <w:start w:val="1"/>
+      <w:numFmt w:val="bullet"/>
+      <w:lvlText w:val=""/>
+      <w:lvlJc w:val="left"/>
+      <w:pPr>
+        <w:tabs>
+          <w:tab w:val="num" w:pos="3600"/>
+        </w:tabs>
+        <w:ind w:left="3600" w:hanging="360"/>
+      </w:pPr>
+      <w:rPr>
+        <w:rFonts w:ascii="Symbol" w:hAnsi="Symbol" w:hint="default"/>
+        <w:sz w:val="20"/>
+      </w:rPr>
+    </w:lvl>
+    <w:lvl w:ilvl="5" w:tentative="1">
+      <w:start w:val="1"/>
+      <w:numFmt w:val="bullet"/>
+      <w:lvlText w:val=""/>
+      <w:lvlJc w:val="left"/>
+      <w:pPr>
+        <w:tabs>
+          <w:tab w:val="num" w:pos="4320"/>
+        </w:tabs>
+        <w:ind w:left="4320" w:hanging="360"/>
+      </w:pPr>
+      <w:rPr>
+        <w:rFonts w:ascii="Symbol" w:hAnsi="Symbol" w:hint="default"/>
+        <w:sz w:val="20"/>
+      </w:rPr>
+    </w:lvl>
+    <w:lvl w:ilvl="6" w:tentative="1">
+      <w:start w:val="1"/>
+      <w:numFmt w:val="bullet"/>
+      <w:lvlText w:val=""/>
+      <w:lvlJc w:val="left"/>
+      <w:pPr>
+        <w:tabs>
+          <w:tab w:val="num" w:pos="5040"/>
+        </w:tabs>
+        <w:ind w:left="5040" w:hanging="360"/>
+      </w:pPr>
+      <w:rPr>
+        <w:rFonts w:ascii="Symbol" w:hAnsi="Symbol" w:hint="default"/>
+        <w:sz w:val="20"/>
+      </w:rPr>
+    </w:lvl>
+    <w:lvl w:ilvl="7" w:tentative="1">
+      <w:start w:val="1"/>
+      <w:numFmt w:val="bullet"/>
+      <w:lvlText w:val=""/>
+      <w:lvlJc w:val="left"/>
+      <w:pPr>
+        <w:tabs>
+          <w:tab w:val="num" w:pos="5760"/>
+        </w:tabs>
+        <w:ind w:left="5760" w:hanging="360"/>
+      </w:pPr>
+      <w:rPr>
+        <w:rFonts w:ascii="Symbol" w:hAnsi="Symbol" w:hint="default"/>
+        <w:sz w:val="20"/>
+      </w:rPr>
+    </w:lvl>
+    <w:lvl w:ilvl="8" w:tentative="1">
+      <w:start w:val="1"/>
+      <w:numFmt w:val="bullet"/>
+      <w:lvlText w:val=""/>
+      <w:lvlJc w:val="left"/>
+      <w:pPr>
+        <w:tabs>
+          <w:tab w:val="num" w:pos="6480"/>
+        </w:tabs>
+        <w:ind w:left="6480" w:hanging="360"/>
+      </w:pPr>
+      <w:rPr>
+        <w:rFonts w:ascii="Symbol" w:hAnsi="Symbol" w:hint="default"/>
+        <w:sz w:val="20"/>
+      </w:rPr>
+    </w:lvl>
+  </w:abstractNum>
+  <w:abstractNum w:abstractNumId="27" w15:restartNumberingAfterBreak="0">
     <w:nsid w:val="3238531A"/>
     <w:multiLevelType w:val="multilevel"/>
     <w:tmpl w:val="BD9A436A"/>
@@ -14924,7 +15719,7 @@
       </w:rPr>
     </w:lvl>
   </w:abstractNum>
-  <w:abstractNum w:abstractNumId="27" w15:restartNumberingAfterBreak="0">
+  <w:abstractNum w:abstractNumId="28" w15:restartNumberingAfterBreak="0">
     <w:nsid w:val="335D3C3E"/>
     <w:multiLevelType w:val="multilevel"/>
     <w:tmpl w:val="CC289B14"/>
@@ -15037,7 +15832,7 @@
       </w:pPr>
     </w:lvl>
   </w:abstractNum>
-  <w:abstractNum w:abstractNumId="28" w15:restartNumberingAfterBreak="0">
+  <w:abstractNum w:abstractNumId="29" w15:restartNumberingAfterBreak="0">
     <w:nsid w:val="35897870"/>
     <w:multiLevelType w:val="multilevel"/>
     <w:tmpl w:val="49046F6C"/>
@@ -15186,7 +15981,7 @@
       </w:rPr>
     </w:lvl>
   </w:abstractNum>
-  <w:abstractNum w:abstractNumId="29" w15:restartNumberingAfterBreak="0">
+  <w:abstractNum w:abstractNumId="30" w15:restartNumberingAfterBreak="0">
     <w:nsid w:val="3A494F19"/>
     <w:multiLevelType w:val="multilevel"/>
     <w:tmpl w:val="67660F38"/>
@@ -15335,7 +16130,7 @@
       </w:rPr>
     </w:lvl>
   </w:abstractNum>
-  <w:abstractNum w:abstractNumId="30" w15:restartNumberingAfterBreak="0">
+  <w:abstractNum w:abstractNumId="31" w15:restartNumberingAfterBreak="0">
     <w:nsid w:val="3D9300C7"/>
     <w:multiLevelType w:val="multilevel"/>
     <w:tmpl w:val="DFA674A0"/>
@@ -15484,7 +16279,7 @@
       </w:rPr>
     </w:lvl>
   </w:abstractNum>
-  <w:abstractNum w:abstractNumId="31" w15:restartNumberingAfterBreak="0">
+  <w:abstractNum w:abstractNumId="32" w15:restartNumberingAfterBreak="0">
     <w:nsid w:val="40180C53"/>
     <w:multiLevelType w:val="multilevel"/>
     <w:tmpl w:val="21B6C67C"/>
@@ -15633,7 +16428,7 @@
       </w:rPr>
     </w:lvl>
   </w:abstractNum>
-  <w:abstractNum w:abstractNumId="32" w15:restartNumberingAfterBreak="0">
+  <w:abstractNum w:abstractNumId="33" w15:restartNumberingAfterBreak="0">
     <w:nsid w:val="410F2FD0"/>
     <w:multiLevelType w:val="multilevel"/>
     <w:tmpl w:val="F24C0008"/>
@@ -15746,7 +16541,7 @@
       </w:pPr>
     </w:lvl>
   </w:abstractNum>
-  <w:abstractNum w:abstractNumId="33" w15:restartNumberingAfterBreak="0">
+  <w:abstractNum w:abstractNumId="34" w15:restartNumberingAfterBreak="0">
     <w:nsid w:val="422847C6"/>
     <w:multiLevelType w:val="multilevel"/>
     <w:tmpl w:val="69DA3BB8"/>
@@ -15895,7 +16690,7 @@
       </w:rPr>
     </w:lvl>
   </w:abstractNum>
-  <w:abstractNum w:abstractNumId="34" w15:restartNumberingAfterBreak="0">
+  <w:abstractNum w:abstractNumId="35" w15:restartNumberingAfterBreak="0">
     <w:nsid w:val="4372395A"/>
     <w:multiLevelType w:val="multilevel"/>
     <w:tmpl w:val="E62A7526"/>
@@ -16008,7 +16803,7 @@
       </w:pPr>
     </w:lvl>
   </w:abstractNum>
-  <w:abstractNum w:abstractNumId="35" w15:restartNumberingAfterBreak="0">
+  <w:abstractNum w:abstractNumId="36" w15:restartNumberingAfterBreak="0">
     <w:nsid w:val="47B76E04"/>
     <w:multiLevelType w:val="multilevel"/>
     <w:tmpl w:val="C21656B2"/>
@@ -16121,7 +16916,7 @@
       </w:pPr>
     </w:lvl>
   </w:abstractNum>
-  <w:abstractNum w:abstractNumId="36" w15:restartNumberingAfterBreak="0">
+  <w:abstractNum w:abstractNumId="37" w15:restartNumberingAfterBreak="0">
     <w:nsid w:val="499B77C8"/>
     <w:multiLevelType w:val="multilevel"/>
     <w:tmpl w:val="08C6F076"/>
@@ -16234,7 +17029,7 @@
       </w:pPr>
     </w:lvl>
   </w:abstractNum>
-  <w:abstractNum w:abstractNumId="37" w15:restartNumberingAfterBreak="0">
+  <w:abstractNum w:abstractNumId="38" w15:restartNumberingAfterBreak="0">
     <w:nsid w:val="4D934FCB"/>
     <w:multiLevelType w:val="multilevel"/>
     <w:tmpl w:val="DD9E8BBE"/>
@@ -16383,7 +17178,7 @@
       </w:rPr>
     </w:lvl>
   </w:abstractNum>
-  <w:abstractNum w:abstractNumId="38" w15:restartNumberingAfterBreak="0">
+  <w:abstractNum w:abstractNumId="39" w15:restartNumberingAfterBreak="0">
     <w:nsid w:val="4FEC5D46"/>
     <w:multiLevelType w:val="multilevel"/>
     <w:tmpl w:val="2B78F738"/>
@@ -16532,7 +17327,7 @@
       </w:rPr>
     </w:lvl>
   </w:abstractNum>
-  <w:abstractNum w:abstractNumId="39" w15:restartNumberingAfterBreak="0">
+  <w:abstractNum w:abstractNumId="40" w15:restartNumberingAfterBreak="0">
     <w:nsid w:val="513E03A7"/>
     <w:multiLevelType w:val="multilevel"/>
     <w:tmpl w:val="BC188678"/>
@@ -16645,7 +17440,7 @@
       </w:pPr>
     </w:lvl>
   </w:abstractNum>
-  <w:abstractNum w:abstractNumId="40" w15:restartNumberingAfterBreak="0">
+  <w:abstractNum w:abstractNumId="41" w15:restartNumberingAfterBreak="0">
     <w:nsid w:val="534C4A2F"/>
     <w:multiLevelType w:val="multilevel"/>
     <w:tmpl w:val="8660958E"/>
@@ -16758,7 +17553,7 @@
       </w:pPr>
     </w:lvl>
   </w:abstractNum>
-  <w:abstractNum w:abstractNumId="41" w15:restartNumberingAfterBreak="0">
+  <w:abstractNum w:abstractNumId="42" w15:restartNumberingAfterBreak="0">
     <w:nsid w:val="552D71D1"/>
     <w:multiLevelType w:val="multilevel"/>
     <w:tmpl w:val="7A68758A"/>
@@ -16871,7 +17666,7 @@
       </w:pPr>
     </w:lvl>
   </w:abstractNum>
-  <w:abstractNum w:abstractNumId="42" w15:restartNumberingAfterBreak="0">
+  <w:abstractNum w:abstractNumId="43" w15:restartNumberingAfterBreak="0">
     <w:nsid w:val="5E367E69"/>
     <w:multiLevelType w:val="multilevel"/>
     <w:tmpl w:val="A83EEE42"/>
@@ -17020,7 +17815,7 @@
       </w:rPr>
     </w:lvl>
   </w:abstractNum>
-  <w:abstractNum w:abstractNumId="43" w15:restartNumberingAfterBreak="0">
+  <w:abstractNum w:abstractNumId="44" w15:restartNumberingAfterBreak="0">
     <w:nsid w:val="644E4D24"/>
     <w:multiLevelType w:val="hybridMultilevel"/>
     <w:tmpl w:val="339EBBC4"/>
@@ -17133,7 +17928,7 @@
       </w:rPr>
     </w:lvl>
   </w:abstractNum>
-  <w:abstractNum w:abstractNumId="44" w15:restartNumberingAfterBreak="0">
+  <w:abstractNum w:abstractNumId="45" w15:restartNumberingAfterBreak="0">
     <w:nsid w:val="677013A8"/>
     <w:multiLevelType w:val="multilevel"/>
     <w:tmpl w:val="6BBCA6D4"/>
@@ -17246,7 +18041,7 @@
       </w:pPr>
     </w:lvl>
   </w:abstractNum>
-  <w:abstractNum w:abstractNumId="45" w15:restartNumberingAfterBreak="0">
+  <w:abstractNum w:abstractNumId="46" w15:restartNumberingAfterBreak="0">
     <w:nsid w:val="6AD127E2"/>
     <w:multiLevelType w:val="hybridMultilevel"/>
     <w:tmpl w:val="139EEE1A"/>
@@ -17359,7 +18154,7 @@
       </w:rPr>
     </w:lvl>
   </w:abstractNum>
-  <w:abstractNum w:abstractNumId="46" w15:restartNumberingAfterBreak="0">
+  <w:abstractNum w:abstractNumId="47" w15:restartNumberingAfterBreak="0">
     <w:nsid w:val="6B7C3983"/>
     <w:multiLevelType w:val="multilevel"/>
     <w:tmpl w:val="3960A000"/>
@@ -17508,7 +18303,7 @@
       </w:rPr>
     </w:lvl>
   </w:abstractNum>
-  <w:abstractNum w:abstractNumId="47" w15:restartNumberingAfterBreak="0">
+  <w:abstractNum w:abstractNumId="48" w15:restartNumberingAfterBreak="0">
     <w:nsid w:val="6BB439FF"/>
     <w:multiLevelType w:val="multilevel"/>
     <w:tmpl w:val="6E2AA7F8"/>
@@ -17621,7 +18416,7 @@
       </w:pPr>
     </w:lvl>
   </w:abstractNum>
-  <w:abstractNum w:abstractNumId="48" w15:restartNumberingAfterBreak="0">
+  <w:abstractNum w:abstractNumId="49" w15:restartNumberingAfterBreak="0">
     <w:nsid w:val="6BCD7020"/>
     <w:multiLevelType w:val="multilevel"/>
     <w:tmpl w:val="80C0E87C"/>
@@ -17770,7 +18565,7 @@
       </w:rPr>
     </w:lvl>
   </w:abstractNum>
-  <w:abstractNum w:abstractNumId="49" w15:restartNumberingAfterBreak="0">
+  <w:abstractNum w:abstractNumId="50" w15:restartNumberingAfterBreak="0">
     <w:nsid w:val="6BE73B8D"/>
     <w:multiLevelType w:val="multilevel"/>
     <w:tmpl w:val="BDBA3786"/>
@@ -17883,7 +18678,7 @@
       </w:pPr>
     </w:lvl>
   </w:abstractNum>
-  <w:abstractNum w:abstractNumId="50" w15:restartNumberingAfterBreak="0">
+  <w:abstractNum w:abstractNumId="51" w15:restartNumberingAfterBreak="0">
     <w:nsid w:val="77764322"/>
     <w:multiLevelType w:val="multilevel"/>
     <w:tmpl w:val="5562088C"/>
@@ -18063,25 +18858,25 @@
     <w:abstractNumId w:val="11"/>
   </w:num>
   <w:num w:numId="11">
-    <w:abstractNumId w:val="47"/>
+    <w:abstractNumId w:val="48"/>
   </w:num>
   <w:num w:numId="12">
-    <w:abstractNumId w:val="26"/>
+    <w:abstractNumId w:val="27"/>
   </w:num>
   <w:num w:numId="13">
-    <w:abstractNumId w:val="39"/>
+    <w:abstractNumId w:val="40"/>
   </w:num>
   <w:num w:numId="14">
     <w:abstractNumId w:val="12"/>
   </w:num>
   <w:num w:numId="15">
-    <w:abstractNumId w:val="44"/>
+    <w:abstractNumId w:val="45"/>
   </w:num>
   <w:num w:numId="16">
-    <w:abstractNumId w:val="30"/>
+    <w:abstractNumId w:val="31"/>
   </w:num>
   <w:num w:numId="17">
-    <w:abstractNumId w:val="35"/>
+    <w:abstractNumId w:val="36"/>
   </w:num>
   <w:num w:numId="18">
     <w:abstractNumId w:val="22"/>
@@ -18090,7 +18885,7 @@
     <w:abstractNumId w:val="19"/>
   </w:num>
   <w:num w:numId="20">
-    <w:abstractNumId w:val="31"/>
+    <w:abstractNumId w:val="32"/>
   </w:num>
   <w:num w:numId="21">
     <w:abstractNumId w:val="18"/>
@@ -18099,34 +18894,34 @@
     <w:abstractNumId w:val="17"/>
   </w:num>
   <w:num w:numId="23">
-    <w:abstractNumId w:val="49"/>
+    <w:abstractNumId w:val="50"/>
   </w:num>
   <w:num w:numId="24">
-    <w:abstractNumId w:val="38"/>
+    <w:abstractNumId w:val="39"/>
   </w:num>
   <w:num w:numId="25">
-    <w:abstractNumId w:val="41"/>
+    <w:abstractNumId w:val="42"/>
   </w:num>
   <w:num w:numId="26">
-    <w:abstractNumId w:val="42"/>
+    <w:abstractNumId w:val="43"/>
   </w:num>
   <w:num w:numId="27">
     <w:abstractNumId w:val="9"/>
   </w:num>
   <w:num w:numId="28">
-    <w:abstractNumId w:val="28"/>
+    <w:abstractNumId w:val="29"/>
   </w:num>
   <w:num w:numId="29">
     <w:abstractNumId w:val="16"/>
   </w:num>
   <w:num w:numId="30">
-    <w:abstractNumId w:val="46"/>
+    <w:abstractNumId w:val="47"/>
   </w:num>
   <w:num w:numId="31">
-    <w:abstractNumId w:val="40"/>
+    <w:abstractNumId w:val="41"/>
   </w:num>
   <w:num w:numId="32">
-    <w:abstractNumId w:val="50"/>
+    <w:abstractNumId w:val="51"/>
   </w:num>
   <w:num w:numId="33">
     <w:abstractNumId w:val="20"/>
@@ -18135,22 +18930,22 @@
     <w:abstractNumId w:val="21"/>
   </w:num>
   <w:num w:numId="35">
-    <w:abstractNumId w:val="34"/>
+    <w:abstractNumId w:val="35"/>
   </w:num>
   <w:num w:numId="36">
+    <w:abstractNumId w:val="38"/>
+  </w:num>
+  <w:num w:numId="37">
+    <w:abstractNumId w:val="28"/>
+  </w:num>
+  <w:num w:numId="38">
+    <w:abstractNumId w:val="49"/>
+  </w:num>
+  <w:num w:numId="39">
     <w:abstractNumId w:val="37"/>
   </w:num>
-  <w:num w:numId="37">
-    <w:abstractNumId w:val="27"/>
-  </w:num>
-  <w:num w:numId="38">
-    <w:abstractNumId w:val="48"/>
-  </w:num>
-  <w:num w:numId="39">
-    <w:abstractNumId w:val="36"/>
-  </w:num>
   <w:num w:numId="40">
-    <w:abstractNumId w:val="29"/>
+    <w:abstractNumId w:val="30"/>
   </w:num>
   <w:num w:numId="41">
     <w:abstractNumId w:val="15"/>
@@ -18159,10 +18954,10 @@
     <w:abstractNumId w:val="14"/>
   </w:num>
   <w:num w:numId="43">
-    <w:abstractNumId w:val="32"/>
+    <w:abstractNumId w:val="33"/>
   </w:num>
   <w:num w:numId="44">
-    <w:abstractNumId w:val="33"/>
+    <w:abstractNumId w:val="34"/>
   </w:num>
   <w:num w:numId="45">
     <w:abstractNumId w:val="23"/>
@@ -18180,10 +18975,13 @@
     <w:abstractNumId w:val="0"/>
   </w:num>
   <w:num w:numId="50">
-    <w:abstractNumId w:val="45"/>
+    <w:abstractNumId w:val="46"/>
   </w:num>
   <w:num w:numId="51">
-    <w:abstractNumId w:val="43"/>
+    <w:abstractNumId w:val="44"/>
+  </w:num>
+  <w:num w:numId="52">
+    <w:abstractNumId w:val="26"/>
   </w:num>
   <w:numIdMacAtCleanup w:val="46"/>
 </w:numbering>
@@ -29964,7 +30762,7 @@
 </file>
 
 <file path=customXml/itemProps1.xml><?xml version="1.0" encoding="utf-8"?>
-<ds:datastoreItem xmlns:ds="http://schemas.openxmlformats.org/officeDocument/2006/customXml" ds:itemID="{413497EB-62E1-4EC8-9351-5C634C793561}">
+<ds:datastoreItem xmlns:ds="http://schemas.openxmlformats.org/officeDocument/2006/customXml" ds:itemID="{79897380-7FB4-42AC-B554-40CCC1F55875}">
   <ds:schemaRefs>
     <ds:schemaRef ds:uri="http://schemas.openxmlformats.org/officeDocument/2006/bibliography"/>
   </ds:schemaRefs>

</xml_diff>

<commit_message>
fr07 bva test cases & explaination
</commit_message>
<xml_diff>
--- a/MainReport.docx
+++ b/MainReport.docx
@@ -387,7 +387,7 @@
                 <w:sz w:val="16"/>
                 <w:szCs w:val="16"/>
               </w:rPr>
-              <w:t>- Họ Tên: Tran Thi B&lt;br&gt;- Email: newuser02@eshop.com&lt;br&gt;- Mật khẩu: Secure$Password2026&lt;br&gt;- Xác nhận MK: Secure$Password2026</w:t>
+              <w:t>- Họ Tên: Tran Thi B&lt;br&gt;- Email: newuser02@eshop.com&lt;br&gt;- Mật khẩu: SecurePassword2026&lt;br&gt;- Xác nhận MK: SecurePassword2026</w:t>
             </w:r>
           </w:p>
         </w:tc>
@@ -1927,7 +1927,7 @@
                 <w:sz w:val="16"/>
                 <w:szCs w:val="16"/>
               </w:rPr>
-              <w:t>Hệ thống từ chối đăng ký, báo lỗi: *"Mật khẩu phải chứa ít nhất 1 ký tự đặc biệt (@, $, !, %, , ?, &amp;)".</w:t>
+              <w:t>Hệ thống từ chối đăng ký, báo lỗi: *"Mật khẩu phải chứa ít nhất 1 ký tự đặc biệt (@, , !, %, , ?, &amp;)".</w:t>
             </w:r>
           </w:p>
         </w:tc>
@@ -2028,7 +2028,7 @@
                 <w:sz w:val="16"/>
                 <w:szCs w:val="16"/>
               </w:rPr>
-              <w:t>Hệ thống từ chối đăng ký, báo lỗi: *"Ký tự đặc biệt chỉ được thuộc nhóm: @, $, !, %, , ?, &amp;".</w:t>
+              <w:t>Hệ thống từ chối đăng ký, báo lỗi: *"Ký tự đặc biệt chỉ được thuộc nhóm: @, , !, %, , ?, &amp;".</w:t>
             </w:r>
           </w:p>
         </w:tc>
@@ -2455,25 +2455,24 @@
           <w:sz w:val="20"/>
           <w:szCs w:val="20"/>
         </w:rPr>
-        <w:t>- __Valid Partitions (Miền hợp lệ - VP</w:t>
+        <w:t>- Valid Partitions (Miền hợp lệ - VP): Tập hợp các giá trị đáp ứng hoàn toàn mọi quy tắc nghiệp vụ. Hệ thống bắt buộc phải xử lý thành công (Happy Path).</w:t>
       </w:r>
-      <w:proofErr w:type="gramStart"/>
+    </w:p>
+    <w:p>
+      <w:pPr>
+        <w:rPr>
+          <w:rFonts w:ascii="Arial" w:hAnsi="Arial" w:cs="Arial"/>
+          <w:sz w:val="20"/>
+          <w:szCs w:val="20"/>
+        </w:rPr>
+      </w:pPr>
       <w:r>
         <w:rPr>
           <w:rFonts w:ascii="Arial" w:hAnsi="Arial" w:cs="Arial"/>
           <w:sz w:val="20"/>
           <w:szCs w:val="20"/>
         </w:rPr>
-        <w:t>):_</w:t>
-      </w:r>
-      <w:proofErr w:type="gramEnd"/>
-      <w:r>
-        <w:rPr>
-          <w:rFonts w:ascii="Arial" w:hAnsi="Arial" w:cs="Arial"/>
-          <w:sz w:val="20"/>
-          <w:szCs w:val="20"/>
-        </w:rPr>
-        <w:t>_ Tập hợp các giá trị đáp ứng hoàn toàn mọi quy tắc nghiệp vụ. Hệ thống bắt buộc phải xử lý thành công (Happy Path).</w:t>
+        <w:t>- Invalid Partitions (Miền bất hợp lệ - IP): Tập hợp các giá trị vi phạm ít nhất một điều kiện nghiệp vụ. Hệ thống bắt buộc phải chặn lại và hiển thị thông báo lỗi tương ứng.</w:t>
       </w:r>
     </w:p>
     <w:p>
@@ -2491,41 +2490,6 @@
           <w:szCs w:val="20"/>
         </w:rPr>
         <w:lastRenderedPageBreak/>
-        <w:t>- __Invalid Partitions (Miền bất hợp lệ - IP</w:t>
-      </w:r>
-      <w:proofErr w:type="gramStart"/>
-      <w:r>
-        <w:rPr>
-          <w:rFonts w:ascii="Arial" w:hAnsi="Arial" w:cs="Arial"/>
-          <w:sz w:val="20"/>
-          <w:szCs w:val="20"/>
-        </w:rPr>
-        <w:t>):_</w:t>
-      </w:r>
-      <w:proofErr w:type="gramEnd"/>
-      <w:r>
-        <w:rPr>
-          <w:rFonts w:ascii="Arial" w:hAnsi="Arial" w:cs="Arial"/>
-          <w:sz w:val="20"/>
-          <w:szCs w:val="20"/>
-        </w:rPr>
-        <w:t>_ Tập hợp các giá trị vi phạm ít nhất một điều kiện nghiệp vụ. Hệ thống bắt buộc phải chặn lại và hiển thị thông báo lỗi tương ứng.</w:t>
-      </w:r>
-    </w:p>
-    <w:p>
-      <w:pPr>
-        <w:rPr>
-          <w:rFonts w:ascii="Arial" w:hAnsi="Arial" w:cs="Arial"/>
-          <w:sz w:val="20"/>
-          <w:szCs w:val="20"/>
-        </w:rPr>
-      </w:pPr>
-      <w:r>
-        <w:rPr>
-          <w:rFonts w:ascii="Arial" w:hAnsi="Arial" w:cs="Arial"/>
-          <w:sz w:val="20"/>
-          <w:szCs w:val="20"/>
-        </w:rPr>
         <w:t>- *Nguyên tắc chia nhỏ (Granularity</w:t>
       </w:r>
       <w:proofErr w:type="gramStart"/>
@@ -2580,95 +2544,41 @@
           <w:sz w:val="20"/>
           <w:szCs w:val="20"/>
         </w:rPr>
-        <w:t xml:space="preserve">Khi kết hợp các phân vùng của nhiều biến vào một kịch bản kiểm thử, sai lầm phổ biến nhất là đưa nhiều giá trị lỗi vào cùng một test case. Điều này dẫn đến __Fault Masking (Hiện tượng lỗi che khuất </w:t>
+        <w:t>Khi kết hợp các phân vùng của nhiều biến vào một kịch bản kiểm thử, sai lầm phổ biến nhất là đưa nhiều giá trị lỗi vào cùng một test case. Điều này dẫn đến Fault Masking (Hiện tượng lỗi che khuất lỗi) — tức là nếu Email sai, hệ thống báo lỗi Email và dừng lại ngay, ta sẽ không thể biết logic kiểm tra Password có hoạt động hay không.</w:t>
       </w:r>
-      <w:proofErr w:type="gramStart"/>
+    </w:p>
+    <w:p>
+      <w:pPr>
+        <w:rPr>
+          <w:rFonts w:ascii="Arial" w:hAnsi="Arial" w:cs="Arial"/>
+          <w:sz w:val="20"/>
+          <w:szCs w:val="20"/>
+        </w:rPr>
+      </w:pPr>
       <w:r>
         <w:rPr>
           <w:rFonts w:ascii="Arial" w:hAnsi="Arial" w:cs="Arial"/>
           <w:sz w:val="20"/>
           <w:szCs w:val="20"/>
         </w:rPr>
-        <w:t>lỗi)_</w:t>
+        <w:t>- Quy tắc giải quyết:</w:t>
       </w:r>
-      <w:proofErr w:type="gramEnd"/>
+    </w:p>
+    <w:p>
+      <w:pPr>
+        <w:rPr>
+          <w:rFonts w:ascii="Arial" w:hAnsi="Arial" w:cs="Arial"/>
+          <w:sz w:val="20"/>
+          <w:szCs w:val="20"/>
+        </w:rPr>
+      </w:pPr>
       <w:r>
         <w:rPr>
           <w:rFonts w:ascii="Arial" w:hAnsi="Arial" w:cs="Arial"/>
           <w:sz w:val="20"/>
           <w:szCs w:val="20"/>
         </w:rPr>
-        <w:t>_ — tức là nếu Email sai, hệ thống báo lỗi Email và dừng lại ngay, ta sẽ không thể biết logic kiểm tra Password có hoạt động hay không.</w:t>
-      </w:r>
-    </w:p>
-    <w:p>
-      <w:pPr>
-        <w:rPr>
-          <w:rFonts w:ascii="Arial" w:hAnsi="Arial" w:cs="Arial"/>
-          <w:sz w:val="20"/>
-          <w:szCs w:val="20"/>
-        </w:rPr>
-      </w:pPr>
-      <w:r>
-        <w:rPr>
-          <w:rFonts w:ascii="Arial" w:hAnsi="Arial" w:cs="Arial"/>
-          <w:sz w:val="20"/>
-          <w:szCs w:val="20"/>
-        </w:rPr>
-        <w:t xml:space="preserve">- __Quy tắc giải </w:t>
-      </w:r>
-      <w:proofErr w:type="gramStart"/>
-      <w:r>
-        <w:rPr>
-          <w:rFonts w:ascii="Arial" w:hAnsi="Arial" w:cs="Arial"/>
-          <w:sz w:val="20"/>
-          <w:szCs w:val="20"/>
-        </w:rPr>
-        <w:t>quyết:_</w:t>
-      </w:r>
-      <w:proofErr w:type="gramEnd"/>
-      <w:r>
-        <w:rPr>
-          <w:rFonts w:ascii="Arial" w:hAnsi="Arial" w:cs="Arial"/>
-          <w:sz w:val="20"/>
-          <w:szCs w:val="20"/>
-        </w:rPr>
-        <w:t>_</w:t>
-      </w:r>
-    </w:p>
-    <w:p>
-      <w:pPr>
-        <w:rPr>
-          <w:rFonts w:ascii="Arial" w:hAnsi="Arial" w:cs="Arial"/>
-          <w:sz w:val="20"/>
-          <w:szCs w:val="20"/>
-        </w:rPr>
-      </w:pPr>
-      <w:r>
-        <w:rPr>
-          <w:rFonts w:ascii="Arial" w:hAnsi="Arial" w:cs="Arial"/>
-          <w:sz w:val="20"/>
-          <w:szCs w:val="20"/>
-        </w:rPr>
-        <w:t xml:space="preserve">  - __Test Case hợp </w:t>
-      </w:r>
-      <w:proofErr w:type="gramStart"/>
-      <w:r>
-        <w:rPr>
-          <w:rFonts w:ascii="Arial" w:hAnsi="Arial" w:cs="Arial"/>
-          <w:sz w:val="20"/>
-          <w:szCs w:val="20"/>
-        </w:rPr>
-        <w:t>lệ:_</w:t>
-      </w:r>
-      <w:proofErr w:type="gramEnd"/>
-      <w:r>
-        <w:rPr>
-          <w:rFonts w:ascii="Arial" w:hAnsi="Arial" w:cs="Arial"/>
-          <w:sz w:val="20"/>
-          <w:szCs w:val="20"/>
-        </w:rPr>
-        <w:t>_ Kết hợp các phân vùng hợp lệ của __tất cả__ các biế</w:t>
+        <w:t xml:space="preserve">  - Test Case hợp lệ: Kết hợp các phân vùng hợp lệ của tất cả các biế</w:t>
       </w:r>
       <w:r>
         <w:rPr>
@@ -2693,25 +2603,7 @@
           <w:sz w:val="20"/>
           <w:szCs w:val="20"/>
         </w:rPr>
-        <w:t xml:space="preserve">  - __Test Case không hợp </w:t>
-      </w:r>
-      <w:proofErr w:type="gramStart"/>
-      <w:r>
-        <w:rPr>
-          <w:rFonts w:ascii="Arial" w:hAnsi="Arial" w:cs="Arial"/>
-          <w:sz w:val="20"/>
-          <w:szCs w:val="20"/>
-        </w:rPr>
-        <w:t>lệ:_</w:t>
-      </w:r>
-      <w:proofErr w:type="gramEnd"/>
-      <w:r>
-        <w:rPr>
-          <w:rFonts w:ascii="Arial" w:hAnsi="Arial" w:cs="Arial"/>
-          <w:sz w:val="20"/>
-          <w:szCs w:val="20"/>
-        </w:rPr>
-        <w:t>_ Tại mỗi thời điểm, __chỉ cho phép DUY NHẤT 1 biến mang giá trị Invalid__, toàn bộ các biến còn lại phải giữ ở giá trị Valid chuẩn (Baseline Values</w:t>
+        <w:t xml:space="preserve">  - Test Case không hợp lệ: Tại mỗi thời điểm, chỉ cho phép DUY NHẤT 1 biến mang giá trị Invalid, toàn bộ các biến còn lại phải giữ ở giá trị Valid chuẩn (Baseline Values</w:t>
       </w:r>
     </w:p>
     <w:p>
@@ -2808,12 +2700,12 @@
         <w:tblLook w:val="04A0" w:firstRow="1" w:lastRow="0" w:firstColumn="1" w:lastColumn="0" w:noHBand="0" w:noVBand="1"/>
       </w:tblPr>
       <w:tblGrid>
-        <w:gridCol w:w="1423"/>
-        <w:gridCol w:w="1450"/>
+        <w:gridCol w:w="1424"/>
+        <w:gridCol w:w="1451"/>
+        <w:gridCol w:w="1393"/>
+        <w:gridCol w:w="1829"/>
         <w:gridCol w:w="1397"/>
-        <w:gridCol w:w="1829"/>
-        <w:gridCol w:w="1396"/>
-        <w:gridCol w:w="1361"/>
+        <w:gridCol w:w="1362"/>
       </w:tblGrid>
       <w:tr>
         <w:tc>
@@ -3021,7 +2913,7 @@
                 <w:sz w:val="16"/>
                 <w:szCs w:val="16"/>
               </w:rPr>
-              <w:t>$Min - 1$ (7 ký tự)</w:t>
+              <w:t>Min - 1 (7 ký tự)</w:t>
             </w:r>
           </w:p>
         </w:tc>
@@ -3161,7 +3053,7 @@
                 <w:sz w:val="16"/>
                 <w:szCs w:val="16"/>
               </w:rPr>
-              <w:t>$Min$ (8 ký tự)</w:t>
+              <w:t>Min (8 ký tự)</w:t>
             </w:r>
           </w:p>
         </w:tc>
@@ -3301,7 +3193,7 @@
                 <w:sz w:val="16"/>
                 <w:szCs w:val="16"/>
               </w:rPr>
-              <w:t>$Min + 1$ (9 ký tự)</w:t>
+              <w:t>Min + 1 (9 ký tự)</w:t>
             </w:r>
           </w:p>
         </w:tc>
@@ -3441,7 +3333,7 @@
                 <w:sz w:val="16"/>
                 <w:szCs w:val="16"/>
               </w:rPr>
-              <w:t>$Max - 1$ (254 ký tự)</w:t>
+              <w:t>Max - 1 (254 ký tự)</w:t>
             </w:r>
           </w:p>
         </w:tc>
@@ -3581,7 +3473,7 @@
                 <w:sz w:val="16"/>
                 <w:szCs w:val="16"/>
               </w:rPr>
-              <w:t>$Max$ (255 ký tự)</w:t>
+              <w:t>Max (255 ký tự)</w:t>
             </w:r>
           </w:p>
         </w:tc>
@@ -3721,7 +3613,7 @@
                 <w:sz w:val="16"/>
                 <w:szCs w:val="16"/>
               </w:rPr>
-              <w:t>$Max + 1$ (256 ký tự)</w:t>
+              <w:t>Max + 1 (256 ký tự)</w:t>
             </w:r>
           </w:p>
         </w:tc>
@@ -3767,7 +3659,147 @@
                 <w:sz w:val="16"/>
                 <w:szCs w:val="16"/>
               </w:rPr>
-              <w:t xml:space="preserve">Hệ thống từ chối hoặc cắt chuỗi, báo lỗi: "Mật khẩu không được </w:t>
+              <w:t>Hệ thống từ chối hoặc cắt chuỗi, báo lỗi: "Mật khẩu không được vượt quá 255 ký tự".</w:t>
+            </w:r>
+          </w:p>
+        </w:tc>
+        <w:tc>
+          <w:tcPr>
+            <w:tcW w:w="1442" w:type="dxa"/>
+            <w:vAlign w:val="center"/>
+          </w:tcPr>
+          <w:p>
+            <w:pPr>
+              <w:rPr>
+                <w:rFonts w:ascii="Arial" w:hAnsi="Arial" w:cs="Arial"/>
+                <w:sz w:val="16"/>
+                <w:szCs w:val="16"/>
+              </w:rPr>
+            </w:pPr>
+            <w:r>
+              <w:rPr>
+                <w:rFonts w:ascii="Arial" w:hAnsi="Arial" w:cs="Arial"/>
+                <w:sz w:val="16"/>
+                <w:szCs w:val="16"/>
+              </w:rPr>
+              <w:t>Invalid</w:t>
+            </w:r>
+          </w:p>
+        </w:tc>
+      </w:tr>
+      <w:tr>
+        <w:tc>
+          <w:tcPr>
+            <w:tcW w:w="1461" w:type="dxa"/>
+            <w:vAlign w:val="center"/>
+          </w:tcPr>
+          <w:p>
+            <w:pPr>
+              <w:rPr>
+                <w:rFonts w:ascii="Arial" w:hAnsi="Arial" w:cs="Arial"/>
+                <w:sz w:val="16"/>
+                <w:szCs w:val="16"/>
+              </w:rPr>
+            </w:pPr>
+            <w:r>
+              <w:rPr>
+                <w:rFonts w:ascii="Arial" w:hAnsi="Arial" w:cs="Arial"/>
+                <w:sz w:val="16"/>
+                <w:szCs w:val="16"/>
+              </w:rPr>
+              <w:t>TC_BVA_07</w:t>
+            </w:r>
+          </w:p>
+        </w:tc>
+        <w:tc>
+          <w:tcPr>
+            <w:tcW w:w="1515" w:type="dxa"/>
+            <w:vAlign w:val="center"/>
+          </w:tcPr>
+          <w:p>
+            <w:pPr>
+              <w:rPr>
+                <w:rFonts w:ascii="Arial" w:hAnsi="Arial" w:cs="Arial"/>
+                <w:sz w:val="16"/>
+                <w:szCs w:val="16"/>
+              </w:rPr>
+            </w:pPr>
+            <w:r>
+              <w:rPr>
+                <w:rFonts w:ascii="Arial" w:hAnsi="Arial" w:cs="Arial"/>
+                <w:sz w:val="16"/>
+                <w:szCs w:val="16"/>
+              </w:rPr>
+              <w:t>password</w:t>
+            </w:r>
+          </w:p>
+        </w:tc>
+        <w:tc>
+          <w:tcPr>
+            <w:tcW w:w="1451" w:type="dxa"/>
+            <w:vAlign w:val="center"/>
+          </w:tcPr>
+          <w:p>
+            <w:pPr>
+              <w:rPr>
+                <w:rFonts w:ascii="Arial" w:hAnsi="Arial" w:cs="Arial"/>
+                <w:sz w:val="16"/>
+                <w:szCs w:val="16"/>
+              </w:rPr>
+            </w:pPr>
+            <w:r>
+              <w:rPr>
+                <w:rFonts w:ascii="Arial" w:hAnsi="Arial" w:cs="Arial"/>
+                <w:sz w:val="16"/>
+                <w:szCs w:val="16"/>
+              </w:rPr>
+              <w:t>Chữ hoa = 0 (Min-1)</w:t>
+            </w:r>
+          </w:p>
+        </w:tc>
+        <w:tc>
+          <w:tcPr>
+            <w:tcW w:w="1535" w:type="dxa"/>
+            <w:vAlign w:val="center"/>
+          </w:tcPr>
+          <w:p>
+            <w:pPr>
+              <w:rPr>
+                <w:rFonts w:ascii="Arial" w:hAnsi="Arial" w:cs="Arial"/>
+                <w:sz w:val="16"/>
+                <w:szCs w:val="16"/>
+              </w:rPr>
+            </w:pPr>
+            <w:r>
+              <w:rPr>
+                <w:rFonts w:ascii="Arial" w:hAnsi="Arial" w:cs="Arial"/>
+                <w:sz w:val="16"/>
+                <w:szCs w:val="16"/>
+              </w:rPr>
+              <w:t>password123! (0 chữ hoa)</w:t>
+            </w:r>
+          </w:p>
+        </w:tc>
+        <w:tc>
+          <w:tcPr>
+            <w:tcW w:w="1452" w:type="dxa"/>
+            <w:vAlign w:val="center"/>
+          </w:tcPr>
+          <w:p>
+            <w:pPr>
+              <w:rPr>
+                <w:rFonts w:ascii="Arial" w:hAnsi="Arial" w:cs="Arial"/>
+                <w:sz w:val="16"/>
+                <w:szCs w:val="16"/>
+              </w:rPr>
+            </w:pPr>
+            <w:r>
+              <w:rPr>
+                <w:rFonts w:ascii="Arial" w:hAnsi="Arial" w:cs="Arial"/>
+                <w:sz w:val="16"/>
+                <w:szCs w:val="16"/>
+              </w:rPr>
+              <w:t xml:space="preserve">Hệ thống từ chối, báo </w:t>
             </w:r>
             <w:r>
               <w:rPr>
@@ -3776,7 +3808,7 @@
                 <w:szCs w:val="16"/>
               </w:rPr>
               <w:lastRenderedPageBreak/>
-              <w:t>vượt quá 255 ký tự".</w:t>
+              <w:t>lỗi: "Mật khẩu phải chứa ít nhất 1 chữ in hoa".</w:t>
             </w:r>
           </w:p>
         </w:tc>
@@ -3826,7 +3858,7 @@
                 <w:szCs w:val="16"/>
               </w:rPr>
               <w:lastRenderedPageBreak/>
-              <w:t>TC_BVA_07</w:t>
+              <w:t>TC_BVA_08</w:t>
             </w:r>
           </w:p>
         </w:tc>
@@ -3872,7 +3904,7 @@
                 <w:sz w:val="16"/>
                 <w:szCs w:val="16"/>
               </w:rPr>
-              <w:t>Chữ hoa = 0 ($Min-1$)</w:t>
+              <w:t>Chữ hoa = 1 (Min)</w:t>
             </w:r>
           </w:p>
         </w:tc>
@@ -3895,7 +3927,7 @@
                 <w:sz w:val="16"/>
                 <w:szCs w:val="16"/>
               </w:rPr>
-              <w:t>password123! (0 chữ hoa)</w:t>
+              <w:t>Password123! (Đúng 1 chữ hoa 'P')</w:t>
             </w:r>
           </w:p>
         </w:tc>
@@ -3918,7 +3950,7 @@
                 <w:sz w:val="16"/>
                 <w:szCs w:val="16"/>
               </w:rPr>
-              <w:t>Hệ thống từ chối, báo lỗi: "Mật khẩu phải chứa ít nhất 1 chữ in hoa".</w:t>
+              <w:t>Hệ thống chấp nhận, đăng ký tài khoản thành công.</w:t>
             </w:r>
           </w:p>
         </w:tc>
@@ -3941,7 +3973,7 @@
                 <w:sz w:val="16"/>
                 <w:szCs w:val="16"/>
               </w:rPr>
-              <w:t>Invalid</w:t>
+              <w:t>Valid</w:t>
             </w:r>
           </w:p>
         </w:tc>
@@ -3966,7 +3998,7 @@
                 <w:sz w:val="16"/>
                 <w:szCs w:val="16"/>
               </w:rPr>
-              <w:t>TC_BVA_08</w:t>
+              <w:t>TC_BVA_09</w:t>
             </w:r>
           </w:p>
         </w:tc>
@@ -4012,7 +4044,7 @@
                 <w:sz w:val="16"/>
                 <w:szCs w:val="16"/>
               </w:rPr>
-              <w:t>Chữ hoa = 1 ($Min$)</w:t>
+              <w:t>Chữ hoa = 2 (Min+1)</w:t>
             </w:r>
           </w:p>
         </w:tc>
@@ -4035,7 +4067,7 @@
                 <w:sz w:val="16"/>
                 <w:szCs w:val="16"/>
               </w:rPr>
-              <w:t>Password123! (Đúng 1 chữ hoa 'P')</w:t>
+              <w:t>PASsword123! (Có 2 chữ hoa 'P', 'A')</w:t>
             </w:r>
           </w:p>
         </w:tc>
@@ -4106,7 +4138,7 @@
                 <w:sz w:val="16"/>
                 <w:szCs w:val="16"/>
               </w:rPr>
-              <w:t>TC_BVA_09</w:t>
+              <w:t>TC_BVA_10</w:t>
             </w:r>
           </w:p>
         </w:tc>
@@ -4152,7 +4184,7 @@
                 <w:sz w:val="16"/>
                 <w:szCs w:val="16"/>
               </w:rPr>
-              <w:t>Chữ hoa = 2 ($Min+1$)</w:t>
+              <w:t>Chữ thường = 0 (Min-1)</w:t>
             </w:r>
           </w:p>
         </w:tc>
@@ -4175,7 +4207,7 @@
                 <w:sz w:val="16"/>
                 <w:szCs w:val="16"/>
               </w:rPr>
-              <w:t>PASsword123! (Có 2 chữ hoa 'P', 'A')</w:t>
+              <w:t>PASS1234! (0 chữ thường)</w:t>
             </w:r>
           </w:p>
         </w:tc>
@@ -4198,7 +4230,7 @@
                 <w:sz w:val="16"/>
                 <w:szCs w:val="16"/>
               </w:rPr>
-              <w:t>Hệ thống chấp nhận, đăng ký tài khoản thành công.</w:t>
+              <w:t>Hệ thống từ chối, báo lỗi: "Mật khẩu phải chứa ít nhất 1 chữ in thường".</w:t>
             </w:r>
           </w:p>
         </w:tc>
@@ -4221,7 +4253,7 @@
                 <w:sz w:val="16"/>
                 <w:szCs w:val="16"/>
               </w:rPr>
-              <w:t>Valid</w:t>
+              <w:t>Invalid</w:t>
             </w:r>
           </w:p>
         </w:tc>
@@ -4246,7 +4278,7 @@
                 <w:sz w:val="16"/>
                 <w:szCs w:val="16"/>
               </w:rPr>
-              <w:t>TC_BVA_10</w:t>
+              <w:t>TC_BVA_11</w:t>
             </w:r>
           </w:p>
         </w:tc>
@@ -4292,7 +4324,7 @@
                 <w:sz w:val="16"/>
                 <w:szCs w:val="16"/>
               </w:rPr>
-              <w:t>Chữ thường = 0 ($Min-1$)</w:t>
+              <w:t>Chữ thường = 1 (Min)</w:t>
             </w:r>
           </w:p>
         </w:tc>
@@ -4315,7 +4347,7 @@
                 <w:sz w:val="16"/>
                 <w:szCs w:val="16"/>
               </w:rPr>
-              <w:t>PASS1234! (0 chữ thường)</w:t>
+              <w:t>PASSa123! (Đúng 1 chữ thường 'a')</w:t>
             </w:r>
           </w:p>
         </w:tc>
@@ -4338,7 +4370,7 @@
                 <w:sz w:val="16"/>
                 <w:szCs w:val="16"/>
               </w:rPr>
-              <w:t>Hệ thống từ chối, báo lỗi: "Mật khẩu phải chứa ít nhất 1 chữ in thường".</w:t>
+              <w:t>Hệ thống chấp nhận, đăng ký tài khoản thành công.</w:t>
             </w:r>
           </w:p>
         </w:tc>
@@ -4361,7 +4393,7 @@
                 <w:sz w:val="16"/>
                 <w:szCs w:val="16"/>
               </w:rPr>
-              <w:t>Invalid</w:t>
+              <w:t>Valid</w:t>
             </w:r>
           </w:p>
         </w:tc>
@@ -4386,7 +4418,7 @@
                 <w:sz w:val="16"/>
                 <w:szCs w:val="16"/>
               </w:rPr>
-              <w:t>TC_BVA_11</w:t>
+              <w:t>TC_BVA_12</w:t>
             </w:r>
           </w:p>
         </w:tc>
@@ -4432,7 +4464,7 @@
                 <w:sz w:val="16"/>
                 <w:szCs w:val="16"/>
               </w:rPr>
-              <w:t>Chữ thường = 1 ($Min$)</w:t>
+              <w:t>Chữ số = 0 (Min-1)</w:t>
             </w:r>
           </w:p>
         </w:tc>
@@ -4455,7 +4487,7 @@
                 <w:sz w:val="16"/>
                 <w:szCs w:val="16"/>
               </w:rPr>
-              <w:t>PASSa123! (Đúng 1 chữ thường 'a')</w:t>
+              <w:t>Password@! (0 chữ số)</w:t>
             </w:r>
           </w:p>
         </w:tc>
@@ -4478,7 +4510,7 @@
                 <w:sz w:val="16"/>
                 <w:szCs w:val="16"/>
               </w:rPr>
-              <w:t>Hệ thống chấp nhận, đăng ký tài khoản thành công.</w:t>
+              <w:t>Hệ thống từ chối, báo lỗi: "Mật khẩu phải chứa ít nhất 1 chữ số".</w:t>
             </w:r>
           </w:p>
         </w:tc>
@@ -4501,7 +4533,7 @@
                 <w:sz w:val="16"/>
                 <w:szCs w:val="16"/>
               </w:rPr>
-              <w:t>Valid</w:t>
+              <w:t>Invalid</w:t>
             </w:r>
           </w:p>
         </w:tc>
@@ -4526,7 +4558,7 @@
                 <w:sz w:val="16"/>
                 <w:szCs w:val="16"/>
               </w:rPr>
-              <w:t>TC_BVA_12</w:t>
+              <w:t>TC_BVA_13</w:t>
             </w:r>
           </w:p>
         </w:tc>
@@ -4572,7 +4604,7 @@
                 <w:sz w:val="16"/>
                 <w:szCs w:val="16"/>
               </w:rPr>
-              <w:t>Chữ số = 0 ($Min-1$)</w:t>
+              <w:t>Chữ số = 1 (Min)</w:t>
             </w:r>
           </w:p>
         </w:tc>
@@ -4595,7 +4627,7 @@
                 <w:sz w:val="16"/>
                 <w:szCs w:val="16"/>
               </w:rPr>
-              <w:t>Password@! (0 chữ số)</w:t>
+              <w:t>Password@1 (Đúng 1 chữ số '1')</w:t>
             </w:r>
           </w:p>
         </w:tc>
@@ -4618,7 +4650,7 @@
                 <w:sz w:val="16"/>
                 <w:szCs w:val="16"/>
               </w:rPr>
-              <w:t>Hệ thống từ chối, báo lỗi: "Mật khẩu phải chứa ít nhất 1 chữ số".</w:t>
+              <w:t>Hệ thống chấp nhận, đăng ký tài khoản thành công.</w:t>
             </w:r>
           </w:p>
         </w:tc>
@@ -4641,7 +4673,7 @@
                 <w:sz w:val="16"/>
                 <w:szCs w:val="16"/>
               </w:rPr>
-              <w:t>Invalid</w:t>
+              <w:t>Valid</w:t>
             </w:r>
           </w:p>
         </w:tc>
@@ -4666,7 +4698,7 @@
                 <w:sz w:val="16"/>
                 <w:szCs w:val="16"/>
               </w:rPr>
-              <w:t>TC_BVA_13</w:t>
+              <w:t>TC_BVA_14</w:t>
             </w:r>
           </w:p>
         </w:tc>
@@ -4712,7 +4744,7 @@
                 <w:sz w:val="16"/>
                 <w:szCs w:val="16"/>
               </w:rPr>
-              <w:t>Chữ số = 1 ($Min$)</w:t>
+              <w:t>Ký tự đặc biệt = 0 (Min-1)</w:t>
             </w:r>
           </w:p>
         </w:tc>
@@ -4735,7 +4767,7 @@
                 <w:sz w:val="16"/>
                 <w:szCs w:val="16"/>
               </w:rPr>
-              <w:t>Password@1 (Đúng 1 chữ số '1')</w:t>
+              <w:t>Password123 (0 ký tự đặc biệt)</w:t>
             </w:r>
           </w:p>
         </w:tc>
@@ -4758,7 +4790,7 @@
                 <w:sz w:val="16"/>
                 <w:szCs w:val="16"/>
               </w:rPr>
-              <w:t>Hệ thống chấp nhận, đăng ký tài khoản thành công.</w:t>
+              <w:t>Hệ thống từ chối, báo lỗi: *"Mật khẩu phải chứa ít nhất 1 ký tự đặc biệt (@, , !, %, , ?, &amp;)".</w:t>
             </w:r>
           </w:p>
         </w:tc>
@@ -4781,7 +4813,7 @@
                 <w:sz w:val="16"/>
                 <w:szCs w:val="16"/>
               </w:rPr>
-              <w:t>Valid</w:t>
+              <w:t>Invalid</w:t>
             </w:r>
           </w:p>
         </w:tc>
@@ -4806,7 +4838,7 @@
                 <w:sz w:val="16"/>
                 <w:szCs w:val="16"/>
               </w:rPr>
-              <w:t>TC_BVA_14</w:t>
+              <w:t>TC_BVA_15</w:t>
             </w:r>
           </w:p>
         </w:tc>
@@ -4852,7 +4884,7 @@
                 <w:sz w:val="16"/>
                 <w:szCs w:val="16"/>
               </w:rPr>
-              <w:t>Ký tự đặc biệt = 0 ($Min-1$)</w:t>
+              <w:t>Ký tự đặc biệt = 1 (Min)</w:t>
             </w:r>
           </w:p>
         </w:tc>
@@ -4875,7 +4907,7 @@
                 <w:sz w:val="16"/>
                 <w:szCs w:val="16"/>
               </w:rPr>
-              <w:t>Password123 (0 ký tự đặc biệt)</w:t>
+              <w:t>Password123@ (Đúng 1 ký tự '@')</w:t>
             </w:r>
           </w:p>
         </w:tc>
@@ -4898,7 +4930,7 @@
                 <w:sz w:val="16"/>
                 <w:szCs w:val="16"/>
               </w:rPr>
-              <w:t>Hệ thống từ chối, báo lỗi: *"Mật khẩu phải chứa ít nhất 1 ký tự đặc biệt (@, $, !, %, , ?, &amp;)".</w:t>
+              <w:t>Hệ thống chấp nhận, đăng ký tài khoản thành công.</w:t>
             </w:r>
           </w:p>
         </w:tc>
@@ -4921,7 +4953,7 @@
                 <w:sz w:val="16"/>
                 <w:szCs w:val="16"/>
               </w:rPr>
-              <w:t>Invalid</w:t>
+              <w:t>Valid</w:t>
             </w:r>
           </w:p>
         </w:tc>
@@ -4946,7 +4978,7 @@
                 <w:sz w:val="16"/>
                 <w:szCs w:val="16"/>
               </w:rPr>
-              <w:t>TC_BVA_15</w:t>
+              <w:t>TC_BVA_16</w:t>
             </w:r>
           </w:p>
         </w:tc>
@@ -4969,7 +5001,7 @@
                 <w:sz w:val="16"/>
                 <w:szCs w:val="16"/>
               </w:rPr>
-              <w:t>password</w:t>
+              <w:t>name</w:t>
             </w:r>
           </w:p>
         </w:tc>
@@ -4992,7 +5024,7 @@
                 <w:sz w:val="16"/>
                 <w:szCs w:val="16"/>
               </w:rPr>
-              <w:t>Ký tự đặc biệt = 1 ($Min$)</w:t>
+              <w:t>Min - 1 (0 ký tự)</w:t>
             </w:r>
           </w:p>
         </w:tc>
@@ -5015,7 +5047,7 @@
                 <w:sz w:val="16"/>
                 <w:szCs w:val="16"/>
               </w:rPr>
-              <w:t>Password123@ (Đúng 1 ký tự '@')</w:t>
+              <w:t>"" (Chuỗi rỗng)</w:t>
             </w:r>
           </w:p>
         </w:tc>
@@ -5038,7 +5070,7 @@
                 <w:sz w:val="16"/>
                 <w:szCs w:val="16"/>
               </w:rPr>
-              <w:t>Hệ thống chấp nhận, đăng ký tài khoản thành công.</w:t>
+              <w:t>Hệ thống từ chối, báo lỗi: "Họ Tên không được để trống".</w:t>
             </w:r>
           </w:p>
         </w:tc>
@@ -5061,7 +5093,7 @@
                 <w:sz w:val="16"/>
                 <w:szCs w:val="16"/>
               </w:rPr>
-              <w:t>Valid</w:t>
+              <w:t>Invalid</w:t>
             </w:r>
           </w:p>
         </w:tc>
@@ -5086,7 +5118,7 @@
                 <w:sz w:val="16"/>
                 <w:szCs w:val="16"/>
               </w:rPr>
-              <w:t>TC_BVA_16</w:t>
+              <w:t>TC_BVA_17</w:t>
             </w:r>
           </w:p>
         </w:tc>
@@ -5132,7 +5164,7 @@
                 <w:sz w:val="16"/>
                 <w:szCs w:val="16"/>
               </w:rPr>
-              <w:t>$Min - 1$ (0 ký tự)</w:t>
+              <w:t>Min (1 ký tự)</w:t>
             </w:r>
           </w:p>
         </w:tc>
@@ -5155,7 +5187,7 @@
                 <w:sz w:val="16"/>
                 <w:szCs w:val="16"/>
               </w:rPr>
-              <w:t>"" (Chuỗi rỗng)</w:t>
+              <w:t>"A"</w:t>
             </w:r>
           </w:p>
         </w:tc>
@@ -5178,7 +5210,7 @@
                 <w:sz w:val="16"/>
                 <w:szCs w:val="16"/>
               </w:rPr>
-              <w:t>Hệ thống từ chối, báo lỗi: "Họ Tên không được để trống".</w:t>
+              <w:t>Hệ thống chấp nhận, đăng ký tài khoản thành công.</w:t>
             </w:r>
           </w:p>
         </w:tc>
@@ -5201,7 +5233,7 @@
                 <w:sz w:val="16"/>
                 <w:szCs w:val="16"/>
               </w:rPr>
-              <w:t>Invalid</w:t>
+              <w:t>Valid</w:t>
             </w:r>
           </w:p>
         </w:tc>
@@ -5226,7 +5258,7 @@
                 <w:sz w:val="16"/>
                 <w:szCs w:val="16"/>
               </w:rPr>
-              <w:t>TC_BVA_17</w:t>
+              <w:t>TC_BVA_18</w:t>
             </w:r>
           </w:p>
         </w:tc>
@@ -5272,7 +5304,7 @@
                 <w:sz w:val="16"/>
                 <w:szCs w:val="16"/>
               </w:rPr>
-              <w:t>$Min$ (1 ký tự)</w:t>
+              <w:t>Min + 1 (2 ký tự)</w:t>
             </w:r>
           </w:p>
         </w:tc>
@@ -5295,7 +5327,7 @@
                 <w:sz w:val="16"/>
                 <w:szCs w:val="16"/>
               </w:rPr>
-              <w:t>"A"</w:t>
+              <w:t>"An"</w:t>
             </w:r>
           </w:p>
         </w:tc>
@@ -5366,7 +5398,7 @@
                 <w:sz w:val="16"/>
                 <w:szCs w:val="16"/>
               </w:rPr>
-              <w:t>TC_BVA_18</w:t>
+              <w:t>TC_BVA_19</w:t>
             </w:r>
           </w:p>
         </w:tc>
@@ -5412,7 +5444,7 @@
                 <w:sz w:val="16"/>
                 <w:szCs w:val="16"/>
               </w:rPr>
-              <w:t>$Min + 1$ (2 ký tự)</w:t>
+              <w:t>Max - 1 (254 ký tự)</w:t>
             </w:r>
           </w:p>
         </w:tc>
@@ -5435,7 +5467,7 @@
                 <w:sz w:val="16"/>
                 <w:szCs w:val="16"/>
               </w:rPr>
-              <w:t>"An"</w:t>
+              <w:t>Chuỗi 254 ký tự "A"*254</w:t>
             </w:r>
           </w:p>
         </w:tc>
@@ -5506,7 +5538,7 @@
                 <w:sz w:val="16"/>
                 <w:szCs w:val="16"/>
               </w:rPr>
-              <w:t>TC_BVA_19</w:t>
+              <w:t>TC_BVA_20</w:t>
             </w:r>
           </w:p>
         </w:tc>
@@ -5552,7 +5584,7 @@
                 <w:sz w:val="16"/>
                 <w:szCs w:val="16"/>
               </w:rPr>
-              <w:t>$Max - 1$ (254 ký tự)</w:t>
+              <w:t>Max (255 ký tự)</w:t>
             </w:r>
           </w:p>
         </w:tc>
@@ -5575,7 +5607,7 @@
                 <w:sz w:val="16"/>
                 <w:szCs w:val="16"/>
               </w:rPr>
-              <w:t>Chuỗi 254 ký tự "A"*254</w:t>
+              <w:t>Chuỗi 255 ký tự "A"*255</w:t>
             </w:r>
           </w:p>
         </w:tc>
@@ -5646,7 +5678,7 @@
                 <w:sz w:val="16"/>
                 <w:szCs w:val="16"/>
               </w:rPr>
-              <w:t>TC_BVA_20</w:t>
+              <w:t>TC_BVA_21</w:t>
             </w:r>
           </w:p>
         </w:tc>
@@ -5692,7 +5724,7 @@
                 <w:sz w:val="16"/>
                 <w:szCs w:val="16"/>
               </w:rPr>
-              <w:t>$Max$ (255 ký tự)</w:t>
+              <w:t>Max + 1 (256 ký tự)</w:t>
             </w:r>
           </w:p>
         </w:tc>
@@ -5715,7 +5747,7 @@
                 <w:sz w:val="16"/>
                 <w:szCs w:val="16"/>
               </w:rPr>
-              <w:t>Chuỗi 255 ký tự "A"*255</w:t>
+              <w:t>Chuỗi 256 ký tự "A"*256</w:t>
             </w:r>
           </w:p>
         </w:tc>
@@ -5738,7 +5770,7 @@
                 <w:sz w:val="16"/>
                 <w:szCs w:val="16"/>
               </w:rPr>
-              <w:t>Hệ thống chấp nhận, đăng ký tài khoản thành công.</w:t>
+              <w:t>Hệ thống từ chối, báo lỗi: "Họ Tên không được vượt quá 255 ký tự".</w:t>
             </w:r>
           </w:p>
         </w:tc>
@@ -5761,7 +5793,7 @@
                 <w:sz w:val="16"/>
                 <w:szCs w:val="16"/>
               </w:rPr>
-              <w:t>Valid</w:t>
+              <w:t>Invalid</w:t>
             </w:r>
           </w:p>
         </w:tc>
@@ -5786,7 +5818,8 @@
                 <w:sz w:val="16"/>
                 <w:szCs w:val="16"/>
               </w:rPr>
-              <w:t>TC_BVA_21</w:t>
+              <w:lastRenderedPageBreak/>
+              <w:t>TC_BVA_22</w:t>
             </w:r>
           </w:p>
         </w:tc>
@@ -5809,7 +5842,7 @@
                 <w:sz w:val="16"/>
                 <w:szCs w:val="16"/>
               </w:rPr>
-              <w:t>name</w:t>
+              <w:t>email</w:t>
             </w:r>
           </w:p>
         </w:tc>
@@ -5832,7 +5865,7 @@
                 <w:sz w:val="16"/>
                 <w:szCs w:val="16"/>
               </w:rPr>
-              <w:t>$Max + 1$ (256 ký tự)</w:t>
+              <w:t>Local-part: Max (64 ký tự)</w:t>
             </w:r>
           </w:p>
         </w:tc>
@@ -5855,7 +5888,7 @@
                 <w:sz w:val="16"/>
                 <w:szCs w:val="16"/>
               </w:rPr>
-              <w:t>Chuỗi 256 ký tự "A"*256</w:t>
+              <w:t>Local 64 ký tự: "a"*64 + "@eshop.com"</w:t>
             </w:r>
           </w:p>
         </w:tc>
@@ -5878,16 +5911,7 @@
                 <w:sz w:val="16"/>
                 <w:szCs w:val="16"/>
               </w:rPr>
-              <w:t xml:space="preserve">Hệ thống từ chối, báo </w:t>
-            </w:r>
-            <w:r>
-              <w:rPr>
-                <w:rFonts w:ascii="Arial" w:hAnsi="Arial" w:cs="Arial"/>
-                <w:sz w:val="16"/>
-                <w:szCs w:val="16"/>
-              </w:rPr>
-              <w:lastRenderedPageBreak/>
-              <w:t>lỗi: "Họ Tên không được vượt quá 255 ký tự".</w:t>
+              <w:t>Hệ thống chấp nhận, đăng ký tài khoản thành công.</w:t>
             </w:r>
           </w:p>
         </w:tc>
@@ -5910,8 +5934,7 @@
                 <w:sz w:val="16"/>
                 <w:szCs w:val="16"/>
               </w:rPr>
-              <w:lastRenderedPageBreak/>
-              <w:t>Invalid</w:t>
+              <w:t>Valid</w:t>
             </w:r>
           </w:p>
         </w:tc>
@@ -5936,8 +5959,7 @@
                 <w:sz w:val="16"/>
                 <w:szCs w:val="16"/>
               </w:rPr>
-              <w:lastRenderedPageBreak/>
-              <w:t>TC_BVA_22</w:t>
+              <w:t>TC_BVA_23</w:t>
             </w:r>
           </w:p>
         </w:tc>
@@ -5983,7 +6005,7 @@
                 <w:sz w:val="16"/>
                 <w:szCs w:val="16"/>
               </w:rPr>
-              <w:t>Local-part: $Max$ (64 ký tự)</w:t>
+              <w:t>Local-part: Max+1 (65 ký tự)</w:t>
             </w:r>
           </w:p>
         </w:tc>
@@ -6006,7 +6028,7 @@
                 <w:sz w:val="16"/>
                 <w:szCs w:val="16"/>
               </w:rPr>
-              <w:t>Local 64 ký tự: "a"*64 + "@eshop.com"</w:t>
+              <w:t>Local 65 ký tự: "a"*65 + "@eshop.com"</w:t>
             </w:r>
           </w:p>
         </w:tc>
@@ -6029,7 +6051,7 @@
                 <w:sz w:val="16"/>
                 <w:szCs w:val="16"/>
               </w:rPr>
-              <w:t>Hệ thống chấp nhận, đăng ký tài khoản thành công.</w:t>
+              <w:t>Hệ thống từ chối, báo lỗi: "Email vượt quá độ dài quy định".</w:t>
             </w:r>
           </w:p>
         </w:tc>
@@ -6052,7 +6074,7 @@
                 <w:sz w:val="16"/>
                 <w:szCs w:val="16"/>
               </w:rPr>
-              <w:t>Valid</w:t>
+              <w:t>Invalid</w:t>
             </w:r>
           </w:p>
         </w:tc>
@@ -6077,7 +6099,7 @@
                 <w:sz w:val="16"/>
                 <w:szCs w:val="16"/>
               </w:rPr>
-              <w:t>TC_BVA_23</w:t>
+              <w:t>TC_BVA_24</w:t>
             </w:r>
           </w:p>
         </w:tc>
@@ -6123,7 +6145,7 @@
                 <w:sz w:val="16"/>
                 <w:szCs w:val="16"/>
               </w:rPr>
-              <w:t>Local-part: $Max+1$ (65 ký tự)</w:t>
+              <w:t>Tổng email: Max (254 ký tự)</w:t>
             </w:r>
           </w:p>
         </w:tc>
@@ -6146,7 +6168,7 @@
                 <w:sz w:val="16"/>
                 <w:szCs w:val="16"/>
               </w:rPr>
-              <w:t>Local 65 ký tự: "a"*65 + "@eshop.com"</w:t>
+              <w:t>Chuỗi 254 ký tự hợp lệ dạng: "a"*64 + "@" + "b"*185 + ".com"</w:t>
             </w:r>
           </w:p>
         </w:tc>
@@ -6169,7 +6191,7 @@
                 <w:sz w:val="16"/>
                 <w:szCs w:val="16"/>
               </w:rPr>
-              <w:t>Hệ thống từ chối, báo lỗi: "Email vượt quá độ dài quy định".</w:t>
+              <w:t>Hệ thống chấp nhận, đăng ký tài khoản thành công.</w:t>
             </w:r>
           </w:p>
         </w:tc>
@@ -6192,7 +6214,7 @@
                 <w:sz w:val="16"/>
                 <w:szCs w:val="16"/>
               </w:rPr>
-              <w:t>Invalid</w:t>
+              <w:t>Valid</w:t>
             </w:r>
           </w:p>
         </w:tc>
@@ -6217,7 +6239,7 @@
                 <w:sz w:val="16"/>
                 <w:szCs w:val="16"/>
               </w:rPr>
-              <w:t>TC_BVA_24</w:t>
+              <w:t>TC_BVA_25</w:t>
             </w:r>
           </w:p>
         </w:tc>
@@ -6263,147 +6285,7 @@
                 <w:sz w:val="16"/>
                 <w:szCs w:val="16"/>
               </w:rPr>
-              <w:t>Tổng email: $Max$ (254 ký tự)</w:t>
-            </w:r>
-          </w:p>
-        </w:tc>
-        <w:tc>
-          <w:tcPr>
-            <w:tcW w:w="1535" w:type="dxa"/>
-            <w:vAlign w:val="center"/>
-          </w:tcPr>
-          <w:p>
-            <w:pPr>
-              <w:rPr>
-                <w:rFonts w:ascii="Arial" w:hAnsi="Arial" w:cs="Arial"/>
-                <w:sz w:val="16"/>
-                <w:szCs w:val="16"/>
-              </w:rPr>
-            </w:pPr>
-            <w:r>
-              <w:rPr>
-                <w:rFonts w:ascii="Arial" w:hAnsi="Arial" w:cs="Arial"/>
-                <w:sz w:val="16"/>
-                <w:szCs w:val="16"/>
-              </w:rPr>
-              <w:t>Chuỗi 254 ký tự hợp lệ dạng: "a"*64 + "@" + "b"*185 + ".com"</w:t>
-            </w:r>
-          </w:p>
-        </w:tc>
-        <w:tc>
-          <w:tcPr>
-            <w:tcW w:w="1452" w:type="dxa"/>
-            <w:vAlign w:val="center"/>
-          </w:tcPr>
-          <w:p>
-            <w:pPr>
-              <w:rPr>
-                <w:rFonts w:ascii="Arial" w:hAnsi="Arial" w:cs="Arial"/>
-                <w:sz w:val="16"/>
-                <w:szCs w:val="16"/>
-              </w:rPr>
-            </w:pPr>
-            <w:r>
-              <w:rPr>
-                <w:rFonts w:ascii="Arial" w:hAnsi="Arial" w:cs="Arial"/>
-                <w:sz w:val="16"/>
-                <w:szCs w:val="16"/>
-              </w:rPr>
-              <w:t>Hệ thống chấp nhận, đăng ký tài khoản thành công.</w:t>
-            </w:r>
-          </w:p>
-        </w:tc>
-        <w:tc>
-          <w:tcPr>
-            <w:tcW w:w="1442" w:type="dxa"/>
-            <w:vAlign w:val="center"/>
-          </w:tcPr>
-          <w:p>
-            <w:pPr>
-              <w:rPr>
-                <w:rFonts w:ascii="Arial" w:hAnsi="Arial" w:cs="Arial"/>
-                <w:sz w:val="16"/>
-                <w:szCs w:val="16"/>
-              </w:rPr>
-            </w:pPr>
-            <w:r>
-              <w:rPr>
-                <w:rFonts w:ascii="Arial" w:hAnsi="Arial" w:cs="Arial"/>
-                <w:sz w:val="16"/>
-                <w:szCs w:val="16"/>
-              </w:rPr>
-              <w:t>Valid</w:t>
-            </w:r>
-          </w:p>
-        </w:tc>
-      </w:tr>
-      <w:tr>
-        <w:tc>
-          <w:tcPr>
-            <w:tcW w:w="1461" w:type="dxa"/>
-            <w:vAlign w:val="center"/>
-          </w:tcPr>
-          <w:p>
-            <w:pPr>
-              <w:rPr>
-                <w:rFonts w:ascii="Arial" w:hAnsi="Arial" w:cs="Arial"/>
-                <w:sz w:val="16"/>
-                <w:szCs w:val="16"/>
-              </w:rPr>
-            </w:pPr>
-            <w:r>
-              <w:rPr>
-                <w:rFonts w:ascii="Arial" w:hAnsi="Arial" w:cs="Arial"/>
-                <w:sz w:val="16"/>
-                <w:szCs w:val="16"/>
-              </w:rPr>
-              <w:t>TC_BVA_25</w:t>
-            </w:r>
-          </w:p>
-        </w:tc>
-        <w:tc>
-          <w:tcPr>
-            <w:tcW w:w="1515" w:type="dxa"/>
-            <w:vAlign w:val="center"/>
-          </w:tcPr>
-          <w:p>
-            <w:pPr>
-              <w:rPr>
-                <w:rFonts w:ascii="Arial" w:hAnsi="Arial" w:cs="Arial"/>
-                <w:sz w:val="16"/>
-                <w:szCs w:val="16"/>
-              </w:rPr>
-            </w:pPr>
-            <w:r>
-              <w:rPr>
-                <w:rFonts w:ascii="Arial" w:hAnsi="Arial" w:cs="Arial"/>
-                <w:sz w:val="16"/>
-                <w:szCs w:val="16"/>
-              </w:rPr>
-              <w:t>email</w:t>
-            </w:r>
-          </w:p>
-        </w:tc>
-        <w:tc>
-          <w:tcPr>
-            <w:tcW w:w="1451" w:type="dxa"/>
-            <w:vAlign w:val="center"/>
-          </w:tcPr>
-          <w:p>
-            <w:pPr>
-              <w:rPr>
-                <w:rFonts w:ascii="Arial" w:hAnsi="Arial" w:cs="Arial"/>
-                <w:sz w:val="16"/>
-                <w:szCs w:val="16"/>
-              </w:rPr>
-            </w:pPr>
-            <w:r>
-              <w:rPr>
-                <w:rFonts w:ascii="Arial" w:hAnsi="Arial" w:cs="Arial"/>
-                <w:sz w:val="16"/>
-                <w:szCs w:val="16"/>
-              </w:rPr>
-              <w:t>Tổng email: $Max+1$ (255 ký tự)</w:t>
+              <w:t>Tổng email: Max+1 (255 ký tự)</w:t>
             </w:r>
           </w:p>
         </w:tc>
@@ -6721,7 +6603,6 @@
         <w:rPr>
           <w:rFonts w:ascii="Arial" w:hAnsi="Arial" w:cs="Arial"/>
         </w:rPr>
-        <w:lastRenderedPageBreak/>
         <w:t xml:space="preserve">   - Ví dụ với điều kiện Length &gt;= 8</w:t>
       </w:r>
     </w:p>
@@ -6750,6 +6631,7 @@
         <w:rPr>
           <w:rFonts w:ascii="Arial" w:hAnsi="Arial" w:cs="Arial"/>
         </w:rPr>
+        <w:lastRenderedPageBreak/>
         <w:t xml:space="preserve">     - Off-point = `7` (Invalid)</w:t>
       </w:r>
     </w:p>
@@ -6792,35 +6674,21 @@
         <w:rPr>
           <w:rFonts w:ascii="Arial" w:hAnsi="Arial" w:cs="Arial"/>
         </w:rPr>
-        <w:t>2. __Chuẩn 3-value BVA (Phương pháp chúng ta đã áp dụng</w:t>
+        <w:t>2. Chuẩn 3-value BVA (Phương pháp chúng ta đã áp dụng):</w:t>
       </w:r>
-      <w:proofErr w:type="gramStart"/>
+    </w:p>
+    <w:p>
+      <w:pPr>
+        <w:ind w:left="360"/>
+        <w:rPr>
+          <w:rFonts w:ascii="Arial" w:hAnsi="Arial" w:cs="Arial"/>
+        </w:rPr>
+      </w:pPr>
       <w:r>
         <w:rPr>
           <w:rFonts w:ascii="Arial" w:hAnsi="Arial" w:cs="Arial"/>
         </w:rPr>
-        <w:t>):_</w:t>
-      </w:r>
-      <w:proofErr w:type="gramEnd"/>
-      <w:r>
-        <w:rPr>
-          <w:rFonts w:ascii="Arial" w:hAnsi="Arial" w:cs="Arial"/>
-        </w:rPr>
-        <w:t>_</w:t>
-      </w:r>
-    </w:p>
-    <w:p>
-      <w:pPr>
-        <w:ind w:left="360"/>
-        <w:rPr>
-          <w:rFonts w:ascii="Arial" w:hAnsi="Arial" w:cs="Arial"/>
-        </w:rPr>
-      </w:pPr>
-      <w:r>
-        <w:rPr>
-          <w:rFonts w:ascii="Arial" w:hAnsi="Arial" w:cs="Arial"/>
-        </w:rPr>
-        <w:t xml:space="preserve">   - Gồm 3 điểm liên tiếp: __$Boundary - 1$, $Boundary$, $Boundary + 1$__.</w:t>
+        <w:t xml:space="preserve">   - Gồm 3 điểm liên tiếp: Boundary - 1, Boundary, Boundary + 1.</w:t>
       </w:r>
     </w:p>
     <w:p>
@@ -7317,7 +7185,6 @@
                 <w:sz w:val="16"/>
                 <w:szCs w:val="16"/>
               </w:rPr>
-              <w:lastRenderedPageBreak/>
               <w:t>TC-FR07-001</w:t>
             </w:r>
           </w:p>
@@ -7390,7 +7257,16 @@
                 <w:sz w:val="16"/>
                 <w:szCs w:val="16"/>
               </w:rPr>
-              <w:t>Giỏ hàng hiển thị 1 dòng: Sản phẩm="iPhone 15 Pro Max", Đơn giá=30.000.000₫, Số lượng=1, Thành tiền=30.000.000₫. Nhãn Tổng cộng = 30.000.000₫</w:t>
+              <w:t xml:space="preserve">Giỏ hàng hiển thị 1 dòng: Sản phẩm="iPhone 15 Pro Max", Đơn giá=30.000.000₫, Số lượng=1, Thành </w:t>
+            </w:r>
+            <w:r>
+              <w:rPr>
+                <w:rFonts w:ascii="Arial" w:hAnsi="Arial" w:cs="Arial"/>
+                <w:sz w:val="16"/>
+                <w:szCs w:val="16"/>
+              </w:rPr>
+              <w:lastRenderedPageBreak/>
+              <w:t>tiền=30.000.000₫. Nhãn Tổng cộng = 30.000.000₫</w:t>
             </w:r>
           </w:p>
         </w:tc>
@@ -7414,6 +7290,7 @@
                 <w:sz w:val="16"/>
                 <w:szCs w:val="16"/>
               </w:rPr>
+              <w:lastRenderedPageBreak/>
               <w:t>Valid</w:t>
             </w:r>
           </w:p>
@@ -7443,6 +7320,7 @@
                 <w:sz w:val="16"/>
                 <w:szCs w:val="16"/>
               </w:rPr>
+              <w:lastRenderedPageBreak/>
               <w:t>TC-FR07-002</w:t>
             </w:r>
           </w:p>
@@ -9443,7 +9321,6 @@
                 <w:sz w:val="16"/>
                 <w:szCs w:val="16"/>
               </w:rPr>
-              <w:lastRenderedPageBreak/>
               <w:t>TC-FR07-018</w:t>
             </w:r>
           </w:p>
@@ -9569,6 +9446,7 @@
                 <w:sz w:val="16"/>
                 <w:szCs w:val="16"/>
               </w:rPr>
+              <w:lastRenderedPageBreak/>
               <w:t>TC-FR07-019</w:t>
             </w:r>
           </w:p>
@@ -10994,7 +10872,6 @@
           <w:sz w:val="20"/>
           <w:szCs w:val="20"/>
         </w:rPr>
-        <w:lastRenderedPageBreak/>
         <w:t>Base case (TC-FR07-001):</w:t>
       </w:r>
       <w:r>
@@ -11022,7 +10899,6 @@
           <w:szCs w:val="20"/>
         </w:rPr>
       </w:pPr>
-      <w:bookmarkStart w:id="1" w:name="_GoBack"/>
       <w:r>
         <w:rPr>
           <w:rFonts w:ascii="Arial" w:eastAsia="Times New Roman" w:hAnsi="Arial" w:cs="Arial"/>
@@ -11043,7 +10919,6 @@
         </w:rPr>
         <w:t> Mỗi test case tiếp theo thay 1 biến thành Invalid/Edge (ví dụ: TC-007 đổi quantity=0, TC-016 đổi sang chưa đăng nhập)</w:t>
       </w:r>
-      <w:bookmarkEnd w:id="1"/>
     </w:p>
     <w:p>
       <w:pPr>
@@ -11069,6 +10944,7 @@
           <w:sz w:val="20"/>
           <w:szCs w:val="20"/>
         </w:rPr>
+        <w:lastRenderedPageBreak/>
         <w:t>Bổ sung:</w:t>
       </w:r>
       <w:r>
@@ -11083,12 +10959,2167 @@
     </w:p>
     <w:p>
       <w:pPr>
+        <w:pStyle w:val="Heading5"/>
+        <w:rPr>
+          <w:rFonts w:ascii="Arial" w:hAnsi="Arial" w:cs="Arial"/>
+          <w:b/>
+          <w:i/>
+        </w:rPr>
+      </w:pPr>
+      <w:r>
+        <w:rPr>
+          <w:rFonts w:ascii="Arial" w:hAnsi="Arial" w:cs="Arial"/>
+          <w:b/>
+          <w:i/>
+        </w:rPr>
+        <w:t>Boundary Value Analysis</w:t>
+      </w:r>
+    </w:p>
+    <w:p>
+      <w:pPr>
+        <w:pStyle w:val="ListParagraph"/>
+        <w:numPr>
+          <w:ilvl w:val="0"/>
+          <w:numId w:val="50"/>
+        </w:numPr>
+        <w:rPr>
+          <w:rFonts w:ascii="Arial" w:hAnsi="Arial" w:cs="Arial"/>
+          <w:sz w:val="20"/>
+          <w:szCs w:val="20"/>
+        </w:rPr>
+      </w:pPr>
+      <w:r>
+        <w:rPr>
+          <w:rFonts w:ascii="Arial" w:hAnsi="Arial" w:cs="Arial"/>
+          <w:b/>
+          <w:sz w:val="20"/>
+          <w:szCs w:val="20"/>
+        </w:rPr>
+        <w:t>Test cases</w:t>
+      </w:r>
+    </w:p>
+    <w:tbl>
+      <w:tblPr>
+        <w:tblStyle w:val="TableGrid"/>
+        <w:tblW w:w="0" w:type="auto"/>
+        <w:tblInd w:w="360" w:type="dxa"/>
+        <w:tblLook w:val="04A0" w:firstRow="1" w:lastRow="0" w:firstColumn="1" w:lastColumn="0" w:noHBand="0" w:noVBand="1"/>
+      </w:tblPr>
+      <w:tblGrid>
+        <w:gridCol w:w="1416"/>
+        <w:gridCol w:w="1416"/>
+        <w:gridCol w:w="1416"/>
+        <w:gridCol w:w="1416"/>
+        <w:gridCol w:w="1416"/>
+        <w:gridCol w:w="1416"/>
+      </w:tblGrid>
+      <w:tr>
+        <w:tc>
+          <w:tcPr>
+            <w:tcW w:w="1416" w:type="dxa"/>
+            <w:vAlign w:val="center"/>
+          </w:tcPr>
+          <w:p>
+            <w:pPr>
+              <w:rPr>
+                <w:rFonts w:ascii="Arial" w:hAnsi="Arial" w:cs="Arial"/>
+                <w:sz w:val="16"/>
+                <w:szCs w:val="16"/>
+              </w:rPr>
+            </w:pPr>
+            <w:r>
+              <w:rPr>
+                <w:rFonts w:ascii="Arial" w:hAnsi="Arial" w:cs="Arial"/>
+                <w:sz w:val="16"/>
+                <w:szCs w:val="16"/>
+              </w:rPr>
+              <w:t>Test ID</w:t>
+            </w:r>
+          </w:p>
+        </w:tc>
+        <w:tc>
+          <w:tcPr>
+            <w:tcW w:w="1416" w:type="dxa"/>
+            <w:vAlign w:val="center"/>
+          </w:tcPr>
+          <w:p>
+            <w:pPr>
+              <w:rPr>
+                <w:rFonts w:ascii="Arial" w:hAnsi="Arial" w:cs="Arial"/>
+                <w:sz w:val="16"/>
+                <w:szCs w:val="16"/>
+              </w:rPr>
+            </w:pPr>
+            <w:r>
+              <w:rPr>
+                <w:rFonts w:ascii="Arial" w:hAnsi="Arial" w:cs="Arial"/>
+                <w:sz w:val="16"/>
+                <w:szCs w:val="16"/>
+              </w:rPr>
+              <w:t>Field / Biến</w:t>
+            </w:r>
+          </w:p>
+        </w:tc>
+        <w:tc>
+          <w:tcPr>
+            <w:tcW w:w="1416" w:type="dxa"/>
+            <w:vAlign w:val="center"/>
+          </w:tcPr>
+          <w:p>
+            <w:pPr>
+              <w:rPr>
+                <w:rFonts w:ascii="Arial" w:hAnsi="Arial" w:cs="Arial"/>
+                <w:sz w:val="16"/>
+                <w:szCs w:val="16"/>
+              </w:rPr>
+            </w:pPr>
+            <w:r>
+              <w:rPr>
+                <w:rFonts w:ascii="Arial" w:hAnsi="Arial" w:cs="Arial"/>
+                <w:sz w:val="16"/>
+                <w:szCs w:val="16"/>
+              </w:rPr>
+              <w:t>Mốc biên (Boundary Point)</w:t>
+            </w:r>
+          </w:p>
+        </w:tc>
+        <w:tc>
+          <w:tcPr>
+            <w:tcW w:w="1416" w:type="dxa"/>
+            <w:vAlign w:val="center"/>
+          </w:tcPr>
+          <w:p>
+            <w:pPr>
+              <w:rPr>
+                <w:rFonts w:ascii="Arial" w:hAnsi="Arial" w:cs="Arial"/>
+                <w:sz w:val="16"/>
+                <w:szCs w:val="16"/>
+              </w:rPr>
+            </w:pPr>
+            <w:r>
+              <w:rPr>
+                <w:rFonts w:ascii="Arial" w:hAnsi="Arial" w:cs="Arial"/>
+                <w:sz w:val="16"/>
+                <w:szCs w:val="16"/>
+              </w:rPr>
+              <w:t>Giá trị kiểm thử (Input Data)</w:t>
+            </w:r>
+          </w:p>
+        </w:tc>
+        <w:tc>
+          <w:tcPr>
+            <w:tcW w:w="1416" w:type="dxa"/>
+            <w:vAlign w:val="center"/>
+          </w:tcPr>
+          <w:p>
+            <w:pPr>
+              <w:rPr>
+                <w:rFonts w:ascii="Arial" w:hAnsi="Arial" w:cs="Arial"/>
+                <w:sz w:val="16"/>
+                <w:szCs w:val="16"/>
+              </w:rPr>
+            </w:pPr>
+            <w:r>
+              <w:rPr>
+                <w:rFonts w:ascii="Arial" w:hAnsi="Arial" w:cs="Arial"/>
+                <w:sz w:val="16"/>
+                <w:szCs w:val="16"/>
+              </w:rPr>
+              <w:t>Kết quả mong đợi (Expected Result)</w:t>
+            </w:r>
+          </w:p>
+        </w:tc>
+        <w:tc>
+          <w:tcPr>
+            <w:tcW w:w="1416" w:type="dxa"/>
+            <w:vAlign w:val="center"/>
+          </w:tcPr>
+          <w:p>
+            <w:pPr>
+              <w:rPr>
+                <w:rFonts w:ascii="Arial" w:hAnsi="Arial" w:cs="Arial"/>
+                <w:sz w:val="16"/>
+                <w:szCs w:val="16"/>
+              </w:rPr>
+            </w:pPr>
+            <w:r>
+              <w:rPr>
+                <w:rFonts w:ascii="Arial" w:hAnsi="Arial" w:cs="Arial"/>
+                <w:sz w:val="16"/>
+                <w:szCs w:val="16"/>
+              </w:rPr>
+              <w:t>Loại (Type)</w:t>
+            </w:r>
+          </w:p>
+        </w:tc>
+      </w:tr>
+      <w:tr>
+        <w:tc>
+          <w:tcPr>
+            <w:tcW w:w="1416" w:type="dxa"/>
+            <w:vAlign w:val="center"/>
+          </w:tcPr>
+          <w:p>
+            <w:pPr>
+              <w:rPr>
+                <w:rFonts w:ascii="Arial" w:hAnsi="Arial" w:cs="Arial"/>
+                <w:sz w:val="16"/>
+                <w:szCs w:val="16"/>
+              </w:rPr>
+            </w:pPr>
+            <w:r>
+              <w:rPr>
+                <w:rFonts w:ascii="Arial" w:hAnsi="Arial" w:cs="Arial"/>
+                <w:sz w:val="16"/>
+                <w:szCs w:val="16"/>
+              </w:rPr>
+              <w:t>BVA-01</w:t>
+            </w:r>
+          </w:p>
+        </w:tc>
+        <w:tc>
+          <w:tcPr>
+            <w:tcW w:w="1416" w:type="dxa"/>
+            <w:vAlign w:val="center"/>
+          </w:tcPr>
+          <w:p>
+            <w:pPr>
+              <w:rPr>
+                <w:rFonts w:ascii="Arial" w:hAnsi="Arial" w:cs="Arial"/>
+                <w:sz w:val="16"/>
+                <w:szCs w:val="16"/>
+              </w:rPr>
+            </w:pPr>
+            <w:r>
+              <w:rPr>
+                <w:rFonts w:ascii="Arial" w:hAnsi="Arial" w:cs="Arial"/>
+                <w:sz w:val="16"/>
+                <w:szCs w:val="16"/>
+              </w:rPr>
+              <w:t>quantity</w:t>
+            </w:r>
+          </w:p>
+        </w:tc>
+        <w:tc>
+          <w:tcPr>
+            <w:tcW w:w="1416" w:type="dxa"/>
+            <w:vAlign w:val="center"/>
+          </w:tcPr>
+          <w:p>
+            <w:pPr>
+              <w:rPr>
+                <w:rFonts w:ascii="Arial" w:hAnsi="Arial" w:cs="Arial"/>
+                <w:sz w:val="16"/>
+                <w:szCs w:val="16"/>
+              </w:rPr>
+            </w:pPr>
+            <w:r>
+              <w:rPr>
+                <w:rFonts w:ascii="Arial" w:hAnsi="Arial" w:cs="Arial"/>
+                <w:sz w:val="16"/>
+                <w:szCs w:val="16"/>
+              </w:rPr>
+              <w:t>Min</w:t>
+            </w:r>
+            <w:r>
+              <w:rPr>
+                <w:rFonts w:ascii="Arial" w:hAnsi="Arial" w:cs="Arial"/>
+                <w:sz w:val="16"/>
+                <w:szCs w:val="16"/>
+              </w:rPr>
+              <w:t xml:space="preserve"> - 1 (0)</w:t>
+            </w:r>
+          </w:p>
+        </w:tc>
+        <w:tc>
+          <w:tcPr>
+            <w:tcW w:w="1416" w:type="dxa"/>
+            <w:vAlign w:val="center"/>
+          </w:tcPr>
+          <w:p>
+            <w:pPr>
+              <w:rPr>
+                <w:rFonts w:ascii="Arial" w:hAnsi="Arial" w:cs="Arial"/>
+                <w:sz w:val="16"/>
+                <w:szCs w:val="16"/>
+              </w:rPr>
+            </w:pPr>
+            <w:r>
+              <w:rPr>
+                <w:rFonts w:ascii="Arial" w:hAnsi="Arial" w:cs="Arial"/>
+                <w:sz w:val="16"/>
+                <w:szCs w:val="16"/>
+              </w:rPr>
+              <w:t>Thêm sản phẩm "iPhone 15" với quantity = 0</w:t>
+            </w:r>
+          </w:p>
+        </w:tc>
+        <w:tc>
+          <w:tcPr>
+            <w:tcW w:w="1416" w:type="dxa"/>
+            <w:vAlign w:val="center"/>
+          </w:tcPr>
+          <w:p>
+            <w:pPr>
+              <w:rPr>
+                <w:rFonts w:ascii="Arial" w:hAnsi="Arial" w:cs="Arial"/>
+                <w:sz w:val="16"/>
+                <w:szCs w:val="16"/>
+              </w:rPr>
+            </w:pPr>
+            <w:r>
+              <w:rPr>
+                <w:rFonts w:ascii="Arial" w:hAnsi="Arial" w:cs="Arial"/>
+                <w:sz w:val="16"/>
+                <w:szCs w:val="16"/>
+              </w:rPr>
+              <w:t>Hệ thống từ chối hoặc tự điều chỉnh về 1, không thêm sản phẩm với số lượng 0.</w:t>
+            </w:r>
+          </w:p>
+        </w:tc>
+        <w:tc>
+          <w:tcPr>
+            <w:tcW w:w="1416" w:type="dxa"/>
+            <w:vAlign w:val="center"/>
+          </w:tcPr>
+          <w:p>
+            <w:pPr>
+              <w:rPr>
+                <w:rFonts w:ascii="Arial" w:hAnsi="Arial" w:cs="Arial"/>
+                <w:sz w:val="16"/>
+                <w:szCs w:val="16"/>
+              </w:rPr>
+            </w:pPr>
+            <w:r>
+              <w:rPr>
+                <w:rFonts w:ascii="Arial" w:hAnsi="Arial" w:cs="Arial"/>
+                <w:sz w:val="16"/>
+                <w:szCs w:val="16"/>
+              </w:rPr>
+              <w:t>Invalid</w:t>
+            </w:r>
+          </w:p>
+        </w:tc>
+      </w:tr>
+      <w:tr>
+        <w:tc>
+          <w:tcPr>
+            <w:tcW w:w="1416" w:type="dxa"/>
+            <w:vAlign w:val="center"/>
+          </w:tcPr>
+          <w:p>
+            <w:pPr>
+              <w:rPr>
+                <w:rFonts w:ascii="Arial" w:hAnsi="Arial" w:cs="Arial"/>
+                <w:sz w:val="16"/>
+                <w:szCs w:val="16"/>
+              </w:rPr>
+            </w:pPr>
+            <w:r>
+              <w:rPr>
+                <w:rFonts w:ascii="Arial" w:hAnsi="Arial" w:cs="Arial"/>
+                <w:sz w:val="16"/>
+                <w:szCs w:val="16"/>
+              </w:rPr>
+              <w:t>BVA-02</w:t>
+            </w:r>
+          </w:p>
+        </w:tc>
+        <w:tc>
+          <w:tcPr>
+            <w:tcW w:w="1416" w:type="dxa"/>
+            <w:vAlign w:val="center"/>
+          </w:tcPr>
+          <w:p>
+            <w:pPr>
+              <w:rPr>
+                <w:rFonts w:ascii="Arial" w:hAnsi="Arial" w:cs="Arial"/>
+                <w:sz w:val="16"/>
+                <w:szCs w:val="16"/>
+              </w:rPr>
+            </w:pPr>
+            <w:r>
+              <w:rPr>
+                <w:rFonts w:ascii="Arial" w:hAnsi="Arial" w:cs="Arial"/>
+                <w:sz w:val="16"/>
+                <w:szCs w:val="16"/>
+              </w:rPr>
+              <w:t>quantity</w:t>
+            </w:r>
+          </w:p>
+        </w:tc>
+        <w:tc>
+          <w:tcPr>
+            <w:tcW w:w="1416" w:type="dxa"/>
+            <w:vAlign w:val="center"/>
+          </w:tcPr>
+          <w:p>
+            <w:pPr>
+              <w:rPr>
+                <w:rFonts w:ascii="Arial" w:hAnsi="Arial" w:cs="Arial"/>
+                <w:sz w:val="16"/>
+                <w:szCs w:val="16"/>
+              </w:rPr>
+            </w:pPr>
+            <w:r>
+              <w:rPr>
+                <w:rFonts w:ascii="Arial" w:hAnsi="Arial" w:cs="Arial"/>
+                <w:sz w:val="16"/>
+                <w:szCs w:val="16"/>
+              </w:rPr>
+              <w:t>Min</w:t>
+            </w:r>
+            <w:r>
+              <w:rPr>
+                <w:rFonts w:ascii="Arial" w:hAnsi="Arial" w:cs="Arial"/>
+                <w:sz w:val="16"/>
+                <w:szCs w:val="16"/>
+              </w:rPr>
+              <w:t xml:space="preserve"> (1)</w:t>
+            </w:r>
+          </w:p>
+        </w:tc>
+        <w:tc>
+          <w:tcPr>
+            <w:tcW w:w="1416" w:type="dxa"/>
+            <w:vAlign w:val="center"/>
+          </w:tcPr>
+          <w:p>
+            <w:pPr>
+              <w:rPr>
+                <w:rFonts w:ascii="Arial" w:hAnsi="Arial" w:cs="Arial"/>
+                <w:sz w:val="16"/>
+                <w:szCs w:val="16"/>
+              </w:rPr>
+            </w:pPr>
+            <w:r>
+              <w:rPr>
+                <w:rFonts w:ascii="Arial" w:hAnsi="Arial" w:cs="Arial"/>
+                <w:sz w:val="16"/>
+                <w:szCs w:val="16"/>
+              </w:rPr>
+              <w:t>Thêm sản phẩm "iPhone 15" với quantity = 1</w:t>
+            </w:r>
+          </w:p>
+        </w:tc>
+        <w:tc>
+          <w:tcPr>
+            <w:tcW w:w="1416" w:type="dxa"/>
+            <w:vAlign w:val="center"/>
+          </w:tcPr>
+          <w:p>
+            <w:pPr>
+              <w:rPr>
+                <w:rFonts w:ascii="Arial" w:hAnsi="Arial" w:cs="Arial"/>
+                <w:sz w:val="16"/>
+                <w:szCs w:val="16"/>
+              </w:rPr>
+            </w:pPr>
+            <w:r>
+              <w:rPr>
+                <w:rFonts w:ascii="Arial" w:hAnsi="Arial" w:cs="Arial"/>
+                <w:sz w:val="16"/>
+                <w:szCs w:val="16"/>
+              </w:rPr>
+              <w:t>Thêm thành công vào giỏ, hiển thị đúng 1 sản phẩm, số lượng = 1.</w:t>
+            </w:r>
+          </w:p>
+        </w:tc>
+        <w:tc>
+          <w:tcPr>
+            <w:tcW w:w="1416" w:type="dxa"/>
+            <w:vAlign w:val="center"/>
+          </w:tcPr>
+          <w:p>
+            <w:pPr>
+              <w:rPr>
+                <w:rFonts w:ascii="Arial" w:hAnsi="Arial" w:cs="Arial"/>
+                <w:sz w:val="16"/>
+                <w:szCs w:val="16"/>
+              </w:rPr>
+            </w:pPr>
+            <w:r>
+              <w:rPr>
+                <w:rFonts w:ascii="Arial" w:hAnsi="Arial" w:cs="Arial"/>
+                <w:sz w:val="16"/>
+                <w:szCs w:val="16"/>
+              </w:rPr>
+              <w:t>Valid</w:t>
+            </w:r>
+          </w:p>
+        </w:tc>
+      </w:tr>
+      <w:tr>
+        <w:tc>
+          <w:tcPr>
+            <w:tcW w:w="1416" w:type="dxa"/>
+            <w:vAlign w:val="center"/>
+          </w:tcPr>
+          <w:p>
+            <w:pPr>
+              <w:rPr>
+                <w:rFonts w:ascii="Arial" w:hAnsi="Arial" w:cs="Arial"/>
+                <w:sz w:val="16"/>
+                <w:szCs w:val="16"/>
+              </w:rPr>
+            </w:pPr>
+            <w:r>
+              <w:rPr>
+                <w:rFonts w:ascii="Arial" w:hAnsi="Arial" w:cs="Arial"/>
+                <w:sz w:val="16"/>
+                <w:szCs w:val="16"/>
+              </w:rPr>
+              <w:t>BVA-03</w:t>
+            </w:r>
+          </w:p>
+        </w:tc>
+        <w:tc>
+          <w:tcPr>
+            <w:tcW w:w="1416" w:type="dxa"/>
+            <w:vAlign w:val="center"/>
+          </w:tcPr>
+          <w:p>
+            <w:pPr>
+              <w:rPr>
+                <w:rFonts w:ascii="Arial" w:hAnsi="Arial" w:cs="Arial"/>
+                <w:sz w:val="16"/>
+                <w:szCs w:val="16"/>
+              </w:rPr>
+            </w:pPr>
+            <w:r>
+              <w:rPr>
+                <w:rFonts w:ascii="Arial" w:hAnsi="Arial" w:cs="Arial"/>
+                <w:sz w:val="16"/>
+                <w:szCs w:val="16"/>
+              </w:rPr>
+              <w:t>quantity</w:t>
+            </w:r>
+          </w:p>
+        </w:tc>
+        <w:tc>
+          <w:tcPr>
+            <w:tcW w:w="1416" w:type="dxa"/>
+            <w:vAlign w:val="center"/>
+          </w:tcPr>
+          <w:p>
+            <w:pPr>
+              <w:rPr>
+                <w:rFonts w:ascii="Arial" w:hAnsi="Arial" w:cs="Arial"/>
+                <w:sz w:val="16"/>
+                <w:szCs w:val="16"/>
+              </w:rPr>
+            </w:pPr>
+            <w:r>
+              <w:rPr>
+                <w:rFonts w:ascii="Arial" w:hAnsi="Arial" w:cs="Arial"/>
+                <w:sz w:val="16"/>
+                <w:szCs w:val="16"/>
+              </w:rPr>
+              <w:t>Min</w:t>
+            </w:r>
+            <w:r>
+              <w:rPr>
+                <w:rFonts w:ascii="Arial" w:hAnsi="Arial" w:cs="Arial"/>
+                <w:sz w:val="16"/>
+                <w:szCs w:val="16"/>
+              </w:rPr>
+              <w:t xml:space="preserve"> + 1 (2)</w:t>
+            </w:r>
+          </w:p>
+        </w:tc>
+        <w:tc>
+          <w:tcPr>
+            <w:tcW w:w="1416" w:type="dxa"/>
+            <w:vAlign w:val="center"/>
+          </w:tcPr>
+          <w:p>
+            <w:pPr>
+              <w:rPr>
+                <w:rFonts w:ascii="Arial" w:hAnsi="Arial" w:cs="Arial"/>
+                <w:sz w:val="16"/>
+                <w:szCs w:val="16"/>
+              </w:rPr>
+            </w:pPr>
+            <w:r>
+              <w:rPr>
+                <w:rFonts w:ascii="Arial" w:hAnsi="Arial" w:cs="Arial"/>
+                <w:sz w:val="16"/>
+                <w:szCs w:val="16"/>
+              </w:rPr>
+              <w:t>Thêm sản phẩm "iPhone 15" với quantity = 2</w:t>
+            </w:r>
+          </w:p>
+        </w:tc>
+        <w:tc>
+          <w:tcPr>
+            <w:tcW w:w="1416" w:type="dxa"/>
+            <w:vAlign w:val="center"/>
+          </w:tcPr>
+          <w:p>
+            <w:pPr>
+              <w:rPr>
+                <w:rFonts w:ascii="Arial" w:hAnsi="Arial" w:cs="Arial"/>
+                <w:sz w:val="16"/>
+                <w:szCs w:val="16"/>
+              </w:rPr>
+            </w:pPr>
+            <w:r>
+              <w:rPr>
+                <w:rFonts w:ascii="Arial" w:hAnsi="Arial" w:cs="Arial"/>
+                <w:sz w:val="16"/>
+                <w:szCs w:val="16"/>
+              </w:rPr>
+              <w:t>Thêm thành công vào giỏ, hiển thị đúng 1 sản phẩm, số lượng = 2, thành tiền nhân đôi.</w:t>
+            </w:r>
+          </w:p>
+        </w:tc>
+        <w:tc>
+          <w:tcPr>
+            <w:tcW w:w="1416" w:type="dxa"/>
+            <w:vAlign w:val="center"/>
+          </w:tcPr>
+          <w:p>
+            <w:pPr>
+              <w:rPr>
+                <w:rFonts w:ascii="Arial" w:hAnsi="Arial" w:cs="Arial"/>
+                <w:sz w:val="16"/>
+                <w:szCs w:val="16"/>
+              </w:rPr>
+            </w:pPr>
+            <w:r>
+              <w:rPr>
+                <w:rFonts w:ascii="Arial" w:hAnsi="Arial" w:cs="Arial"/>
+                <w:sz w:val="16"/>
+                <w:szCs w:val="16"/>
+              </w:rPr>
+              <w:t>Valid</w:t>
+            </w:r>
+          </w:p>
+        </w:tc>
+      </w:tr>
+      <w:tr>
+        <w:tc>
+          <w:tcPr>
+            <w:tcW w:w="1416" w:type="dxa"/>
+            <w:vAlign w:val="center"/>
+          </w:tcPr>
+          <w:p>
+            <w:pPr>
+              <w:rPr>
+                <w:rFonts w:ascii="Arial" w:hAnsi="Arial" w:cs="Arial"/>
+                <w:sz w:val="16"/>
+                <w:szCs w:val="16"/>
+              </w:rPr>
+            </w:pPr>
+            <w:r>
+              <w:rPr>
+                <w:rFonts w:ascii="Arial" w:hAnsi="Arial" w:cs="Arial"/>
+                <w:sz w:val="16"/>
+                <w:szCs w:val="16"/>
+              </w:rPr>
+              <w:t>BVA-04</w:t>
+            </w:r>
+          </w:p>
+        </w:tc>
+        <w:tc>
+          <w:tcPr>
+            <w:tcW w:w="1416" w:type="dxa"/>
+            <w:vAlign w:val="center"/>
+          </w:tcPr>
+          <w:p>
+            <w:pPr>
+              <w:rPr>
+                <w:rFonts w:ascii="Arial" w:hAnsi="Arial" w:cs="Arial"/>
+                <w:sz w:val="16"/>
+                <w:szCs w:val="16"/>
+              </w:rPr>
+            </w:pPr>
+            <w:r>
+              <w:rPr>
+                <w:rFonts w:ascii="Arial" w:hAnsi="Arial" w:cs="Arial"/>
+                <w:sz w:val="16"/>
+                <w:szCs w:val="16"/>
+              </w:rPr>
+              <w:t>quantity</w:t>
+            </w:r>
+          </w:p>
+        </w:tc>
+        <w:tc>
+          <w:tcPr>
+            <w:tcW w:w="1416" w:type="dxa"/>
+            <w:vAlign w:val="center"/>
+          </w:tcPr>
+          <w:p>
+            <w:pPr>
+              <w:rPr>
+                <w:rFonts w:ascii="Arial" w:hAnsi="Arial" w:cs="Arial"/>
+                <w:sz w:val="16"/>
+                <w:szCs w:val="16"/>
+              </w:rPr>
+            </w:pPr>
+            <w:r>
+              <w:rPr>
+                <w:rFonts w:ascii="Arial" w:hAnsi="Arial" w:cs="Arial"/>
+                <w:sz w:val="16"/>
+                <w:szCs w:val="16"/>
+              </w:rPr>
+              <w:t>Giá trị âm ( -1 )</w:t>
+            </w:r>
+          </w:p>
+        </w:tc>
+        <w:tc>
+          <w:tcPr>
+            <w:tcW w:w="1416" w:type="dxa"/>
+            <w:vAlign w:val="center"/>
+          </w:tcPr>
+          <w:p>
+            <w:pPr>
+              <w:rPr>
+                <w:rFonts w:ascii="Arial" w:hAnsi="Arial" w:cs="Arial"/>
+                <w:sz w:val="16"/>
+                <w:szCs w:val="16"/>
+              </w:rPr>
+            </w:pPr>
+            <w:r>
+              <w:rPr>
+                <w:rFonts w:ascii="Arial" w:hAnsi="Arial" w:cs="Arial"/>
+                <w:sz w:val="16"/>
+                <w:szCs w:val="16"/>
+              </w:rPr>
+              <w:t>Thêm sản phẩm "iPhone 15" với quantity = -1</w:t>
+            </w:r>
+          </w:p>
+        </w:tc>
+        <w:tc>
+          <w:tcPr>
+            <w:tcW w:w="1416" w:type="dxa"/>
+            <w:vAlign w:val="center"/>
+          </w:tcPr>
+          <w:p>
+            <w:pPr>
+              <w:rPr>
+                <w:rFonts w:ascii="Arial" w:hAnsi="Arial" w:cs="Arial"/>
+                <w:sz w:val="16"/>
+                <w:szCs w:val="16"/>
+              </w:rPr>
+            </w:pPr>
+            <w:r>
+              <w:rPr>
+                <w:rFonts w:ascii="Arial" w:hAnsi="Arial" w:cs="Arial"/>
+                <w:sz w:val="16"/>
+                <w:szCs w:val="16"/>
+              </w:rPr>
+              <w:t>Hệ thống chặn, báo lỗi hoặc ép về 1. Không cho phép số lượng âm.</w:t>
+            </w:r>
+          </w:p>
+        </w:tc>
+        <w:tc>
+          <w:tcPr>
+            <w:tcW w:w="1416" w:type="dxa"/>
+            <w:vAlign w:val="center"/>
+          </w:tcPr>
+          <w:p>
+            <w:pPr>
+              <w:rPr>
+                <w:rFonts w:ascii="Arial" w:hAnsi="Arial" w:cs="Arial"/>
+                <w:sz w:val="16"/>
+                <w:szCs w:val="16"/>
+              </w:rPr>
+            </w:pPr>
+            <w:r>
+              <w:rPr>
+                <w:rFonts w:ascii="Arial" w:hAnsi="Arial" w:cs="Arial"/>
+                <w:sz w:val="16"/>
+                <w:szCs w:val="16"/>
+              </w:rPr>
+              <w:t>Invalid</w:t>
+            </w:r>
+          </w:p>
+        </w:tc>
+      </w:tr>
+      <w:tr>
+        <w:tc>
+          <w:tcPr>
+            <w:tcW w:w="1416" w:type="dxa"/>
+            <w:vAlign w:val="center"/>
+          </w:tcPr>
+          <w:p>
+            <w:pPr>
+              <w:rPr>
+                <w:rFonts w:ascii="Arial" w:hAnsi="Arial" w:cs="Arial"/>
+                <w:sz w:val="16"/>
+                <w:szCs w:val="16"/>
+              </w:rPr>
+            </w:pPr>
+            <w:r>
+              <w:rPr>
+                <w:rFonts w:ascii="Arial" w:hAnsi="Arial" w:cs="Arial"/>
+                <w:sz w:val="16"/>
+                <w:szCs w:val="16"/>
+              </w:rPr>
+              <w:t>BVA-05</w:t>
+            </w:r>
+          </w:p>
+        </w:tc>
+        <w:tc>
+          <w:tcPr>
+            <w:tcW w:w="1416" w:type="dxa"/>
+            <w:vAlign w:val="center"/>
+          </w:tcPr>
+          <w:p>
+            <w:pPr>
+              <w:rPr>
+                <w:rFonts w:ascii="Arial" w:hAnsi="Arial" w:cs="Arial"/>
+                <w:sz w:val="16"/>
+                <w:szCs w:val="16"/>
+              </w:rPr>
+            </w:pPr>
+            <w:r>
+              <w:rPr>
+                <w:rFonts w:ascii="Arial" w:hAnsi="Arial" w:cs="Arial"/>
+                <w:sz w:val="16"/>
+                <w:szCs w:val="16"/>
+              </w:rPr>
+              <w:t>quantity</w:t>
+            </w:r>
+          </w:p>
+        </w:tc>
+        <w:tc>
+          <w:tcPr>
+            <w:tcW w:w="1416" w:type="dxa"/>
+            <w:vAlign w:val="center"/>
+          </w:tcPr>
+          <w:p>
+            <w:pPr>
+              <w:rPr>
+                <w:rFonts w:ascii="Arial" w:hAnsi="Arial" w:cs="Arial"/>
+                <w:sz w:val="16"/>
+                <w:szCs w:val="16"/>
+              </w:rPr>
+            </w:pPr>
+            <w:r>
+              <w:rPr>
+                <w:rFonts w:ascii="Arial" w:hAnsi="Arial" w:cs="Arial"/>
+                <w:sz w:val="16"/>
+                <w:szCs w:val="16"/>
+              </w:rPr>
+              <w:t>Ký tự sát biên dưới (Thập phân)</w:t>
+            </w:r>
+          </w:p>
+        </w:tc>
+        <w:tc>
+          <w:tcPr>
+            <w:tcW w:w="1416" w:type="dxa"/>
+            <w:vAlign w:val="center"/>
+          </w:tcPr>
+          <w:p>
+            <w:pPr>
+              <w:rPr>
+                <w:rFonts w:ascii="Arial" w:hAnsi="Arial" w:cs="Arial"/>
+                <w:sz w:val="16"/>
+                <w:szCs w:val="16"/>
+              </w:rPr>
+            </w:pPr>
+            <w:r>
+              <w:rPr>
+                <w:rFonts w:ascii="Arial" w:hAnsi="Arial" w:cs="Arial"/>
+                <w:sz w:val="16"/>
+                <w:szCs w:val="16"/>
+              </w:rPr>
+              <w:t>Thêm sản phẩm "iPhone 15" với quantity = 0.5</w:t>
+            </w:r>
+          </w:p>
+        </w:tc>
+        <w:tc>
+          <w:tcPr>
+            <w:tcW w:w="1416" w:type="dxa"/>
+            <w:vAlign w:val="center"/>
+          </w:tcPr>
+          <w:p>
+            <w:pPr>
+              <w:rPr>
+                <w:rFonts w:ascii="Arial" w:hAnsi="Arial" w:cs="Arial"/>
+                <w:sz w:val="16"/>
+                <w:szCs w:val="16"/>
+              </w:rPr>
+            </w:pPr>
+            <w:r>
+              <w:rPr>
+                <w:rFonts w:ascii="Arial" w:hAnsi="Arial" w:cs="Arial"/>
+                <w:sz w:val="16"/>
+                <w:szCs w:val="16"/>
+              </w:rPr>
+              <w:t>Hệ thống ép kiểu (làm tròn) hoặc báo lỗi yêu cầu số nguyên dương.</w:t>
+            </w:r>
+          </w:p>
+        </w:tc>
+        <w:tc>
+          <w:tcPr>
+            <w:tcW w:w="1416" w:type="dxa"/>
+            <w:vAlign w:val="center"/>
+          </w:tcPr>
+          <w:p>
+            <w:pPr>
+              <w:rPr>
+                <w:rFonts w:ascii="Arial" w:hAnsi="Arial" w:cs="Arial"/>
+                <w:sz w:val="16"/>
+                <w:szCs w:val="16"/>
+              </w:rPr>
+            </w:pPr>
+            <w:r>
+              <w:rPr>
+                <w:rFonts w:ascii="Arial" w:hAnsi="Arial" w:cs="Arial"/>
+                <w:sz w:val="16"/>
+                <w:szCs w:val="16"/>
+              </w:rPr>
+              <w:t>Invalid</w:t>
+            </w:r>
+          </w:p>
+        </w:tc>
+      </w:tr>
+      <w:tr>
+        <w:tc>
+          <w:tcPr>
+            <w:tcW w:w="1416" w:type="dxa"/>
+            <w:vAlign w:val="center"/>
+          </w:tcPr>
+          <w:p>
+            <w:pPr>
+              <w:rPr>
+                <w:rFonts w:ascii="Arial" w:hAnsi="Arial" w:cs="Arial"/>
+                <w:sz w:val="16"/>
+                <w:szCs w:val="16"/>
+              </w:rPr>
+            </w:pPr>
+            <w:r>
+              <w:rPr>
+                <w:rFonts w:ascii="Arial" w:hAnsi="Arial" w:cs="Arial"/>
+                <w:sz w:val="16"/>
+                <w:szCs w:val="16"/>
+              </w:rPr>
+              <w:t>BVA-06</w:t>
+            </w:r>
+          </w:p>
+        </w:tc>
+        <w:tc>
+          <w:tcPr>
+            <w:tcW w:w="1416" w:type="dxa"/>
+            <w:vAlign w:val="center"/>
+          </w:tcPr>
+          <w:p>
+            <w:pPr>
+              <w:rPr>
+                <w:rFonts w:ascii="Arial" w:hAnsi="Arial" w:cs="Arial"/>
+                <w:sz w:val="16"/>
+                <w:szCs w:val="16"/>
+              </w:rPr>
+            </w:pPr>
+            <w:r>
+              <w:rPr>
+                <w:rFonts w:ascii="Arial" w:hAnsi="Arial" w:cs="Arial"/>
+                <w:sz w:val="16"/>
+                <w:szCs w:val="16"/>
+              </w:rPr>
+              <w:t>quantity</w:t>
+            </w:r>
+          </w:p>
+        </w:tc>
+        <w:tc>
+          <w:tcPr>
+            <w:tcW w:w="1416" w:type="dxa"/>
+            <w:vAlign w:val="center"/>
+          </w:tcPr>
+          <w:p>
+            <w:pPr>
+              <w:rPr>
+                <w:rFonts w:ascii="Arial" w:hAnsi="Arial" w:cs="Arial"/>
+                <w:sz w:val="16"/>
+                <w:szCs w:val="16"/>
+              </w:rPr>
+            </w:pPr>
+            <w:r>
+              <w:rPr>
+                <w:rFonts w:ascii="Arial" w:hAnsi="Arial" w:cs="Arial"/>
+                <w:sz w:val="16"/>
+                <w:szCs w:val="16"/>
+              </w:rPr>
+              <w:t>Min</w:t>
+            </w:r>
+            <w:r>
+              <w:rPr>
+                <w:rFonts w:ascii="Arial" w:hAnsi="Arial" w:cs="Arial"/>
+                <w:sz w:val="16"/>
+                <w:szCs w:val="16"/>
+              </w:rPr>
+              <w:t xml:space="preserve"> - 1 (9998)</w:t>
+            </w:r>
+          </w:p>
+        </w:tc>
+        <w:tc>
+          <w:tcPr>
+            <w:tcW w:w="1416" w:type="dxa"/>
+            <w:vAlign w:val="center"/>
+          </w:tcPr>
+          <w:p>
+            <w:pPr>
+              <w:rPr>
+                <w:rFonts w:ascii="Arial" w:hAnsi="Arial" w:cs="Arial"/>
+                <w:sz w:val="16"/>
+                <w:szCs w:val="16"/>
+              </w:rPr>
+            </w:pPr>
+            <w:r>
+              <w:rPr>
+                <w:rFonts w:ascii="Arial" w:hAnsi="Arial" w:cs="Arial"/>
+                <w:sz w:val="16"/>
+                <w:szCs w:val="16"/>
+              </w:rPr>
+              <w:t>Thêm sản phẩm với quantity = 9998</w:t>
+            </w:r>
+          </w:p>
+        </w:tc>
+        <w:tc>
+          <w:tcPr>
+            <w:tcW w:w="1416" w:type="dxa"/>
+            <w:vAlign w:val="center"/>
+          </w:tcPr>
+          <w:p>
+            <w:pPr>
+              <w:rPr>
+                <w:rFonts w:ascii="Arial" w:hAnsi="Arial" w:cs="Arial"/>
+                <w:sz w:val="16"/>
+                <w:szCs w:val="16"/>
+              </w:rPr>
+            </w:pPr>
+            <w:r>
+              <w:rPr>
+                <w:rFonts w:ascii="Arial" w:hAnsi="Arial" w:cs="Arial"/>
+                <w:sz w:val="16"/>
+                <w:szCs w:val="16"/>
+              </w:rPr>
+              <w:t>Chấp nhận, tính toán thành tiền chính xác không bị tràn số (Overflow).</w:t>
+            </w:r>
+          </w:p>
+        </w:tc>
+        <w:tc>
+          <w:tcPr>
+            <w:tcW w:w="1416" w:type="dxa"/>
+            <w:vAlign w:val="center"/>
+          </w:tcPr>
+          <w:p>
+            <w:pPr>
+              <w:rPr>
+                <w:rFonts w:ascii="Arial" w:hAnsi="Arial" w:cs="Arial"/>
+                <w:sz w:val="16"/>
+                <w:szCs w:val="16"/>
+              </w:rPr>
+            </w:pPr>
+            <w:r>
+              <w:rPr>
+                <w:rFonts w:ascii="Arial" w:hAnsi="Arial" w:cs="Arial"/>
+                <w:sz w:val="16"/>
+                <w:szCs w:val="16"/>
+              </w:rPr>
+              <w:t>Valid</w:t>
+            </w:r>
+          </w:p>
+        </w:tc>
+      </w:tr>
+      <w:tr>
+        <w:tc>
+          <w:tcPr>
+            <w:tcW w:w="1416" w:type="dxa"/>
+            <w:vAlign w:val="center"/>
+          </w:tcPr>
+          <w:p>
+            <w:pPr>
+              <w:rPr>
+                <w:rFonts w:ascii="Arial" w:hAnsi="Arial" w:cs="Arial"/>
+                <w:sz w:val="16"/>
+                <w:szCs w:val="16"/>
+              </w:rPr>
+            </w:pPr>
+            <w:r>
+              <w:rPr>
+                <w:rFonts w:ascii="Arial" w:hAnsi="Arial" w:cs="Arial"/>
+                <w:sz w:val="16"/>
+                <w:szCs w:val="16"/>
+              </w:rPr>
+              <w:t>BVA-07</w:t>
+            </w:r>
+          </w:p>
+        </w:tc>
+        <w:tc>
+          <w:tcPr>
+            <w:tcW w:w="1416" w:type="dxa"/>
+            <w:vAlign w:val="center"/>
+          </w:tcPr>
+          <w:p>
+            <w:pPr>
+              <w:rPr>
+                <w:rFonts w:ascii="Arial" w:hAnsi="Arial" w:cs="Arial"/>
+                <w:sz w:val="16"/>
+                <w:szCs w:val="16"/>
+              </w:rPr>
+            </w:pPr>
+            <w:r>
+              <w:rPr>
+                <w:rFonts w:ascii="Arial" w:hAnsi="Arial" w:cs="Arial"/>
+                <w:sz w:val="16"/>
+                <w:szCs w:val="16"/>
+              </w:rPr>
+              <w:t>quantity</w:t>
+            </w:r>
+          </w:p>
+        </w:tc>
+        <w:tc>
+          <w:tcPr>
+            <w:tcW w:w="1416" w:type="dxa"/>
+            <w:vAlign w:val="center"/>
+          </w:tcPr>
+          <w:p>
+            <w:pPr>
+              <w:rPr>
+                <w:rFonts w:ascii="Arial" w:hAnsi="Arial" w:cs="Arial"/>
+                <w:sz w:val="16"/>
+                <w:szCs w:val="16"/>
+              </w:rPr>
+            </w:pPr>
+            <w:r>
+              <w:rPr>
+                <w:rFonts w:ascii="Arial" w:hAnsi="Arial" w:cs="Arial"/>
+                <w:sz w:val="16"/>
+                <w:szCs w:val="16"/>
+              </w:rPr>
+              <w:t>Min</w:t>
+            </w:r>
+            <w:r>
+              <w:rPr>
+                <w:rFonts w:ascii="Arial" w:hAnsi="Arial" w:cs="Arial"/>
+                <w:sz w:val="16"/>
+                <w:szCs w:val="16"/>
+              </w:rPr>
+              <w:t xml:space="preserve"> (9999)</w:t>
+            </w:r>
+          </w:p>
+        </w:tc>
+        <w:tc>
+          <w:tcPr>
+            <w:tcW w:w="1416" w:type="dxa"/>
+            <w:vAlign w:val="center"/>
+          </w:tcPr>
+          <w:p>
+            <w:pPr>
+              <w:rPr>
+                <w:rFonts w:ascii="Arial" w:hAnsi="Arial" w:cs="Arial"/>
+                <w:sz w:val="16"/>
+                <w:szCs w:val="16"/>
+              </w:rPr>
+            </w:pPr>
+            <w:r>
+              <w:rPr>
+                <w:rFonts w:ascii="Arial" w:hAnsi="Arial" w:cs="Arial"/>
+                <w:sz w:val="16"/>
+                <w:szCs w:val="16"/>
+              </w:rPr>
+              <w:t>Thêm sản phẩm với quantity = 9999</w:t>
+            </w:r>
+          </w:p>
+        </w:tc>
+        <w:tc>
+          <w:tcPr>
+            <w:tcW w:w="1416" w:type="dxa"/>
+            <w:vAlign w:val="center"/>
+          </w:tcPr>
+          <w:p>
+            <w:pPr>
+              <w:rPr>
+                <w:rFonts w:ascii="Arial" w:hAnsi="Arial" w:cs="Arial"/>
+                <w:sz w:val="16"/>
+                <w:szCs w:val="16"/>
+              </w:rPr>
+            </w:pPr>
+            <w:r>
+              <w:rPr>
+                <w:rFonts w:ascii="Arial" w:hAnsi="Arial" w:cs="Arial"/>
+                <w:sz w:val="16"/>
+                <w:szCs w:val="16"/>
+              </w:rPr>
+              <w:t>Chấp nhận tối đa, hiển thị đúng trong giỏ hàng.</w:t>
+            </w:r>
+          </w:p>
+        </w:tc>
+        <w:tc>
+          <w:tcPr>
+            <w:tcW w:w="1416" w:type="dxa"/>
+            <w:vAlign w:val="center"/>
+          </w:tcPr>
+          <w:p>
+            <w:pPr>
+              <w:rPr>
+                <w:rFonts w:ascii="Arial" w:hAnsi="Arial" w:cs="Arial"/>
+                <w:sz w:val="16"/>
+                <w:szCs w:val="16"/>
+              </w:rPr>
+            </w:pPr>
+            <w:r>
+              <w:rPr>
+                <w:rFonts w:ascii="Arial" w:hAnsi="Arial" w:cs="Arial"/>
+                <w:sz w:val="16"/>
+                <w:szCs w:val="16"/>
+              </w:rPr>
+              <w:t>Valid</w:t>
+            </w:r>
+          </w:p>
+        </w:tc>
+      </w:tr>
+      <w:tr>
+        <w:tc>
+          <w:tcPr>
+            <w:tcW w:w="1416" w:type="dxa"/>
+            <w:vAlign w:val="center"/>
+          </w:tcPr>
+          <w:p>
+            <w:pPr>
+              <w:rPr>
+                <w:rFonts w:ascii="Arial" w:hAnsi="Arial" w:cs="Arial"/>
+                <w:sz w:val="16"/>
+                <w:szCs w:val="16"/>
+              </w:rPr>
+            </w:pPr>
+            <w:r>
+              <w:rPr>
+                <w:rFonts w:ascii="Arial" w:hAnsi="Arial" w:cs="Arial"/>
+                <w:sz w:val="16"/>
+                <w:szCs w:val="16"/>
+              </w:rPr>
+              <w:t>BVA-08</w:t>
+            </w:r>
+          </w:p>
+        </w:tc>
+        <w:tc>
+          <w:tcPr>
+            <w:tcW w:w="1416" w:type="dxa"/>
+            <w:vAlign w:val="center"/>
+          </w:tcPr>
+          <w:p>
+            <w:pPr>
+              <w:rPr>
+                <w:rFonts w:ascii="Arial" w:hAnsi="Arial" w:cs="Arial"/>
+                <w:sz w:val="16"/>
+                <w:szCs w:val="16"/>
+              </w:rPr>
+            </w:pPr>
+            <w:r>
+              <w:rPr>
+                <w:rFonts w:ascii="Arial" w:hAnsi="Arial" w:cs="Arial"/>
+                <w:sz w:val="16"/>
+                <w:szCs w:val="16"/>
+              </w:rPr>
+              <w:t>quantity</w:t>
+            </w:r>
+          </w:p>
+        </w:tc>
+        <w:tc>
+          <w:tcPr>
+            <w:tcW w:w="1416" w:type="dxa"/>
+            <w:vAlign w:val="center"/>
+          </w:tcPr>
+          <w:p>
+            <w:pPr>
+              <w:rPr>
+                <w:rFonts w:ascii="Arial" w:hAnsi="Arial" w:cs="Arial"/>
+                <w:sz w:val="16"/>
+                <w:szCs w:val="16"/>
+              </w:rPr>
+            </w:pPr>
+            <w:r>
+              <w:rPr>
+                <w:rFonts w:ascii="Arial" w:hAnsi="Arial" w:cs="Arial"/>
+                <w:sz w:val="16"/>
+                <w:szCs w:val="16"/>
+              </w:rPr>
+              <w:t>Min</w:t>
+            </w:r>
+            <w:r>
+              <w:rPr>
+                <w:rFonts w:ascii="Arial" w:hAnsi="Arial" w:cs="Arial"/>
+                <w:sz w:val="16"/>
+                <w:szCs w:val="16"/>
+              </w:rPr>
+              <w:t xml:space="preserve"> + 1 (10000)</w:t>
+            </w:r>
+          </w:p>
+        </w:tc>
+        <w:tc>
+          <w:tcPr>
+            <w:tcW w:w="1416" w:type="dxa"/>
+            <w:vAlign w:val="center"/>
+          </w:tcPr>
+          <w:p>
+            <w:pPr>
+              <w:rPr>
+                <w:rFonts w:ascii="Arial" w:hAnsi="Arial" w:cs="Arial"/>
+                <w:sz w:val="16"/>
+                <w:szCs w:val="16"/>
+              </w:rPr>
+            </w:pPr>
+            <w:r>
+              <w:rPr>
+                <w:rFonts w:ascii="Arial" w:hAnsi="Arial" w:cs="Arial"/>
+                <w:sz w:val="16"/>
+                <w:szCs w:val="16"/>
+              </w:rPr>
+              <w:t>Thêm sản phẩm với quantity = 10000</w:t>
+            </w:r>
+          </w:p>
+        </w:tc>
+        <w:tc>
+          <w:tcPr>
+            <w:tcW w:w="1416" w:type="dxa"/>
+            <w:vAlign w:val="center"/>
+          </w:tcPr>
+          <w:p>
+            <w:pPr>
+              <w:rPr>
+                <w:rFonts w:ascii="Arial" w:hAnsi="Arial" w:cs="Arial"/>
+                <w:sz w:val="16"/>
+                <w:szCs w:val="16"/>
+              </w:rPr>
+            </w:pPr>
+            <w:r>
+              <w:rPr>
+                <w:rFonts w:ascii="Arial" w:hAnsi="Arial" w:cs="Arial"/>
+                <w:sz w:val="16"/>
+                <w:szCs w:val="16"/>
+              </w:rPr>
+              <w:t>Hệ thống cảnh báo vượt quá giới hạn cho phép hoặc chặn lại.</w:t>
+            </w:r>
+          </w:p>
+        </w:tc>
+        <w:tc>
+          <w:tcPr>
+            <w:tcW w:w="1416" w:type="dxa"/>
+            <w:vAlign w:val="center"/>
+          </w:tcPr>
+          <w:p>
+            <w:pPr>
+              <w:rPr>
+                <w:rFonts w:ascii="Arial" w:hAnsi="Arial" w:cs="Arial"/>
+                <w:sz w:val="16"/>
+                <w:szCs w:val="16"/>
+              </w:rPr>
+            </w:pPr>
+            <w:r>
+              <w:rPr>
+                <w:rFonts w:ascii="Arial" w:hAnsi="Arial" w:cs="Arial"/>
+                <w:sz w:val="16"/>
+                <w:szCs w:val="16"/>
+              </w:rPr>
+              <w:t>Invalid</w:t>
+            </w:r>
+          </w:p>
+        </w:tc>
+      </w:tr>
+      <w:tr>
+        <w:tc>
+          <w:tcPr>
+            <w:tcW w:w="1416" w:type="dxa"/>
+            <w:vAlign w:val="center"/>
+          </w:tcPr>
+          <w:p>
+            <w:pPr>
+              <w:rPr>
+                <w:rFonts w:ascii="Arial" w:hAnsi="Arial" w:cs="Arial"/>
+                <w:sz w:val="16"/>
+                <w:szCs w:val="16"/>
+              </w:rPr>
+            </w:pPr>
+            <w:r>
+              <w:rPr>
+                <w:rFonts w:ascii="Arial" w:hAnsi="Arial" w:cs="Arial"/>
+                <w:sz w:val="16"/>
+                <w:szCs w:val="16"/>
+              </w:rPr>
+              <w:t>BVA-09</w:t>
+            </w:r>
+          </w:p>
+        </w:tc>
+        <w:tc>
+          <w:tcPr>
+            <w:tcW w:w="1416" w:type="dxa"/>
+            <w:vAlign w:val="center"/>
+          </w:tcPr>
+          <w:p>
+            <w:pPr>
+              <w:rPr>
+                <w:rFonts w:ascii="Arial" w:hAnsi="Arial" w:cs="Arial"/>
+                <w:sz w:val="16"/>
+                <w:szCs w:val="16"/>
+              </w:rPr>
+            </w:pPr>
+            <w:r>
+              <w:rPr>
+                <w:rFonts w:ascii="Arial" w:hAnsi="Arial" w:cs="Arial"/>
+                <w:sz w:val="16"/>
+                <w:szCs w:val="16"/>
+              </w:rPr>
+              <w:t>cart.length</w:t>
+            </w:r>
+          </w:p>
+        </w:tc>
+        <w:tc>
+          <w:tcPr>
+            <w:tcW w:w="1416" w:type="dxa"/>
+            <w:vAlign w:val="center"/>
+          </w:tcPr>
+          <w:p>
+            <w:pPr>
+              <w:rPr>
+                <w:rFonts w:ascii="Arial" w:hAnsi="Arial" w:cs="Arial"/>
+                <w:sz w:val="16"/>
+                <w:szCs w:val="16"/>
+              </w:rPr>
+            </w:pPr>
+            <w:r>
+              <w:rPr>
+                <w:rFonts w:ascii="Arial" w:hAnsi="Arial" w:cs="Arial"/>
+                <w:sz w:val="16"/>
+                <w:szCs w:val="16"/>
+              </w:rPr>
+              <w:t>Min</w:t>
+            </w:r>
+            <w:r>
+              <w:rPr>
+                <w:rFonts w:ascii="Arial" w:hAnsi="Arial" w:cs="Arial"/>
+                <w:sz w:val="16"/>
+                <w:szCs w:val="16"/>
+              </w:rPr>
+              <w:t xml:space="preserve"> (0)</w:t>
+            </w:r>
+          </w:p>
+        </w:tc>
+        <w:tc>
+          <w:tcPr>
+            <w:tcW w:w="1416" w:type="dxa"/>
+            <w:vAlign w:val="center"/>
+          </w:tcPr>
+          <w:p>
+            <w:pPr>
+              <w:rPr>
+                <w:rFonts w:ascii="Arial" w:hAnsi="Arial" w:cs="Arial"/>
+                <w:sz w:val="16"/>
+                <w:szCs w:val="16"/>
+              </w:rPr>
+            </w:pPr>
+            <w:r>
+              <w:rPr>
+                <w:rFonts w:ascii="Arial" w:hAnsi="Arial" w:cs="Arial"/>
+                <w:sz w:val="16"/>
+                <w:szCs w:val="16"/>
+              </w:rPr>
+              <w:t>Mở trang giỏ hàng khi giỏ chưa có sản phẩm (cart = [])</w:t>
+            </w:r>
+          </w:p>
+        </w:tc>
+        <w:tc>
+          <w:tcPr>
+            <w:tcW w:w="1416" w:type="dxa"/>
+            <w:vAlign w:val="center"/>
+          </w:tcPr>
+          <w:p>
+            <w:pPr>
+              <w:rPr>
+                <w:rFonts w:ascii="Arial" w:hAnsi="Arial" w:cs="Arial"/>
+                <w:sz w:val="16"/>
+                <w:szCs w:val="16"/>
+              </w:rPr>
+            </w:pPr>
+            <w:r>
+              <w:rPr>
+                <w:rFonts w:ascii="Arial" w:hAnsi="Arial" w:cs="Arial"/>
+                <w:sz w:val="16"/>
+                <w:szCs w:val="16"/>
+              </w:rPr>
+              <w:t>Hiển thị giao diện giỏ hàng trống: Có hình minh họa (illustration) + thông báo + nút "Tiếp tục mua sắm".</w:t>
+            </w:r>
+          </w:p>
+        </w:tc>
+        <w:tc>
+          <w:tcPr>
+            <w:tcW w:w="1416" w:type="dxa"/>
+            <w:vAlign w:val="center"/>
+          </w:tcPr>
+          <w:p>
+            <w:pPr>
+              <w:rPr>
+                <w:rFonts w:ascii="Arial" w:hAnsi="Arial" w:cs="Arial"/>
+                <w:sz w:val="16"/>
+                <w:szCs w:val="16"/>
+              </w:rPr>
+            </w:pPr>
+            <w:r>
+              <w:rPr>
+                <w:rFonts w:ascii="Arial" w:hAnsi="Arial" w:cs="Arial"/>
+                <w:sz w:val="16"/>
+                <w:szCs w:val="16"/>
+              </w:rPr>
+              <w:t>Valid</w:t>
+            </w:r>
+          </w:p>
+        </w:tc>
+      </w:tr>
+      <w:tr>
+        <w:tc>
+          <w:tcPr>
+            <w:tcW w:w="1416" w:type="dxa"/>
+            <w:vAlign w:val="center"/>
+          </w:tcPr>
+          <w:p>
+            <w:pPr>
+              <w:rPr>
+                <w:rFonts w:ascii="Arial" w:hAnsi="Arial" w:cs="Arial"/>
+                <w:sz w:val="16"/>
+                <w:szCs w:val="16"/>
+              </w:rPr>
+            </w:pPr>
+            <w:r>
+              <w:rPr>
+                <w:rFonts w:ascii="Arial" w:hAnsi="Arial" w:cs="Arial"/>
+                <w:sz w:val="16"/>
+                <w:szCs w:val="16"/>
+              </w:rPr>
+              <w:t>BVA-10</w:t>
+            </w:r>
+          </w:p>
+        </w:tc>
+        <w:tc>
+          <w:tcPr>
+            <w:tcW w:w="1416" w:type="dxa"/>
+            <w:vAlign w:val="center"/>
+          </w:tcPr>
+          <w:p>
+            <w:pPr>
+              <w:rPr>
+                <w:rFonts w:ascii="Arial" w:hAnsi="Arial" w:cs="Arial"/>
+                <w:sz w:val="16"/>
+                <w:szCs w:val="16"/>
+              </w:rPr>
+            </w:pPr>
+            <w:r>
+              <w:rPr>
+                <w:rFonts w:ascii="Arial" w:hAnsi="Arial" w:cs="Arial"/>
+                <w:sz w:val="16"/>
+                <w:szCs w:val="16"/>
+              </w:rPr>
+              <w:t>cart.length</w:t>
+            </w:r>
+          </w:p>
+        </w:tc>
+        <w:tc>
+          <w:tcPr>
+            <w:tcW w:w="1416" w:type="dxa"/>
+            <w:vAlign w:val="center"/>
+          </w:tcPr>
+          <w:p>
+            <w:pPr>
+              <w:rPr>
+                <w:rFonts w:ascii="Arial" w:hAnsi="Arial" w:cs="Arial"/>
+                <w:sz w:val="16"/>
+                <w:szCs w:val="16"/>
+              </w:rPr>
+            </w:pPr>
+            <w:r>
+              <w:rPr>
+                <w:rFonts w:ascii="Arial" w:hAnsi="Arial" w:cs="Arial"/>
+                <w:sz w:val="16"/>
+                <w:szCs w:val="16"/>
+              </w:rPr>
+              <w:t>Min</w:t>
+            </w:r>
+            <w:r>
+              <w:rPr>
+                <w:rFonts w:ascii="Arial" w:hAnsi="Arial" w:cs="Arial"/>
+                <w:sz w:val="16"/>
+                <w:szCs w:val="16"/>
+              </w:rPr>
+              <w:t xml:space="preserve"> + 1 (1)</w:t>
+            </w:r>
+          </w:p>
+        </w:tc>
+        <w:tc>
+          <w:tcPr>
+            <w:tcW w:w="1416" w:type="dxa"/>
+            <w:vAlign w:val="center"/>
+          </w:tcPr>
+          <w:p>
+            <w:pPr>
+              <w:rPr>
+                <w:rFonts w:ascii="Arial" w:hAnsi="Arial" w:cs="Arial"/>
+                <w:sz w:val="16"/>
+                <w:szCs w:val="16"/>
+              </w:rPr>
+            </w:pPr>
+            <w:r>
+              <w:rPr>
+                <w:rFonts w:ascii="Arial" w:hAnsi="Arial" w:cs="Arial"/>
+                <w:sz w:val="16"/>
+                <w:szCs w:val="16"/>
+              </w:rPr>
+              <w:t>Thêm 1 sản phẩm vào giỏ (cart.length = 1)</w:t>
+            </w:r>
+          </w:p>
+        </w:tc>
+        <w:tc>
+          <w:tcPr>
+            <w:tcW w:w="1416" w:type="dxa"/>
+            <w:vAlign w:val="center"/>
+          </w:tcPr>
+          <w:p>
+            <w:pPr>
+              <w:rPr>
+                <w:rFonts w:ascii="Arial" w:hAnsi="Arial" w:cs="Arial"/>
+                <w:sz w:val="16"/>
+                <w:szCs w:val="16"/>
+              </w:rPr>
+            </w:pPr>
+            <w:r>
+              <w:rPr>
+                <w:rFonts w:ascii="Arial" w:hAnsi="Arial" w:cs="Arial"/>
+                <w:sz w:val="16"/>
+                <w:szCs w:val="16"/>
+              </w:rPr>
+              <w:t>Hiển thị bảng danh sách gồm đúng 1 dòng sản phẩm, nhãn tổng tiền là "Tổng cộng".</w:t>
+            </w:r>
+          </w:p>
+        </w:tc>
+        <w:tc>
+          <w:tcPr>
+            <w:tcW w:w="1416" w:type="dxa"/>
+            <w:vAlign w:val="center"/>
+          </w:tcPr>
+          <w:p>
+            <w:pPr>
+              <w:rPr>
+                <w:rFonts w:ascii="Arial" w:hAnsi="Arial" w:cs="Arial"/>
+                <w:sz w:val="16"/>
+                <w:szCs w:val="16"/>
+              </w:rPr>
+            </w:pPr>
+            <w:r>
+              <w:rPr>
+                <w:rFonts w:ascii="Arial" w:hAnsi="Arial" w:cs="Arial"/>
+                <w:sz w:val="16"/>
+                <w:szCs w:val="16"/>
+              </w:rPr>
+              <w:t>Valid</w:t>
+            </w:r>
+          </w:p>
+        </w:tc>
+      </w:tr>
+    </w:tbl>
+    <w:p>
+      <w:pPr>
         <w:ind w:left="360"/>
         <w:rPr>
           <w:rFonts w:ascii="Arial" w:hAnsi="Arial" w:cs="Arial"/>
+          <w:sz w:val="20"/>
+          <w:szCs w:val="20"/>
+        </w:rPr>
+      </w:pPr>
+    </w:p>
+    <w:p>
+      <w:pPr>
+        <w:ind w:left="360"/>
+        <w:rPr>
+          <w:rFonts w:ascii="Arial" w:hAnsi="Arial" w:cs="Arial"/>
+          <w:sz w:val="20"/>
+          <w:szCs w:val="20"/>
+        </w:rPr>
+      </w:pPr>
+    </w:p>
+    <w:p>
+      <w:pPr>
+        <w:pStyle w:val="ListParagraph"/>
+        <w:numPr>
+          <w:ilvl w:val="0"/>
+          <w:numId w:val="50"/>
+        </w:numPr>
+        <w:rPr>
+          <w:rFonts w:ascii="Arial" w:hAnsi="Arial" w:cs="Arial"/>
           <w:b/>
+          <w:sz w:val="20"/>
+          <w:szCs w:val="20"/>
         </w:rPr>
       </w:pPr>
+      <w:r>
+        <w:rPr>
+          <w:rFonts w:ascii="Arial" w:hAnsi="Arial" w:cs="Arial"/>
+          <w:b/>
+          <w:sz w:val="20"/>
+          <w:szCs w:val="20"/>
+        </w:rPr>
+        <w:lastRenderedPageBreak/>
+        <w:t>Explaination</w:t>
+      </w:r>
+    </w:p>
+    <w:p>
+      <w:pPr>
+        <w:rPr>
+          <w:rFonts w:ascii="Arial" w:hAnsi="Arial" w:cs="Arial"/>
+          <w:sz w:val="20"/>
+          <w:szCs w:val="20"/>
+        </w:rPr>
+      </w:pPr>
+      <w:r>
+        <w:rPr>
+          <w:rFonts w:ascii="Arial" w:hAnsi="Arial" w:cs="Arial"/>
+          <w:b/>
+          <w:sz w:val="20"/>
+          <w:szCs w:val="20"/>
+        </w:rPr>
+        <w:t xml:space="preserve">- </w:t>
+      </w:r>
+      <w:r>
+        <w:rPr>
+          <w:rFonts w:ascii="Arial" w:hAnsi="Arial" w:cs="Arial"/>
+          <w:b/>
+          <w:sz w:val="20"/>
+          <w:szCs w:val="20"/>
+        </w:rPr>
+        <w:t xml:space="preserve">Bước 1. </w:t>
+      </w:r>
+      <w:r>
+        <w:rPr>
+          <w:rFonts w:ascii="Arial" w:hAnsi="Arial" w:cs="Arial"/>
+          <w:b/>
+          <w:sz w:val="20"/>
+          <w:szCs w:val="20"/>
+        </w:rPr>
+        <w:t>Nhận diện đúng thuộc tính có biên:</w:t>
+      </w:r>
+      <w:r>
+        <w:rPr>
+          <w:rFonts w:ascii="Arial" w:hAnsi="Arial" w:cs="Arial"/>
+          <w:sz w:val="20"/>
+          <w:szCs w:val="20"/>
+        </w:rPr>
+        <w:t xml:space="preserve"> Trong FR-07 và FR-06, biến số l</w:t>
+      </w:r>
+      <w:r>
+        <w:rPr>
+          <w:rFonts w:ascii="Arial" w:hAnsi="Arial" w:cs="Arial" w:hint="cs"/>
+          <w:sz w:val="20"/>
+          <w:szCs w:val="20"/>
+        </w:rPr>
+        <w:t>ư</w:t>
+      </w:r>
+      <w:r>
+        <w:rPr>
+          <w:rFonts w:ascii="Arial" w:hAnsi="Arial" w:cs="Arial"/>
+          <w:sz w:val="20"/>
+          <w:szCs w:val="20"/>
+        </w:rPr>
+        <w:t>ợng (`quantity`) và số l</w:t>
+      </w:r>
+      <w:r>
+        <w:rPr>
+          <w:rFonts w:ascii="Arial" w:hAnsi="Arial" w:cs="Arial" w:hint="cs"/>
+          <w:sz w:val="20"/>
+          <w:szCs w:val="20"/>
+        </w:rPr>
+        <w:t>ư</w:t>
+      </w:r>
+      <w:r>
+        <w:rPr>
+          <w:rFonts w:ascii="Arial" w:hAnsi="Arial" w:cs="Arial"/>
+          <w:sz w:val="20"/>
+          <w:szCs w:val="20"/>
+        </w:rPr>
+        <w:t>ợng phần tử giỏ hàng (`</w:t>
+      </w:r>
+      <w:proofErr w:type="gramStart"/>
+      <w:r>
+        <w:rPr>
+          <w:rFonts w:ascii="Arial" w:hAnsi="Arial" w:cs="Arial"/>
+          <w:sz w:val="20"/>
+          <w:szCs w:val="20"/>
+        </w:rPr>
+        <w:t>cart.length</w:t>
+      </w:r>
+      <w:proofErr w:type="gramEnd"/>
+      <w:r>
+        <w:rPr>
+          <w:rFonts w:ascii="Arial" w:hAnsi="Arial" w:cs="Arial"/>
+          <w:sz w:val="20"/>
+          <w:szCs w:val="20"/>
+        </w:rPr>
+        <w:t>`) là các đại l</w:t>
+      </w:r>
+      <w:r>
+        <w:rPr>
+          <w:rFonts w:ascii="Arial" w:hAnsi="Arial" w:cs="Arial" w:hint="cs"/>
+          <w:sz w:val="20"/>
+          <w:szCs w:val="20"/>
+        </w:rPr>
+        <w:t>ư</w:t>
+      </w:r>
+      <w:r>
+        <w:rPr>
+          <w:rFonts w:ascii="Arial" w:hAnsi="Arial" w:cs="Arial"/>
+          <w:sz w:val="20"/>
+          <w:szCs w:val="20"/>
+        </w:rPr>
+        <w:t xml:space="preserve">ợng rời rạc có thứ tự rõ ràng (số nguyên), rất nhạy cảm với các lỗi lập trình </w:t>
+      </w:r>
+      <w:r>
+        <w:rPr>
+          <w:rFonts w:ascii="Arial" w:hAnsi="Arial" w:cs="Arial"/>
+          <w:sz w:val="20"/>
+          <w:szCs w:val="20"/>
+        </w:rPr>
+        <w:t>so sán</w:t>
+      </w:r>
+      <w:bookmarkStart w:id="1" w:name="_GoBack"/>
+      <w:bookmarkEnd w:id="1"/>
+      <w:r>
+        <w:rPr>
+          <w:rFonts w:ascii="Arial" w:hAnsi="Arial" w:cs="Arial"/>
+          <w:sz w:val="20"/>
+          <w:szCs w:val="20"/>
+        </w:rPr>
+        <w:t>h (`&gt;`, `&lt;`, `&gt;=`, `&lt;=`).</w:t>
+      </w:r>
+    </w:p>
+    <w:p>
+      <w:pPr>
+        <w:rPr>
+          <w:rFonts w:ascii="Arial" w:hAnsi="Arial" w:cs="Arial"/>
+          <w:b/>
+          <w:sz w:val="20"/>
+          <w:szCs w:val="20"/>
+        </w:rPr>
+      </w:pPr>
+      <w:r>
+        <w:rPr>
+          <w:rFonts w:ascii="Arial" w:hAnsi="Arial" w:cs="Arial"/>
+          <w:b/>
+          <w:sz w:val="20"/>
+          <w:szCs w:val="20"/>
+        </w:rPr>
+        <w:t>-</w:t>
+      </w:r>
+      <w:r>
+        <w:rPr>
+          <w:rFonts w:ascii="Arial" w:hAnsi="Arial" w:cs="Arial"/>
+          <w:sz w:val="20"/>
+          <w:szCs w:val="20"/>
+        </w:rPr>
+        <w:t xml:space="preserve"> </w:t>
+      </w:r>
+      <w:r>
+        <w:rPr>
+          <w:rFonts w:ascii="Arial" w:hAnsi="Arial" w:cs="Arial"/>
+          <w:b/>
+          <w:sz w:val="20"/>
+          <w:szCs w:val="20"/>
+        </w:rPr>
+        <w:t xml:space="preserve">Bước 2. </w:t>
+      </w:r>
+      <w:r>
+        <w:rPr>
+          <w:rFonts w:ascii="Arial" w:hAnsi="Arial" w:cs="Arial"/>
+          <w:b/>
+          <w:sz w:val="20"/>
+          <w:szCs w:val="20"/>
+        </w:rPr>
+        <w:t>Khai thác biên t</w:t>
+      </w:r>
+      <w:r>
+        <w:rPr>
+          <w:rFonts w:ascii="Arial" w:hAnsi="Arial" w:cs="Arial" w:hint="cs"/>
+          <w:b/>
+          <w:sz w:val="20"/>
+          <w:szCs w:val="20"/>
+        </w:rPr>
+        <w:t>ư</w:t>
+      </w:r>
+      <w:r>
+        <w:rPr>
+          <w:rFonts w:ascii="Arial" w:hAnsi="Arial" w:cs="Arial"/>
+          <w:b/>
+          <w:sz w:val="20"/>
+          <w:szCs w:val="20"/>
+        </w:rPr>
+        <w:t>ờng minh &amp; ngầm đị</w:t>
+      </w:r>
+      <w:r>
+        <w:rPr>
+          <w:rFonts w:ascii="Arial" w:hAnsi="Arial" w:cs="Arial"/>
+          <w:b/>
+          <w:sz w:val="20"/>
+          <w:szCs w:val="20"/>
+        </w:rPr>
+        <w:t>nh:</w:t>
+      </w:r>
+    </w:p>
+    <w:p>
+      <w:pPr>
+        <w:rPr>
+          <w:rFonts w:ascii="Arial" w:hAnsi="Arial" w:cs="Arial"/>
+          <w:sz w:val="20"/>
+          <w:szCs w:val="20"/>
+        </w:rPr>
+      </w:pPr>
+      <w:r>
+        <w:rPr>
+          <w:rFonts w:ascii="Arial" w:hAnsi="Arial" w:cs="Arial"/>
+          <w:sz w:val="20"/>
+          <w:szCs w:val="20"/>
+        </w:rPr>
+        <w:t xml:space="preserve">  - Biên t</w:t>
+      </w:r>
+      <w:r>
+        <w:rPr>
+          <w:rFonts w:ascii="Arial" w:hAnsi="Arial" w:cs="Arial" w:hint="cs"/>
+          <w:sz w:val="20"/>
+          <w:szCs w:val="20"/>
+        </w:rPr>
+        <w:t>ư</w:t>
+      </w:r>
+      <w:r>
+        <w:rPr>
+          <w:rFonts w:ascii="Arial" w:hAnsi="Arial" w:cs="Arial"/>
+          <w:sz w:val="20"/>
+          <w:szCs w:val="20"/>
+        </w:rPr>
+        <w:t xml:space="preserve">ờng </w:t>
+      </w:r>
+      <w:proofErr w:type="gramStart"/>
+      <w:r>
+        <w:rPr>
+          <w:rFonts w:ascii="Arial" w:hAnsi="Arial" w:cs="Arial"/>
+          <w:sz w:val="20"/>
+          <w:szCs w:val="20"/>
+        </w:rPr>
+        <w:t>minh  =</w:t>
+      </w:r>
+      <w:proofErr w:type="gramEnd"/>
+      <w:r>
+        <w:rPr>
+          <w:rFonts w:ascii="Arial" w:hAnsi="Arial" w:cs="Arial"/>
+          <w:sz w:val="20"/>
+          <w:szCs w:val="20"/>
+        </w:rPr>
+        <w:t xml:space="preserve"> 1 lấy trực tiếp từ yêu cầu FR-06 ("tối thiểu là 1").</w:t>
+      </w:r>
+    </w:p>
+    <w:p>
+      <w:pPr>
+        <w:rPr>
+          <w:rFonts w:ascii="Arial" w:hAnsi="Arial" w:cs="Arial"/>
+          <w:sz w:val="20"/>
+          <w:szCs w:val="20"/>
+        </w:rPr>
+      </w:pPr>
+      <w:r>
+        <w:rPr>
+          <w:rFonts w:ascii="Arial" w:hAnsi="Arial" w:cs="Arial"/>
+          <w:sz w:val="20"/>
+          <w:szCs w:val="20"/>
+        </w:rPr>
+        <w:t xml:space="preserve">  - Biên ngầm </w:t>
+      </w:r>
+      <w:proofErr w:type="gramStart"/>
+      <w:r>
+        <w:rPr>
+          <w:rFonts w:ascii="Arial" w:hAnsi="Arial" w:cs="Arial"/>
+          <w:sz w:val="20"/>
+          <w:szCs w:val="20"/>
+        </w:rPr>
+        <w:t>định  =</w:t>
+      </w:r>
+      <w:proofErr w:type="gramEnd"/>
+      <w:r>
+        <w:rPr>
+          <w:rFonts w:ascii="Arial" w:hAnsi="Arial" w:cs="Arial"/>
+          <w:sz w:val="20"/>
+          <w:szCs w:val="20"/>
+        </w:rPr>
+        <w:t xml:space="preserve"> 0 (giỏ trống) và biên Max (giới hạn hệ thống/số nguyên an toàn) đ</w:t>
+      </w:r>
+      <w:r>
+        <w:rPr>
+          <w:rFonts w:ascii="Arial" w:hAnsi="Arial" w:cs="Arial" w:hint="cs"/>
+          <w:sz w:val="20"/>
+          <w:szCs w:val="20"/>
+        </w:rPr>
+        <w:t>ư</w:t>
+      </w:r>
+      <w:r>
+        <w:rPr>
+          <w:rFonts w:ascii="Arial" w:hAnsi="Arial" w:cs="Arial"/>
+          <w:sz w:val="20"/>
+          <w:szCs w:val="20"/>
+        </w:rPr>
+        <w:t>ợc bổ sung để kiểm tra độ bền vững của ứng dụ</w:t>
+      </w:r>
+      <w:r>
+        <w:rPr>
+          <w:rFonts w:ascii="Arial" w:hAnsi="Arial" w:cs="Arial"/>
+          <w:sz w:val="20"/>
+          <w:szCs w:val="20"/>
+        </w:rPr>
+        <w:t>ng.</w:t>
+      </w:r>
+    </w:p>
+    <w:p>
+      <w:pPr>
+        <w:rPr>
+          <w:rFonts w:ascii="Arial" w:hAnsi="Arial" w:cs="Arial"/>
+          <w:sz w:val="20"/>
+          <w:szCs w:val="20"/>
+        </w:rPr>
+      </w:pPr>
+      <w:r>
+        <w:rPr>
+          <w:rFonts w:ascii="Arial" w:hAnsi="Arial" w:cs="Arial"/>
+          <w:b/>
+          <w:sz w:val="20"/>
+          <w:szCs w:val="20"/>
+        </w:rPr>
+        <w:t xml:space="preserve">- </w:t>
+      </w:r>
+      <w:r>
+        <w:rPr>
+          <w:rFonts w:ascii="Arial" w:hAnsi="Arial" w:cs="Arial"/>
+          <w:b/>
+          <w:sz w:val="20"/>
+          <w:szCs w:val="20"/>
+        </w:rPr>
+        <w:t xml:space="preserve">Bước 3. </w:t>
+      </w:r>
+      <w:r>
+        <w:rPr>
+          <w:rFonts w:ascii="Arial" w:hAnsi="Arial" w:cs="Arial"/>
+          <w:b/>
+          <w:sz w:val="20"/>
+          <w:szCs w:val="20"/>
+        </w:rPr>
+        <w:t>Ứng dụng chuẩn 3-value BVA</w:t>
+      </w:r>
+      <w:r>
+        <w:rPr>
+          <w:rFonts w:ascii="Arial" w:hAnsi="Arial" w:cs="Arial"/>
+          <w:sz w:val="20"/>
+          <w:szCs w:val="20"/>
+        </w:rPr>
+        <w:t>: Mô hình 3 giá trị (-1</w:t>
+      </w:r>
+      <w:proofErr w:type="gramStart"/>
+      <w:r>
+        <w:rPr>
+          <w:rFonts w:ascii="Arial" w:hAnsi="Arial" w:cs="Arial"/>
+          <w:sz w:val="20"/>
+          <w:szCs w:val="20"/>
+        </w:rPr>
+        <w:t>, ,</w:t>
+      </w:r>
+      <w:proofErr w:type="gramEnd"/>
+      <w:r>
+        <w:rPr>
+          <w:rFonts w:ascii="Arial" w:hAnsi="Arial" w:cs="Arial"/>
+          <w:sz w:val="20"/>
+          <w:szCs w:val="20"/>
+        </w:rPr>
+        <w:t xml:space="preserve"> +1 và -1, , +1) giúp phát hiện triệt để các lỗi `Off-by-one` kinh điển của lập trình viên (ví dụ: viết nhầm điều kiện `quantity</w:t>
+      </w:r>
+      <w:r>
+        <w:rPr>
+          <w:rFonts w:ascii="Arial" w:hAnsi="Arial" w:cs="Arial"/>
+          <w:sz w:val="20"/>
+          <w:szCs w:val="20"/>
+        </w:rPr>
+        <w:t xml:space="preserve"> &gt; 1` thay vì `quantity &gt;= 1`).</w:t>
+      </w:r>
+    </w:p>
+    <w:p>
+      <w:pPr>
+        <w:rPr>
+          <w:rFonts w:ascii="Arial" w:hAnsi="Arial" w:cs="Arial"/>
+          <w:sz w:val="20"/>
+          <w:szCs w:val="20"/>
+        </w:rPr>
+      </w:pPr>
+      <w:r>
+        <w:rPr>
+          <w:rFonts w:ascii="Arial" w:hAnsi="Arial" w:cs="Arial"/>
+          <w:b/>
+          <w:sz w:val="20"/>
+          <w:szCs w:val="20"/>
+        </w:rPr>
+        <w:t xml:space="preserve">- </w:t>
+      </w:r>
+      <w:r>
+        <w:rPr>
+          <w:rFonts w:ascii="Arial" w:hAnsi="Arial" w:cs="Arial"/>
+          <w:b/>
+          <w:sz w:val="20"/>
+          <w:szCs w:val="20"/>
+        </w:rPr>
+        <w:t xml:space="preserve">Bước 4. </w:t>
+      </w:r>
+      <w:r>
+        <w:rPr>
+          <w:rFonts w:ascii="Arial" w:hAnsi="Arial" w:cs="Arial"/>
+          <w:b/>
+          <w:sz w:val="20"/>
+          <w:szCs w:val="20"/>
+        </w:rPr>
+        <w:t>Cô lập biến (Isolate variables):</w:t>
+      </w:r>
+      <w:r>
+        <w:rPr>
+          <w:rFonts w:ascii="Arial" w:hAnsi="Arial" w:cs="Arial"/>
+          <w:sz w:val="20"/>
+          <w:szCs w:val="20"/>
+        </w:rPr>
+        <w:t xml:space="preserve"> Các test case biên đ</w:t>
+      </w:r>
+      <w:r>
+        <w:rPr>
+          <w:rFonts w:ascii="Arial" w:hAnsi="Arial" w:cs="Arial" w:hint="cs"/>
+          <w:sz w:val="20"/>
+          <w:szCs w:val="20"/>
+        </w:rPr>
+        <w:t>ư</w:t>
+      </w:r>
+      <w:r>
+        <w:rPr>
+          <w:rFonts w:ascii="Arial" w:hAnsi="Arial" w:cs="Arial"/>
+          <w:sz w:val="20"/>
+          <w:szCs w:val="20"/>
+        </w:rPr>
+        <w:t>ợc thiết kế độc lập, chỉ thay đổi duy nhất giá trị của `quantity` hoặc `</w:t>
+      </w:r>
+      <w:proofErr w:type="gramStart"/>
+      <w:r>
+        <w:rPr>
+          <w:rFonts w:ascii="Arial" w:hAnsi="Arial" w:cs="Arial"/>
+          <w:sz w:val="20"/>
+          <w:szCs w:val="20"/>
+        </w:rPr>
+        <w:t>cart.length</w:t>
+      </w:r>
+      <w:proofErr w:type="gramEnd"/>
+      <w:r>
+        <w:rPr>
+          <w:rFonts w:ascii="Arial" w:hAnsi="Arial" w:cs="Arial"/>
+          <w:sz w:val="20"/>
+          <w:szCs w:val="20"/>
+        </w:rPr>
+        <w:t>` trong khi giữ nguyên các thông tin sản phẩm và trạng thái đăng nhập hợp lệ, giúp việc xác định nguyên nhân lỗi (nếu xảy ra) trở nên chính xác tuyệt đối.</w:t>
+      </w:r>
     </w:p>
     <w:sdt>
       <w:sdtPr>
@@ -11949,6 +13980,7 @@
         <w:rPr>
           <w:rFonts w:ascii="Arial" w:hAnsi="Arial" w:cs="Arial"/>
         </w:rPr>
+        <w:lastRenderedPageBreak/>
         <w:t>Self-assessment</w:t>
       </w:r>
       <w:bookmarkEnd w:id="3"/>
@@ -18044,7 +20076,7 @@
   <w:abstractNum w:abstractNumId="46" w15:restartNumberingAfterBreak="0">
     <w:nsid w:val="6AD127E2"/>
     <w:multiLevelType w:val="hybridMultilevel"/>
-    <w:tmpl w:val="139EEE1A"/>
+    <w:tmpl w:val="8278994E"/>
     <w:lvl w:ilvl="0" w:tplc="04090001">
       <w:start w:val="1"/>
       <w:numFmt w:val="bullet"/>
@@ -30762,7 +32794,7 @@
 </file>
 
 <file path=customXml/itemProps1.xml><?xml version="1.0" encoding="utf-8"?>
-<ds:datastoreItem xmlns:ds="http://schemas.openxmlformats.org/officeDocument/2006/customXml" ds:itemID="{79897380-7FB4-42AC-B554-40CCC1F55875}">
+<ds:datastoreItem xmlns:ds="http://schemas.openxmlformats.org/officeDocument/2006/customXml" ds:itemID="{0FF09095-FB12-4BB6-B522-DEA7C99F175B}">
   <ds:schemaRefs>
     <ds:schemaRef ds:uri="http://schemas.openxmlformats.org/officeDocument/2006/bibliography"/>
   </ds:schemaRefs>

</xml_diff>

<commit_message>
FR15, requirement 1 test cases
</commit_message>
<xml_diff>
--- a/MainReport.docx
+++ b/MainReport.docx
@@ -387,7 +387,55 @@
                 <w:sz w:val="16"/>
                 <w:szCs w:val="16"/>
               </w:rPr>
-              <w:t>- Họ Tên: Tran Thi B&lt;br&gt;- Email: newuser02@eshop.com&lt;br&gt;- Mật khẩu: SecurePassword2026&lt;br&gt;- Xác nhận MK: SecurePassword2026</w:t>
+              <w:t>- Họ Tên: Tran Thi B</w:t>
+            </w:r>
+            <w:r>
+              <w:rPr>
+                <w:rFonts w:ascii="Arial" w:hAnsi="Arial" w:cs="Arial"/>
+                <w:sz w:val="16"/>
+                <w:szCs w:val="16"/>
+              </w:rPr>
+              <w:t xml:space="preserve"> </w:t>
+            </w:r>
+            <w:r>
+              <w:rPr>
+                <w:rFonts w:ascii="Arial" w:hAnsi="Arial" w:cs="Arial"/>
+                <w:sz w:val="16"/>
+                <w:szCs w:val="16"/>
+              </w:rPr>
+              <w:t>- Email: newuser02@eshop.com</w:t>
+            </w:r>
+            <w:r>
+              <w:rPr>
+                <w:rFonts w:ascii="Arial" w:hAnsi="Arial" w:cs="Arial"/>
+                <w:sz w:val="16"/>
+                <w:szCs w:val="16"/>
+              </w:rPr>
+              <w:t xml:space="preserve"> </w:t>
+            </w:r>
+            <w:r>
+              <w:rPr>
+                <w:rFonts w:ascii="Arial" w:hAnsi="Arial" w:cs="Arial"/>
+                <w:sz w:val="16"/>
+                <w:szCs w:val="16"/>
+              </w:rPr>
+              <w:t>- Mật khẩu: SecurePassword2026</w:t>
+            </w:r>
+            <w:r>
+              <w:rPr>
+                <w:rFonts w:ascii="Arial" w:hAnsi="Arial" w:cs="Arial"/>
+                <w:sz w:val="16"/>
+                <w:szCs w:val="16"/>
+              </w:rPr>
+              <w:t xml:space="preserve"> </w:t>
+            </w:r>
+            <w:r>
+              <w:rPr>
+                <w:rFonts w:ascii="Arial" w:hAnsi="Arial" w:cs="Arial"/>
+                <w:sz w:val="16"/>
+                <w:szCs w:val="16"/>
+              </w:rPr>
+              <w:t>- Xác nhận MK: SecurePassword2026</w:t>
             </w:r>
           </w:p>
         </w:tc>
@@ -488,7 +536,55 @@
                 <w:sz w:val="16"/>
                 <w:szCs w:val="16"/>
               </w:rPr>
-              <w:t>- Họ Tên: "" (Để trống)&lt;br&gt;- Email: user03@eshop.com&lt;br&gt;- Mật khẩu: Test@1234&lt;br&gt;- Xác nhận MK: Test@1234</w:t>
+              <w:t>- Họ Tên: "" (Để trống)</w:t>
+            </w:r>
+            <w:r>
+              <w:rPr>
+                <w:rFonts w:ascii="Arial" w:hAnsi="Arial" w:cs="Arial"/>
+                <w:sz w:val="16"/>
+                <w:szCs w:val="16"/>
+              </w:rPr>
+              <w:t xml:space="preserve"> </w:t>
+            </w:r>
+            <w:r>
+              <w:rPr>
+                <w:rFonts w:ascii="Arial" w:hAnsi="Arial" w:cs="Arial"/>
+                <w:sz w:val="16"/>
+                <w:szCs w:val="16"/>
+              </w:rPr>
+              <w:t>- Email: user03@eshop.com</w:t>
+            </w:r>
+            <w:r>
+              <w:rPr>
+                <w:rFonts w:ascii="Arial" w:hAnsi="Arial" w:cs="Arial"/>
+                <w:sz w:val="16"/>
+                <w:szCs w:val="16"/>
+              </w:rPr>
+              <w:t xml:space="preserve"> </w:t>
+            </w:r>
+            <w:r>
+              <w:rPr>
+                <w:rFonts w:ascii="Arial" w:hAnsi="Arial" w:cs="Arial"/>
+                <w:sz w:val="16"/>
+                <w:szCs w:val="16"/>
+              </w:rPr>
+              <w:t>- Mật khẩu: Test@1234</w:t>
+            </w:r>
+            <w:r>
+              <w:rPr>
+                <w:rFonts w:ascii="Arial" w:hAnsi="Arial" w:cs="Arial"/>
+                <w:sz w:val="16"/>
+                <w:szCs w:val="16"/>
+              </w:rPr>
+              <w:t xml:space="preserve"> </w:t>
+            </w:r>
+            <w:r>
+              <w:rPr>
+                <w:rFonts w:ascii="Arial" w:hAnsi="Arial" w:cs="Arial"/>
+                <w:sz w:val="16"/>
+                <w:szCs w:val="16"/>
+              </w:rPr>
+              <w:t>- Xác nhận MK: Test@1234</w:t>
             </w:r>
           </w:p>
         </w:tc>
@@ -589,7 +685,55 @@
                 <w:sz w:val="16"/>
                 <w:szCs w:val="16"/>
               </w:rPr>
-              <w:t>- Họ Tên: " " (Khoảng trắng)&lt;br&gt;- Email: user04@eshop.com&lt;br&gt;- Mật khẩu: Test@1234&lt;br&gt;- Xác nhận MK: Test@1234</w:t>
+              <w:t>- Họ Tên: " " (Khoảng trắng)</w:t>
+            </w:r>
+            <w:r>
+              <w:rPr>
+                <w:rFonts w:ascii="Arial" w:hAnsi="Arial" w:cs="Arial"/>
+                <w:sz w:val="16"/>
+                <w:szCs w:val="16"/>
+              </w:rPr>
+              <w:t xml:space="preserve"> </w:t>
+            </w:r>
+            <w:r>
+              <w:rPr>
+                <w:rFonts w:ascii="Arial" w:hAnsi="Arial" w:cs="Arial"/>
+                <w:sz w:val="16"/>
+                <w:szCs w:val="16"/>
+              </w:rPr>
+              <w:t>- Email: user04@eshop.com</w:t>
+            </w:r>
+            <w:r>
+              <w:rPr>
+                <w:rFonts w:ascii="Arial" w:hAnsi="Arial" w:cs="Arial"/>
+                <w:sz w:val="16"/>
+                <w:szCs w:val="16"/>
+              </w:rPr>
+              <w:t xml:space="preserve"> </w:t>
+            </w:r>
+            <w:r>
+              <w:rPr>
+                <w:rFonts w:ascii="Arial" w:hAnsi="Arial" w:cs="Arial"/>
+                <w:sz w:val="16"/>
+                <w:szCs w:val="16"/>
+              </w:rPr>
+              <w:t>- Mật khẩu: Test@1234</w:t>
+            </w:r>
+            <w:r>
+              <w:rPr>
+                <w:rFonts w:ascii="Arial" w:hAnsi="Arial" w:cs="Arial"/>
+                <w:sz w:val="16"/>
+                <w:szCs w:val="16"/>
+              </w:rPr>
+              <w:t xml:space="preserve"> </w:t>
+            </w:r>
+            <w:r>
+              <w:rPr>
+                <w:rFonts w:ascii="Arial" w:hAnsi="Arial" w:cs="Arial"/>
+                <w:sz w:val="16"/>
+                <w:szCs w:val="16"/>
+              </w:rPr>
+              <w:t>- Xác nhận MK: Test@1234</w:t>
             </w:r>
           </w:p>
         </w:tc>
@@ -690,7 +834,55 @@
                 <w:sz w:val="16"/>
                 <w:szCs w:val="16"/>
               </w:rPr>
-              <w:t>- Họ Tên: Nguyen Van A&lt;br&gt;- Email: "" (Để trống)&lt;br&gt;- Mật khẩu: Test@1234&lt;br&gt;- Xác nhận MK: Test@1234</w:t>
+              <w:t>- Họ Tên: Nguyen Van A</w:t>
+            </w:r>
+            <w:r>
+              <w:rPr>
+                <w:rFonts w:ascii="Arial" w:hAnsi="Arial" w:cs="Arial"/>
+                <w:sz w:val="16"/>
+                <w:szCs w:val="16"/>
+              </w:rPr>
+              <w:t xml:space="preserve"> </w:t>
+            </w:r>
+            <w:r>
+              <w:rPr>
+                <w:rFonts w:ascii="Arial" w:hAnsi="Arial" w:cs="Arial"/>
+                <w:sz w:val="16"/>
+                <w:szCs w:val="16"/>
+              </w:rPr>
+              <w:t>- Email: "" (Để trống)</w:t>
+            </w:r>
+            <w:r>
+              <w:rPr>
+                <w:rFonts w:ascii="Arial" w:hAnsi="Arial" w:cs="Arial"/>
+                <w:sz w:val="16"/>
+                <w:szCs w:val="16"/>
+              </w:rPr>
+              <w:t xml:space="preserve"> </w:t>
+            </w:r>
+            <w:r>
+              <w:rPr>
+                <w:rFonts w:ascii="Arial" w:hAnsi="Arial" w:cs="Arial"/>
+                <w:sz w:val="16"/>
+                <w:szCs w:val="16"/>
+              </w:rPr>
+              <w:t>- Mật khẩu: Test@1234</w:t>
+            </w:r>
+            <w:r>
+              <w:rPr>
+                <w:rFonts w:ascii="Arial" w:hAnsi="Arial" w:cs="Arial"/>
+                <w:sz w:val="16"/>
+                <w:szCs w:val="16"/>
+              </w:rPr>
+              <w:t xml:space="preserve"> </w:t>
+            </w:r>
+            <w:r>
+              <w:rPr>
+                <w:rFonts w:ascii="Arial" w:hAnsi="Arial" w:cs="Arial"/>
+                <w:sz w:val="16"/>
+                <w:szCs w:val="16"/>
+              </w:rPr>
+              <w:t>- Xác nhận MK: Test@1234</w:t>
             </w:r>
           </w:p>
         </w:tc>
@@ -791,7 +983,55 @@
                 <w:sz w:val="16"/>
                 <w:szCs w:val="16"/>
               </w:rPr>
-              <w:t>- Họ Tên: Nguyen Van A&lt;br&gt;- Email: usereshop.com (Thiếu @)&lt;br&gt;- Mật khẩu: Test@1234&lt;br&gt;- Xác nhận MK: Test@1234</w:t>
+              <w:t>- Họ Tên: Nguyen Van A</w:t>
+            </w:r>
+            <w:r>
+              <w:rPr>
+                <w:rFonts w:ascii="Arial" w:hAnsi="Arial" w:cs="Arial"/>
+                <w:sz w:val="16"/>
+                <w:szCs w:val="16"/>
+              </w:rPr>
+              <w:t xml:space="preserve"> </w:t>
+            </w:r>
+            <w:r>
+              <w:rPr>
+                <w:rFonts w:ascii="Arial" w:hAnsi="Arial" w:cs="Arial"/>
+                <w:sz w:val="16"/>
+                <w:szCs w:val="16"/>
+              </w:rPr>
+              <w:t>- Email: usereshop.com (Thiếu @)</w:t>
+            </w:r>
+            <w:r>
+              <w:rPr>
+                <w:rFonts w:ascii="Arial" w:hAnsi="Arial" w:cs="Arial"/>
+                <w:sz w:val="16"/>
+                <w:szCs w:val="16"/>
+              </w:rPr>
+              <w:t xml:space="preserve"> </w:t>
+            </w:r>
+            <w:r>
+              <w:rPr>
+                <w:rFonts w:ascii="Arial" w:hAnsi="Arial" w:cs="Arial"/>
+                <w:sz w:val="16"/>
+                <w:szCs w:val="16"/>
+              </w:rPr>
+              <w:t>- Mật khẩu: Test@1234</w:t>
+            </w:r>
+            <w:r>
+              <w:rPr>
+                <w:rFonts w:ascii="Arial" w:hAnsi="Arial" w:cs="Arial"/>
+                <w:sz w:val="16"/>
+                <w:szCs w:val="16"/>
+              </w:rPr>
+              <w:t xml:space="preserve"> </w:t>
+            </w:r>
+            <w:r>
+              <w:rPr>
+                <w:rFonts w:ascii="Arial" w:hAnsi="Arial" w:cs="Arial"/>
+                <w:sz w:val="16"/>
+                <w:szCs w:val="16"/>
+              </w:rPr>
+              <w:t>- Xác nhận MK: Test@1234</w:t>
             </w:r>
           </w:p>
         </w:tc>
@@ -892,7 +1132,55 @@
                 <w:sz w:val="16"/>
                 <w:szCs w:val="16"/>
               </w:rPr>
-              <w:t>- Họ Tên: Nguyen Van A&lt;br&gt;- Email: user@ (Thiếu domain)&lt;br&gt;- Mật khẩu: Test@1234&lt;br&gt;- Xác nhận MK: Test@1234</w:t>
+              <w:t>- Họ Tên: Nguyen Van A</w:t>
+            </w:r>
+            <w:r>
+              <w:rPr>
+                <w:rFonts w:ascii="Arial" w:hAnsi="Arial" w:cs="Arial"/>
+                <w:sz w:val="16"/>
+                <w:szCs w:val="16"/>
+              </w:rPr>
+              <w:t xml:space="preserve"> </w:t>
+            </w:r>
+            <w:r>
+              <w:rPr>
+                <w:rFonts w:ascii="Arial" w:hAnsi="Arial" w:cs="Arial"/>
+                <w:sz w:val="16"/>
+                <w:szCs w:val="16"/>
+              </w:rPr>
+              <w:t>- Email: user@ (Thiếu domain)</w:t>
+            </w:r>
+            <w:r>
+              <w:rPr>
+                <w:rFonts w:ascii="Arial" w:hAnsi="Arial" w:cs="Arial"/>
+                <w:sz w:val="16"/>
+                <w:szCs w:val="16"/>
+              </w:rPr>
+              <w:t xml:space="preserve"> </w:t>
+            </w:r>
+            <w:r>
+              <w:rPr>
+                <w:rFonts w:ascii="Arial" w:hAnsi="Arial" w:cs="Arial"/>
+                <w:sz w:val="16"/>
+                <w:szCs w:val="16"/>
+              </w:rPr>
+              <w:t>- Mật khẩu: Test@1234</w:t>
+            </w:r>
+            <w:r>
+              <w:rPr>
+                <w:rFonts w:ascii="Arial" w:hAnsi="Arial" w:cs="Arial"/>
+                <w:sz w:val="16"/>
+                <w:szCs w:val="16"/>
+              </w:rPr>
+              <w:t xml:space="preserve"> </w:t>
+            </w:r>
+            <w:r>
+              <w:rPr>
+                <w:rFonts w:ascii="Arial" w:hAnsi="Arial" w:cs="Arial"/>
+                <w:sz w:val="16"/>
+                <w:szCs w:val="16"/>
+              </w:rPr>
+              <w:t>- Xác nhận MK: Test@1234</w:t>
             </w:r>
           </w:p>
         </w:tc>
@@ -993,7 +1281,55 @@
                 <w:sz w:val="16"/>
                 <w:szCs w:val="16"/>
               </w:rPr>
-              <w:t>- Họ Tên: Nguyen Van A&lt;br&gt;- Email: @eshop.com (Thiếu local-part)&lt;br&gt;- Mật khẩu: Test@1234&lt;br&gt;- Xác nhận MK: Test@1234</w:t>
+              <w:t>- Họ Tên: Nguyen Van A</w:t>
+            </w:r>
+            <w:r>
+              <w:rPr>
+                <w:rFonts w:ascii="Arial" w:hAnsi="Arial" w:cs="Arial"/>
+                <w:sz w:val="16"/>
+                <w:szCs w:val="16"/>
+              </w:rPr>
+              <w:t xml:space="preserve"> </w:t>
+            </w:r>
+            <w:r>
+              <w:rPr>
+                <w:rFonts w:ascii="Arial" w:hAnsi="Arial" w:cs="Arial"/>
+                <w:sz w:val="16"/>
+                <w:szCs w:val="16"/>
+              </w:rPr>
+              <w:t>- Email: @eshop.com (Thiếu local-part)</w:t>
+            </w:r>
+            <w:r>
+              <w:rPr>
+                <w:rFonts w:ascii="Arial" w:hAnsi="Arial" w:cs="Arial"/>
+                <w:sz w:val="16"/>
+                <w:szCs w:val="16"/>
+              </w:rPr>
+              <w:t xml:space="preserve"> </w:t>
+            </w:r>
+            <w:r>
+              <w:rPr>
+                <w:rFonts w:ascii="Arial" w:hAnsi="Arial" w:cs="Arial"/>
+                <w:sz w:val="16"/>
+                <w:szCs w:val="16"/>
+              </w:rPr>
+              <w:t>- Mật khẩu: Test@1234</w:t>
+            </w:r>
+            <w:r>
+              <w:rPr>
+                <w:rFonts w:ascii="Arial" w:hAnsi="Arial" w:cs="Arial"/>
+                <w:sz w:val="16"/>
+                <w:szCs w:val="16"/>
+              </w:rPr>
+              <w:t xml:space="preserve"> </w:t>
+            </w:r>
+            <w:r>
+              <w:rPr>
+                <w:rFonts w:ascii="Arial" w:hAnsi="Arial" w:cs="Arial"/>
+                <w:sz w:val="16"/>
+                <w:szCs w:val="16"/>
+              </w:rPr>
+              <w:t>- Xác nhận MK: Test@1234</w:t>
             </w:r>
           </w:p>
         </w:tc>
@@ -1094,7 +1430,55 @@
                 <w:sz w:val="16"/>
                 <w:szCs w:val="16"/>
               </w:rPr>
-              <w:t>- Họ Tên: Nguyen Van A&lt;br&gt;- Email: user@eshop (Thiếu TLD)&lt;br&gt;- Mật khẩu: Test@1234&lt;br&gt;- Xác nhận MK: Test@1234</w:t>
+              <w:t>- Họ Tên: Nguyen Van A</w:t>
+            </w:r>
+            <w:r>
+              <w:rPr>
+                <w:rFonts w:ascii="Arial" w:hAnsi="Arial" w:cs="Arial"/>
+                <w:sz w:val="16"/>
+                <w:szCs w:val="16"/>
+              </w:rPr>
+              <w:t xml:space="preserve"> </w:t>
+            </w:r>
+            <w:r>
+              <w:rPr>
+                <w:rFonts w:ascii="Arial" w:hAnsi="Arial" w:cs="Arial"/>
+                <w:sz w:val="16"/>
+                <w:szCs w:val="16"/>
+              </w:rPr>
+              <w:t>- Email: user@eshop (Thiếu TLD)</w:t>
+            </w:r>
+            <w:r>
+              <w:rPr>
+                <w:rFonts w:ascii="Arial" w:hAnsi="Arial" w:cs="Arial"/>
+                <w:sz w:val="16"/>
+                <w:szCs w:val="16"/>
+              </w:rPr>
+              <w:t xml:space="preserve"> </w:t>
+            </w:r>
+            <w:r>
+              <w:rPr>
+                <w:rFonts w:ascii="Arial" w:hAnsi="Arial" w:cs="Arial"/>
+                <w:sz w:val="16"/>
+                <w:szCs w:val="16"/>
+              </w:rPr>
+              <w:t>- Mật khẩu: Test@1234</w:t>
+            </w:r>
+            <w:r>
+              <w:rPr>
+                <w:rFonts w:ascii="Arial" w:hAnsi="Arial" w:cs="Arial"/>
+                <w:sz w:val="16"/>
+                <w:szCs w:val="16"/>
+              </w:rPr>
+              <w:t xml:space="preserve"> </w:t>
+            </w:r>
+            <w:r>
+              <w:rPr>
+                <w:rFonts w:ascii="Arial" w:hAnsi="Arial" w:cs="Arial"/>
+                <w:sz w:val="16"/>
+                <w:szCs w:val="16"/>
+              </w:rPr>
+              <w:t>- Xác nhận MK: Test@1234</w:t>
             </w:r>
           </w:p>
         </w:tc>
@@ -1195,7 +1579,55 @@
                 <w:sz w:val="16"/>
                 <w:szCs w:val="16"/>
               </w:rPr>
-              <w:t>- Họ Tên: Nguyen Van A&lt;br&gt;- Email: user name@eshop.com (Có space)&lt;br&gt;- Mật khẩu: Test@1234&lt;br&gt;- Xác nhận MK: Test@1234</w:t>
+              <w:t>- Họ Tên: Nguyen Van A</w:t>
+            </w:r>
+            <w:r>
+              <w:rPr>
+                <w:rFonts w:ascii="Arial" w:hAnsi="Arial" w:cs="Arial"/>
+                <w:sz w:val="16"/>
+                <w:szCs w:val="16"/>
+              </w:rPr>
+              <w:t xml:space="preserve"> </w:t>
+            </w:r>
+            <w:r>
+              <w:rPr>
+                <w:rFonts w:ascii="Arial" w:hAnsi="Arial" w:cs="Arial"/>
+                <w:sz w:val="16"/>
+                <w:szCs w:val="16"/>
+              </w:rPr>
+              <w:t>- Email: user name@eshop.com (Có space)</w:t>
+            </w:r>
+            <w:r>
+              <w:rPr>
+                <w:rFonts w:ascii="Arial" w:hAnsi="Arial" w:cs="Arial"/>
+                <w:sz w:val="16"/>
+                <w:szCs w:val="16"/>
+              </w:rPr>
+              <w:t xml:space="preserve"> </w:t>
+            </w:r>
+            <w:r>
+              <w:rPr>
+                <w:rFonts w:ascii="Arial" w:hAnsi="Arial" w:cs="Arial"/>
+                <w:sz w:val="16"/>
+                <w:szCs w:val="16"/>
+              </w:rPr>
+              <w:t>- Mật khẩu: Test@1234</w:t>
+            </w:r>
+            <w:r>
+              <w:rPr>
+                <w:rFonts w:ascii="Arial" w:hAnsi="Arial" w:cs="Arial"/>
+                <w:sz w:val="16"/>
+                <w:szCs w:val="16"/>
+              </w:rPr>
+              <w:t xml:space="preserve"> </w:t>
+            </w:r>
+            <w:r>
+              <w:rPr>
+                <w:rFonts w:ascii="Arial" w:hAnsi="Arial" w:cs="Arial"/>
+                <w:sz w:val="16"/>
+                <w:szCs w:val="16"/>
+              </w:rPr>
+              <w:t>- Xác nhận MK: Test@1234</w:t>
             </w:r>
           </w:p>
         </w:tc>
@@ -1296,7 +1728,55 @@
                 <w:sz w:val="16"/>
                 <w:szCs w:val="16"/>
               </w:rPr>
-              <w:t>- Họ Tên: Nguyen Van A&lt;br&gt;- Email: existing_user@eshop.com&lt;br&gt;- Mật khẩu: Test@1234&lt;br&gt;- Xác nhận MK: Test@1234</w:t>
+              <w:t>- Họ Tên: Nguyen Van A</w:t>
+            </w:r>
+            <w:r>
+              <w:rPr>
+                <w:rFonts w:ascii="Arial" w:hAnsi="Arial" w:cs="Arial"/>
+                <w:sz w:val="16"/>
+                <w:szCs w:val="16"/>
+              </w:rPr>
+              <w:t xml:space="preserve"> </w:t>
+            </w:r>
+            <w:r>
+              <w:rPr>
+                <w:rFonts w:ascii="Arial" w:hAnsi="Arial" w:cs="Arial"/>
+                <w:sz w:val="16"/>
+                <w:szCs w:val="16"/>
+              </w:rPr>
+              <w:t>- Email: existing_user@eshop.com</w:t>
+            </w:r>
+            <w:r>
+              <w:rPr>
+                <w:rFonts w:ascii="Arial" w:hAnsi="Arial" w:cs="Arial"/>
+                <w:sz w:val="16"/>
+                <w:szCs w:val="16"/>
+              </w:rPr>
+              <w:t xml:space="preserve"> </w:t>
+            </w:r>
+            <w:r>
+              <w:rPr>
+                <w:rFonts w:ascii="Arial" w:hAnsi="Arial" w:cs="Arial"/>
+                <w:sz w:val="16"/>
+                <w:szCs w:val="16"/>
+              </w:rPr>
+              <w:t>- Mật khẩu: Test@1234</w:t>
+            </w:r>
+            <w:r>
+              <w:rPr>
+                <w:rFonts w:ascii="Arial" w:hAnsi="Arial" w:cs="Arial"/>
+                <w:sz w:val="16"/>
+                <w:szCs w:val="16"/>
+              </w:rPr>
+              <w:t xml:space="preserve"> </w:t>
+            </w:r>
+            <w:r>
+              <w:rPr>
+                <w:rFonts w:ascii="Arial" w:hAnsi="Arial" w:cs="Arial"/>
+                <w:sz w:val="16"/>
+                <w:szCs w:val="16"/>
+              </w:rPr>
+              <w:t>- Xác nhận MK: Test@1234</w:t>
             </w:r>
           </w:p>
         </w:tc>
@@ -1398,7 +1878,55 @@
                 <w:sz w:val="16"/>
                 <w:szCs w:val="16"/>
               </w:rPr>
-              <w:t>- Họ Tên: Nguyen Van A&lt;br&gt;- Email: user12@eshop.com&lt;br&gt;- Mật khẩu: "" (Để trống)&lt;br&gt;- Xác nhận MK: ""</w:t>
+              <w:t>- Họ Tên: Nguyen Van A</w:t>
+            </w:r>
+            <w:r>
+              <w:rPr>
+                <w:rFonts w:ascii="Arial" w:hAnsi="Arial" w:cs="Arial"/>
+                <w:sz w:val="16"/>
+                <w:szCs w:val="16"/>
+              </w:rPr>
+              <w:t xml:space="preserve"> </w:t>
+            </w:r>
+            <w:r>
+              <w:rPr>
+                <w:rFonts w:ascii="Arial" w:hAnsi="Arial" w:cs="Arial"/>
+                <w:sz w:val="16"/>
+                <w:szCs w:val="16"/>
+              </w:rPr>
+              <w:t>- Email: user12@eshop.com</w:t>
+            </w:r>
+            <w:r>
+              <w:rPr>
+                <w:rFonts w:ascii="Arial" w:hAnsi="Arial" w:cs="Arial"/>
+                <w:sz w:val="16"/>
+                <w:szCs w:val="16"/>
+              </w:rPr>
+              <w:t xml:space="preserve"> </w:t>
+            </w:r>
+            <w:r>
+              <w:rPr>
+                <w:rFonts w:ascii="Arial" w:hAnsi="Arial" w:cs="Arial"/>
+                <w:sz w:val="16"/>
+                <w:szCs w:val="16"/>
+              </w:rPr>
+              <w:t>- Mật khẩu: "" (Để trống)</w:t>
+            </w:r>
+            <w:r>
+              <w:rPr>
+                <w:rFonts w:ascii="Arial" w:hAnsi="Arial" w:cs="Arial"/>
+                <w:sz w:val="16"/>
+                <w:szCs w:val="16"/>
+              </w:rPr>
+              <w:t xml:space="preserve"> </w:t>
+            </w:r>
+            <w:r>
+              <w:rPr>
+                <w:rFonts w:ascii="Arial" w:hAnsi="Arial" w:cs="Arial"/>
+                <w:sz w:val="16"/>
+                <w:szCs w:val="16"/>
+              </w:rPr>
+              <w:t>- Xác nhận MK: ""</w:t>
             </w:r>
           </w:p>
         </w:tc>
@@ -1499,7 +2027,55 @@
                 <w:sz w:val="16"/>
                 <w:szCs w:val="16"/>
               </w:rPr>
-              <w:t>- Họ Tên: Nguyen Van A&lt;br&gt;- Email: user13@eshop.com&lt;br&gt;- Mật khẩu: Pass1@a (7 ký tự - Biên dưới)&lt;br&gt;- Xác nhận MK: Pass1@a</w:t>
+              <w:t>- Họ Tên: Nguyen Van A</w:t>
+            </w:r>
+            <w:r>
+              <w:rPr>
+                <w:rFonts w:ascii="Arial" w:hAnsi="Arial" w:cs="Arial"/>
+                <w:sz w:val="16"/>
+                <w:szCs w:val="16"/>
+              </w:rPr>
+              <w:t xml:space="preserve"> </w:t>
+            </w:r>
+            <w:r>
+              <w:rPr>
+                <w:rFonts w:ascii="Arial" w:hAnsi="Arial" w:cs="Arial"/>
+                <w:sz w:val="16"/>
+                <w:szCs w:val="16"/>
+              </w:rPr>
+              <w:t>- Email: user13@eshop.com</w:t>
+            </w:r>
+            <w:r>
+              <w:rPr>
+                <w:rFonts w:ascii="Arial" w:hAnsi="Arial" w:cs="Arial"/>
+                <w:sz w:val="16"/>
+                <w:szCs w:val="16"/>
+              </w:rPr>
+              <w:t xml:space="preserve"> </w:t>
+            </w:r>
+            <w:r>
+              <w:rPr>
+                <w:rFonts w:ascii="Arial" w:hAnsi="Arial" w:cs="Arial"/>
+                <w:sz w:val="16"/>
+                <w:szCs w:val="16"/>
+              </w:rPr>
+              <w:t>- Mật khẩu: Pass1@a (7 ký tự - Biên dưới)</w:t>
+            </w:r>
+            <w:r>
+              <w:rPr>
+                <w:rFonts w:ascii="Arial" w:hAnsi="Arial" w:cs="Arial"/>
+                <w:sz w:val="16"/>
+                <w:szCs w:val="16"/>
+              </w:rPr>
+              <w:t xml:space="preserve"> </w:t>
+            </w:r>
+            <w:r>
+              <w:rPr>
+                <w:rFonts w:ascii="Arial" w:hAnsi="Arial" w:cs="Arial"/>
+                <w:sz w:val="16"/>
+                <w:szCs w:val="16"/>
+              </w:rPr>
+              <w:t>- Xác nhận MK: Pass1@a</w:t>
             </w:r>
           </w:p>
         </w:tc>
@@ -1600,7 +2176,55 @@
                 <w:sz w:val="16"/>
                 <w:szCs w:val="16"/>
               </w:rPr>
-              <w:t>- Họ Tên: Nguyen Van A&lt;br&gt;- Email: user14@eshop.com&lt;br&gt;- Mật khẩu: pass@1234 (Thiếu chữ hoa)&lt;br&gt;- Xác nhận MK: pass@1234</w:t>
+              <w:t>- Họ Tên: Nguyen Van A</w:t>
+            </w:r>
+            <w:r>
+              <w:rPr>
+                <w:rFonts w:ascii="Arial" w:hAnsi="Arial" w:cs="Arial"/>
+                <w:sz w:val="16"/>
+                <w:szCs w:val="16"/>
+              </w:rPr>
+              <w:t xml:space="preserve"> </w:t>
+            </w:r>
+            <w:r>
+              <w:rPr>
+                <w:rFonts w:ascii="Arial" w:hAnsi="Arial" w:cs="Arial"/>
+                <w:sz w:val="16"/>
+                <w:szCs w:val="16"/>
+              </w:rPr>
+              <w:t>- Email: user14@eshop.com</w:t>
+            </w:r>
+            <w:r>
+              <w:rPr>
+                <w:rFonts w:ascii="Arial" w:hAnsi="Arial" w:cs="Arial"/>
+                <w:sz w:val="16"/>
+                <w:szCs w:val="16"/>
+              </w:rPr>
+              <w:t xml:space="preserve"> </w:t>
+            </w:r>
+            <w:r>
+              <w:rPr>
+                <w:rFonts w:ascii="Arial" w:hAnsi="Arial" w:cs="Arial"/>
+                <w:sz w:val="16"/>
+                <w:szCs w:val="16"/>
+              </w:rPr>
+              <w:t>- Mật khẩu: pass@1234 (Thiếu chữ hoa)</w:t>
+            </w:r>
+            <w:r>
+              <w:rPr>
+                <w:rFonts w:ascii="Arial" w:hAnsi="Arial" w:cs="Arial"/>
+                <w:sz w:val="16"/>
+                <w:szCs w:val="16"/>
+              </w:rPr>
+              <w:t xml:space="preserve"> </w:t>
+            </w:r>
+            <w:r>
+              <w:rPr>
+                <w:rFonts w:ascii="Arial" w:hAnsi="Arial" w:cs="Arial"/>
+                <w:sz w:val="16"/>
+                <w:szCs w:val="16"/>
+              </w:rPr>
+              <w:t>- Xác nhận MK: pass@1234</w:t>
             </w:r>
           </w:p>
         </w:tc>
@@ -1701,7 +2325,55 @@
                 <w:sz w:val="16"/>
                 <w:szCs w:val="16"/>
               </w:rPr>
-              <w:t>- Họ Tên: Nguyen Van A&lt;br&gt;- Email: user15@eshop.com&lt;br&gt;- Mật khẩu: PASS@1234 (Thiếu chữ thường)&lt;br&gt;- Xác nhận MK: PASS@1234</w:t>
+              <w:t>- Họ Tên: Nguyen Van A</w:t>
+            </w:r>
+            <w:r>
+              <w:rPr>
+                <w:rFonts w:ascii="Arial" w:hAnsi="Arial" w:cs="Arial"/>
+                <w:sz w:val="16"/>
+                <w:szCs w:val="16"/>
+              </w:rPr>
+              <w:t xml:space="preserve"> </w:t>
+            </w:r>
+            <w:r>
+              <w:rPr>
+                <w:rFonts w:ascii="Arial" w:hAnsi="Arial" w:cs="Arial"/>
+                <w:sz w:val="16"/>
+                <w:szCs w:val="16"/>
+              </w:rPr>
+              <w:t>- Email: user15@eshop.com</w:t>
+            </w:r>
+            <w:r>
+              <w:rPr>
+                <w:rFonts w:ascii="Arial" w:hAnsi="Arial" w:cs="Arial"/>
+                <w:sz w:val="16"/>
+                <w:szCs w:val="16"/>
+              </w:rPr>
+              <w:t xml:space="preserve"> </w:t>
+            </w:r>
+            <w:r>
+              <w:rPr>
+                <w:rFonts w:ascii="Arial" w:hAnsi="Arial" w:cs="Arial"/>
+                <w:sz w:val="16"/>
+                <w:szCs w:val="16"/>
+              </w:rPr>
+              <w:t>- Mật khẩu: PASS@1234 (Thiếu chữ thường)</w:t>
+            </w:r>
+            <w:r>
+              <w:rPr>
+                <w:rFonts w:ascii="Arial" w:hAnsi="Arial" w:cs="Arial"/>
+                <w:sz w:val="16"/>
+                <w:szCs w:val="16"/>
+              </w:rPr>
+              <w:t xml:space="preserve"> </w:t>
+            </w:r>
+            <w:r>
+              <w:rPr>
+                <w:rFonts w:ascii="Arial" w:hAnsi="Arial" w:cs="Arial"/>
+                <w:sz w:val="16"/>
+                <w:szCs w:val="16"/>
+              </w:rPr>
+              <w:t>- Xác nhận MK: PASS@1234</w:t>
             </w:r>
           </w:p>
         </w:tc>
@@ -1802,7 +2474,55 @@
                 <w:sz w:val="16"/>
                 <w:szCs w:val="16"/>
               </w:rPr>
-              <w:t>- Họ Tên: Nguyen Van A&lt;br&gt;- Email: user16@eshop.com&lt;br&gt;- Mật khẩu: Password@! (Thiếu số)&lt;br&gt;- Xác nhận MK: Password@!</w:t>
+              <w:t>- Họ Tên: Nguyen Van A</w:t>
+            </w:r>
+            <w:r>
+              <w:rPr>
+                <w:rFonts w:ascii="Arial" w:hAnsi="Arial" w:cs="Arial"/>
+                <w:sz w:val="16"/>
+                <w:szCs w:val="16"/>
+              </w:rPr>
+              <w:t xml:space="preserve"> </w:t>
+            </w:r>
+            <w:r>
+              <w:rPr>
+                <w:rFonts w:ascii="Arial" w:hAnsi="Arial" w:cs="Arial"/>
+                <w:sz w:val="16"/>
+                <w:szCs w:val="16"/>
+              </w:rPr>
+              <w:t>- Email: user16@eshop.com</w:t>
+            </w:r>
+            <w:r>
+              <w:rPr>
+                <w:rFonts w:ascii="Arial" w:hAnsi="Arial" w:cs="Arial"/>
+                <w:sz w:val="16"/>
+                <w:szCs w:val="16"/>
+              </w:rPr>
+              <w:t xml:space="preserve"> </w:t>
+            </w:r>
+            <w:r>
+              <w:rPr>
+                <w:rFonts w:ascii="Arial" w:hAnsi="Arial" w:cs="Arial"/>
+                <w:sz w:val="16"/>
+                <w:szCs w:val="16"/>
+              </w:rPr>
+              <w:t>- Mật khẩu: Password@! (Thiếu số)</w:t>
+            </w:r>
+            <w:r>
+              <w:rPr>
+                <w:rFonts w:ascii="Arial" w:hAnsi="Arial" w:cs="Arial"/>
+                <w:sz w:val="16"/>
+                <w:szCs w:val="16"/>
+              </w:rPr>
+              <w:t xml:space="preserve"> </w:t>
+            </w:r>
+            <w:r>
+              <w:rPr>
+                <w:rFonts w:ascii="Arial" w:hAnsi="Arial" w:cs="Arial"/>
+                <w:sz w:val="16"/>
+                <w:szCs w:val="16"/>
+              </w:rPr>
+              <w:t>- Xác nhận MK: Password@!</w:t>
             </w:r>
           </w:p>
         </w:tc>
@@ -1903,7 +2623,55 @@
                 <w:sz w:val="16"/>
                 <w:szCs w:val="16"/>
               </w:rPr>
-              <w:t>- Họ Tên: Nguyen Van A&lt;br&gt;- Email: user17@eshop.com&lt;br&gt;- Mật khẩu: Password123 (Thiếu ký tự đặc biệt)&lt;br&gt;- Xác nhận MK: Password123</w:t>
+              <w:t>- Họ Tên: Nguyen Van A</w:t>
+            </w:r>
+            <w:r>
+              <w:rPr>
+                <w:rFonts w:ascii="Arial" w:hAnsi="Arial" w:cs="Arial"/>
+                <w:sz w:val="16"/>
+                <w:szCs w:val="16"/>
+              </w:rPr>
+              <w:t xml:space="preserve"> </w:t>
+            </w:r>
+            <w:r>
+              <w:rPr>
+                <w:rFonts w:ascii="Arial" w:hAnsi="Arial" w:cs="Arial"/>
+                <w:sz w:val="16"/>
+                <w:szCs w:val="16"/>
+              </w:rPr>
+              <w:t>- Email: user17@eshop.com</w:t>
+            </w:r>
+            <w:r>
+              <w:rPr>
+                <w:rFonts w:ascii="Arial" w:hAnsi="Arial" w:cs="Arial"/>
+                <w:sz w:val="16"/>
+                <w:szCs w:val="16"/>
+              </w:rPr>
+              <w:t xml:space="preserve"> </w:t>
+            </w:r>
+            <w:r>
+              <w:rPr>
+                <w:rFonts w:ascii="Arial" w:hAnsi="Arial" w:cs="Arial"/>
+                <w:sz w:val="16"/>
+                <w:szCs w:val="16"/>
+              </w:rPr>
+              <w:t>- Mật khẩu: Password123 (Thiếu ký tự đặc biệt)</w:t>
+            </w:r>
+            <w:r>
+              <w:rPr>
+                <w:rFonts w:ascii="Arial" w:hAnsi="Arial" w:cs="Arial"/>
+                <w:sz w:val="16"/>
+                <w:szCs w:val="16"/>
+              </w:rPr>
+              <w:t xml:space="preserve"> </w:t>
+            </w:r>
+            <w:r>
+              <w:rPr>
+                <w:rFonts w:ascii="Arial" w:hAnsi="Arial" w:cs="Arial"/>
+                <w:sz w:val="16"/>
+                <w:szCs w:val="16"/>
+              </w:rPr>
+              <w:t>- Xác nhận MK: Password123</w:t>
             </w:r>
           </w:p>
         </w:tc>
@@ -2004,7 +2772,55 @@
                 <w:sz w:val="16"/>
                 <w:szCs w:val="16"/>
               </w:rPr>
-              <w:t>- Họ Tên: Nguyen Van A&lt;br&gt;- Email: user18@eshop.com&lt;br&gt;- Mật khẩu: Password#123 (Dùng ký tự # ngoài nhóm)&lt;br&gt;- Xác nhận MK: Password#123</w:t>
+              <w:t>- Họ Tên: Nguyen Van A</w:t>
+            </w:r>
+            <w:r>
+              <w:rPr>
+                <w:rFonts w:ascii="Arial" w:hAnsi="Arial" w:cs="Arial"/>
+                <w:sz w:val="16"/>
+                <w:szCs w:val="16"/>
+              </w:rPr>
+              <w:t xml:space="preserve"> </w:t>
+            </w:r>
+            <w:r>
+              <w:rPr>
+                <w:rFonts w:ascii="Arial" w:hAnsi="Arial" w:cs="Arial"/>
+                <w:sz w:val="16"/>
+                <w:szCs w:val="16"/>
+              </w:rPr>
+              <w:t>- Email: user18@eshop.com</w:t>
+            </w:r>
+            <w:r>
+              <w:rPr>
+                <w:rFonts w:ascii="Arial" w:hAnsi="Arial" w:cs="Arial"/>
+                <w:sz w:val="16"/>
+                <w:szCs w:val="16"/>
+              </w:rPr>
+              <w:t xml:space="preserve"> </w:t>
+            </w:r>
+            <w:r>
+              <w:rPr>
+                <w:rFonts w:ascii="Arial" w:hAnsi="Arial" w:cs="Arial"/>
+                <w:sz w:val="16"/>
+                <w:szCs w:val="16"/>
+              </w:rPr>
+              <w:t>- Mật khẩu: Password#123 (Dùng ký tự # ngoài nhóm)</w:t>
+            </w:r>
+            <w:r>
+              <w:rPr>
+                <w:rFonts w:ascii="Arial" w:hAnsi="Arial" w:cs="Arial"/>
+                <w:sz w:val="16"/>
+                <w:szCs w:val="16"/>
+              </w:rPr>
+              <w:t xml:space="preserve"> </w:t>
+            </w:r>
+            <w:r>
+              <w:rPr>
+                <w:rFonts w:ascii="Arial" w:hAnsi="Arial" w:cs="Arial"/>
+                <w:sz w:val="16"/>
+                <w:szCs w:val="16"/>
+              </w:rPr>
+              <w:t>- Xác nhận MK: Password#123</w:t>
             </w:r>
           </w:p>
         </w:tc>
@@ -2105,7 +2921,55 @@
                 <w:sz w:val="16"/>
                 <w:szCs w:val="16"/>
               </w:rPr>
-              <w:t>- Họ Tên: Nguyen Van A&lt;br&gt;- Email: user19@eshop.com&lt;br&gt;- Mật khẩu: Test@1234&lt;br&gt;- Xác nhận MK: "" (Để trống)</w:t>
+              <w:t>- Họ Tên: Nguyen Van A</w:t>
+            </w:r>
+            <w:r>
+              <w:rPr>
+                <w:rFonts w:ascii="Arial" w:hAnsi="Arial" w:cs="Arial"/>
+                <w:sz w:val="16"/>
+                <w:szCs w:val="16"/>
+              </w:rPr>
+              <w:t xml:space="preserve"> </w:t>
+            </w:r>
+            <w:r>
+              <w:rPr>
+                <w:rFonts w:ascii="Arial" w:hAnsi="Arial" w:cs="Arial"/>
+                <w:sz w:val="16"/>
+                <w:szCs w:val="16"/>
+              </w:rPr>
+              <w:t>- Email: user19@eshop.com</w:t>
+            </w:r>
+            <w:r>
+              <w:rPr>
+                <w:rFonts w:ascii="Arial" w:hAnsi="Arial" w:cs="Arial"/>
+                <w:sz w:val="16"/>
+                <w:szCs w:val="16"/>
+              </w:rPr>
+              <w:t xml:space="preserve"> </w:t>
+            </w:r>
+            <w:r>
+              <w:rPr>
+                <w:rFonts w:ascii="Arial" w:hAnsi="Arial" w:cs="Arial"/>
+                <w:sz w:val="16"/>
+                <w:szCs w:val="16"/>
+              </w:rPr>
+              <w:t>- Mật khẩu: Test@1234</w:t>
+            </w:r>
+            <w:r>
+              <w:rPr>
+                <w:rFonts w:ascii="Arial" w:hAnsi="Arial" w:cs="Arial"/>
+                <w:sz w:val="16"/>
+                <w:szCs w:val="16"/>
+              </w:rPr>
+              <w:t xml:space="preserve"> </w:t>
+            </w:r>
+            <w:r>
+              <w:rPr>
+                <w:rFonts w:ascii="Arial" w:hAnsi="Arial" w:cs="Arial"/>
+                <w:sz w:val="16"/>
+                <w:szCs w:val="16"/>
+              </w:rPr>
+              <w:t>- Xác nhận MK: "" (Để trống)</w:t>
             </w:r>
           </w:p>
         </w:tc>
@@ -2206,7 +3070,55 @@
                 <w:sz w:val="16"/>
                 <w:szCs w:val="16"/>
               </w:rPr>
-              <w:t>- Họ Tên: Nguyen Van A&lt;br&gt;- Email: user20@eshop.com&lt;br&gt;- Mật khẩu: Test@1234&lt;br&gt;- Xác nhận MK: Test@12345 (Không khớp)</w:t>
+              <w:t>- Họ Tên: Nguyen Van A</w:t>
+            </w:r>
+            <w:r>
+              <w:rPr>
+                <w:rFonts w:ascii="Arial" w:hAnsi="Arial" w:cs="Arial"/>
+                <w:sz w:val="16"/>
+                <w:szCs w:val="16"/>
+              </w:rPr>
+              <w:t xml:space="preserve"> </w:t>
+            </w:r>
+            <w:r>
+              <w:rPr>
+                <w:rFonts w:ascii="Arial" w:hAnsi="Arial" w:cs="Arial"/>
+                <w:sz w:val="16"/>
+                <w:szCs w:val="16"/>
+              </w:rPr>
+              <w:t>- Email: user20@eshop.com</w:t>
+            </w:r>
+            <w:r>
+              <w:rPr>
+                <w:rFonts w:ascii="Arial" w:hAnsi="Arial" w:cs="Arial"/>
+                <w:sz w:val="16"/>
+                <w:szCs w:val="16"/>
+              </w:rPr>
+              <w:t xml:space="preserve"> </w:t>
+            </w:r>
+            <w:r>
+              <w:rPr>
+                <w:rFonts w:ascii="Arial" w:hAnsi="Arial" w:cs="Arial"/>
+                <w:sz w:val="16"/>
+                <w:szCs w:val="16"/>
+              </w:rPr>
+              <w:t>- Mật khẩu: Test@1234</w:t>
+            </w:r>
+            <w:r>
+              <w:rPr>
+                <w:rFonts w:ascii="Arial" w:hAnsi="Arial" w:cs="Arial"/>
+                <w:sz w:val="16"/>
+                <w:szCs w:val="16"/>
+              </w:rPr>
+              <w:t xml:space="preserve"> </w:t>
+            </w:r>
+            <w:r>
+              <w:rPr>
+                <w:rFonts w:ascii="Arial" w:hAnsi="Arial" w:cs="Arial"/>
+                <w:sz w:val="16"/>
+                <w:szCs w:val="16"/>
+              </w:rPr>
+              <w:t>- Xác nhận MK: Test@12345 (Không khớp)</w:t>
             </w:r>
           </w:p>
         </w:tc>
@@ -12778,17 +13690,7 @@
           <w:sz w:val="20"/>
           <w:szCs w:val="20"/>
         </w:rPr>
-        <w:t>so sán</w:t>
-      </w:r>
-      <w:bookmarkStart w:id="1" w:name="_GoBack"/>
-      <w:bookmarkEnd w:id="1"/>
-      <w:r>
-        <w:rPr>
-          <w:rFonts w:ascii="Arial" w:hAnsi="Arial" w:cs="Arial"/>
-          <w:sz w:val="20"/>
-          <w:szCs w:val="20"/>
-        </w:rPr>
-        <w:t>h (`&gt;`, `&lt;`, `&gt;=`, `&lt;=`).</w:t>
+        <w:t>so sánh (`&gt;`, `&lt;`, `&gt;=`, `&lt;=`).</w:t>
       </w:r>
     </w:p>
     <w:p>
@@ -13120,6 +14022,2070 @@
         </w:rPr>
         <w:t>` trong khi giữ nguyên các thông tin sản phẩm và trạng thái đăng nhập hợp lệ, giúp việc xác định nguyên nhân lỗi (nếu xảy ra) trở nên chính xác tuyệt đối.</w:t>
       </w:r>
+    </w:p>
+    <w:p>
+      <w:pPr>
+        <w:pStyle w:val="Heading4"/>
+        <w:rPr>
+          <w:rFonts w:ascii="Arial" w:hAnsi="Arial" w:cs="Arial"/>
+        </w:rPr>
+      </w:pPr>
+      <w:r>
+        <w:rPr>
+          <w:rFonts w:ascii="Arial" w:hAnsi="Arial" w:cs="Arial"/>
+        </w:rPr>
+        <w:t>FR</w:t>
+      </w:r>
+      <w:r>
+        <w:rPr>
+          <w:rFonts w:ascii="Arial" w:hAnsi="Arial" w:cs="Arial"/>
+        </w:rPr>
+        <w:t>15 – Quản lý sản phẩm</w:t>
+      </w:r>
+    </w:p>
+    <w:p>
+      <w:pPr>
+        <w:pStyle w:val="Heading5"/>
+        <w:rPr>
+          <w:rFonts w:ascii="Arial" w:hAnsi="Arial" w:cs="Arial"/>
+          <w:b/>
+          <w:i/>
+        </w:rPr>
+      </w:pPr>
+      <w:r>
+        <w:rPr>
+          <w:rFonts w:ascii="Arial" w:hAnsi="Arial" w:cs="Arial"/>
+          <w:b/>
+          <w:i/>
+        </w:rPr>
+        <w:t>Domain Testing</w:t>
+      </w:r>
+    </w:p>
+    <w:tbl>
+      <w:tblPr>
+        <w:tblStyle w:val="TableGrid"/>
+        <w:tblW w:w="0" w:type="auto"/>
+        <w:tblLook w:val="04A0" w:firstRow="1" w:lastRow="0" w:firstColumn="1" w:lastColumn="0" w:noHBand="0" w:noVBand="1"/>
+      </w:tblPr>
+      <w:tblGrid>
+        <w:gridCol w:w="2159"/>
+        <w:gridCol w:w="2322"/>
+        <w:gridCol w:w="2197"/>
+        <w:gridCol w:w="2178"/>
+      </w:tblGrid>
+      <w:tr>
+        <w:tc>
+          <w:tcPr>
+            <w:tcW w:w="2214" w:type="dxa"/>
+            <w:vAlign w:val="center"/>
+          </w:tcPr>
+          <w:p>
+            <w:pPr>
+              <w:rPr>
+                <w:rFonts w:ascii="Arial" w:hAnsi="Arial" w:cs="Arial"/>
+                <w:sz w:val="16"/>
+                <w:szCs w:val="16"/>
+              </w:rPr>
+            </w:pPr>
+            <w:r>
+              <w:rPr>
+                <w:rFonts w:ascii="Arial" w:hAnsi="Arial" w:cs="Arial"/>
+                <w:sz w:val="16"/>
+                <w:szCs w:val="16"/>
+              </w:rPr>
+              <w:t>Test ID</w:t>
+            </w:r>
+          </w:p>
+        </w:tc>
+        <w:tc>
+          <w:tcPr>
+            <w:tcW w:w="2214" w:type="dxa"/>
+            <w:vAlign w:val="center"/>
+          </w:tcPr>
+          <w:p>
+            <w:pPr>
+              <w:rPr>
+                <w:rFonts w:ascii="Arial" w:hAnsi="Arial" w:cs="Arial"/>
+                <w:sz w:val="16"/>
+                <w:szCs w:val="16"/>
+              </w:rPr>
+            </w:pPr>
+            <w:r>
+              <w:rPr>
+                <w:rFonts w:ascii="Arial" w:hAnsi="Arial" w:cs="Arial"/>
+                <w:sz w:val="16"/>
+                <w:szCs w:val="16"/>
+              </w:rPr>
+              <w:t>Input Data</w:t>
+            </w:r>
+          </w:p>
+        </w:tc>
+        <w:tc>
+          <w:tcPr>
+            <w:tcW w:w="2214" w:type="dxa"/>
+            <w:vAlign w:val="center"/>
+          </w:tcPr>
+          <w:p>
+            <w:pPr>
+              <w:rPr>
+                <w:rFonts w:ascii="Arial" w:hAnsi="Arial" w:cs="Arial"/>
+                <w:sz w:val="16"/>
+                <w:szCs w:val="16"/>
+              </w:rPr>
+            </w:pPr>
+            <w:r>
+              <w:rPr>
+                <w:rFonts w:ascii="Arial" w:hAnsi="Arial" w:cs="Arial"/>
+                <w:sz w:val="16"/>
+                <w:szCs w:val="16"/>
+              </w:rPr>
+              <w:t>Expected Output</w:t>
+            </w:r>
+          </w:p>
+        </w:tc>
+        <w:tc>
+          <w:tcPr>
+            <w:tcW w:w="2214" w:type="dxa"/>
+            <w:vAlign w:val="center"/>
+          </w:tcPr>
+          <w:p>
+            <w:pPr>
+              <w:rPr>
+                <w:rFonts w:ascii="Arial" w:hAnsi="Arial" w:cs="Arial"/>
+                <w:sz w:val="16"/>
+                <w:szCs w:val="16"/>
+              </w:rPr>
+            </w:pPr>
+            <w:r>
+              <w:rPr>
+                <w:rFonts w:ascii="Arial" w:hAnsi="Arial" w:cs="Arial"/>
+                <w:sz w:val="16"/>
+                <w:szCs w:val="16"/>
+              </w:rPr>
+              <w:t>Type (Valid/Invalid)</w:t>
+            </w:r>
+          </w:p>
+        </w:tc>
+      </w:tr>
+      <w:tr>
+        <w:tc>
+          <w:tcPr>
+            <w:tcW w:w="2214" w:type="dxa"/>
+            <w:vAlign w:val="center"/>
+          </w:tcPr>
+          <w:p>
+            <w:pPr>
+              <w:rPr>
+                <w:rFonts w:ascii="Arial" w:hAnsi="Arial" w:cs="Arial"/>
+                <w:sz w:val="16"/>
+                <w:szCs w:val="16"/>
+              </w:rPr>
+            </w:pPr>
+            <w:r>
+              <w:rPr>
+                <w:rFonts w:ascii="Arial" w:hAnsi="Arial" w:cs="Arial"/>
+                <w:sz w:val="16"/>
+                <w:szCs w:val="16"/>
+              </w:rPr>
+              <w:t>TC-FR15-001</w:t>
+            </w:r>
+          </w:p>
+        </w:tc>
+        <w:tc>
+          <w:tcPr>
+            <w:tcW w:w="2214" w:type="dxa"/>
+            <w:vAlign w:val="center"/>
+          </w:tcPr>
+          <w:p>
+            <w:pPr>
+              <w:rPr>
+                <w:rFonts w:ascii="Arial" w:hAnsi="Arial" w:cs="Arial"/>
+                <w:sz w:val="16"/>
+                <w:szCs w:val="16"/>
+              </w:rPr>
+            </w:pPr>
+            <w:r>
+              <w:rPr>
+                <w:rFonts w:ascii="Arial" w:hAnsi="Arial" w:cs="Arial"/>
+                <w:sz w:val="16"/>
+                <w:szCs w:val="16"/>
+              </w:rPr>
+              <w:t>Thêm sản phẩm mới hợp lệ:</w:t>
+            </w:r>
+            <w:r>
+              <w:rPr>
+                <w:rFonts w:ascii="Arial" w:hAnsi="Arial" w:cs="Arial"/>
+                <w:sz w:val="16"/>
+                <w:szCs w:val="16"/>
+              </w:rPr>
+              <w:t xml:space="preserve"> </w:t>
+            </w:r>
+            <w:r>
+              <w:rPr>
+                <w:rFonts w:ascii="Arial" w:hAnsi="Arial" w:cs="Arial"/>
+                <w:sz w:val="16"/>
+                <w:szCs w:val="16"/>
+              </w:rPr>
+              <w:t>name: "MacBook Air M3"</w:t>
+            </w:r>
+            <w:r>
+              <w:rPr>
+                <w:rFonts w:ascii="Arial" w:hAnsi="Arial" w:cs="Arial"/>
+                <w:sz w:val="16"/>
+                <w:szCs w:val="16"/>
+              </w:rPr>
+              <w:t xml:space="preserve"> </w:t>
+            </w:r>
+            <w:r>
+              <w:rPr>
+                <w:rFonts w:ascii="Arial" w:hAnsi="Arial" w:cs="Arial"/>
+                <w:sz w:val="16"/>
+                <w:szCs w:val="16"/>
+              </w:rPr>
+              <w:t>price: 30000000</w:t>
+            </w:r>
+            <w:r>
+              <w:rPr>
+                <w:rFonts w:ascii="Arial" w:hAnsi="Arial" w:cs="Arial"/>
+                <w:sz w:val="16"/>
+                <w:szCs w:val="16"/>
+              </w:rPr>
+              <w:t xml:space="preserve"> </w:t>
+            </w:r>
+            <w:r>
+              <w:rPr>
+                <w:rFonts w:ascii="Arial" w:hAnsi="Arial" w:cs="Arial"/>
+                <w:sz w:val="16"/>
+                <w:szCs w:val="16"/>
+              </w:rPr>
+              <w:t>description: "Laptop mỏng nhẹ"</w:t>
+            </w:r>
+            <w:r>
+              <w:rPr>
+                <w:rFonts w:ascii="Arial" w:hAnsi="Arial" w:cs="Arial"/>
+                <w:sz w:val="16"/>
+                <w:szCs w:val="16"/>
+              </w:rPr>
+              <w:t xml:space="preserve"> </w:t>
+            </w:r>
+            <w:r>
+              <w:rPr>
+                <w:rFonts w:ascii="Arial" w:hAnsi="Arial" w:cs="Arial"/>
+                <w:sz w:val="16"/>
+                <w:szCs w:val="16"/>
+              </w:rPr>
+              <w:t>imageUrl: "</w:t>
+            </w:r>
+            <w:hyperlink r:id="rId6" w:history="1">
+              <w:r>
+                <w:rPr>
+                  <w:rStyle w:val="Hyperlink"/>
+                  <w:rFonts w:ascii="Arial" w:hAnsi="Arial" w:cs="Arial"/>
+                  <w:sz w:val="16"/>
+                  <w:szCs w:val="16"/>
+                </w:rPr>
+                <w:t>https://example.com/img.jpg</w:t>
+              </w:r>
+            </w:hyperlink>
+            <w:r>
+              <w:rPr>
+                <w:rFonts w:ascii="Arial" w:hAnsi="Arial" w:cs="Arial"/>
+                <w:sz w:val="16"/>
+                <w:szCs w:val="16"/>
+              </w:rPr>
+              <w:t>"</w:t>
+            </w:r>
+            <w:r>
+              <w:rPr>
+                <w:rFonts w:ascii="Arial" w:hAnsi="Arial" w:cs="Arial"/>
+                <w:sz w:val="16"/>
+                <w:szCs w:val="16"/>
+              </w:rPr>
+              <w:t xml:space="preserve"> </w:t>
+            </w:r>
+            <w:r>
+              <w:rPr>
+                <w:rFonts w:ascii="Arial" w:hAnsi="Arial" w:cs="Arial"/>
+                <w:sz w:val="16"/>
+                <w:szCs w:val="16"/>
+              </w:rPr>
+              <w:t>category_id: 2 (Laptop)</w:t>
+            </w:r>
+            <w:r>
+              <w:rPr>
+                <w:rFonts w:ascii="Arial" w:hAnsi="Arial" w:cs="Arial"/>
+                <w:sz w:val="16"/>
+                <w:szCs w:val="16"/>
+              </w:rPr>
+              <w:t xml:space="preserve"> </w:t>
+            </w:r>
+            <w:r>
+              <w:rPr>
+                <w:rFonts w:ascii="Arial" w:hAnsi="Arial" w:cs="Arial"/>
+                <w:sz w:val="16"/>
+                <w:szCs w:val="16"/>
+              </w:rPr>
+              <w:t>Role: Admin</w:t>
+            </w:r>
+          </w:p>
+        </w:tc>
+        <w:tc>
+          <w:tcPr>
+            <w:tcW w:w="2214" w:type="dxa"/>
+            <w:vAlign w:val="center"/>
+          </w:tcPr>
+          <w:p>
+            <w:pPr>
+              <w:rPr>
+                <w:rFonts w:ascii="Arial" w:hAnsi="Arial" w:cs="Arial"/>
+                <w:sz w:val="16"/>
+                <w:szCs w:val="16"/>
+              </w:rPr>
+            </w:pPr>
+            <w:r>
+              <w:rPr>
+                <w:rFonts w:ascii="Arial" w:hAnsi="Arial" w:cs="Arial"/>
+                <w:sz w:val="16"/>
+                <w:szCs w:val="16"/>
+              </w:rPr>
+              <w:t>Hệ thống thêm sản phẩm thành công vào CSDL. Trả về thông báo thành công hoặc ID sản phẩm mới. Sản phẩm xuất hiện trên trang chủ.</w:t>
+            </w:r>
+          </w:p>
+        </w:tc>
+        <w:tc>
+          <w:tcPr>
+            <w:tcW w:w="2214" w:type="dxa"/>
+            <w:vAlign w:val="center"/>
+          </w:tcPr>
+          <w:p>
+            <w:pPr>
+              <w:rPr>
+                <w:rFonts w:ascii="Arial" w:hAnsi="Arial" w:cs="Arial"/>
+                <w:sz w:val="16"/>
+                <w:szCs w:val="16"/>
+              </w:rPr>
+            </w:pPr>
+            <w:r>
+              <w:rPr>
+                <w:rFonts w:ascii="Arial" w:hAnsi="Arial" w:cs="Arial"/>
+                <w:sz w:val="16"/>
+                <w:szCs w:val="16"/>
+              </w:rPr>
+              <w:t>Valid</w:t>
+            </w:r>
+          </w:p>
+        </w:tc>
+      </w:tr>
+      <w:tr>
+        <w:tc>
+          <w:tcPr>
+            <w:tcW w:w="2214" w:type="dxa"/>
+            <w:vAlign w:val="center"/>
+          </w:tcPr>
+          <w:p>
+            <w:pPr>
+              <w:rPr>
+                <w:rFonts w:ascii="Arial" w:hAnsi="Arial" w:cs="Arial"/>
+                <w:sz w:val="16"/>
+                <w:szCs w:val="16"/>
+              </w:rPr>
+            </w:pPr>
+            <w:r>
+              <w:rPr>
+                <w:rFonts w:ascii="Arial" w:hAnsi="Arial" w:cs="Arial"/>
+                <w:sz w:val="16"/>
+                <w:szCs w:val="16"/>
+              </w:rPr>
+              <w:t>TC-FR15-002</w:t>
+            </w:r>
+          </w:p>
+        </w:tc>
+        <w:tc>
+          <w:tcPr>
+            <w:tcW w:w="2214" w:type="dxa"/>
+            <w:vAlign w:val="center"/>
+          </w:tcPr>
+          <w:p>
+            <w:pPr>
+              <w:rPr>
+                <w:rFonts w:ascii="Arial" w:hAnsi="Arial" w:cs="Arial"/>
+                <w:sz w:val="16"/>
+                <w:szCs w:val="16"/>
+              </w:rPr>
+            </w:pPr>
+            <w:r>
+              <w:rPr>
+                <w:rFonts w:ascii="Arial" w:hAnsi="Arial" w:cs="Arial"/>
+                <w:sz w:val="16"/>
+                <w:szCs w:val="16"/>
+              </w:rPr>
+              <w:t>Thêm sản phẩm với tên để trống:</w:t>
+            </w:r>
+            <w:r>
+              <w:rPr>
+                <w:rFonts w:ascii="Arial" w:hAnsi="Arial" w:cs="Arial"/>
+                <w:sz w:val="16"/>
+                <w:szCs w:val="16"/>
+              </w:rPr>
+              <w:t xml:space="preserve"> </w:t>
+            </w:r>
+            <w:r>
+              <w:rPr>
+                <w:rFonts w:ascii="Arial" w:hAnsi="Arial" w:cs="Arial"/>
+                <w:sz w:val="16"/>
+                <w:szCs w:val="16"/>
+              </w:rPr>
+              <w:t>name: ""</w:t>
+            </w:r>
+            <w:r>
+              <w:rPr>
+                <w:rFonts w:ascii="Arial" w:hAnsi="Arial" w:cs="Arial"/>
+                <w:sz w:val="16"/>
+                <w:szCs w:val="16"/>
+              </w:rPr>
+              <w:t xml:space="preserve"> </w:t>
+            </w:r>
+            <w:r>
+              <w:rPr>
+                <w:rFonts w:ascii="Arial" w:hAnsi="Arial" w:cs="Arial"/>
+                <w:sz w:val="16"/>
+                <w:szCs w:val="16"/>
+              </w:rPr>
+              <w:t>price: 1500000</w:t>
+            </w:r>
+            <w:r>
+              <w:rPr>
+                <w:rFonts w:ascii="Arial" w:hAnsi="Arial" w:cs="Arial"/>
+                <w:sz w:val="16"/>
+                <w:szCs w:val="16"/>
+              </w:rPr>
+              <w:t xml:space="preserve"> </w:t>
+            </w:r>
+            <w:r>
+              <w:rPr>
+                <w:rFonts w:ascii="Arial" w:hAnsi="Arial" w:cs="Arial"/>
+                <w:sz w:val="16"/>
+                <w:szCs w:val="16"/>
+              </w:rPr>
+              <w:t>category_id: 3</w:t>
+            </w:r>
+            <w:r>
+              <w:rPr>
+                <w:rFonts w:ascii="Arial" w:hAnsi="Arial" w:cs="Arial"/>
+                <w:sz w:val="16"/>
+                <w:szCs w:val="16"/>
+              </w:rPr>
+              <w:t xml:space="preserve"> </w:t>
+            </w:r>
+            <w:r>
+              <w:rPr>
+                <w:rFonts w:ascii="Arial" w:hAnsi="Arial" w:cs="Arial"/>
+                <w:sz w:val="16"/>
+                <w:szCs w:val="16"/>
+              </w:rPr>
+              <w:t>Role: Admin</w:t>
+            </w:r>
+          </w:p>
+        </w:tc>
+        <w:tc>
+          <w:tcPr>
+            <w:tcW w:w="2214" w:type="dxa"/>
+            <w:vAlign w:val="center"/>
+          </w:tcPr>
+          <w:p>
+            <w:pPr>
+              <w:rPr>
+                <w:rFonts w:ascii="Arial" w:hAnsi="Arial" w:cs="Arial"/>
+                <w:sz w:val="16"/>
+                <w:szCs w:val="16"/>
+              </w:rPr>
+            </w:pPr>
+            <w:r>
+              <w:rPr>
+                <w:rFonts w:ascii="Arial" w:hAnsi="Arial" w:cs="Arial"/>
+                <w:sz w:val="16"/>
+                <w:szCs w:val="16"/>
+              </w:rPr>
+              <w:t>Hệ thống từ chối yêu cầu, trả về lỗi validation (400 Bad Request) do tên sản phẩm bắt buộc.</w:t>
+            </w:r>
+          </w:p>
+        </w:tc>
+        <w:tc>
+          <w:tcPr>
+            <w:tcW w:w="2214" w:type="dxa"/>
+            <w:vAlign w:val="center"/>
+          </w:tcPr>
+          <w:p>
+            <w:pPr>
+              <w:rPr>
+                <w:rFonts w:ascii="Arial" w:hAnsi="Arial" w:cs="Arial"/>
+                <w:sz w:val="16"/>
+                <w:szCs w:val="16"/>
+              </w:rPr>
+            </w:pPr>
+            <w:r>
+              <w:rPr>
+                <w:rFonts w:ascii="Arial" w:hAnsi="Arial" w:cs="Arial"/>
+                <w:sz w:val="16"/>
+                <w:szCs w:val="16"/>
+              </w:rPr>
+              <w:t>Invalid</w:t>
+            </w:r>
+          </w:p>
+        </w:tc>
+      </w:tr>
+      <w:tr>
+        <w:tc>
+          <w:tcPr>
+            <w:tcW w:w="2214" w:type="dxa"/>
+            <w:vAlign w:val="center"/>
+          </w:tcPr>
+          <w:p>
+            <w:pPr>
+              <w:rPr>
+                <w:rFonts w:ascii="Arial" w:hAnsi="Arial" w:cs="Arial"/>
+                <w:sz w:val="16"/>
+                <w:szCs w:val="16"/>
+              </w:rPr>
+            </w:pPr>
+            <w:r>
+              <w:rPr>
+                <w:rFonts w:ascii="Arial" w:hAnsi="Arial" w:cs="Arial"/>
+                <w:sz w:val="16"/>
+                <w:szCs w:val="16"/>
+              </w:rPr>
+              <w:t>TC-FR15-003</w:t>
+            </w:r>
+          </w:p>
+        </w:tc>
+        <w:tc>
+          <w:tcPr>
+            <w:tcW w:w="2214" w:type="dxa"/>
+            <w:vAlign w:val="center"/>
+          </w:tcPr>
+          <w:p>
+            <w:pPr>
+              <w:rPr>
+                <w:rFonts w:ascii="Arial" w:hAnsi="Arial" w:cs="Arial"/>
+                <w:sz w:val="16"/>
+                <w:szCs w:val="16"/>
+              </w:rPr>
+            </w:pPr>
+            <w:r>
+              <w:rPr>
+                <w:rFonts w:ascii="Arial" w:hAnsi="Arial" w:cs="Arial"/>
+                <w:sz w:val="16"/>
+                <w:szCs w:val="16"/>
+              </w:rPr>
+              <w:t>Thêm sản phẩm với tên vượt 255 ký tự:</w:t>
+            </w:r>
+            <w:r>
+              <w:rPr>
+                <w:rFonts w:ascii="Arial" w:hAnsi="Arial" w:cs="Arial"/>
+                <w:sz w:val="16"/>
+                <w:szCs w:val="16"/>
+              </w:rPr>
+              <w:t xml:space="preserve"> </w:t>
+            </w:r>
+            <w:r>
+              <w:rPr>
+                <w:rFonts w:ascii="Arial" w:hAnsi="Arial" w:cs="Arial"/>
+                <w:sz w:val="16"/>
+                <w:szCs w:val="16"/>
+              </w:rPr>
+              <w:t>name: Chuỗi ký tự có độ dài = 256 ký tự</w:t>
+            </w:r>
+            <w:r>
+              <w:rPr>
+                <w:rFonts w:ascii="Arial" w:hAnsi="Arial" w:cs="Arial"/>
+                <w:sz w:val="16"/>
+                <w:szCs w:val="16"/>
+              </w:rPr>
+              <w:t xml:space="preserve"> </w:t>
+            </w:r>
+            <w:r>
+              <w:rPr>
+                <w:rFonts w:ascii="Arial" w:hAnsi="Arial" w:cs="Arial"/>
+                <w:sz w:val="16"/>
+                <w:szCs w:val="16"/>
+              </w:rPr>
+              <w:t>price: 500000</w:t>
+            </w:r>
+            <w:r>
+              <w:rPr>
+                <w:rFonts w:ascii="Arial" w:hAnsi="Arial" w:cs="Arial"/>
+                <w:sz w:val="16"/>
+                <w:szCs w:val="16"/>
+              </w:rPr>
+              <w:t xml:space="preserve"> </w:t>
+            </w:r>
+            <w:r>
+              <w:rPr>
+                <w:rFonts w:ascii="Arial" w:hAnsi="Arial" w:cs="Arial"/>
+                <w:sz w:val="16"/>
+                <w:szCs w:val="16"/>
+              </w:rPr>
+              <w:t>category_id: 1</w:t>
+            </w:r>
+            <w:r>
+              <w:rPr>
+                <w:rFonts w:ascii="Arial" w:hAnsi="Arial" w:cs="Arial"/>
+                <w:sz w:val="16"/>
+                <w:szCs w:val="16"/>
+              </w:rPr>
+              <w:t xml:space="preserve"> </w:t>
+            </w:r>
+            <w:r>
+              <w:rPr>
+                <w:rFonts w:ascii="Arial" w:hAnsi="Arial" w:cs="Arial"/>
+                <w:sz w:val="16"/>
+                <w:szCs w:val="16"/>
+              </w:rPr>
+              <w:t>Role: Admin</w:t>
+            </w:r>
+          </w:p>
+        </w:tc>
+        <w:tc>
+          <w:tcPr>
+            <w:tcW w:w="2214" w:type="dxa"/>
+            <w:vAlign w:val="center"/>
+          </w:tcPr>
+          <w:p>
+            <w:pPr>
+              <w:rPr>
+                <w:rFonts w:ascii="Arial" w:hAnsi="Arial" w:cs="Arial"/>
+                <w:sz w:val="16"/>
+                <w:szCs w:val="16"/>
+              </w:rPr>
+            </w:pPr>
+            <w:r>
+              <w:rPr>
+                <w:rFonts w:ascii="Arial" w:hAnsi="Arial" w:cs="Arial"/>
+                <w:sz w:val="16"/>
+                <w:szCs w:val="16"/>
+              </w:rPr>
+              <w:t>Hệ thống chặn hoặc báo lỗi do vượt quá giới hạn tối đa 255 ký tự của trường name.</w:t>
+            </w:r>
+          </w:p>
+        </w:tc>
+        <w:tc>
+          <w:tcPr>
+            <w:tcW w:w="2214" w:type="dxa"/>
+            <w:vAlign w:val="center"/>
+          </w:tcPr>
+          <w:p>
+            <w:pPr>
+              <w:rPr>
+                <w:rFonts w:ascii="Arial" w:hAnsi="Arial" w:cs="Arial"/>
+                <w:sz w:val="16"/>
+                <w:szCs w:val="16"/>
+              </w:rPr>
+            </w:pPr>
+            <w:r>
+              <w:rPr>
+                <w:rFonts w:ascii="Arial" w:hAnsi="Arial" w:cs="Arial"/>
+                <w:sz w:val="16"/>
+                <w:szCs w:val="16"/>
+              </w:rPr>
+              <w:t>Invalid</w:t>
+            </w:r>
+          </w:p>
+        </w:tc>
+      </w:tr>
+      <w:tr>
+        <w:tc>
+          <w:tcPr>
+            <w:tcW w:w="2214" w:type="dxa"/>
+            <w:vAlign w:val="center"/>
+          </w:tcPr>
+          <w:p>
+            <w:pPr>
+              <w:rPr>
+                <w:rFonts w:ascii="Arial" w:hAnsi="Arial" w:cs="Arial"/>
+                <w:sz w:val="16"/>
+                <w:szCs w:val="16"/>
+              </w:rPr>
+            </w:pPr>
+            <w:r>
+              <w:rPr>
+                <w:rFonts w:ascii="Arial" w:hAnsi="Arial" w:cs="Arial"/>
+                <w:sz w:val="16"/>
+                <w:szCs w:val="16"/>
+              </w:rPr>
+              <w:t>TC-FR15-004</w:t>
+            </w:r>
+          </w:p>
+        </w:tc>
+        <w:tc>
+          <w:tcPr>
+            <w:tcW w:w="2214" w:type="dxa"/>
+            <w:vAlign w:val="center"/>
+          </w:tcPr>
+          <w:p>
+            <w:pPr>
+              <w:rPr>
+                <w:rFonts w:ascii="Arial" w:hAnsi="Arial" w:cs="Arial"/>
+                <w:sz w:val="16"/>
+                <w:szCs w:val="16"/>
+              </w:rPr>
+            </w:pPr>
+            <w:r>
+              <w:rPr>
+                <w:rFonts w:ascii="Arial" w:hAnsi="Arial" w:cs="Arial"/>
+                <w:sz w:val="16"/>
+                <w:szCs w:val="16"/>
+              </w:rPr>
+              <w:t>Thêm sản phẩm với giá bằng 0:</w:t>
+            </w:r>
+            <w:r>
+              <w:rPr>
+                <w:rFonts w:ascii="Arial" w:hAnsi="Arial" w:cs="Arial"/>
+                <w:sz w:val="16"/>
+                <w:szCs w:val="16"/>
+              </w:rPr>
+              <w:t xml:space="preserve"> </w:t>
+            </w:r>
+            <w:r>
+              <w:rPr>
+                <w:rFonts w:ascii="Arial" w:hAnsi="Arial" w:cs="Arial"/>
+                <w:sz w:val="16"/>
+                <w:szCs w:val="16"/>
+              </w:rPr>
+              <w:t>name: "Sản phẩm 0 đồng"</w:t>
+            </w:r>
+            <w:r>
+              <w:rPr>
+                <w:rFonts w:ascii="Arial" w:hAnsi="Arial" w:cs="Arial"/>
+                <w:sz w:val="16"/>
+                <w:szCs w:val="16"/>
+              </w:rPr>
+              <w:t xml:space="preserve"> </w:t>
+            </w:r>
+            <w:r>
+              <w:rPr>
+                <w:rFonts w:ascii="Arial" w:hAnsi="Arial" w:cs="Arial"/>
+                <w:sz w:val="16"/>
+                <w:szCs w:val="16"/>
+              </w:rPr>
+              <w:t>price: 0</w:t>
+            </w:r>
+            <w:r>
+              <w:rPr>
+                <w:rFonts w:ascii="Arial" w:hAnsi="Arial" w:cs="Arial"/>
+                <w:sz w:val="16"/>
+                <w:szCs w:val="16"/>
+              </w:rPr>
+              <w:t xml:space="preserve"> </w:t>
+            </w:r>
+            <w:r>
+              <w:rPr>
+                <w:rFonts w:ascii="Arial" w:hAnsi="Arial" w:cs="Arial"/>
+                <w:sz w:val="16"/>
+                <w:szCs w:val="16"/>
+              </w:rPr>
+              <w:t>category_id: 3</w:t>
+            </w:r>
+            <w:r>
+              <w:rPr>
+                <w:rFonts w:ascii="Arial" w:hAnsi="Arial" w:cs="Arial"/>
+                <w:sz w:val="16"/>
+                <w:szCs w:val="16"/>
+              </w:rPr>
+              <w:t xml:space="preserve"> </w:t>
+            </w:r>
+            <w:r>
+              <w:rPr>
+                <w:rFonts w:ascii="Arial" w:hAnsi="Arial" w:cs="Arial"/>
+                <w:sz w:val="16"/>
+                <w:szCs w:val="16"/>
+              </w:rPr>
+              <w:t>Role: Admin</w:t>
+            </w:r>
+          </w:p>
+        </w:tc>
+        <w:tc>
+          <w:tcPr>
+            <w:tcW w:w="2214" w:type="dxa"/>
+            <w:vAlign w:val="center"/>
+          </w:tcPr>
+          <w:p>
+            <w:pPr>
+              <w:rPr>
+                <w:rFonts w:ascii="Arial" w:hAnsi="Arial" w:cs="Arial"/>
+                <w:sz w:val="16"/>
+                <w:szCs w:val="16"/>
+              </w:rPr>
+            </w:pPr>
+            <w:r>
+              <w:rPr>
+                <w:rFonts w:ascii="Arial" w:hAnsi="Arial" w:cs="Arial"/>
+                <w:sz w:val="16"/>
+                <w:szCs w:val="16"/>
+              </w:rPr>
+              <w:t>Hệ thống từ chối, trả về lỗi do giá sản phẩm phải là số dương lớn hơn 0 ($\text{price} &gt; 0$).</w:t>
+            </w:r>
+          </w:p>
+        </w:tc>
+        <w:tc>
+          <w:tcPr>
+            <w:tcW w:w="2214" w:type="dxa"/>
+            <w:vAlign w:val="center"/>
+          </w:tcPr>
+          <w:p>
+            <w:pPr>
+              <w:rPr>
+                <w:rFonts w:ascii="Arial" w:hAnsi="Arial" w:cs="Arial"/>
+                <w:sz w:val="16"/>
+                <w:szCs w:val="16"/>
+              </w:rPr>
+            </w:pPr>
+            <w:r>
+              <w:rPr>
+                <w:rFonts w:ascii="Arial" w:hAnsi="Arial" w:cs="Arial"/>
+                <w:sz w:val="16"/>
+                <w:szCs w:val="16"/>
+              </w:rPr>
+              <w:t>Invalid</w:t>
+            </w:r>
+          </w:p>
+        </w:tc>
+      </w:tr>
+      <w:tr>
+        <w:tc>
+          <w:tcPr>
+            <w:tcW w:w="2214" w:type="dxa"/>
+            <w:vAlign w:val="center"/>
+          </w:tcPr>
+          <w:p>
+            <w:pPr>
+              <w:rPr>
+                <w:rFonts w:ascii="Arial" w:hAnsi="Arial" w:cs="Arial"/>
+                <w:sz w:val="16"/>
+                <w:szCs w:val="16"/>
+              </w:rPr>
+            </w:pPr>
+            <w:r>
+              <w:rPr>
+                <w:rFonts w:ascii="Arial" w:hAnsi="Arial" w:cs="Arial"/>
+                <w:sz w:val="16"/>
+                <w:szCs w:val="16"/>
+              </w:rPr>
+              <w:t>TC-FR15-005</w:t>
+            </w:r>
+          </w:p>
+        </w:tc>
+        <w:tc>
+          <w:tcPr>
+            <w:tcW w:w="2214" w:type="dxa"/>
+            <w:vAlign w:val="center"/>
+          </w:tcPr>
+          <w:p>
+            <w:pPr>
+              <w:rPr>
+                <w:rFonts w:ascii="Arial" w:hAnsi="Arial" w:cs="Arial"/>
+                <w:sz w:val="16"/>
+                <w:szCs w:val="16"/>
+              </w:rPr>
+            </w:pPr>
+            <w:r>
+              <w:rPr>
+                <w:rFonts w:ascii="Arial" w:hAnsi="Arial" w:cs="Arial"/>
+                <w:sz w:val="16"/>
+                <w:szCs w:val="16"/>
+              </w:rPr>
+              <w:t>Thêm sản phẩm với giá âm:</w:t>
+            </w:r>
+            <w:r>
+              <w:rPr>
+                <w:rFonts w:ascii="Arial" w:hAnsi="Arial" w:cs="Arial"/>
+                <w:sz w:val="16"/>
+                <w:szCs w:val="16"/>
+              </w:rPr>
+              <w:t xml:space="preserve"> </w:t>
+            </w:r>
+            <w:r>
+              <w:rPr>
+                <w:rFonts w:ascii="Arial" w:hAnsi="Arial" w:cs="Arial"/>
+                <w:sz w:val="16"/>
+                <w:szCs w:val="16"/>
+              </w:rPr>
+              <w:t>name: "Sản phẩm âm"</w:t>
+            </w:r>
+            <w:r>
+              <w:rPr>
+                <w:rFonts w:ascii="Arial" w:hAnsi="Arial" w:cs="Arial"/>
+                <w:sz w:val="16"/>
+                <w:szCs w:val="16"/>
+              </w:rPr>
+              <w:t xml:space="preserve"> </w:t>
+            </w:r>
+            <w:r>
+              <w:rPr>
+                <w:rFonts w:ascii="Arial" w:hAnsi="Arial" w:cs="Arial"/>
+                <w:sz w:val="16"/>
+                <w:szCs w:val="16"/>
+              </w:rPr>
+              <w:t>price: -100000</w:t>
+            </w:r>
+            <w:r>
+              <w:rPr>
+                <w:rFonts w:ascii="Arial" w:hAnsi="Arial" w:cs="Arial"/>
+                <w:sz w:val="16"/>
+                <w:szCs w:val="16"/>
+              </w:rPr>
+              <w:t xml:space="preserve"> </w:t>
+            </w:r>
+            <w:r>
+              <w:rPr>
+                <w:rFonts w:ascii="Arial" w:hAnsi="Arial" w:cs="Arial"/>
+                <w:sz w:val="16"/>
+                <w:szCs w:val="16"/>
+              </w:rPr>
+              <w:t>category_id: 3</w:t>
+            </w:r>
+            <w:r>
+              <w:rPr>
+                <w:rFonts w:ascii="Arial" w:hAnsi="Arial" w:cs="Arial"/>
+                <w:sz w:val="16"/>
+                <w:szCs w:val="16"/>
+              </w:rPr>
+              <w:t xml:space="preserve"> </w:t>
+            </w:r>
+            <w:r>
+              <w:rPr>
+                <w:rFonts w:ascii="Arial" w:hAnsi="Arial" w:cs="Arial"/>
+                <w:sz w:val="16"/>
+                <w:szCs w:val="16"/>
+              </w:rPr>
+              <w:t>Role: Admin</w:t>
+            </w:r>
+          </w:p>
+        </w:tc>
+        <w:tc>
+          <w:tcPr>
+            <w:tcW w:w="2214" w:type="dxa"/>
+            <w:vAlign w:val="center"/>
+          </w:tcPr>
+          <w:p>
+            <w:pPr>
+              <w:rPr>
+                <w:rFonts w:ascii="Arial" w:hAnsi="Arial" w:cs="Arial"/>
+                <w:sz w:val="16"/>
+                <w:szCs w:val="16"/>
+              </w:rPr>
+            </w:pPr>
+            <w:r>
+              <w:rPr>
+                <w:rFonts w:ascii="Arial" w:hAnsi="Arial" w:cs="Arial"/>
+                <w:sz w:val="16"/>
+                <w:szCs w:val="16"/>
+              </w:rPr>
+              <w:t>Hệ thống từ chối, trả về lỗi do giá không được phép là số âm.</w:t>
+            </w:r>
+          </w:p>
+        </w:tc>
+        <w:tc>
+          <w:tcPr>
+            <w:tcW w:w="2214" w:type="dxa"/>
+            <w:vAlign w:val="center"/>
+          </w:tcPr>
+          <w:p>
+            <w:pPr>
+              <w:rPr>
+                <w:rFonts w:ascii="Arial" w:hAnsi="Arial" w:cs="Arial"/>
+                <w:sz w:val="16"/>
+                <w:szCs w:val="16"/>
+              </w:rPr>
+            </w:pPr>
+            <w:r>
+              <w:rPr>
+                <w:rFonts w:ascii="Arial" w:hAnsi="Arial" w:cs="Arial"/>
+                <w:sz w:val="16"/>
+                <w:szCs w:val="16"/>
+              </w:rPr>
+              <w:t>Invalid</w:t>
+            </w:r>
+          </w:p>
+        </w:tc>
+      </w:tr>
+      <w:tr>
+        <w:tc>
+          <w:tcPr>
+            <w:tcW w:w="2214" w:type="dxa"/>
+            <w:vAlign w:val="center"/>
+          </w:tcPr>
+          <w:p>
+            <w:pPr>
+              <w:rPr>
+                <w:rFonts w:ascii="Arial" w:hAnsi="Arial" w:cs="Arial"/>
+                <w:sz w:val="16"/>
+                <w:szCs w:val="16"/>
+              </w:rPr>
+            </w:pPr>
+            <w:r>
+              <w:rPr>
+                <w:rFonts w:ascii="Arial" w:hAnsi="Arial" w:cs="Arial"/>
+                <w:sz w:val="16"/>
+                <w:szCs w:val="16"/>
+              </w:rPr>
+              <w:t>TC-FR15-006</w:t>
+            </w:r>
+          </w:p>
+        </w:tc>
+        <w:tc>
+          <w:tcPr>
+            <w:tcW w:w="2214" w:type="dxa"/>
+            <w:vAlign w:val="center"/>
+          </w:tcPr>
+          <w:p>
+            <w:pPr>
+              <w:rPr>
+                <w:rFonts w:ascii="Arial" w:hAnsi="Arial" w:cs="Arial"/>
+                <w:sz w:val="16"/>
+                <w:szCs w:val="16"/>
+              </w:rPr>
+            </w:pPr>
+            <w:r>
+              <w:rPr>
+                <w:rFonts w:ascii="Arial" w:hAnsi="Arial" w:cs="Arial"/>
+                <w:sz w:val="16"/>
+                <w:szCs w:val="16"/>
+              </w:rPr>
+              <w:t>Thêm sản phẩm với giá không phải là số:</w:t>
+            </w:r>
+            <w:r>
+              <w:rPr>
+                <w:rFonts w:ascii="Arial" w:hAnsi="Arial" w:cs="Arial"/>
+                <w:sz w:val="16"/>
+                <w:szCs w:val="16"/>
+              </w:rPr>
+              <w:t xml:space="preserve"> </w:t>
+            </w:r>
+            <w:r>
+              <w:rPr>
+                <w:rFonts w:ascii="Arial" w:hAnsi="Arial" w:cs="Arial"/>
+                <w:sz w:val="16"/>
+                <w:szCs w:val="16"/>
+              </w:rPr>
+              <w:t>name: "Sản phẩm chữ"</w:t>
+            </w:r>
+            <w:r>
+              <w:rPr>
+                <w:rFonts w:ascii="Arial" w:hAnsi="Arial" w:cs="Arial"/>
+                <w:sz w:val="16"/>
+                <w:szCs w:val="16"/>
+              </w:rPr>
+              <w:t xml:space="preserve"> </w:t>
+            </w:r>
+            <w:r>
+              <w:rPr>
+                <w:rFonts w:ascii="Arial" w:hAnsi="Arial" w:cs="Arial"/>
+                <w:sz w:val="16"/>
+                <w:szCs w:val="16"/>
+              </w:rPr>
+              <w:t>price: "abc"</w:t>
+            </w:r>
+            <w:r>
+              <w:rPr>
+                <w:rFonts w:ascii="Arial" w:hAnsi="Arial" w:cs="Arial"/>
+                <w:sz w:val="16"/>
+                <w:szCs w:val="16"/>
+              </w:rPr>
+              <w:t xml:space="preserve"> </w:t>
+            </w:r>
+            <w:r>
+              <w:rPr>
+                <w:rFonts w:ascii="Arial" w:hAnsi="Arial" w:cs="Arial"/>
+                <w:sz w:val="16"/>
+                <w:szCs w:val="16"/>
+              </w:rPr>
+              <w:t>category_id: 3</w:t>
+            </w:r>
+            <w:r>
+              <w:rPr>
+                <w:rFonts w:ascii="Arial" w:hAnsi="Arial" w:cs="Arial"/>
+                <w:sz w:val="16"/>
+                <w:szCs w:val="16"/>
+              </w:rPr>
+              <w:t xml:space="preserve"> </w:t>
+            </w:r>
+            <w:r>
+              <w:rPr>
+                <w:rFonts w:ascii="Arial" w:hAnsi="Arial" w:cs="Arial"/>
+                <w:sz w:val="16"/>
+                <w:szCs w:val="16"/>
+              </w:rPr>
+              <w:t>Role: Admin</w:t>
+            </w:r>
+          </w:p>
+        </w:tc>
+        <w:tc>
+          <w:tcPr>
+            <w:tcW w:w="2214" w:type="dxa"/>
+            <w:vAlign w:val="center"/>
+          </w:tcPr>
+          <w:p>
+            <w:pPr>
+              <w:rPr>
+                <w:rFonts w:ascii="Arial" w:hAnsi="Arial" w:cs="Arial"/>
+                <w:sz w:val="16"/>
+                <w:szCs w:val="16"/>
+              </w:rPr>
+            </w:pPr>
+            <w:r>
+              <w:rPr>
+                <w:rFonts w:ascii="Arial" w:hAnsi="Arial" w:cs="Arial"/>
+                <w:sz w:val="16"/>
+                <w:szCs w:val="16"/>
+              </w:rPr>
+              <w:t>Hệ thống báo lỗi ép kiểu / validation, từ chối lưu vào CSDL.</w:t>
+            </w:r>
+          </w:p>
+        </w:tc>
+        <w:tc>
+          <w:tcPr>
+            <w:tcW w:w="2214" w:type="dxa"/>
+            <w:vAlign w:val="center"/>
+          </w:tcPr>
+          <w:p>
+            <w:pPr>
+              <w:rPr>
+                <w:rFonts w:ascii="Arial" w:hAnsi="Arial" w:cs="Arial"/>
+                <w:sz w:val="16"/>
+                <w:szCs w:val="16"/>
+              </w:rPr>
+            </w:pPr>
+            <w:r>
+              <w:rPr>
+                <w:rFonts w:ascii="Arial" w:hAnsi="Arial" w:cs="Arial"/>
+                <w:sz w:val="16"/>
+                <w:szCs w:val="16"/>
+              </w:rPr>
+              <w:t>Invalid</w:t>
+            </w:r>
+            <w:bookmarkStart w:id="1" w:name="_GoBack"/>
+            <w:bookmarkEnd w:id="1"/>
+          </w:p>
+        </w:tc>
+      </w:tr>
+      <w:tr>
+        <w:tc>
+          <w:tcPr>
+            <w:tcW w:w="2214" w:type="dxa"/>
+            <w:vAlign w:val="center"/>
+          </w:tcPr>
+          <w:p>
+            <w:pPr>
+              <w:rPr>
+                <w:rFonts w:ascii="Arial" w:hAnsi="Arial" w:cs="Arial"/>
+                <w:sz w:val="16"/>
+                <w:szCs w:val="16"/>
+              </w:rPr>
+            </w:pPr>
+            <w:r>
+              <w:rPr>
+                <w:rFonts w:ascii="Arial" w:hAnsi="Arial" w:cs="Arial"/>
+                <w:sz w:val="16"/>
+                <w:szCs w:val="16"/>
+              </w:rPr>
+              <w:t>TC-FR15-007</w:t>
+            </w:r>
+          </w:p>
+        </w:tc>
+        <w:tc>
+          <w:tcPr>
+            <w:tcW w:w="2214" w:type="dxa"/>
+            <w:vAlign w:val="center"/>
+          </w:tcPr>
+          <w:p>
+            <w:pPr>
+              <w:rPr>
+                <w:rFonts w:ascii="Arial" w:hAnsi="Arial" w:cs="Arial"/>
+                <w:sz w:val="16"/>
+                <w:szCs w:val="16"/>
+              </w:rPr>
+            </w:pPr>
+            <w:r>
+              <w:rPr>
+                <w:rFonts w:ascii="Arial" w:hAnsi="Arial" w:cs="Arial"/>
+                <w:sz w:val="16"/>
+                <w:szCs w:val="16"/>
+              </w:rPr>
+              <w:t>Thêm sản phẩm với danh mục không tồn tại:</w:t>
+            </w:r>
+            <w:r>
+              <w:rPr>
+                <w:rFonts w:ascii="Arial" w:hAnsi="Arial" w:cs="Arial"/>
+                <w:sz w:val="16"/>
+                <w:szCs w:val="16"/>
+              </w:rPr>
+              <w:t xml:space="preserve"> </w:t>
+            </w:r>
+            <w:r>
+              <w:rPr>
+                <w:rFonts w:ascii="Arial" w:hAnsi="Arial" w:cs="Arial"/>
+                <w:sz w:val="16"/>
+                <w:szCs w:val="16"/>
+              </w:rPr>
+              <w:t>name: "Test Product"</w:t>
+            </w:r>
+            <w:r>
+              <w:rPr>
+                <w:rFonts w:ascii="Arial" w:hAnsi="Arial" w:cs="Arial"/>
+                <w:sz w:val="16"/>
+                <w:szCs w:val="16"/>
+              </w:rPr>
+              <w:t xml:space="preserve"> </w:t>
+            </w:r>
+            <w:r>
+              <w:rPr>
+                <w:rFonts w:ascii="Arial" w:hAnsi="Arial" w:cs="Arial"/>
+                <w:sz w:val="16"/>
+                <w:szCs w:val="16"/>
+              </w:rPr>
+              <w:t>price: 200000</w:t>
+            </w:r>
+            <w:r>
+              <w:rPr>
+                <w:rFonts w:ascii="Arial" w:hAnsi="Arial" w:cs="Arial"/>
+                <w:sz w:val="16"/>
+                <w:szCs w:val="16"/>
+              </w:rPr>
+              <w:t xml:space="preserve"> </w:t>
+            </w:r>
+            <w:r>
+              <w:rPr>
+                <w:rFonts w:ascii="Arial" w:hAnsi="Arial" w:cs="Arial"/>
+                <w:sz w:val="16"/>
+                <w:szCs w:val="16"/>
+              </w:rPr>
+              <w:t>category_id: 9999</w:t>
+            </w:r>
+            <w:r>
+              <w:rPr>
+                <w:rFonts w:ascii="Arial" w:hAnsi="Arial" w:cs="Arial"/>
+                <w:sz w:val="16"/>
+                <w:szCs w:val="16"/>
+              </w:rPr>
+              <w:t xml:space="preserve"> </w:t>
+            </w:r>
+            <w:r>
+              <w:rPr>
+                <w:rFonts w:ascii="Arial" w:hAnsi="Arial" w:cs="Arial"/>
+                <w:sz w:val="16"/>
+                <w:szCs w:val="16"/>
+              </w:rPr>
+              <w:t>Role: Admin</w:t>
+            </w:r>
+          </w:p>
+        </w:tc>
+        <w:tc>
+          <w:tcPr>
+            <w:tcW w:w="2214" w:type="dxa"/>
+            <w:vAlign w:val="center"/>
+          </w:tcPr>
+          <w:p>
+            <w:pPr>
+              <w:rPr>
+                <w:rFonts w:ascii="Arial" w:hAnsi="Arial" w:cs="Arial"/>
+                <w:sz w:val="16"/>
+                <w:szCs w:val="16"/>
+              </w:rPr>
+            </w:pPr>
+            <w:r>
+              <w:rPr>
+                <w:rFonts w:ascii="Arial" w:hAnsi="Arial" w:cs="Arial"/>
+                <w:sz w:val="16"/>
+                <w:szCs w:val="16"/>
+              </w:rPr>
+              <w:t>Hệ thống từ chối do category_id không khớp với bất kỳ danh mục hợp lệ nào trong CSDL.</w:t>
+            </w:r>
+          </w:p>
+        </w:tc>
+        <w:tc>
+          <w:tcPr>
+            <w:tcW w:w="2214" w:type="dxa"/>
+            <w:vAlign w:val="center"/>
+          </w:tcPr>
+          <w:p>
+            <w:pPr>
+              <w:rPr>
+                <w:rFonts w:ascii="Arial" w:hAnsi="Arial" w:cs="Arial"/>
+                <w:sz w:val="16"/>
+                <w:szCs w:val="16"/>
+              </w:rPr>
+            </w:pPr>
+            <w:r>
+              <w:rPr>
+                <w:rFonts w:ascii="Arial" w:hAnsi="Arial" w:cs="Arial"/>
+                <w:sz w:val="16"/>
+                <w:szCs w:val="16"/>
+              </w:rPr>
+              <w:t>Invalid</w:t>
+            </w:r>
+          </w:p>
+        </w:tc>
+      </w:tr>
+      <w:tr>
+        <w:tc>
+          <w:tcPr>
+            <w:tcW w:w="2214" w:type="dxa"/>
+            <w:vAlign w:val="center"/>
+          </w:tcPr>
+          <w:p>
+            <w:pPr>
+              <w:rPr>
+                <w:rFonts w:ascii="Arial" w:hAnsi="Arial" w:cs="Arial"/>
+                <w:sz w:val="16"/>
+                <w:szCs w:val="16"/>
+              </w:rPr>
+            </w:pPr>
+            <w:r>
+              <w:rPr>
+                <w:rFonts w:ascii="Arial" w:hAnsi="Arial" w:cs="Arial"/>
+                <w:sz w:val="16"/>
+                <w:szCs w:val="16"/>
+              </w:rPr>
+              <w:t>TC-FR15-008</w:t>
+            </w:r>
+          </w:p>
+        </w:tc>
+        <w:tc>
+          <w:tcPr>
+            <w:tcW w:w="2214" w:type="dxa"/>
+            <w:vAlign w:val="center"/>
+          </w:tcPr>
+          <w:p>
+            <w:pPr>
+              <w:rPr>
+                <w:rFonts w:ascii="Arial" w:hAnsi="Arial" w:cs="Arial"/>
+                <w:sz w:val="16"/>
+                <w:szCs w:val="16"/>
+              </w:rPr>
+            </w:pPr>
+            <w:r>
+              <w:rPr>
+                <w:rFonts w:ascii="Arial" w:hAnsi="Arial" w:cs="Arial"/>
+                <w:sz w:val="16"/>
+                <w:szCs w:val="16"/>
+              </w:rPr>
+              <w:t>Thêm sản phẩm để trống danh mục:</w:t>
+            </w:r>
+            <w:r>
+              <w:rPr>
+                <w:rFonts w:ascii="Arial" w:hAnsi="Arial" w:cs="Arial"/>
+                <w:sz w:val="16"/>
+                <w:szCs w:val="16"/>
+              </w:rPr>
+              <w:t xml:space="preserve"> </w:t>
+            </w:r>
+            <w:r>
+              <w:rPr>
+                <w:rFonts w:ascii="Arial" w:hAnsi="Arial" w:cs="Arial"/>
+                <w:sz w:val="16"/>
+                <w:szCs w:val="16"/>
+              </w:rPr>
+              <w:t xml:space="preserve">name: "Test </w:t>
+            </w:r>
+            <w:r>
+              <w:rPr>
+                <w:rFonts w:ascii="Arial" w:hAnsi="Arial" w:cs="Arial"/>
+                <w:sz w:val="16"/>
+                <w:szCs w:val="16"/>
+              </w:rPr>
+              <w:lastRenderedPageBreak/>
+              <w:t>Product"</w:t>
+            </w:r>
+            <w:r>
+              <w:rPr>
+                <w:rFonts w:ascii="Arial" w:hAnsi="Arial" w:cs="Arial"/>
+                <w:sz w:val="16"/>
+                <w:szCs w:val="16"/>
+              </w:rPr>
+              <w:t xml:space="preserve"> </w:t>
+            </w:r>
+            <w:r>
+              <w:rPr>
+                <w:rFonts w:ascii="Arial" w:hAnsi="Arial" w:cs="Arial"/>
+                <w:sz w:val="16"/>
+                <w:szCs w:val="16"/>
+              </w:rPr>
+              <w:t>price: 200000</w:t>
+            </w:r>
+            <w:r>
+              <w:rPr>
+                <w:rFonts w:ascii="Arial" w:hAnsi="Arial" w:cs="Arial"/>
+                <w:sz w:val="16"/>
+                <w:szCs w:val="16"/>
+              </w:rPr>
+              <w:t xml:space="preserve"> </w:t>
+            </w:r>
+            <w:r>
+              <w:rPr>
+                <w:rFonts w:ascii="Arial" w:hAnsi="Arial" w:cs="Arial"/>
+                <w:sz w:val="16"/>
+                <w:szCs w:val="16"/>
+              </w:rPr>
+              <w:t>category_id: null</w:t>
+            </w:r>
+            <w:r>
+              <w:rPr>
+                <w:rFonts w:ascii="Arial" w:hAnsi="Arial" w:cs="Arial"/>
+                <w:sz w:val="16"/>
+                <w:szCs w:val="16"/>
+              </w:rPr>
+              <w:t xml:space="preserve"> </w:t>
+            </w:r>
+            <w:r>
+              <w:rPr>
+                <w:rFonts w:ascii="Arial" w:hAnsi="Arial" w:cs="Arial"/>
+                <w:sz w:val="16"/>
+                <w:szCs w:val="16"/>
+              </w:rPr>
+              <w:t>Role: Admin</w:t>
+            </w:r>
+          </w:p>
+        </w:tc>
+        <w:tc>
+          <w:tcPr>
+            <w:tcW w:w="2214" w:type="dxa"/>
+            <w:vAlign w:val="center"/>
+          </w:tcPr>
+          <w:p>
+            <w:pPr>
+              <w:rPr>
+                <w:rFonts w:ascii="Arial" w:hAnsi="Arial" w:cs="Arial"/>
+                <w:sz w:val="16"/>
+                <w:szCs w:val="16"/>
+              </w:rPr>
+            </w:pPr>
+            <w:r>
+              <w:rPr>
+                <w:rFonts w:ascii="Arial" w:hAnsi="Arial" w:cs="Arial"/>
+                <w:sz w:val="16"/>
+                <w:szCs w:val="16"/>
+              </w:rPr>
+              <w:lastRenderedPageBreak/>
+              <w:t xml:space="preserve">Hệ thống báo lỗi do danh mục là trường bắt buộc </w:t>
+            </w:r>
+            <w:r>
+              <w:rPr>
+                <w:rFonts w:ascii="Arial" w:hAnsi="Arial" w:cs="Arial"/>
+                <w:sz w:val="16"/>
+                <w:szCs w:val="16"/>
+              </w:rPr>
+              <w:lastRenderedPageBreak/>
+              <w:t>phải chọn.</w:t>
+            </w:r>
+          </w:p>
+        </w:tc>
+        <w:tc>
+          <w:tcPr>
+            <w:tcW w:w="2214" w:type="dxa"/>
+            <w:vAlign w:val="center"/>
+          </w:tcPr>
+          <w:p>
+            <w:pPr>
+              <w:rPr>
+                <w:rFonts w:ascii="Arial" w:hAnsi="Arial" w:cs="Arial"/>
+                <w:sz w:val="16"/>
+                <w:szCs w:val="16"/>
+              </w:rPr>
+            </w:pPr>
+            <w:r>
+              <w:rPr>
+                <w:rFonts w:ascii="Arial" w:hAnsi="Arial" w:cs="Arial"/>
+                <w:sz w:val="16"/>
+                <w:szCs w:val="16"/>
+              </w:rPr>
+              <w:lastRenderedPageBreak/>
+              <w:t>Invalid</w:t>
+            </w:r>
+          </w:p>
+        </w:tc>
+      </w:tr>
+      <w:tr>
+        <w:tc>
+          <w:tcPr>
+            <w:tcW w:w="2214" w:type="dxa"/>
+            <w:vAlign w:val="center"/>
+          </w:tcPr>
+          <w:p>
+            <w:pPr>
+              <w:rPr>
+                <w:rFonts w:ascii="Arial" w:hAnsi="Arial" w:cs="Arial"/>
+                <w:sz w:val="16"/>
+                <w:szCs w:val="16"/>
+              </w:rPr>
+            </w:pPr>
+            <w:r>
+              <w:rPr>
+                <w:rFonts w:ascii="Arial" w:hAnsi="Arial" w:cs="Arial"/>
+                <w:sz w:val="16"/>
+                <w:szCs w:val="16"/>
+              </w:rPr>
+              <w:lastRenderedPageBreak/>
+              <w:t>TC-FR15-009</w:t>
+            </w:r>
+          </w:p>
+        </w:tc>
+        <w:tc>
+          <w:tcPr>
+            <w:tcW w:w="2214" w:type="dxa"/>
+            <w:vAlign w:val="center"/>
+          </w:tcPr>
+          <w:p>
+            <w:pPr>
+              <w:rPr>
+                <w:rFonts w:ascii="Arial" w:hAnsi="Arial" w:cs="Arial"/>
+                <w:sz w:val="16"/>
+                <w:szCs w:val="16"/>
+              </w:rPr>
+            </w:pPr>
+            <w:r>
+              <w:rPr>
+                <w:rFonts w:ascii="Arial" w:hAnsi="Arial" w:cs="Arial"/>
+                <w:sz w:val="16"/>
+                <w:szCs w:val="16"/>
+              </w:rPr>
+              <w:t>Thêm sản phẩm bằng tài khoản User thường:</w:t>
+            </w:r>
+            <w:r>
+              <w:rPr>
+                <w:rFonts w:ascii="Arial" w:hAnsi="Arial" w:cs="Arial"/>
+                <w:sz w:val="16"/>
+                <w:szCs w:val="16"/>
+              </w:rPr>
+              <w:t xml:space="preserve"> </w:t>
+            </w:r>
+            <w:r>
+              <w:rPr>
+                <w:rFonts w:ascii="Arial" w:hAnsi="Arial" w:cs="Arial"/>
+                <w:sz w:val="16"/>
+                <w:szCs w:val="16"/>
+              </w:rPr>
+              <w:t>name: "Hacker Product"</w:t>
+            </w:r>
+            <w:r>
+              <w:rPr>
+                <w:rFonts w:ascii="Arial" w:hAnsi="Arial" w:cs="Arial"/>
+                <w:sz w:val="16"/>
+                <w:szCs w:val="16"/>
+              </w:rPr>
+              <w:t xml:space="preserve"> </w:t>
+            </w:r>
+            <w:r>
+              <w:rPr>
+                <w:rFonts w:ascii="Arial" w:hAnsi="Arial" w:cs="Arial"/>
+                <w:sz w:val="16"/>
+                <w:szCs w:val="16"/>
+              </w:rPr>
+              <w:t>price: 100000</w:t>
+            </w:r>
+            <w:r>
+              <w:rPr>
+                <w:rFonts w:ascii="Arial" w:hAnsi="Arial" w:cs="Arial"/>
+                <w:sz w:val="16"/>
+                <w:szCs w:val="16"/>
+              </w:rPr>
+              <w:t xml:space="preserve"> </w:t>
+            </w:r>
+            <w:r>
+              <w:rPr>
+                <w:rFonts w:ascii="Arial" w:hAnsi="Arial" w:cs="Arial"/>
+                <w:sz w:val="16"/>
+                <w:szCs w:val="16"/>
+              </w:rPr>
+              <w:t>category_id: 1</w:t>
+            </w:r>
+            <w:r>
+              <w:rPr>
+                <w:rFonts w:ascii="Arial" w:hAnsi="Arial" w:cs="Arial"/>
+                <w:sz w:val="16"/>
+                <w:szCs w:val="16"/>
+              </w:rPr>
+              <w:t xml:space="preserve"> </w:t>
+            </w:r>
+            <w:r>
+              <w:rPr>
+                <w:rFonts w:ascii="Arial" w:hAnsi="Arial" w:cs="Arial"/>
+                <w:sz w:val="16"/>
+                <w:szCs w:val="16"/>
+              </w:rPr>
+              <w:t>Role: User (role = 'user')</w:t>
+            </w:r>
+          </w:p>
+        </w:tc>
+        <w:tc>
+          <w:tcPr>
+            <w:tcW w:w="2214" w:type="dxa"/>
+            <w:vAlign w:val="center"/>
+          </w:tcPr>
+          <w:p>
+            <w:pPr>
+              <w:rPr>
+                <w:rFonts w:ascii="Arial" w:hAnsi="Arial" w:cs="Arial"/>
+                <w:sz w:val="16"/>
+                <w:szCs w:val="16"/>
+              </w:rPr>
+            </w:pPr>
+            <w:r>
+              <w:rPr>
+                <w:rFonts w:ascii="Arial" w:hAnsi="Arial" w:cs="Arial"/>
+                <w:sz w:val="16"/>
+                <w:szCs w:val="16"/>
+              </w:rPr>
+              <w:t>Hệ thống từ chối truy cập (Trả về lỗi 403 Forbidden / Unauthorized), bảo vệ phân hệ Admin.</w:t>
+            </w:r>
+          </w:p>
+        </w:tc>
+        <w:tc>
+          <w:tcPr>
+            <w:tcW w:w="2214" w:type="dxa"/>
+            <w:vAlign w:val="center"/>
+          </w:tcPr>
+          <w:p>
+            <w:pPr>
+              <w:rPr>
+                <w:rFonts w:ascii="Arial" w:hAnsi="Arial" w:cs="Arial"/>
+                <w:sz w:val="16"/>
+                <w:szCs w:val="16"/>
+              </w:rPr>
+            </w:pPr>
+            <w:r>
+              <w:rPr>
+                <w:rFonts w:ascii="Arial" w:hAnsi="Arial" w:cs="Arial"/>
+                <w:sz w:val="16"/>
+                <w:szCs w:val="16"/>
+              </w:rPr>
+              <w:t>Invalid</w:t>
+            </w:r>
+          </w:p>
+        </w:tc>
+      </w:tr>
+      <w:tr>
+        <w:tc>
+          <w:tcPr>
+            <w:tcW w:w="2214" w:type="dxa"/>
+            <w:vAlign w:val="center"/>
+          </w:tcPr>
+          <w:p>
+            <w:pPr>
+              <w:rPr>
+                <w:rFonts w:ascii="Arial" w:hAnsi="Arial" w:cs="Arial"/>
+                <w:sz w:val="16"/>
+                <w:szCs w:val="16"/>
+              </w:rPr>
+            </w:pPr>
+            <w:r>
+              <w:rPr>
+                <w:rFonts w:ascii="Arial" w:hAnsi="Arial" w:cs="Arial"/>
+                <w:sz w:val="16"/>
+                <w:szCs w:val="16"/>
+              </w:rPr>
+              <w:t>TC-FR15-010</w:t>
+            </w:r>
+          </w:p>
+        </w:tc>
+        <w:tc>
+          <w:tcPr>
+            <w:tcW w:w="2214" w:type="dxa"/>
+            <w:vAlign w:val="center"/>
+          </w:tcPr>
+          <w:p>
+            <w:pPr>
+              <w:rPr>
+                <w:rFonts w:ascii="Arial" w:hAnsi="Arial" w:cs="Arial"/>
+                <w:sz w:val="16"/>
+                <w:szCs w:val="16"/>
+              </w:rPr>
+            </w:pPr>
+            <w:r>
+              <w:rPr>
+                <w:rFonts w:ascii="Arial" w:hAnsi="Arial" w:cs="Arial"/>
+                <w:sz w:val="16"/>
+                <w:szCs w:val="16"/>
+              </w:rPr>
+              <w:t>Thêm sản phẩm khi chưa đăng nhập:</w:t>
+            </w:r>
+            <w:r>
+              <w:rPr>
+                <w:rFonts w:ascii="Arial" w:hAnsi="Arial" w:cs="Arial"/>
+                <w:sz w:val="16"/>
+                <w:szCs w:val="16"/>
+              </w:rPr>
+              <w:t xml:space="preserve"> </w:t>
+            </w:r>
+            <w:r>
+              <w:rPr>
+                <w:rFonts w:ascii="Arial" w:hAnsi="Arial" w:cs="Arial"/>
+                <w:sz w:val="16"/>
+                <w:szCs w:val="16"/>
+              </w:rPr>
+              <w:t>name: "No Auth Product"</w:t>
+            </w:r>
+            <w:r>
+              <w:rPr>
+                <w:rFonts w:ascii="Arial" w:hAnsi="Arial" w:cs="Arial"/>
+                <w:sz w:val="16"/>
+                <w:szCs w:val="16"/>
+              </w:rPr>
+              <w:t xml:space="preserve"> </w:t>
+            </w:r>
+            <w:r>
+              <w:rPr>
+                <w:rFonts w:ascii="Arial" w:hAnsi="Arial" w:cs="Arial"/>
+                <w:sz w:val="16"/>
+                <w:szCs w:val="16"/>
+              </w:rPr>
+              <w:t>price: 100000</w:t>
+            </w:r>
+            <w:r>
+              <w:rPr>
+                <w:rFonts w:ascii="Arial" w:hAnsi="Arial" w:cs="Arial"/>
+                <w:sz w:val="16"/>
+                <w:szCs w:val="16"/>
+              </w:rPr>
+              <w:t xml:space="preserve"> </w:t>
+            </w:r>
+            <w:r>
+              <w:rPr>
+                <w:rFonts w:ascii="Arial" w:hAnsi="Arial" w:cs="Arial"/>
+                <w:sz w:val="16"/>
+                <w:szCs w:val="16"/>
+              </w:rPr>
+              <w:t>category_id: 1</w:t>
+            </w:r>
+            <w:r>
+              <w:rPr>
+                <w:rFonts w:ascii="Arial" w:hAnsi="Arial" w:cs="Arial"/>
+                <w:sz w:val="16"/>
+                <w:szCs w:val="16"/>
+              </w:rPr>
+              <w:t xml:space="preserve"> </w:t>
+            </w:r>
+            <w:r>
+              <w:rPr>
+                <w:rFonts w:ascii="Arial" w:hAnsi="Arial" w:cs="Arial"/>
+                <w:sz w:val="16"/>
+                <w:szCs w:val="16"/>
+              </w:rPr>
+              <w:t>Không gửi Token Authorization</w:t>
+            </w:r>
+          </w:p>
+        </w:tc>
+        <w:tc>
+          <w:tcPr>
+            <w:tcW w:w="2214" w:type="dxa"/>
+            <w:vAlign w:val="center"/>
+          </w:tcPr>
+          <w:p>
+            <w:pPr>
+              <w:rPr>
+                <w:rFonts w:ascii="Arial" w:hAnsi="Arial" w:cs="Arial"/>
+                <w:sz w:val="16"/>
+                <w:szCs w:val="16"/>
+              </w:rPr>
+            </w:pPr>
+            <w:r>
+              <w:rPr>
+                <w:rFonts w:ascii="Arial" w:hAnsi="Arial" w:cs="Arial"/>
+                <w:sz w:val="16"/>
+                <w:szCs w:val="16"/>
+              </w:rPr>
+              <w:t>Hệ thống từ chối yêu cầu (401 Unauthorized).</w:t>
+            </w:r>
+          </w:p>
+        </w:tc>
+        <w:tc>
+          <w:tcPr>
+            <w:tcW w:w="2214" w:type="dxa"/>
+            <w:vAlign w:val="center"/>
+          </w:tcPr>
+          <w:p>
+            <w:pPr>
+              <w:rPr>
+                <w:rFonts w:ascii="Arial" w:hAnsi="Arial" w:cs="Arial"/>
+                <w:sz w:val="16"/>
+                <w:szCs w:val="16"/>
+              </w:rPr>
+            </w:pPr>
+            <w:r>
+              <w:rPr>
+                <w:rFonts w:ascii="Arial" w:hAnsi="Arial" w:cs="Arial"/>
+                <w:sz w:val="16"/>
+                <w:szCs w:val="16"/>
+              </w:rPr>
+              <w:t>Invalid</w:t>
+            </w:r>
+          </w:p>
+        </w:tc>
+      </w:tr>
+      <w:tr>
+        <w:tc>
+          <w:tcPr>
+            <w:tcW w:w="2214" w:type="dxa"/>
+            <w:vAlign w:val="center"/>
+          </w:tcPr>
+          <w:p>
+            <w:pPr>
+              <w:rPr>
+                <w:rFonts w:ascii="Arial" w:hAnsi="Arial" w:cs="Arial"/>
+                <w:sz w:val="16"/>
+                <w:szCs w:val="16"/>
+              </w:rPr>
+            </w:pPr>
+            <w:r>
+              <w:rPr>
+                <w:rFonts w:ascii="Arial" w:hAnsi="Arial" w:cs="Arial"/>
+                <w:sz w:val="16"/>
+                <w:szCs w:val="16"/>
+              </w:rPr>
+              <w:t>TC-FR15-011</w:t>
+            </w:r>
+          </w:p>
+        </w:tc>
+        <w:tc>
+          <w:tcPr>
+            <w:tcW w:w="2214" w:type="dxa"/>
+            <w:vAlign w:val="center"/>
+          </w:tcPr>
+          <w:p>
+            <w:pPr>
+              <w:rPr>
+                <w:rFonts w:ascii="Arial" w:hAnsi="Arial" w:cs="Arial"/>
+                <w:sz w:val="16"/>
+                <w:szCs w:val="16"/>
+              </w:rPr>
+            </w:pPr>
+            <w:r>
+              <w:rPr>
+                <w:rFonts w:ascii="Arial" w:hAnsi="Arial" w:cs="Arial"/>
+                <w:sz w:val="16"/>
+                <w:szCs w:val="16"/>
+              </w:rPr>
+              <w:t>Cập nhật sản phẩm hợp lệ (PUT /api/products/1):</w:t>
+            </w:r>
+            <w:r>
+              <w:rPr>
+                <w:rFonts w:ascii="Arial" w:hAnsi="Arial" w:cs="Arial"/>
+                <w:sz w:val="16"/>
+                <w:szCs w:val="16"/>
+              </w:rPr>
+              <w:t xml:space="preserve"> </w:t>
+            </w:r>
+            <w:r>
+              <w:rPr>
+                <w:rFonts w:ascii="Arial" w:hAnsi="Arial" w:cs="Arial"/>
+                <w:sz w:val="16"/>
+                <w:szCs w:val="16"/>
+              </w:rPr>
+              <w:t>Đổi tên thành "iPhone 15 Pro Max (Updated)"</w:t>
+            </w:r>
+            <w:r>
+              <w:rPr>
+                <w:rFonts w:ascii="Arial" w:hAnsi="Arial" w:cs="Arial"/>
+                <w:sz w:val="16"/>
+                <w:szCs w:val="16"/>
+              </w:rPr>
+              <w:t xml:space="preserve"> </w:t>
+            </w:r>
+            <w:r>
+              <w:rPr>
+                <w:rFonts w:ascii="Arial" w:hAnsi="Arial" w:cs="Arial"/>
+                <w:sz w:val="16"/>
+                <w:szCs w:val="16"/>
+              </w:rPr>
+              <w:t>Role: Admin</w:t>
+            </w:r>
+          </w:p>
+        </w:tc>
+        <w:tc>
+          <w:tcPr>
+            <w:tcW w:w="2214" w:type="dxa"/>
+            <w:vAlign w:val="center"/>
+          </w:tcPr>
+          <w:p>
+            <w:pPr>
+              <w:rPr>
+                <w:rFonts w:ascii="Arial" w:hAnsi="Arial" w:cs="Arial"/>
+                <w:sz w:val="16"/>
+                <w:szCs w:val="16"/>
+              </w:rPr>
+            </w:pPr>
+            <w:r>
+              <w:rPr>
+                <w:rFonts w:ascii="Arial" w:hAnsi="Arial" w:cs="Arial"/>
+                <w:sz w:val="16"/>
+                <w:szCs w:val="16"/>
+              </w:rPr>
+              <w:t>Cập nhật thành công. Chỉ sản phẩm có id = 1 bị thay đổi thông tin, các sản phẩm khác (id &gt; 1) giữ nguyên trạng thái cũ.</w:t>
+            </w:r>
+          </w:p>
+        </w:tc>
+        <w:tc>
+          <w:tcPr>
+            <w:tcW w:w="2214" w:type="dxa"/>
+            <w:vAlign w:val="center"/>
+          </w:tcPr>
+          <w:p>
+            <w:pPr>
+              <w:rPr>
+                <w:rFonts w:ascii="Arial" w:hAnsi="Arial" w:cs="Arial"/>
+                <w:sz w:val="16"/>
+                <w:szCs w:val="16"/>
+              </w:rPr>
+            </w:pPr>
+            <w:r>
+              <w:rPr>
+                <w:rFonts w:ascii="Arial" w:hAnsi="Arial" w:cs="Arial"/>
+                <w:sz w:val="16"/>
+                <w:szCs w:val="16"/>
+              </w:rPr>
+              <w:t>Valid</w:t>
+            </w:r>
+          </w:p>
+        </w:tc>
+      </w:tr>
+      <w:tr>
+        <w:tc>
+          <w:tcPr>
+            <w:tcW w:w="2214" w:type="dxa"/>
+            <w:vAlign w:val="center"/>
+          </w:tcPr>
+          <w:p>
+            <w:pPr>
+              <w:rPr>
+                <w:rFonts w:ascii="Arial" w:hAnsi="Arial" w:cs="Arial"/>
+                <w:sz w:val="16"/>
+                <w:szCs w:val="16"/>
+              </w:rPr>
+            </w:pPr>
+            <w:r>
+              <w:rPr>
+                <w:rFonts w:ascii="Arial" w:hAnsi="Arial" w:cs="Arial"/>
+                <w:sz w:val="16"/>
+                <w:szCs w:val="16"/>
+              </w:rPr>
+              <w:t>TC-FR15-012</w:t>
+            </w:r>
+          </w:p>
+        </w:tc>
+        <w:tc>
+          <w:tcPr>
+            <w:tcW w:w="2214" w:type="dxa"/>
+            <w:vAlign w:val="center"/>
+          </w:tcPr>
+          <w:p>
+            <w:pPr>
+              <w:rPr>
+                <w:rFonts w:ascii="Arial" w:hAnsi="Arial" w:cs="Arial"/>
+                <w:sz w:val="16"/>
+                <w:szCs w:val="16"/>
+              </w:rPr>
+            </w:pPr>
+            <w:r>
+              <w:rPr>
+                <w:rFonts w:ascii="Arial" w:hAnsi="Arial" w:cs="Arial"/>
+                <w:sz w:val="16"/>
+                <w:szCs w:val="16"/>
+              </w:rPr>
+              <w:t>Cập nhật sản phẩm với id không tồn tại (PUT /api/products/99999):</w:t>
+            </w:r>
+            <w:r>
+              <w:rPr>
+                <w:rFonts w:ascii="Arial" w:hAnsi="Arial" w:cs="Arial"/>
+                <w:sz w:val="16"/>
+                <w:szCs w:val="16"/>
+              </w:rPr>
+              <w:t xml:space="preserve"> </w:t>
+            </w:r>
+            <w:r>
+              <w:rPr>
+                <w:rFonts w:ascii="Arial" w:hAnsi="Arial" w:cs="Arial"/>
+                <w:sz w:val="16"/>
+                <w:szCs w:val="16"/>
+              </w:rPr>
+              <w:t>Role: Admin</w:t>
+            </w:r>
+          </w:p>
+        </w:tc>
+        <w:tc>
+          <w:tcPr>
+            <w:tcW w:w="2214" w:type="dxa"/>
+            <w:vAlign w:val="center"/>
+          </w:tcPr>
+          <w:p>
+            <w:pPr>
+              <w:rPr>
+                <w:rFonts w:ascii="Arial" w:hAnsi="Arial" w:cs="Arial"/>
+                <w:sz w:val="16"/>
+                <w:szCs w:val="16"/>
+              </w:rPr>
+            </w:pPr>
+            <w:r>
+              <w:rPr>
+                <w:rFonts w:ascii="Arial" w:hAnsi="Arial" w:cs="Arial"/>
+                <w:sz w:val="16"/>
+                <w:szCs w:val="16"/>
+              </w:rPr>
+              <w:t>Hệ thống trả về lỗi 404 Not Found hoặc thông báo sản phẩm không tồn tại.</w:t>
+            </w:r>
+          </w:p>
+        </w:tc>
+        <w:tc>
+          <w:tcPr>
+            <w:tcW w:w="2214" w:type="dxa"/>
+            <w:vAlign w:val="center"/>
+          </w:tcPr>
+          <w:p>
+            <w:pPr>
+              <w:rPr>
+                <w:rFonts w:ascii="Arial" w:hAnsi="Arial" w:cs="Arial"/>
+                <w:sz w:val="16"/>
+                <w:szCs w:val="16"/>
+              </w:rPr>
+            </w:pPr>
+            <w:r>
+              <w:rPr>
+                <w:rFonts w:ascii="Arial" w:hAnsi="Arial" w:cs="Arial"/>
+                <w:sz w:val="16"/>
+                <w:szCs w:val="16"/>
+              </w:rPr>
+              <w:t>Invalid</w:t>
+            </w:r>
+          </w:p>
+        </w:tc>
+      </w:tr>
+    </w:tbl>
+    <w:p/>
+    <w:p>
+      <w:pPr>
+        <w:pStyle w:val="Heading5"/>
+        <w:rPr>
+          <w:rFonts w:ascii="Arial" w:hAnsi="Arial" w:cs="Arial"/>
+          <w:b/>
+          <w:i/>
+        </w:rPr>
+      </w:pPr>
+      <w:r>
+        <w:rPr>
+          <w:rFonts w:ascii="Arial" w:hAnsi="Arial" w:cs="Arial"/>
+          <w:b/>
+          <w:i/>
+        </w:rPr>
+        <w:t>Boundary Value Analysis</w:t>
+      </w:r>
+    </w:p>
+    <w:p/>
+    <w:p>
+      <w:pPr>
+        <w:rPr>
+          <w:rFonts w:ascii="Arial" w:hAnsi="Arial" w:cs="Arial"/>
+          <w:sz w:val="20"/>
+          <w:szCs w:val="20"/>
+        </w:rPr>
+      </w:pPr>
     </w:p>
     <w:sdt>
       <w:sdtPr>
@@ -32794,7 +35760,7 @@
 </file>
 
 <file path=customXml/itemProps1.xml><?xml version="1.0" encoding="utf-8"?>
-<ds:datastoreItem xmlns:ds="http://schemas.openxmlformats.org/officeDocument/2006/customXml" ds:itemID="{0FF09095-FB12-4BB6-B522-DEA7C99F175B}">
+<ds:datastoreItem xmlns:ds="http://schemas.openxmlformats.org/officeDocument/2006/customXml" ds:itemID="{06922364-1D40-4D4C-83D6-21BAEA3D983C}">
   <ds:schemaRefs>
     <ds:schemaRef ds:uri="http://schemas.openxmlformats.org/officeDocument/2006/bibliography"/>
   </ds:schemaRefs>

</xml_diff>

<commit_message>
FR01 requirement 1, explaination + requirement 2 test cases
</commit_message>
<xml_diff>
--- a/MainReport.docx
+++ b/MainReport.docx
@@ -13590,25 +13590,7 @@
           <w:sz w:val="20"/>
           <w:szCs w:val="20"/>
         </w:rPr>
-        <w:t xml:space="preserve">- </w:t>
-      </w:r>
-      <w:r>
-        <w:rPr>
-          <w:rFonts w:ascii="Arial" w:hAnsi="Arial" w:cs="Arial"/>
-          <w:b/>
-          <w:sz w:val="20"/>
-          <w:szCs w:val="20"/>
-        </w:rPr>
-        <w:t xml:space="preserve">Bước 1. </w:t>
-      </w:r>
-      <w:r>
-        <w:rPr>
-          <w:rFonts w:ascii="Arial" w:hAnsi="Arial" w:cs="Arial"/>
-          <w:b/>
-          <w:sz w:val="20"/>
-          <w:szCs w:val="20"/>
-        </w:rPr>
-        <w:t>Nhận diện đúng thuộc tính có biên:</w:t>
+        <w:t>- Bước 1. Nhận diện đúng thuộc tính có biên:</w:t>
       </w:r>
       <w:r>
         <w:rPr>
@@ -13682,15 +13664,7 @@
           <w:sz w:val="20"/>
           <w:szCs w:val="20"/>
         </w:rPr>
-        <w:t xml:space="preserve">ợng rời rạc có thứ tự rõ ràng (số nguyên), rất nhạy cảm với các lỗi lập trình </w:t>
-      </w:r>
-      <w:r>
-        <w:rPr>
-          <w:rFonts w:ascii="Arial" w:hAnsi="Arial" w:cs="Arial"/>
-          <w:sz w:val="20"/>
-          <w:szCs w:val="20"/>
-        </w:rPr>
-        <w:t>so sánh (`&gt;`, `&lt;`, `&gt;=`, `&lt;=`).</w:t>
+        <w:t>ợng rời rạc có thứ tự rõ ràng (số nguyên), rất nhạy cảm với các lỗi lập trình so sánh (`&gt;`, `&lt;`, `&gt;=`, `&lt;=`).</w:t>
       </w:r>
     </w:p>
     <w:p>
@@ -13726,16 +13700,7 @@
           <w:sz w:val="20"/>
           <w:szCs w:val="20"/>
         </w:rPr>
-        <w:t xml:space="preserve">Bước 2. </w:t>
-      </w:r>
-      <w:r>
-        <w:rPr>
-          <w:rFonts w:ascii="Arial" w:hAnsi="Arial" w:cs="Arial"/>
-          <w:b/>
-          <w:sz w:val="20"/>
-          <w:szCs w:val="20"/>
-        </w:rPr>
-        <w:t>Khai thác biên t</w:t>
+        <w:t>Bước 2. Khai thác biên t</w:t>
       </w:r>
       <w:r>
         <w:rPr>
@@ -13753,16 +13718,7 @@
           <w:sz w:val="20"/>
           <w:szCs w:val="20"/>
         </w:rPr>
-        <w:t>ờng minh &amp; ngầm đị</w:t>
-      </w:r>
-      <w:r>
-        <w:rPr>
-          <w:rFonts w:ascii="Arial" w:hAnsi="Arial" w:cs="Arial"/>
-          <w:b/>
-          <w:sz w:val="20"/>
-          <w:szCs w:val="20"/>
-        </w:rPr>
-        <w:t>nh:</w:t>
+        <w:t>ờng minh &amp; ngầm định:</w:t>
       </w:r>
     </w:p>
     <w:p>
@@ -13864,15 +13820,7 @@
           <w:sz w:val="20"/>
           <w:szCs w:val="20"/>
         </w:rPr>
-        <w:t>ợc bổ sung để kiểm tra độ bền vững của ứng dụ</w:t>
-      </w:r>
-      <w:r>
-        <w:rPr>
-          <w:rFonts w:ascii="Arial" w:hAnsi="Arial" w:cs="Arial"/>
-          <w:sz w:val="20"/>
-          <w:szCs w:val="20"/>
-        </w:rPr>
-        <w:t>ng.</w:t>
+        <w:t>ợc bổ sung để kiểm tra độ bền vững của ứng dụng.</w:t>
       </w:r>
     </w:p>
     <w:p>
@@ -13890,25 +13838,7 @@
           <w:sz w:val="20"/>
           <w:szCs w:val="20"/>
         </w:rPr>
-        <w:t xml:space="preserve">- </w:t>
-      </w:r>
-      <w:r>
-        <w:rPr>
-          <w:rFonts w:ascii="Arial" w:hAnsi="Arial" w:cs="Arial"/>
-          <w:b/>
-          <w:sz w:val="20"/>
-          <w:szCs w:val="20"/>
-        </w:rPr>
-        <w:t xml:space="preserve">Bước 3. </w:t>
-      </w:r>
-      <w:r>
-        <w:rPr>
-          <w:rFonts w:ascii="Arial" w:hAnsi="Arial" w:cs="Arial"/>
-          <w:b/>
-          <w:sz w:val="20"/>
-          <w:szCs w:val="20"/>
-        </w:rPr>
-        <w:t>Ứng dụng chuẩn 3-value BVA</w:t>
+        <w:t>- Bước 3. Ứng dụng chuẩn 3-value BVA</w:t>
       </w:r>
       <w:r>
         <w:rPr>
@@ -13934,15 +13864,7 @@
           <w:sz w:val="20"/>
           <w:szCs w:val="20"/>
         </w:rPr>
-        <w:t xml:space="preserve"> +1 và -1, , +1) giúp phát hiện triệt để các lỗi `Off-by-one` kinh điển của lập trình viên (ví dụ: viết nhầm điều kiện `quantity</w:t>
-      </w:r>
-      <w:r>
-        <w:rPr>
-          <w:rFonts w:ascii="Arial" w:hAnsi="Arial" w:cs="Arial"/>
-          <w:sz w:val="20"/>
-          <w:szCs w:val="20"/>
-        </w:rPr>
-        <w:t xml:space="preserve"> &gt; 1` thay vì `quantity &gt;= 1`).</w:t>
+        <w:t xml:space="preserve"> +1 và -1, , +1) giúp phát hiện triệt để các lỗi `Off-by-one` kinh điển của lập trình viên (ví dụ: viết nhầm điều kiện `quantity &gt; 1` thay vì `quantity &gt;= 1`).</w:t>
       </w:r>
     </w:p>
     <w:p>
@@ -13960,25 +13882,7 @@
           <w:sz w:val="20"/>
           <w:szCs w:val="20"/>
         </w:rPr>
-        <w:t xml:space="preserve">- </w:t>
-      </w:r>
-      <w:r>
-        <w:rPr>
-          <w:rFonts w:ascii="Arial" w:hAnsi="Arial" w:cs="Arial"/>
-          <w:b/>
-          <w:sz w:val="20"/>
-          <w:szCs w:val="20"/>
-        </w:rPr>
-        <w:t xml:space="preserve">Bước 4. </w:t>
-      </w:r>
-      <w:r>
-        <w:rPr>
-          <w:rFonts w:ascii="Arial" w:hAnsi="Arial" w:cs="Arial"/>
-          <w:b/>
-          <w:sz w:val="20"/>
-          <w:szCs w:val="20"/>
-        </w:rPr>
-        <w:t>Cô lập biến (Isolate variables):</w:t>
+        <w:t>- Bước 4. Cô lập biến (Isolate variables):</w:t>
       </w:r>
       <w:r>
         <w:rPr>
@@ -14061,6 +13965,26 @@
         <w:t>Domain Testing</w:t>
       </w:r>
     </w:p>
+    <w:p>
+      <w:pPr>
+        <w:pStyle w:val="ListParagraph"/>
+        <w:numPr>
+          <w:ilvl w:val="0"/>
+          <w:numId w:val="50"/>
+        </w:numPr>
+        <w:rPr>
+          <w:rFonts w:ascii="Arial" w:hAnsi="Arial" w:cs="Arial"/>
+          <w:b/>
+        </w:rPr>
+      </w:pPr>
+      <w:r>
+        <w:rPr>
+          <w:rFonts w:ascii="Arial" w:hAnsi="Arial" w:cs="Arial"/>
+          <w:b/>
+        </w:rPr>
+        <w:t>Test cases</w:t>
+      </w:r>
+    </w:p>
     <w:tbl>
       <w:tblPr>
         <w:tblStyle w:val="TableGrid"/>
@@ -14822,7 +14746,7 @@
                 <w:sz w:val="16"/>
                 <w:szCs w:val="16"/>
               </w:rPr>
-              <w:t>Hệ thống từ chối, trả về lỗi do giá sản phẩm phải là số dương lớn hơn 0 ($\text{price} &gt; 0$).</w:t>
+              <w:t>Hệ thống từ chối, trả về lỗi do giá sản phẩm phải là số dương lớn hơn 0 ({price} &gt; 0).</w:t>
             </w:r>
           </w:p>
         </w:tc>
@@ -15163,8 +15087,6 @@
               </w:rPr>
               <w:t>Invalid</w:t>
             </w:r>
-            <w:bookmarkStart w:id="1" w:name="_GoBack"/>
-            <w:bookmarkEnd w:id="1"/>
           </w:p>
         </w:tc>
       </w:tr>
@@ -15275,7 +15197,16 @@
                 <w:sz w:val="16"/>
                 <w:szCs w:val="16"/>
               </w:rPr>
-              <w:t>Role: Admin</w:t>
+              <w:t xml:space="preserve">Role: </w:t>
+            </w:r>
+            <w:r>
+              <w:rPr>
+                <w:rFonts w:ascii="Arial" w:hAnsi="Arial" w:cs="Arial"/>
+                <w:sz w:val="16"/>
+                <w:szCs w:val="16"/>
+              </w:rPr>
+              <w:lastRenderedPageBreak/>
+              <w:t>Admin</w:t>
             </w:r>
           </w:p>
         </w:tc>
@@ -15298,6 +15229,7 @@
                 <w:sz w:val="16"/>
                 <w:szCs w:val="16"/>
               </w:rPr>
+              <w:lastRenderedPageBreak/>
               <w:t>Hệ thống từ chối do category_id không khớp với bất kỳ danh mục hợp lệ nào trong CSDL.</w:t>
             </w:r>
           </w:p>
@@ -15346,6 +15278,7 @@
                 <w:sz w:val="16"/>
                 <w:szCs w:val="16"/>
               </w:rPr>
+              <w:lastRenderedPageBreak/>
               <w:t>TC-FR15-008</w:t>
             </w:r>
           </w:p>
@@ -15385,16 +15318,7 @@
                 <w:sz w:val="16"/>
                 <w:szCs w:val="16"/>
               </w:rPr>
-              <w:t xml:space="preserve">name: "Test </w:t>
-            </w:r>
-            <w:r>
-              <w:rPr>
-                <w:rFonts w:ascii="Arial" w:hAnsi="Arial" w:cs="Arial"/>
-                <w:sz w:val="16"/>
-                <w:szCs w:val="16"/>
-              </w:rPr>
-              <w:lastRenderedPageBreak/>
-              <w:t>Product"</w:t>
+              <w:t>name: "Test Product"</w:t>
             </w:r>
             <w:r>
               <w:rPr>
@@ -15465,17 +15389,7 @@
                 <w:sz w:val="16"/>
                 <w:szCs w:val="16"/>
               </w:rPr>
-              <w:lastRenderedPageBreak/>
-              <w:t xml:space="preserve">Hệ thống báo lỗi do danh mục là trường bắt buộc </w:t>
-            </w:r>
-            <w:r>
-              <w:rPr>
-                <w:rFonts w:ascii="Arial" w:hAnsi="Arial" w:cs="Arial"/>
-                <w:sz w:val="16"/>
-                <w:szCs w:val="16"/>
-              </w:rPr>
-              <w:lastRenderedPageBreak/>
-              <w:t>phải chọn.</w:t>
+              <w:t>Hệ thống báo lỗi do danh mục là trường bắt buộc phải chọn.</w:t>
             </w:r>
           </w:p>
         </w:tc>
@@ -15498,7 +15412,6 @@
                 <w:sz w:val="16"/>
                 <w:szCs w:val="16"/>
               </w:rPr>
-              <w:lastRenderedPageBreak/>
               <w:t>Invalid</w:t>
             </w:r>
           </w:p>
@@ -15524,7 +15437,6 @@
                 <w:sz w:val="16"/>
                 <w:szCs w:val="16"/>
               </w:rPr>
-              <w:lastRenderedPageBreak/>
               <w:t>TC-FR15-009</w:t>
             </w:r>
           </w:p>
@@ -16058,7 +15970,565 @@
         </w:tc>
       </w:tr>
     </w:tbl>
-    <w:p/>
+    <w:p>
+      <w:pPr>
+        <w:pStyle w:val="ListParagraph"/>
+        <w:numPr>
+          <w:ilvl w:val="0"/>
+          <w:numId w:val="50"/>
+        </w:numPr>
+        <w:rPr>
+          <w:rFonts w:ascii="Arial" w:hAnsi="Arial" w:cs="Arial"/>
+          <w:b/>
+        </w:rPr>
+      </w:pPr>
+      <w:r>
+        <w:rPr>
+          <w:rFonts w:ascii="Arial" w:hAnsi="Arial" w:cs="Arial"/>
+          <w:b/>
+        </w:rPr>
+        <w:t>Explaination</w:t>
+      </w:r>
+    </w:p>
+    <w:p>
+      <w:pPr>
+        <w:ind w:left="360"/>
+        <w:rPr>
+          <w:rFonts w:ascii="Arial" w:hAnsi="Arial" w:cs="Arial"/>
+          <w:b/>
+          <w:sz w:val="20"/>
+          <w:szCs w:val="20"/>
+        </w:rPr>
+      </w:pPr>
+      <w:r>
+        <w:rPr>
+          <w:rFonts w:ascii="Arial" w:hAnsi="Arial" w:cs="Arial"/>
+          <w:b/>
+          <w:sz w:val="20"/>
+          <w:szCs w:val="20"/>
+        </w:rPr>
+        <w:t>B</w:t>
+      </w:r>
+      <w:r>
+        <w:rPr>
+          <w:rFonts w:ascii="Arial" w:hAnsi="Arial" w:cs="Arial" w:hint="cs"/>
+          <w:b/>
+          <w:sz w:val="20"/>
+          <w:szCs w:val="20"/>
+        </w:rPr>
+        <w:t>ư</w:t>
+      </w:r>
+      <w:r>
+        <w:rPr>
+          <w:rFonts w:ascii="Arial" w:hAnsi="Arial" w:cs="Arial"/>
+          <w:b/>
+          <w:sz w:val="20"/>
+          <w:szCs w:val="20"/>
+        </w:rPr>
+        <w:t>ớc 1 (Xác định biến đầu vào &amp; Phân vùng t</w:t>
+      </w:r>
+      <w:r>
+        <w:rPr>
+          <w:rFonts w:ascii="Arial" w:hAnsi="Arial" w:cs="Arial" w:hint="cs"/>
+          <w:b/>
+          <w:sz w:val="20"/>
+          <w:szCs w:val="20"/>
+        </w:rPr>
+        <w:t>ươ</w:t>
+      </w:r>
+      <w:r>
+        <w:rPr>
+          <w:rFonts w:ascii="Arial" w:hAnsi="Arial" w:cs="Arial"/>
+          <w:b/>
+          <w:sz w:val="20"/>
+          <w:szCs w:val="20"/>
+        </w:rPr>
+        <w:t>ng đ</w:t>
+      </w:r>
+      <w:r>
+        <w:rPr>
+          <w:rFonts w:ascii="Arial" w:hAnsi="Arial" w:cs="Arial" w:hint="cs"/>
+          <w:b/>
+          <w:sz w:val="20"/>
+          <w:szCs w:val="20"/>
+        </w:rPr>
+        <w:t>ươ</w:t>
+      </w:r>
+      <w:r>
+        <w:rPr>
+          <w:rFonts w:ascii="Arial" w:hAnsi="Arial" w:cs="Arial"/>
+          <w:b/>
+          <w:sz w:val="20"/>
+          <w:szCs w:val="20"/>
+        </w:rPr>
+        <w:t>ng):</w:t>
+      </w:r>
+    </w:p>
+    <w:p>
+      <w:pPr>
+        <w:rPr>
+          <w:rFonts w:ascii="Arial" w:hAnsi="Arial" w:cs="Arial"/>
+          <w:sz w:val="20"/>
+          <w:szCs w:val="20"/>
+        </w:rPr>
+      </w:pPr>
+      <w:r>
+        <w:rPr>
+          <w:rFonts w:ascii="Arial" w:hAnsi="Arial" w:cs="Arial"/>
+          <w:sz w:val="20"/>
+          <w:szCs w:val="20"/>
+        </w:rPr>
+        <w:t>Tôi đã phân tích kỹ đặc tả FR-15 để tách bạch các tr</w:t>
+      </w:r>
+      <w:r>
+        <w:rPr>
+          <w:rFonts w:ascii="Arial" w:hAnsi="Arial" w:cs="Arial" w:hint="cs"/>
+          <w:sz w:val="20"/>
+          <w:szCs w:val="20"/>
+        </w:rPr>
+        <w:t>ư</w:t>
+      </w:r>
+      <w:r>
+        <w:rPr>
+          <w:rFonts w:ascii="Arial" w:hAnsi="Arial" w:cs="Arial"/>
+          <w:sz w:val="20"/>
+          <w:szCs w:val="20"/>
+        </w:rPr>
+        <w:t>ờng dữ liệu đầu vào của tính năng Quản lý Sản phẩm (`name`, `price`, `category_id`), cùng với các điều kiện môi tr</w:t>
+      </w:r>
+      <w:r>
+        <w:rPr>
+          <w:rFonts w:ascii="Arial" w:hAnsi="Arial" w:cs="Arial" w:hint="cs"/>
+          <w:sz w:val="20"/>
+          <w:szCs w:val="20"/>
+        </w:rPr>
+        <w:t>ư</w:t>
+      </w:r>
+      <w:r>
+        <w:rPr>
+          <w:rFonts w:ascii="Arial" w:hAnsi="Arial" w:cs="Arial"/>
+          <w:sz w:val="20"/>
+          <w:szCs w:val="20"/>
+        </w:rPr>
+        <w:t>ờng/hệ thống quan trọng nh</w:t>
+      </w:r>
+      <w:r>
+        <w:rPr>
+          <w:rFonts w:ascii="Arial" w:hAnsi="Arial" w:cs="Arial" w:hint="cs"/>
+          <w:sz w:val="20"/>
+          <w:szCs w:val="20"/>
+        </w:rPr>
+        <w:t>ư</w:t>
+      </w:r>
+      <w:r>
+        <w:rPr>
+          <w:rFonts w:ascii="Arial" w:hAnsi="Arial" w:cs="Arial"/>
+          <w:sz w:val="20"/>
+          <w:szCs w:val="20"/>
+        </w:rPr>
+        <w:t xml:space="preserve"> Phân quyền Admin (Role) và ID sản phẩm khi cập nhật (Update Target).</w:t>
+      </w:r>
+    </w:p>
+    <w:p>
+      <w:pPr>
+        <w:rPr>
+          <w:rFonts w:ascii="Arial" w:hAnsi="Arial" w:cs="Arial"/>
+          <w:sz w:val="20"/>
+          <w:szCs w:val="20"/>
+        </w:rPr>
+      </w:pPr>
+      <w:r>
+        <w:rPr>
+          <w:rFonts w:ascii="Arial" w:hAnsi="Arial" w:cs="Arial"/>
+          <w:sz w:val="20"/>
+          <w:szCs w:val="20"/>
+        </w:rPr>
+        <w:t>Mỗi biến đ</w:t>
+      </w:r>
+      <w:r>
+        <w:rPr>
+          <w:rFonts w:ascii="Arial" w:hAnsi="Arial" w:cs="Arial" w:hint="cs"/>
+          <w:sz w:val="20"/>
+          <w:szCs w:val="20"/>
+        </w:rPr>
+        <w:t>ư</w:t>
+      </w:r>
+      <w:r>
+        <w:rPr>
+          <w:rFonts w:ascii="Arial" w:hAnsi="Arial" w:cs="Arial"/>
+          <w:sz w:val="20"/>
+          <w:szCs w:val="20"/>
+        </w:rPr>
+        <w:t>ợc chia rõ thành các phân vùng Valid (hợp lệ theo đúng đặc tả) và Invalid (vi phạm ràng buộc về khoảng giá trị, kiểu dữ liệu, rỗng, hoặc không tồn tạ</w:t>
+      </w:r>
+      <w:r>
+        <w:rPr>
+          <w:rFonts w:ascii="Arial" w:hAnsi="Arial" w:cs="Arial"/>
+          <w:sz w:val="20"/>
+          <w:szCs w:val="20"/>
+        </w:rPr>
+        <w:t>i trong CSDL).</w:t>
+      </w:r>
+    </w:p>
+    <w:p>
+      <w:pPr>
+        <w:ind w:left="360"/>
+        <w:rPr>
+          <w:rFonts w:ascii="Arial" w:hAnsi="Arial" w:cs="Arial"/>
+          <w:b/>
+          <w:sz w:val="20"/>
+          <w:szCs w:val="20"/>
+        </w:rPr>
+      </w:pPr>
+      <w:r>
+        <w:rPr>
+          <w:rFonts w:ascii="Arial" w:hAnsi="Arial" w:cs="Arial"/>
+          <w:b/>
+          <w:sz w:val="20"/>
+          <w:szCs w:val="20"/>
+        </w:rPr>
+        <w:t>B</w:t>
+      </w:r>
+      <w:r>
+        <w:rPr>
+          <w:rFonts w:ascii="Arial" w:hAnsi="Arial" w:cs="Arial" w:hint="cs"/>
+          <w:b/>
+          <w:sz w:val="20"/>
+          <w:szCs w:val="20"/>
+        </w:rPr>
+        <w:t>ư</w:t>
+      </w:r>
+      <w:r>
+        <w:rPr>
+          <w:rFonts w:ascii="Arial" w:hAnsi="Arial" w:cs="Arial"/>
+          <w:b/>
+          <w:sz w:val="20"/>
+          <w:szCs w:val="20"/>
+        </w:rPr>
+        <w:t>ớc 2 (Ma trận kết hợ</w:t>
+      </w:r>
+      <w:r>
+        <w:rPr>
+          <w:rFonts w:ascii="Arial" w:hAnsi="Arial" w:cs="Arial"/>
+          <w:b/>
+          <w:sz w:val="20"/>
+          <w:szCs w:val="20"/>
+        </w:rPr>
+        <w:t>p phân vùng):</w:t>
+      </w:r>
+    </w:p>
+    <w:p>
+      <w:pPr>
+        <w:rPr>
+          <w:rFonts w:ascii="Arial" w:hAnsi="Arial" w:cs="Arial"/>
+          <w:sz w:val="20"/>
+          <w:szCs w:val="20"/>
+        </w:rPr>
+      </w:pPr>
+      <w:r>
+        <w:rPr>
+          <w:rFonts w:ascii="Arial" w:hAnsi="Arial" w:cs="Arial"/>
+          <w:sz w:val="20"/>
+          <w:szCs w:val="20"/>
+        </w:rPr>
+        <w:t>Áp dụng chiến l</w:t>
+      </w:r>
+      <w:r>
+        <w:rPr>
+          <w:rFonts w:ascii="Arial" w:hAnsi="Arial" w:cs="Arial" w:hint="cs"/>
+          <w:sz w:val="20"/>
+          <w:szCs w:val="20"/>
+        </w:rPr>
+        <w:t>ư</w:t>
+      </w:r>
+      <w:r>
+        <w:rPr>
+          <w:rFonts w:ascii="Arial" w:hAnsi="Arial" w:cs="Arial"/>
+          <w:sz w:val="20"/>
+          <w:szCs w:val="20"/>
+        </w:rPr>
+        <w:t>ợc Base Choice Coverage: Lấy ca kiểm thử `M-01` làm gốc hoàn toàn hợp lệ (Valid Base). Sau đó, tiến hành xoay vòng thay đổi đ</w:t>
+      </w:r>
+      <w:r>
+        <w:rPr>
+          <w:rFonts w:ascii="Arial" w:hAnsi="Arial" w:cs="Arial" w:hint="cs"/>
+          <w:sz w:val="20"/>
+          <w:szCs w:val="20"/>
+        </w:rPr>
+        <w:t>ơ</w:t>
+      </w:r>
+      <w:r>
+        <w:rPr>
+          <w:rFonts w:ascii="Arial" w:hAnsi="Arial" w:cs="Arial"/>
+          <w:sz w:val="20"/>
+          <w:szCs w:val="20"/>
+        </w:rPr>
+        <w:t>n lẻ từng biến sang các trạng thái Invalid t</w:t>
+      </w:r>
+      <w:r>
+        <w:rPr>
+          <w:rFonts w:ascii="Arial" w:hAnsi="Arial" w:cs="Arial" w:hint="cs"/>
+          <w:sz w:val="20"/>
+          <w:szCs w:val="20"/>
+        </w:rPr>
+        <w:t>ươ</w:t>
+      </w:r>
+      <w:r>
+        <w:rPr>
+          <w:rFonts w:ascii="Arial" w:hAnsi="Arial" w:cs="Arial"/>
+          <w:sz w:val="20"/>
+          <w:szCs w:val="20"/>
+        </w:rPr>
+        <w:t xml:space="preserve">ng ứng (`M-02` đến `M-11`). Cách tiếp cận này giúp tối </w:t>
+      </w:r>
+      <w:r>
+        <w:rPr>
+          <w:rFonts w:ascii="Arial" w:hAnsi="Arial" w:cs="Arial" w:hint="cs"/>
+          <w:sz w:val="20"/>
+          <w:szCs w:val="20"/>
+        </w:rPr>
+        <w:t>ư</w:t>
+      </w:r>
+      <w:r>
+        <w:rPr>
+          <w:rFonts w:ascii="Arial" w:hAnsi="Arial" w:cs="Arial"/>
+          <w:sz w:val="20"/>
+          <w:szCs w:val="20"/>
+        </w:rPr>
+        <w:t>u số l</w:t>
+      </w:r>
+      <w:r>
+        <w:rPr>
+          <w:rFonts w:ascii="Arial" w:hAnsi="Arial" w:cs="Arial" w:hint="cs"/>
+          <w:sz w:val="20"/>
+          <w:szCs w:val="20"/>
+        </w:rPr>
+        <w:t>ư</w:t>
+      </w:r>
+      <w:r>
+        <w:rPr>
+          <w:rFonts w:ascii="Arial" w:hAnsi="Arial" w:cs="Arial"/>
+          <w:sz w:val="20"/>
+          <w:szCs w:val="20"/>
+        </w:rPr>
+        <w:t>ợng test case nh</w:t>
+      </w:r>
+      <w:r>
+        <w:rPr>
+          <w:rFonts w:ascii="Arial" w:hAnsi="Arial" w:cs="Arial" w:hint="cs"/>
+          <w:sz w:val="20"/>
+          <w:szCs w:val="20"/>
+        </w:rPr>
+        <w:t>ư</w:t>
+      </w:r>
+      <w:r>
+        <w:rPr>
+          <w:rFonts w:ascii="Arial" w:hAnsi="Arial" w:cs="Arial"/>
+          <w:sz w:val="20"/>
+          <w:szCs w:val="20"/>
+        </w:rPr>
+        <w:t>ng vẫn đảm bảo phủ kín toàn bộ các rủi ro nghiệp vụ của tính năng CRUD sản phẩ</w:t>
+      </w:r>
+      <w:r>
+        <w:rPr>
+          <w:rFonts w:ascii="Arial" w:hAnsi="Arial" w:cs="Arial"/>
+          <w:sz w:val="20"/>
+          <w:szCs w:val="20"/>
+        </w:rPr>
+        <w:t>m.</w:t>
+      </w:r>
+    </w:p>
+    <w:p>
+      <w:pPr>
+        <w:ind w:left="360"/>
+        <w:rPr>
+          <w:rFonts w:ascii="Arial" w:hAnsi="Arial" w:cs="Arial"/>
+          <w:b/>
+          <w:sz w:val="20"/>
+          <w:szCs w:val="20"/>
+        </w:rPr>
+      </w:pPr>
+      <w:r>
+        <w:rPr>
+          <w:rFonts w:ascii="Arial" w:hAnsi="Arial" w:cs="Arial"/>
+          <w:b/>
+          <w:sz w:val="20"/>
+          <w:szCs w:val="20"/>
+        </w:rPr>
+        <w:t>B</w:t>
+      </w:r>
+      <w:r>
+        <w:rPr>
+          <w:rFonts w:ascii="Arial" w:hAnsi="Arial" w:cs="Arial" w:hint="cs"/>
+          <w:b/>
+          <w:sz w:val="20"/>
+          <w:szCs w:val="20"/>
+        </w:rPr>
+        <w:t>ư</w:t>
+      </w:r>
+      <w:r>
+        <w:rPr>
+          <w:rFonts w:ascii="Arial" w:hAnsi="Arial" w:cs="Arial"/>
+          <w:b/>
+          <w:sz w:val="20"/>
+          <w:szCs w:val="20"/>
+        </w:rPr>
+        <w:t>ớc 3 (Xuấ</w:t>
+      </w:r>
+      <w:r>
+        <w:rPr>
+          <w:rFonts w:ascii="Arial" w:hAnsi="Arial" w:cs="Arial"/>
+          <w:b/>
+          <w:sz w:val="20"/>
+          <w:szCs w:val="20"/>
+        </w:rPr>
+        <w:t>t danh sách Test Case):</w:t>
+      </w:r>
+    </w:p>
+    <w:p>
+      <w:pPr>
+        <w:rPr>
+          <w:rFonts w:ascii="Arial" w:hAnsi="Arial" w:cs="Arial"/>
+          <w:sz w:val="20"/>
+          <w:szCs w:val="20"/>
+        </w:rPr>
+      </w:pPr>
+      <w:r>
+        <w:rPr>
+          <w:rFonts w:ascii="Arial" w:hAnsi="Arial" w:cs="Arial"/>
+          <w:sz w:val="20"/>
+          <w:szCs w:val="20"/>
+        </w:rPr>
+        <w:t>Danh sách 12 test cases đ</w:t>
+      </w:r>
+      <w:r>
+        <w:rPr>
+          <w:rFonts w:ascii="Arial" w:hAnsi="Arial" w:cs="Arial" w:hint="cs"/>
+          <w:sz w:val="20"/>
+          <w:szCs w:val="20"/>
+        </w:rPr>
+        <w:t>ư</w:t>
+      </w:r>
+      <w:r>
+        <w:rPr>
+          <w:rFonts w:ascii="Arial" w:hAnsi="Arial" w:cs="Arial"/>
+          <w:sz w:val="20"/>
+          <w:szCs w:val="20"/>
+        </w:rPr>
+        <w:t>ợc mô tả cụ thể với dữ liệu đầu vào (`Input Data`) và kết quả mong đợi (`Expected Output`) rõ ràng, bao gồm cả các kiểm tra về bảo mật phân quyền (Admin vs. User) và tính nguyên vẹn dữ liệu khi cập nhậ</w:t>
+      </w:r>
+      <w:r>
+        <w:rPr>
+          <w:rFonts w:ascii="Arial" w:hAnsi="Arial" w:cs="Arial"/>
+          <w:sz w:val="20"/>
+          <w:szCs w:val="20"/>
+        </w:rPr>
+        <w:t>t (`PUT`).</w:t>
+      </w:r>
+    </w:p>
+    <w:p>
+      <w:pPr>
+        <w:ind w:left="360"/>
+        <w:rPr>
+          <w:rFonts w:ascii="Arial" w:hAnsi="Arial" w:cs="Arial"/>
+          <w:b/>
+          <w:sz w:val="20"/>
+          <w:szCs w:val="20"/>
+        </w:rPr>
+      </w:pPr>
+      <w:r>
+        <w:rPr>
+          <w:rFonts w:ascii="Arial" w:hAnsi="Arial" w:cs="Arial"/>
+          <w:b/>
+          <w:sz w:val="20"/>
+          <w:szCs w:val="20"/>
+        </w:rPr>
+        <w:t>B</w:t>
+      </w:r>
+      <w:r>
+        <w:rPr>
+          <w:rFonts w:ascii="Arial" w:hAnsi="Arial" w:cs="Arial" w:hint="cs"/>
+          <w:b/>
+          <w:sz w:val="20"/>
+          <w:szCs w:val="20"/>
+        </w:rPr>
+        <w:t>ư</w:t>
+      </w:r>
+      <w:r>
+        <w:rPr>
+          <w:rFonts w:ascii="Arial" w:hAnsi="Arial" w:cs="Arial"/>
+          <w:b/>
+          <w:sz w:val="20"/>
+          <w:szCs w:val="20"/>
+        </w:rPr>
+        <w:t>ớc 4 (Đảm bảo tính toàn vẹn hệ thống):</w:t>
+      </w:r>
+    </w:p>
+    <w:p>
+      <w:pPr>
+        <w:rPr>
+          <w:rFonts w:ascii="Arial" w:hAnsi="Arial" w:cs="Arial"/>
+          <w:sz w:val="20"/>
+          <w:szCs w:val="20"/>
+        </w:rPr>
+      </w:pPr>
+      <w:r>
+        <w:rPr>
+          <w:rFonts w:ascii="Arial" w:hAnsi="Arial" w:cs="Arial"/>
+          <w:sz w:val="20"/>
+          <w:szCs w:val="20"/>
+        </w:rPr>
+        <w:t>Các tr</w:t>
+      </w:r>
+      <w:r>
+        <w:rPr>
+          <w:rFonts w:ascii="Arial" w:hAnsi="Arial" w:cs="Arial" w:hint="cs"/>
+          <w:sz w:val="20"/>
+          <w:szCs w:val="20"/>
+        </w:rPr>
+        <w:t>ư</w:t>
+      </w:r>
+      <w:r>
+        <w:rPr>
+          <w:rFonts w:ascii="Arial" w:hAnsi="Arial" w:cs="Arial"/>
+          <w:sz w:val="20"/>
+          <w:szCs w:val="20"/>
+        </w:rPr>
+        <w:t>ờng hợp kiểm thử không chỉ kiểm tra tính hợp lệ của dữ liệu đầu vào đ</w:t>
+      </w:r>
+      <w:r>
+        <w:rPr>
+          <w:rFonts w:ascii="Arial" w:hAnsi="Arial" w:cs="Arial" w:hint="cs"/>
+          <w:sz w:val="20"/>
+          <w:szCs w:val="20"/>
+        </w:rPr>
+        <w:t>ơ</w:t>
+      </w:r>
+      <w:r>
+        <w:rPr>
+          <w:rFonts w:ascii="Arial" w:hAnsi="Arial" w:cs="Arial"/>
+          <w:sz w:val="20"/>
+          <w:szCs w:val="20"/>
+        </w:rPr>
+        <w:t>n lẻ mà còn kiểm tra các ràng buộc quan hệ c</w:t>
+      </w:r>
+      <w:r>
+        <w:rPr>
+          <w:rFonts w:ascii="Arial" w:hAnsi="Arial" w:cs="Arial" w:hint="cs"/>
+          <w:sz w:val="20"/>
+          <w:szCs w:val="20"/>
+        </w:rPr>
+        <w:t>ơ</w:t>
+      </w:r>
+      <w:r>
+        <w:rPr>
+          <w:rFonts w:ascii="Arial" w:hAnsi="Arial" w:cs="Arial"/>
+          <w:sz w:val="20"/>
+          <w:szCs w:val="20"/>
+        </w:rPr>
+        <w:t xml:space="preserve"> sở dữ liệu (`category_id` phải tồn tại) và bảo mật API (`/api/products` yêu cầu role admin theo FR-12).</w:t>
+      </w:r>
+    </w:p>
     <w:p>
       <w:pPr>
         <w:pStyle w:val="Heading5"/>
@@ -16075,6 +16545,2161 @@
           <w:i/>
         </w:rPr>
         <w:t>Boundary Value Analysis</w:t>
+      </w:r>
+    </w:p>
+    <w:p>
+      <w:pPr>
+        <w:pStyle w:val="ListParagraph"/>
+        <w:numPr>
+          <w:ilvl w:val="0"/>
+          <w:numId w:val="50"/>
+        </w:numPr>
+        <w:rPr>
+          <w:rFonts w:ascii="Arial" w:hAnsi="Arial" w:cs="Arial"/>
+          <w:b/>
+          <w:sz w:val="20"/>
+          <w:szCs w:val="20"/>
+        </w:rPr>
+      </w:pPr>
+      <w:r>
+        <w:rPr>
+          <w:rFonts w:ascii="Arial" w:hAnsi="Arial" w:cs="Arial"/>
+          <w:b/>
+          <w:sz w:val="20"/>
+          <w:szCs w:val="20"/>
+        </w:rPr>
+        <w:t>Test cases</w:t>
+      </w:r>
+      <w:bookmarkStart w:id="1" w:name="_GoBack"/>
+      <w:bookmarkEnd w:id="1"/>
+    </w:p>
+    <w:tbl>
+      <w:tblPr>
+        <w:tblStyle w:val="TableGrid"/>
+        <w:tblW w:w="0" w:type="auto"/>
+        <w:tblInd w:w="360" w:type="dxa"/>
+        <w:tblLook w:val="04A0" w:firstRow="1" w:lastRow="0" w:firstColumn="1" w:lastColumn="0" w:noHBand="0" w:noVBand="1"/>
+      </w:tblPr>
+      <w:tblGrid>
+        <w:gridCol w:w="996"/>
+        <w:gridCol w:w="1238"/>
+        <w:gridCol w:w="1159"/>
+        <w:gridCol w:w="2485"/>
+        <w:gridCol w:w="1613"/>
+        <w:gridCol w:w="1005"/>
+      </w:tblGrid>
+      <w:tr>
+        <w:tc>
+          <w:tcPr>
+            <w:tcW w:w="1416" w:type="dxa"/>
+            <w:vAlign w:val="center"/>
+          </w:tcPr>
+          <w:p>
+            <w:pPr>
+              <w:rPr>
+                <w:rFonts w:ascii="Arial" w:hAnsi="Arial" w:cs="Arial"/>
+                <w:sz w:val="16"/>
+                <w:szCs w:val="16"/>
+              </w:rPr>
+            </w:pPr>
+            <w:r>
+              <w:rPr>
+                <w:rFonts w:ascii="Arial" w:hAnsi="Arial" w:cs="Arial"/>
+                <w:sz w:val="16"/>
+                <w:szCs w:val="16"/>
+              </w:rPr>
+              <w:t>Test ID</w:t>
+            </w:r>
+          </w:p>
+        </w:tc>
+        <w:tc>
+          <w:tcPr>
+            <w:tcW w:w="1416" w:type="dxa"/>
+            <w:vAlign w:val="center"/>
+          </w:tcPr>
+          <w:p>
+            <w:pPr>
+              <w:rPr>
+                <w:rFonts w:ascii="Arial" w:hAnsi="Arial" w:cs="Arial"/>
+                <w:sz w:val="16"/>
+                <w:szCs w:val="16"/>
+              </w:rPr>
+            </w:pPr>
+            <w:r>
+              <w:rPr>
+                <w:rFonts w:ascii="Arial" w:hAnsi="Arial" w:cs="Arial"/>
+                <w:sz w:val="16"/>
+                <w:szCs w:val="16"/>
+              </w:rPr>
+              <w:t>Field / Biến</w:t>
+            </w:r>
+          </w:p>
+        </w:tc>
+        <w:tc>
+          <w:tcPr>
+            <w:tcW w:w="1416" w:type="dxa"/>
+            <w:vAlign w:val="center"/>
+          </w:tcPr>
+          <w:p>
+            <w:pPr>
+              <w:rPr>
+                <w:rFonts w:ascii="Arial" w:hAnsi="Arial" w:cs="Arial"/>
+                <w:sz w:val="16"/>
+                <w:szCs w:val="16"/>
+              </w:rPr>
+            </w:pPr>
+            <w:r>
+              <w:rPr>
+                <w:rFonts w:ascii="Arial" w:hAnsi="Arial" w:cs="Arial"/>
+                <w:sz w:val="16"/>
+                <w:szCs w:val="16"/>
+              </w:rPr>
+              <w:t xml:space="preserve">Mốc biên </w:t>
+            </w:r>
+            <w:r>
+              <w:rPr>
+                <w:rFonts w:ascii="Arial" w:hAnsi="Arial" w:cs="Arial"/>
+                <w:sz w:val="16"/>
+                <w:szCs w:val="16"/>
+              </w:rPr>
+              <w:lastRenderedPageBreak/>
+              <w:t>(Boundary Point)</w:t>
+            </w:r>
+          </w:p>
+        </w:tc>
+        <w:tc>
+          <w:tcPr>
+            <w:tcW w:w="1416" w:type="dxa"/>
+            <w:vAlign w:val="center"/>
+          </w:tcPr>
+          <w:p>
+            <w:pPr>
+              <w:rPr>
+                <w:rFonts w:ascii="Arial" w:hAnsi="Arial" w:cs="Arial"/>
+                <w:sz w:val="16"/>
+                <w:szCs w:val="16"/>
+              </w:rPr>
+            </w:pPr>
+            <w:r>
+              <w:rPr>
+                <w:rFonts w:ascii="Arial" w:hAnsi="Arial" w:cs="Arial"/>
+                <w:sz w:val="16"/>
+                <w:szCs w:val="16"/>
+              </w:rPr>
+              <w:lastRenderedPageBreak/>
+              <w:t>Dữ liệu đầu vào (Input Data)</w:t>
+            </w:r>
+          </w:p>
+        </w:tc>
+        <w:tc>
+          <w:tcPr>
+            <w:tcW w:w="1416" w:type="dxa"/>
+            <w:vAlign w:val="center"/>
+          </w:tcPr>
+          <w:p>
+            <w:pPr>
+              <w:rPr>
+                <w:rFonts w:ascii="Arial" w:hAnsi="Arial" w:cs="Arial"/>
+                <w:sz w:val="16"/>
+                <w:szCs w:val="16"/>
+              </w:rPr>
+            </w:pPr>
+            <w:r>
+              <w:rPr>
+                <w:rFonts w:ascii="Arial" w:hAnsi="Arial" w:cs="Arial"/>
+                <w:sz w:val="16"/>
+                <w:szCs w:val="16"/>
+              </w:rPr>
+              <w:t xml:space="preserve">Kết quả mong đợi </w:t>
+            </w:r>
+            <w:r>
+              <w:rPr>
+                <w:rFonts w:ascii="Arial" w:hAnsi="Arial" w:cs="Arial"/>
+                <w:sz w:val="16"/>
+                <w:szCs w:val="16"/>
+              </w:rPr>
+              <w:lastRenderedPageBreak/>
+              <w:t>(Expected Result)</w:t>
+            </w:r>
+          </w:p>
+        </w:tc>
+        <w:tc>
+          <w:tcPr>
+            <w:tcW w:w="1416" w:type="dxa"/>
+            <w:vAlign w:val="center"/>
+          </w:tcPr>
+          <w:p>
+            <w:pPr>
+              <w:rPr>
+                <w:rFonts w:ascii="Arial" w:hAnsi="Arial" w:cs="Arial"/>
+                <w:sz w:val="16"/>
+                <w:szCs w:val="16"/>
+              </w:rPr>
+            </w:pPr>
+            <w:r>
+              <w:rPr>
+                <w:rFonts w:ascii="Arial" w:hAnsi="Arial" w:cs="Arial"/>
+                <w:sz w:val="16"/>
+                <w:szCs w:val="16"/>
+              </w:rPr>
+              <w:lastRenderedPageBreak/>
+              <w:t xml:space="preserve">Loại </w:t>
+            </w:r>
+            <w:r>
+              <w:rPr>
+                <w:rFonts w:ascii="Arial" w:hAnsi="Arial" w:cs="Arial"/>
+                <w:sz w:val="16"/>
+                <w:szCs w:val="16"/>
+              </w:rPr>
+              <w:lastRenderedPageBreak/>
+              <w:t>(Type)</w:t>
+            </w:r>
+          </w:p>
+        </w:tc>
+      </w:tr>
+      <w:tr>
+        <w:tc>
+          <w:tcPr>
+            <w:tcW w:w="1416" w:type="dxa"/>
+            <w:vAlign w:val="center"/>
+          </w:tcPr>
+          <w:p>
+            <w:pPr>
+              <w:rPr>
+                <w:rFonts w:ascii="Arial" w:hAnsi="Arial" w:cs="Arial"/>
+                <w:sz w:val="16"/>
+                <w:szCs w:val="16"/>
+              </w:rPr>
+            </w:pPr>
+            <w:r>
+              <w:rPr>
+                <w:rFonts w:ascii="Arial" w:hAnsi="Arial" w:cs="Arial"/>
+                <w:sz w:val="16"/>
+                <w:szCs w:val="16"/>
+              </w:rPr>
+              <w:lastRenderedPageBreak/>
+              <w:t>BVA-FR15-01</w:t>
+            </w:r>
+          </w:p>
+        </w:tc>
+        <w:tc>
+          <w:tcPr>
+            <w:tcW w:w="1416" w:type="dxa"/>
+            <w:vAlign w:val="center"/>
+          </w:tcPr>
+          <w:p>
+            <w:pPr>
+              <w:rPr>
+                <w:rFonts w:ascii="Arial" w:hAnsi="Arial" w:cs="Arial"/>
+                <w:sz w:val="16"/>
+                <w:szCs w:val="16"/>
+              </w:rPr>
+            </w:pPr>
+            <w:r>
+              <w:rPr>
+                <w:rFonts w:ascii="Arial" w:hAnsi="Arial" w:cs="Arial"/>
+                <w:sz w:val="16"/>
+                <w:szCs w:val="16"/>
+              </w:rPr>
+              <w:t>name.length</w:t>
+            </w:r>
+          </w:p>
+        </w:tc>
+        <w:tc>
+          <w:tcPr>
+            <w:tcW w:w="1416" w:type="dxa"/>
+            <w:vAlign w:val="center"/>
+          </w:tcPr>
+          <w:p>
+            <w:pPr>
+              <w:rPr>
+                <w:rFonts w:ascii="Arial" w:hAnsi="Arial" w:cs="Arial"/>
+                <w:sz w:val="16"/>
+                <w:szCs w:val="16"/>
+              </w:rPr>
+            </w:pPr>
+            <w:r>
+              <w:rPr>
+                <w:rFonts w:ascii="Arial" w:hAnsi="Arial" w:cs="Arial"/>
+                <w:sz w:val="16"/>
+                <w:szCs w:val="16"/>
+              </w:rPr>
+              <w:t>Min</w:t>
+            </w:r>
+            <w:r>
+              <w:rPr>
+                <w:rFonts w:ascii="Arial" w:hAnsi="Arial" w:cs="Arial"/>
+                <w:sz w:val="16"/>
+                <w:szCs w:val="16"/>
+              </w:rPr>
+              <w:t xml:space="preserve"> - 1 (0 ký tự)</w:t>
+            </w:r>
+          </w:p>
+        </w:tc>
+        <w:tc>
+          <w:tcPr>
+            <w:tcW w:w="1416" w:type="dxa"/>
+            <w:vAlign w:val="center"/>
+          </w:tcPr>
+          <w:p>
+            <w:pPr>
+              <w:rPr>
+                <w:rFonts w:ascii="Arial" w:hAnsi="Arial" w:cs="Arial"/>
+                <w:sz w:val="16"/>
+                <w:szCs w:val="16"/>
+              </w:rPr>
+            </w:pPr>
+            <w:r>
+              <w:rPr>
+                <w:rFonts w:ascii="Arial" w:hAnsi="Arial" w:cs="Arial"/>
+                <w:sz w:val="16"/>
+                <w:szCs w:val="16"/>
+              </w:rPr>
+              <w:t>name: "" (Chuỗi rỗng), price: 100000, category_id: 1</w:t>
+            </w:r>
+          </w:p>
+        </w:tc>
+        <w:tc>
+          <w:tcPr>
+            <w:tcW w:w="1416" w:type="dxa"/>
+            <w:vAlign w:val="center"/>
+          </w:tcPr>
+          <w:p>
+            <w:pPr>
+              <w:rPr>
+                <w:rFonts w:ascii="Arial" w:hAnsi="Arial" w:cs="Arial"/>
+                <w:sz w:val="16"/>
+                <w:szCs w:val="16"/>
+              </w:rPr>
+            </w:pPr>
+            <w:r>
+              <w:rPr>
+                <w:rFonts w:ascii="Arial" w:hAnsi="Arial" w:cs="Arial"/>
+                <w:sz w:val="16"/>
+                <w:szCs w:val="16"/>
+              </w:rPr>
+              <w:t>Hệ thống từ chối, trả về lỗi validation do tên sản phẩm không được để trống.</w:t>
+            </w:r>
+          </w:p>
+        </w:tc>
+        <w:tc>
+          <w:tcPr>
+            <w:tcW w:w="1416" w:type="dxa"/>
+            <w:vAlign w:val="center"/>
+          </w:tcPr>
+          <w:p>
+            <w:pPr>
+              <w:rPr>
+                <w:rFonts w:ascii="Arial" w:hAnsi="Arial" w:cs="Arial"/>
+                <w:sz w:val="16"/>
+                <w:szCs w:val="16"/>
+              </w:rPr>
+            </w:pPr>
+            <w:r>
+              <w:rPr>
+                <w:rFonts w:ascii="Arial" w:hAnsi="Arial" w:cs="Arial"/>
+                <w:sz w:val="16"/>
+                <w:szCs w:val="16"/>
+              </w:rPr>
+              <w:t>Invalid</w:t>
+            </w:r>
+          </w:p>
+        </w:tc>
+      </w:tr>
+      <w:tr>
+        <w:tc>
+          <w:tcPr>
+            <w:tcW w:w="1416" w:type="dxa"/>
+            <w:vAlign w:val="center"/>
+          </w:tcPr>
+          <w:p>
+            <w:pPr>
+              <w:rPr>
+                <w:rFonts w:ascii="Arial" w:hAnsi="Arial" w:cs="Arial"/>
+                <w:sz w:val="16"/>
+                <w:szCs w:val="16"/>
+              </w:rPr>
+            </w:pPr>
+            <w:r>
+              <w:rPr>
+                <w:rFonts w:ascii="Arial" w:hAnsi="Arial" w:cs="Arial"/>
+                <w:sz w:val="16"/>
+                <w:szCs w:val="16"/>
+              </w:rPr>
+              <w:t>BVA-FR15-02</w:t>
+            </w:r>
+          </w:p>
+        </w:tc>
+        <w:tc>
+          <w:tcPr>
+            <w:tcW w:w="1416" w:type="dxa"/>
+            <w:vAlign w:val="center"/>
+          </w:tcPr>
+          <w:p>
+            <w:pPr>
+              <w:rPr>
+                <w:rFonts w:ascii="Arial" w:hAnsi="Arial" w:cs="Arial"/>
+                <w:sz w:val="16"/>
+                <w:szCs w:val="16"/>
+              </w:rPr>
+            </w:pPr>
+            <w:r>
+              <w:rPr>
+                <w:rFonts w:ascii="Arial" w:hAnsi="Arial" w:cs="Arial"/>
+                <w:sz w:val="16"/>
+                <w:szCs w:val="16"/>
+              </w:rPr>
+              <w:t>name.length</w:t>
+            </w:r>
+          </w:p>
+        </w:tc>
+        <w:tc>
+          <w:tcPr>
+            <w:tcW w:w="1416" w:type="dxa"/>
+            <w:vAlign w:val="center"/>
+          </w:tcPr>
+          <w:p>
+            <w:pPr>
+              <w:rPr>
+                <w:rFonts w:ascii="Arial" w:hAnsi="Arial" w:cs="Arial"/>
+                <w:sz w:val="16"/>
+                <w:szCs w:val="16"/>
+              </w:rPr>
+            </w:pPr>
+            <w:r>
+              <w:rPr>
+                <w:rFonts w:ascii="Arial" w:hAnsi="Arial" w:cs="Arial"/>
+                <w:sz w:val="16"/>
+                <w:szCs w:val="16"/>
+              </w:rPr>
+              <w:t>Min</w:t>
+            </w:r>
+            <w:r>
+              <w:rPr>
+                <w:rFonts w:ascii="Arial" w:hAnsi="Arial" w:cs="Arial"/>
+                <w:sz w:val="16"/>
+                <w:szCs w:val="16"/>
+              </w:rPr>
+              <w:t xml:space="preserve"> (1 ký tự)</w:t>
+            </w:r>
+          </w:p>
+        </w:tc>
+        <w:tc>
+          <w:tcPr>
+            <w:tcW w:w="1416" w:type="dxa"/>
+            <w:vAlign w:val="center"/>
+          </w:tcPr>
+          <w:p>
+            <w:pPr>
+              <w:rPr>
+                <w:rFonts w:ascii="Arial" w:hAnsi="Arial" w:cs="Arial"/>
+                <w:sz w:val="16"/>
+                <w:szCs w:val="16"/>
+              </w:rPr>
+            </w:pPr>
+            <w:r>
+              <w:rPr>
+                <w:rFonts w:ascii="Arial" w:hAnsi="Arial" w:cs="Arial"/>
+                <w:sz w:val="16"/>
+                <w:szCs w:val="16"/>
+              </w:rPr>
+              <w:t>name: "A", price: 100000, category_id: 1</w:t>
+            </w:r>
+          </w:p>
+        </w:tc>
+        <w:tc>
+          <w:tcPr>
+            <w:tcW w:w="1416" w:type="dxa"/>
+            <w:vAlign w:val="center"/>
+          </w:tcPr>
+          <w:p>
+            <w:pPr>
+              <w:rPr>
+                <w:rFonts w:ascii="Arial" w:hAnsi="Arial" w:cs="Arial"/>
+                <w:sz w:val="16"/>
+                <w:szCs w:val="16"/>
+              </w:rPr>
+            </w:pPr>
+            <w:r>
+              <w:rPr>
+                <w:rFonts w:ascii="Arial" w:hAnsi="Arial" w:cs="Arial"/>
+                <w:sz w:val="16"/>
+                <w:szCs w:val="16"/>
+              </w:rPr>
+              <w:t>Thêm sản phẩm thành công với tên đúng 1 ký tự.</w:t>
+            </w:r>
+          </w:p>
+        </w:tc>
+        <w:tc>
+          <w:tcPr>
+            <w:tcW w:w="1416" w:type="dxa"/>
+            <w:vAlign w:val="center"/>
+          </w:tcPr>
+          <w:p>
+            <w:pPr>
+              <w:rPr>
+                <w:rFonts w:ascii="Arial" w:hAnsi="Arial" w:cs="Arial"/>
+                <w:sz w:val="16"/>
+                <w:szCs w:val="16"/>
+              </w:rPr>
+            </w:pPr>
+            <w:r>
+              <w:rPr>
+                <w:rFonts w:ascii="Arial" w:hAnsi="Arial" w:cs="Arial"/>
+                <w:sz w:val="16"/>
+                <w:szCs w:val="16"/>
+              </w:rPr>
+              <w:t>Valid</w:t>
+            </w:r>
+          </w:p>
+        </w:tc>
+      </w:tr>
+      <w:tr>
+        <w:tc>
+          <w:tcPr>
+            <w:tcW w:w="1416" w:type="dxa"/>
+            <w:vAlign w:val="center"/>
+          </w:tcPr>
+          <w:p>
+            <w:pPr>
+              <w:rPr>
+                <w:rFonts w:ascii="Arial" w:hAnsi="Arial" w:cs="Arial"/>
+                <w:sz w:val="16"/>
+                <w:szCs w:val="16"/>
+              </w:rPr>
+            </w:pPr>
+            <w:r>
+              <w:rPr>
+                <w:rFonts w:ascii="Arial" w:hAnsi="Arial" w:cs="Arial"/>
+                <w:sz w:val="16"/>
+                <w:szCs w:val="16"/>
+              </w:rPr>
+              <w:t>BVA-FR15-03</w:t>
+            </w:r>
+          </w:p>
+        </w:tc>
+        <w:tc>
+          <w:tcPr>
+            <w:tcW w:w="1416" w:type="dxa"/>
+            <w:vAlign w:val="center"/>
+          </w:tcPr>
+          <w:p>
+            <w:pPr>
+              <w:rPr>
+                <w:rFonts w:ascii="Arial" w:hAnsi="Arial" w:cs="Arial"/>
+                <w:sz w:val="16"/>
+                <w:szCs w:val="16"/>
+              </w:rPr>
+            </w:pPr>
+            <w:r>
+              <w:rPr>
+                <w:rFonts w:ascii="Arial" w:hAnsi="Arial" w:cs="Arial"/>
+                <w:sz w:val="16"/>
+                <w:szCs w:val="16"/>
+              </w:rPr>
+              <w:t>name.length</w:t>
+            </w:r>
+          </w:p>
+        </w:tc>
+        <w:tc>
+          <w:tcPr>
+            <w:tcW w:w="1416" w:type="dxa"/>
+            <w:vAlign w:val="center"/>
+          </w:tcPr>
+          <w:p>
+            <w:pPr>
+              <w:rPr>
+                <w:rFonts w:ascii="Arial" w:hAnsi="Arial" w:cs="Arial"/>
+                <w:sz w:val="16"/>
+                <w:szCs w:val="16"/>
+              </w:rPr>
+            </w:pPr>
+            <w:r>
+              <w:rPr>
+                <w:rFonts w:ascii="Arial" w:hAnsi="Arial" w:cs="Arial"/>
+                <w:sz w:val="16"/>
+                <w:szCs w:val="16"/>
+              </w:rPr>
+              <w:t>Min</w:t>
+            </w:r>
+            <w:r>
+              <w:rPr>
+                <w:rFonts w:ascii="Arial" w:hAnsi="Arial" w:cs="Arial"/>
+                <w:sz w:val="16"/>
+                <w:szCs w:val="16"/>
+              </w:rPr>
+              <w:t xml:space="preserve"> + 1 (2 ký tự)</w:t>
+            </w:r>
+          </w:p>
+        </w:tc>
+        <w:tc>
+          <w:tcPr>
+            <w:tcW w:w="1416" w:type="dxa"/>
+            <w:vAlign w:val="center"/>
+          </w:tcPr>
+          <w:p>
+            <w:pPr>
+              <w:rPr>
+                <w:rFonts w:ascii="Arial" w:hAnsi="Arial" w:cs="Arial"/>
+                <w:sz w:val="16"/>
+                <w:szCs w:val="16"/>
+              </w:rPr>
+            </w:pPr>
+            <w:r>
+              <w:rPr>
+                <w:rFonts w:ascii="Arial" w:hAnsi="Arial" w:cs="Arial"/>
+                <w:sz w:val="16"/>
+                <w:szCs w:val="16"/>
+              </w:rPr>
+              <w:t>name: "Ab", price: 100000, category_id: 1</w:t>
+            </w:r>
+          </w:p>
+        </w:tc>
+        <w:tc>
+          <w:tcPr>
+            <w:tcW w:w="1416" w:type="dxa"/>
+            <w:vAlign w:val="center"/>
+          </w:tcPr>
+          <w:p>
+            <w:pPr>
+              <w:rPr>
+                <w:rFonts w:ascii="Arial" w:hAnsi="Arial" w:cs="Arial"/>
+                <w:sz w:val="16"/>
+                <w:szCs w:val="16"/>
+              </w:rPr>
+            </w:pPr>
+            <w:r>
+              <w:rPr>
+                <w:rFonts w:ascii="Arial" w:hAnsi="Arial" w:cs="Arial"/>
+                <w:sz w:val="16"/>
+                <w:szCs w:val="16"/>
+              </w:rPr>
+              <w:t>Thêm sản phẩm thành công với tên 2 ký tự.</w:t>
+            </w:r>
+          </w:p>
+        </w:tc>
+        <w:tc>
+          <w:tcPr>
+            <w:tcW w:w="1416" w:type="dxa"/>
+            <w:vAlign w:val="center"/>
+          </w:tcPr>
+          <w:p>
+            <w:pPr>
+              <w:rPr>
+                <w:rFonts w:ascii="Arial" w:hAnsi="Arial" w:cs="Arial"/>
+                <w:sz w:val="16"/>
+                <w:szCs w:val="16"/>
+              </w:rPr>
+            </w:pPr>
+            <w:r>
+              <w:rPr>
+                <w:rFonts w:ascii="Arial" w:hAnsi="Arial" w:cs="Arial"/>
+                <w:sz w:val="16"/>
+                <w:szCs w:val="16"/>
+              </w:rPr>
+              <w:t>Valid</w:t>
+            </w:r>
+          </w:p>
+        </w:tc>
+      </w:tr>
+      <w:tr>
+        <w:tc>
+          <w:tcPr>
+            <w:tcW w:w="1416" w:type="dxa"/>
+            <w:vAlign w:val="center"/>
+          </w:tcPr>
+          <w:p>
+            <w:pPr>
+              <w:rPr>
+                <w:rFonts w:ascii="Arial" w:hAnsi="Arial" w:cs="Arial"/>
+                <w:sz w:val="16"/>
+                <w:szCs w:val="16"/>
+              </w:rPr>
+            </w:pPr>
+            <w:r>
+              <w:rPr>
+                <w:rFonts w:ascii="Arial" w:hAnsi="Arial" w:cs="Arial"/>
+                <w:sz w:val="16"/>
+                <w:szCs w:val="16"/>
+              </w:rPr>
+              <w:t>BVA-FR15-04</w:t>
+            </w:r>
+          </w:p>
+        </w:tc>
+        <w:tc>
+          <w:tcPr>
+            <w:tcW w:w="1416" w:type="dxa"/>
+            <w:vAlign w:val="center"/>
+          </w:tcPr>
+          <w:p>
+            <w:pPr>
+              <w:rPr>
+                <w:rFonts w:ascii="Arial" w:hAnsi="Arial" w:cs="Arial"/>
+                <w:sz w:val="16"/>
+                <w:szCs w:val="16"/>
+              </w:rPr>
+            </w:pPr>
+            <w:r>
+              <w:rPr>
+                <w:rFonts w:ascii="Arial" w:hAnsi="Arial" w:cs="Arial"/>
+                <w:sz w:val="16"/>
+                <w:szCs w:val="16"/>
+              </w:rPr>
+              <w:t>name.length</w:t>
+            </w:r>
+          </w:p>
+        </w:tc>
+        <w:tc>
+          <w:tcPr>
+            <w:tcW w:w="1416" w:type="dxa"/>
+            <w:vAlign w:val="center"/>
+          </w:tcPr>
+          <w:p>
+            <w:pPr>
+              <w:rPr>
+                <w:rFonts w:ascii="Arial" w:hAnsi="Arial" w:cs="Arial"/>
+                <w:sz w:val="16"/>
+                <w:szCs w:val="16"/>
+              </w:rPr>
+            </w:pPr>
+            <w:r>
+              <w:rPr>
+                <w:rFonts w:ascii="Arial" w:hAnsi="Arial" w:cs="Arial"/>
+                <w:sz w:val="16"/>
+                <w:szCs w:val="16"/>
+              </w:rPr>
+              <w:t>Max</w:t>
+            </w:r>
+            <w:r>
+              <w:rPr>
+                <w:rFonts w:ascii="Arial" w:hAnsi="Arial" w:cs="Arial"/>
+                <w:sz w:val="16"/>
+                <w:szCs w:val="16"/>
+              </w:rPr>
+              <w:t xml:space="preserve"> - 1 (254 ký tự)</w:t>
+            </w:r>
+          </w:p>
+        </w:tc>
+        <w:tc>
+          <w:tcPr>
+            <w:tcW w:w="1416" w:type="dxa"/>
+            <w:vAlign w:val="center"/>
+          </w:tcPr>
+          <w:p>
+            <w:pPr>
+              <w:rPr>
+                <w:rFonts w:ascii="Arial" w:hAnsi="Arial" w:cs="Arial"/>
+                <w:sz w:val="16"/>
+                <w:szCs w:val="16"/>
+              </w:rPr>
+            </w:pPr>
+            <w:r>
+              <w:rPr>
+                <w:rFonts w:ascii="Arial" w:hAnsi="Arial" w:cs="Arial"/>
+                <w:sz w:val="16"/>
+                <w:szCs w:val="16"/>
+              </w:rPr>
+              <w:t>name: Chuỗi ký tự gồm đúng 254 chữ 'A', price: 100000, category_id: 1</w:t>
+            </w:r>
+          </w:p>
+        </w:tc>
+        <w:tc>
+          <w:tcPr>
+            <w:tcW w:w="1416" w:type="dxa"/>
+            <w:vAlign w:val="center"/>
+          </w:tcPr>
+          <w:p>
+            <w:pPr>
+              <w:rPr>
+                <w:rFonts w:ascii="Arial" w:hAnsi="Arial" w:cs="Arial"/>
+                <w:sz w:val="16"/>
+                <w:szCs w:val="16"/>
+              </w:rPr>
+            </w:pPr>
+            <w:r>
+              <w:rPr>
+                <w:rFonts w:ascii="Arial" w:hAnsi="Arial" w:cs="Arial"/>
+                <w:sz w:val="16"/>
+                <w:szCs w:val="16"/>
+              </w:rPr>
+              <w:t>Thêm sản phẩm thành công (dưới ngưỡng tối đa 1 ký tự).</w:t>
+            </w:r>
+          </w:p>
+        </w:tc>
+        <w:tc>
+          <w:tcPr>
+            <w:tcW w:w="1416" w:type="dxa"/>
+            <w:vAlign w:val="center"/>
+          </w:tcPr>
+          <w:p>
+            <w:pPr>
+              <w:rPr>
+                <w:rFonts w:ascii="Arial" w:hAnsi="Arial" w:cs="Arial"/>
+                <w:sz w:val="16"/>
+                <w:szCs w:val="16"/>
+              </w:rPr>
+            </w:pPr>
+            <w:r>
+              <w:rPr>
+                <w:rFonts w:ascii="Arial" w:hAnsi="Arial" w:cs="Arial"/>
+                <w:sz w:val="16"/>
+                <w:szCs w:val="16"/>
+              </w:rPr>
+              <w:t>Valid</w:t>
+            </w:r>
+          </w:p>
+        </w:tc>
+      </w:tr>
+      <w:tr>
+        <w:tc>
+          <w:tcPr>
+            <w:tcW w:w="1416" w:type="dxa"/>
+            <w:vAlign w:val="center"/>
+          </w:tcPr>
+          <w:p>
+            <w:pPr>
+              <w:rPr>
+                <w:rFonts w:ascii="Arial" w:hAnsi="Arial" w:cs="Arial"/>
+                <w:sz w:val="16"/>
+                <w:szCs w:val="16"/>
+              </w:rPr>
+            </w:pPr>
+            <w:r>
+              <w:rPr>
+                <w:rFonts w:ascii="Arial" w:hAnsi="Arial" w:cs="Arial"/>
+                <w:sz w:val="16"/>
+                <w:szCs w:val="16"/>
+              </w:rPr>
+              <w:t>BVA-FR15-05</w:t>
+            </w:r>
+          </w:p>
+        </w:tc>
+        <w:tc>
+          <w:tcPr>
+            <w:tcW w:w="1416" w:type="dxa"/>
+            <w:vAlign w:val="center"/>
+          </w:tcPr>
+          <w:p>
+            <w:pPr>
+              <w:rPr>
+                <w:rFonts w:ascii="Arial" w:hAnsi="Arial" w:cs="Arial"/>
+                <w:sz w:val="16"/>
+                <w:szCs w:val="16"/>
+              </w:rPr>
+            </w:pPr>
+            <w:r>
+              <w:rPr>
+                <w:rFonts w:ascii="Arial" w:hAnsi="Arial" w:cs="Arial"/>
+                <w:sz w:val="16"/>
+                <w:szCs w:val="16"/>
+              </w:rPr>
+              <w:t>name.length</w:t>
+            </w:r>
+          </w:p>
+        </w:tc>
+        <w:tc>
+          <w:tcPr>
+            <w:tcW w:w="1416" w:type="dxa"/>
+            <w:vAlign w:val="center"/>
+          </w:tcPr>
+          <w:p>
+            <w:pPr>
+              <w:rPr>
+                <w:rFonts w:ascii="Arial" w:hAnsi="Arial" w:cs="Arial"/>
+                <w:sz w:val="16"/>
+                <w:szCs w:val="16"/>
+              </w:rPr>
+            </w:pPr>
+            <w:r>
+              <w:rPr>
+                <w:rFonts w:ascii="Arial" w:hAnsi="Arial" w:cs="Arial"/>
+                <w:sz w:val="16"/>
+                <w:szCs w:val="16"/>
+              </w:rPr>
+              <w:t>Max</w:t>
+            </w:r>
+            <w:r>
+              <w:rPr>
+                <w:rFonts w:ascii="Arial" w:hAnsi="Arial" w:cs="Arial"/>
+                <w:sz w:val="16"/>
+                <w:szCs w:val="16"/>
+              </w:rPr>
+              <w:t xml:space="preserve"> (255 ký tự)</w:t>
+            </w:r>
+          </w:p>
+        </w:tc>
+        <w:tc>
+          <w:tcPr>
+            <w:tcW w:w="1416" w:type="dxa"/>
+            <w:vAlign w:val="center"/>
+          </w:tcPr>
+          <w:p>
+            <w:pPr>
+              <w:rPr>
+                <w:rFonts w:ascii="Arial" w:hAnsi="Arial" w:cs="Arial"/>
+                <w:sz w:val="16"/>
+                <w:szCs w:val="16"/>
+              </w:rPr>
+            </w:pPr>
+            <w:r>
+              <w:rPr>
+                <w:rFonts w:ascii="Arial" w:hAnsi="Arial" w:cs="Arial"/>
+                <w:sz w:val="16"/>
+                <w:szCs w:val="16"/>
+              </w:rPr>
+              <w:t>name: Chuỗi ký tự gồm đúng 255 chữ 'A', price: 100000, category_id: 1</w:t>
+            </w:r>
+          </w:p>
+        </w:tc>
+        <w:tc>
+          <w:tcPr>
+            <w:tcW w:w="1416" w:type="dxa"/>
+            <w:vAlign w:val="center"/>
+          </w:tcPr>
+          <w:p>
+            <w:pPr>
+              <w:rPr>
+                <w:rFonts w:ascii="Arial" w:hAnsi="Arial" w:cs="Arial"/>
+                <w:sz w:val="16"/>
+                <w:szCs w:val="16"/>
+              </w:rPr>
+            </w:pPr>
+            <w:r>
+              <w:rPr>
+                <w:rFonts w:ascii="Arial" w:hAnsi="Arial" w:cs="Arial"/>
+                <w:sz w:val="16"/>
+                <w:szCs w:val="16"/>
+              </w:rPr>
+              <w:t>Thêm sản phẩm thành công với độ dài tối đa cho phép.</w:t>
+            </w:r>
+          </w:p>
+        </w:tc>
+        <w:tc>
+          <w:tcPr>
+            <w:tcW w:w="1416" w:type="dxa"/>
+            <w:vAlign w:val="center"/>
+          </w:tcPr>
+          <w:p>
+            <w:pPr>
+              <w:rPr>
+                <w:rFonts w:ascii="Arial" w:hAnsi="Arial" w:cs="Arial"/>
+                <w:sz w:val="16"/>
+                <w:szCs w:val="16"/>
+              </w:rPr>
+            </w:pPr>
+            <w:r>
+              <w:rPr>
+                <w:rFonts w:ascii="Arial" w:hAnsi="Arial" w:cs="Arial"/>
+                <w:sz w:val="16"/>
+                <w:szCs w:val="16"/>
+              </w:rPr>
+              <w:t>Valid</w:t>
+            </w:r>
+          </w:p>
+        </w:tc>
+      </w:tr>
+      <w:tr>
+        <w:tc>
+          <w:tcPr>
+            <w:tcW w:w="1416" w:type="dxa"/>
+            <w:vAlign w:val="center"/>
+          </w:tcPr>
+          <w:p>
+            <w:pPr>
+              <w:rPr>
+                <w:rFonts w:ascii="Arial" w:hAnsi="Arial" w:cs="Arial"/>
+                <w:sz w:val="16"/>
+                <w:szCs w:val="16"/>
+              </w:rPr>
+            </w:pPr>
+            <w:r>
+              <w:rPr>
+                <w:rFonts w:ascii="Arial" w:hAnsi="Arial" w:cs="Arial"/>
+                <w:sz w:val="16"/>
+                <w:szCs w:val="16"/>
+              </w:rPr>
+              <w:t>BVA-FR15-06</w:t>
+            </w:r>
+          </w:p>
+        </w:tc>
+        <w:tc>
+          <w:tcPr>
+            <w:tcW w:w="1416" w:type="dxa"/>
+            <w:vAlign w:val="center"/>
+          </w:tcPr>
+          <w:p>
+            <w:pPr>
+              <w:rPr>
+                <w:rFonts w:ascii="Arial" w:hAnsi="Arial" w:cs="Arial"/>
+                <w:sz w:val="16"/>
+                <w:szCs w:val="16"/>
+              </w:rPr>
+            </w:pPr>
+            <w:r>
+              <w:rPr>
+                <w:rFonts w:ascii="Arial" w:hAnsi="Arial" w:cs="Arial"/>
+                <w:sz w:val="16"/>
+                <w:szCs w:val="16"/>
+              </w:rPr>
+              <w:t>name.length</w:t>
+            </w:r>
+          </w:p>
+        </w:tc>
+        <w:tc>
+          <w:tcPr>
+            <w:tcW w:w="1416" w:type="dxa"/>
+            <w:vAlign w:val="center"/>
+          </w:tcPr>
+          <w:p>
+            <w:pPr>
+              <w:rPr>
+                <w:rFonts w:ascii="Arial" w:hAnsi="Arial" w:cs="Arial"/>
+                <w:sz w:val="16"/>
+                <w:szCs w:val="16"/>
+              </w:rPr>
+            </w:pPr>
+            <w:r>
+              <w:rPr>
+                <w:rFonts w:ascii="Arial" w:hAnsi="Arial" w:cs="Arial"/>
+                <w:sz w:val="16"/>
+                <w:szCs w:val="16"/>
+              </w:rPr>
+              <w:t>Max</w:t>
+            </w:r>
+            <w:r>
+              <w:rPr>
+                <w:rFonts w:ascii="Arial" w:hAnsi="Arial" w:cs="Arial"/>
+                <w:sz w:val="16"/>
+                <w:szCs w:val="16"/>
+              </w:rPr>
+              <w:t xml:space="preserve"> + 1 (256 ký tự)</w:t>
+            </w:r>
+          </w:p>
+        </w:tc>
+        <w:tc>
+          <w:tcPr>
+            <w:tcW w:w="1416" w:type="dxa"/>
+            <w:vAlign w:val="center"/>
+          </w:tcPr>
+          <w:p>
+            <w:pPr>
+              <w:rPr>
+                <w:rFonts w:ascii="Arial" w:hAnsi="Arial" w:cs="Arial"/>
+                <w:sz w:val="16"/>
+                <w:szCs w:val="16"/>
+              </w:rPr>
+            </w:pPr>
+            <w:r>
+              <w:rPr>
+                <w:rFonts w:ascii="Arial" w:hAnsi="Arial" w:cs="Arial"/>
+                <w:sz w:val="16"/>
+                <w:szCs w:val="16"/>
+              </w:rPr>
+              <w:t>name: Chuỗi ký tự gồm đúng 256 chữ 'A', price: 100000, category_id: 1</w:t>
+            </w:r>
+          </w:p>
+        </w:tc>
+        <w:tc>
+          <w:tcPr>
+            <w:tcW w:w="1416" w:type="dxa"/>
+            <w:vAlign w:val="center"/>
+          </w:tcPr>
+          <w:p>
+            <w:pPr>
+              <w:rPr>
+                <w:rFonts w:ascii="Arial" w:hAnsi="Arial" w:cs="Arial"/>
+                <w:sz w:val="16"/>
+                <w:szCs w:val="16"/>
+              </w:rPr>
+            </w:pPr>
+            <w:r>
+              <w:rPr>
+                <w:rFonts w:ascii="Arial" w:hAnsi="Arial" w:cs="Arial"/>
+                <w:sz w:val="16"/>
+                <w:szCs w:val="16"/>
+              </w:rPr>
+              <w:t>Hệ thống từ chối hoặc cắt chuỗi (truncate) do vượt quá giới hạn 255 ký tự.</w:t>
+            </w:r>
+          </w:p>
+        </w:tc>
+        <w:tc>
+          <w:tcPr>
+            <w:tcW w:w="1416" w:type="dxa"/>
+            <w:vAlign w:val="center"/>
+          </w:tcPr>
+          <w:p>
+            <w:pPr>
+              <w:rPr>
+                <w:rFonts w:ascii="Arial" w:hAnsi="Arial" w:cs="Arial"/>
+                <w:sz w:val="16"/>
+                <w:szCs w:val="16"/>
+              </w:rPr>
+            </w:pPr>
+            <w:r>
+              <w:rPr>
+                <w:rFonts w:ascii="Arial" w:hAnsi="Arial" w:cs="Arial"/>
+                <w:sz w:val="16"/>
+                <w:szCs w:val="16"/>
+              </w:rPr>
+              <w:t>Invalid</w:t>
+            </w:r>
+          </w:p>
+        </w:tc>
+      </w:tr>
+      <w:tr>
+        <w:tc>
+          <w:tcPr>
+            <w:tcW w:w="1416" w:type="dxa"/>
+            <w:vAlign w:val="center"/>
+          </w:tcPr>
+          <w:p>
+            <w:pPr>
+              <w:rPr>
+                <w:rFonts w:ascii="Arial" w:hAnsi="Arial" w:cs="Arial"/>
+                <w:sz w:val="16"/>
+                <w:szCs w:val="16"/>
+              </w:rPr>
+            </w:pPr>
+            <w:r>
+              <w:rPr>
+                <w:rFonts w:ascii="Arial" w:hAnsi="Arial" w:cs="Arial"/>
+                <w:sz w:val="16"/>
+                <w:szCs w:val="16"/>
+              </w:rPr>
+              <w:t>BVA-FR15-07</w:t>
+            </w:r>
+          </w:p>
+        </w:tc>
+        <w:tc>
+          <w:tcPr>
+            <w:tcW w:w="1416" w:type="dxa"/>
+            <w:vAlign w:val="center"/>
+          </w:tcPr>
+          <w:p>
+            <w:pPr>
+              <w:rPr>
+                <w:rFonts w:ascii="Arial" w:hAnsi="Arial" w:cs="Arial"/>
+                <w:sz w:val="16"/>
+                <w:szCs w:val="16"/>
+              </w:rPr>
+            </w:pPr>
+            <w:r>
+              <w:rPr>
+                <w:rFonts w:ascii="Arial" w:hAnsi="Arial" w:cs="Arial"/>
+                <w:sz w:val="16"/>
+                <w:szCs w:val="16"/>
+              </w:rPr>
+              <w:t>price</w:t>
+            </w:r>
+          </w:p>
+        </w:tc>
+        <w:tc>
+          <w:tcPr>
+            <w:tcW w:w="1416" w:type="dxa"/>
+            <w:vAlign w:val="center"/>
+          </w:tcPr>
+          <w:p>
+            <w:pPr>
+              <w:rPr>
+                <w:rFonts w:ascii="Arial" w:hAnsi="Arial" w:cs="Arial"/>
+                <w:sz w:val="16"/>
+                <w:szCs w:val="16"/>
+              </w:rPr>
+            </w:pPr>
+            <w:r>
+              <w:rPr>
+                <w:rFonts w:ascii="Arial" w:hAnsi="Arial" w:cs="Arial"/>
+                <w:sz w:val="16"/>
+                <w:szCs w:val="16"/>
+              </w:rPr>
+              <w:t>Giá trị âm (-1)</w:t>
+            </w:r>
+          </w:p>
+        </w:tc>
+        <w:tc>
+          <w:tcPr>
+            <w:tcW w:w="1416" w:type="dxa"/>
+            <w:vAlign w:val="center"/>
+          </w:tcPr>
+          <w:p>
+            <w:pPr>
+              <w:rPr>
+                <w:rFonts w:ascii="Arial" w:hAnsi="Arial" w:cs="Arial"/>
+                <w:sz w:val="16"/>
+                <w:szCs w:val="16"/>
+              </w:rPr>
+            </w:pPr>
+            <w:r>
+              <w:rPr>
+                <w:rFonts w:ascii="Arial" w:hAnsi="Arial" w:cs="Arial"/>
+                <w:sz w:val="16"/>
+                <w:szCs w:val="16"/>
+              </w:rPr>
+              <w:t>name: "Test", price: -1, category_id: 1</w:t>
+            </w:r>
+          </w:p>
+        </w:tc>
+        <w:tc>
+          <w:tcPr>
+            <w:tcW w:w="1416" w:type="dxa"/>
+            <w:vAlign w:val="center"/>
+          </w:tcPr>
+          <w:p>
+            <w:pPr>
+              <w:rPr>
+                <w:rFonts w:ascii="Arial" w:hAnsi="Arial" w:cs="Arial"/>
+                <w:sz w:val="16"/>
+                <w:szCs w:val="16"/>
+              </w:rPr>
+            </w:pPr>
+            <w:r>
+              <w:rPr>
+                <w:rFonts w:ascii="Arial" w:hAnsi="Arial" w:cs="Arial"/>
+                <w:sz w:val="16"/>
+                <w:szCs w:val="16"/>
+              </w:rPr>
+              <w:t>Hệ thống từ chối do giá sản phẩm không được là số âm.</w:t>
+            </w:r>
+          </w:p>
+        </w:tc>
+        <w:tc>
+          <w:tcPr>
+            <w:tcW w:w="1416" w:type="dxa"/>
+            <w:vAlign w:val="center"/>
+          </w:tcPr>
+          <w:p>
+            <w:pPr>
+              <w:rPr>
+                <w:rFonts w:ascii="Arial" w:hAnsi="Arial" w:cs="Arial"/>
+                <w:sz w:val="16"/>
+                <w:szCs w:val="16"/>
+              </w:rPr>
+            </w:pPr>
+            <w:r>
+              <w:rPr>
+                <w:rFonts w:ascii="Arial" w:hAnsi="Arial" w:cs="Arial"/>
+                <w:sz w:val="16"/>
+                <w:szCs w:val="16"/>
+              </w:rPr>
+              <w:t>Invalid</w:t>
+            </w:r>
+          </w:p>
+        </w:tc>
+      </w:tr>
+      <w:tr>
+        <w:tc>
+          <w:tcPr>
+            <w:tcW w:w="1416" w:type="dxa"/>
+            <w:vAlign w:val="center"/>
+          </w:tcPr>
+          <w:p>
+            <w:pPr>
+              <w:rPr>
+                <w:rFonts w:ascii="Arial" w:hAnsi="Arial" w:cs="Arial"/>
+                <w:sz w:val="16"/>
+                <w:szCs w:val="16"/>
+              </w:rPr>
+            </w:pPr>
+            <w:r>
+              <w:rPr>
+                <w:rFonts w:ascii="Arial" w:hAnsi="Arial" w:cs="Arial"/>
+                <w:sz w:val="16"/>
+                <w:szCs w:val="16"/>
+              </w:rPr>
+              <w:t>BVA-FR15-08</w:t>
+            </w:r>
+          </w:p>
+        </w:tc>
+        <w:tc>
+          <w:tcPr>
+            <w:tcW w:w="1416" w:type="dxa"/>
+            <w:vAlign w:val="center"/>
+          </w:tcPr>
+          <w:p>
+            <w:pPr>
+              <w:rPr>
+                <w:rFonts w:ascii="Arial" w:hAnsi="Arial" w:cs="Arial"/>
+                <w:sz w:val="16"/>
+                <w:szCs w:val="16"/>
+              </w:rPr>
+            </w:pPr>
+            <w:r>
+              <w:rPr>
+                <w:rFonts w:ascii="Arial" w:hAnsi="Arial" w:cs="Arial"/>
+                <w:sz w:val="16"/>
+                <w:szCs w:val="16"/>
+              </w:rPr>
+              <w:t>price</w:t>
+            </w:r>
+          </w:p>
+        </w:tc>
+        <w:tc>
+          <w:tcPr>
+            <w:tcW w:w="1416" w:type="dxa"/>
+            <w:vAlign w:val="center"/>
+          </w:tcPr>
+          <w:p>
+            <w:pPr>
+              <w:rPr>
+                <w:rFonts w:ascii="Arial" w:hAnsi="Arial" w:cs="Arial"/>
+                <w:sz w:val="16"/>
+                <w:szCs w:val="16"/>
+              </w:rPr>
+            </w:pPr>
+            <w:r>
+              <w:rPr>
+                <w:rFonts w:ascii="Arial" w:hAnsi="Arial" w:cs="Arial"/>
+                <w:sz w:val="16"/>
+                <w:szCs w:val="16"/>
+              </w:rPr>
+              <w:t>Biên giá trị 0</w:t>
+            </w:r>
+          </w:p>
+        </w:tc>
+        <w:tc>
+          <w:tcPr>
+            <w:tcW w:w="1416" w:type="dxa"/>
+            <w:vAlign w:val="center"/>
+          </w:tcPr>
+          <w:p>
+            <w:pPr>
+              <w:rPr>
+                <w:rFonts w:ascii="Arial" w:hAnsi="Arial" w:cs="Arial"/>
+                <w:sz w:val="16"/>
+                <w:szCs w:val="16"/>
+              </w:rPr>
+            </w:pPr>
+            <w:r>
+              <w:rPr>
+                <w:rFonts w:ascii="Arial" w:hAnsi="Arial" w:cs="Arial"/>
+                <w:sz w:val="16"/>
+                <w:szCs w:val="16"/>
+              </w:rPr>
+              <w:t>name: "Test", price: 0, category_id: 1</w:t>
+            </w:r>
+          </w:p>
+        </w:tc>
+        <w:tc>
+          <w:tcPr>
+            <w:tcW w:w="1416" w:type="dxa"/>
+            <w:vAlign w:val="center"/>
+          </w:tcPr>
+          <w:p>
+            <w:pPr>
+              <w:rPr>
+                <w:rFonts w:ascii="Arial" w:hAnsi="Arial" w:cs="Arial"/>
+                <w:sz w:val="16"/>
+                <w:szCs w:val="16"/>
+              </w:rPr>
+            </w:pPr>
+            <w:r>
+              <w:rPr>
+                <w:rFonts w:ascii="Arial" w:hAnsi="Arial" w:cs="Arial"/>
+                <w:sz w:val="16"/>
+                <w:szCs w:val="16"/>
+              </w:rPr>
+              <w:t>Hệ thống từ chối do giá phải là số dương lớn hơn 0 ({price} &gt; 0).</w:t>
+            </w:r>
+          </w:p>
+        </w:tc>
+        <w:tc>
+          <w:tcPr>
+            <w:tcW w:w="1416" w:type="dxa"/>
+            <w:vAlign w:val="center"/>
+          </w:tcPr>
+          <w:p>
+            <w:pPr>
+              <w:rPr>
+                <w:rFonts w:ascii="Arial" w:hAnsi="Arial" w:cs="Arial"/>
+                <w:sz w:val="16"/>
+                <w:szCs w:val="16"/>
+              </w:rPr>
+            </w:pPr>
+            <w:r>
+              <w:rPr>
+                <w:rFonts w:ascii="Arial" w:hAnsi="Arial" w:cs="Arial"/>
+                <w:sz w:val="16"/>
+                <w:szCs w:val="16"/>
+              </w:rPr>
+              <w:t>Invalid</w:t>
+            </w:r>
+          </w:p>
+        </w:tc>
+      </w:tr>
+      <w:tr>
+        <w:tc>
+          <w:tcPr>
+            <w:tcW w:w="1416" w:type="dxa"/>
+            <w:vAlign w:val="center"/>
+          </w:tcPr>
+          <w:p>
+            <w:pPr>
+              <w:rPr>
+                <w:rFonts w:ascii="Arial" w:hAnsi="Arial" w:cs="Arial"/>
+                <w:sz w:val="16"/>
+                <w:szCs w:val="16"/>
+              </w:rPr>
+            </w:pPr>
+            <w:r>
+              <w:rPr>
+                <w:rFonts w:ascii="Arial" w:hAnsi="Arial" w:cs="Arial"/>
+                <w:sz w:val="16"/>
+                <w:szCs w:val="16"/>
+              </w:rPr>
+              <w:t>BVA-FR15-09</w:t>
+            </w:r>
+          </w:p>
+        </w:tc>
+        <w:tc>
+          <w:tcPr>
+            <w:tcW w:w="1416" w:type="dxa"/>
+            <w:vAlign w:val="center"/>
+          </w:tcPr>
+          <w:p>
+            <w:pPr>
+              <w:rPr>
+                <w:rFonts w:ascii="Arial" w:hAnsi="Arial" w:cs="Arial"/>
+                <w:sz w:val="16"/>
+                <w:szCs w:val="16"/>
+              </w:rPr>
+            </w:pPr>
+            <w:r>
+              <w:rPr>
+                <w:rFonts w:ascii="Arial" w:hAnsi="Arial" w:cs="Arial"/>
+                <w:sz w:val="16"/>
+                <w:szCs w:val="16"/>
+              </w:rPr>
+              <w:t>price</w:t>
+            </w:r>
+          </w:p>
+        </w:tc>
+        <w:tc>
+          <w:tcPr>
+            <w:tcW w:w="1416" w:type="dxa"/>
+            <w:vAlign w:val="center"/>
+          </w:tcPr>
+          <w:p>
+            <w:pPr>
+              <w:rPr>
+                <w:rFonts w:ascii="Arial" w:hAnsi="Arial" w:cs="Arial"/>
+                <w:sz w:val="16"/>
+                <w:szCs w:val="16"/>
+              </w:rPr>
+            </w:pPr>
+            <w:r>
+              <w:rPr>
+                <w:rFonts w:ascii="Arial" w:hAnsi="Arial" w:cs="Arial"/>
+                <w:sz w:val="16"/>
+                <w:szCs w:val="16"/>
+              </w:rPr>
+              <w:t>Min</w:t>
+            </w:r>
+            <w:r>
+              <w:rPr>
+                <w:rFonts w:ascii="Arial" w:hAnsi="Arial" w:cs="Arial"/>
+                <w:sz w:val="16"/>
+                <w:szCs w:val="16"/>
+              </w:rPr>
+              <w:t xml:space="preserve"> tối thiểu (1)</w:t>
+            </w:r>
+          </w:p>
+        </w:tc>
+        <w:tc>
+          <w:tcPr>
+            <w:tcW w:w="1416" w:type="dxa"/>
+            <w:vAlign w:val="center"/>
+          </w:tcPr>
+          <w:p>
+            <w:pPr>
+              <w:rPr>
+                <w:rFonts w:ascii="Arial" w:hAnsi="Arial" w:cs="Arial"/>
+                <w:sz w:val="16"/>
+                <w:szCs w:val="16"/>
+              </w:rPr>
+            </w:pPr>
+            <w:r>
+              <w:rPr>
+                <w:rFonts w:ascii="Arial" w:hAnsi="Arial" w:cs="Arial"/>
+                <w:sz w:val="16"/>
+                <w:szCs w:val="16"/>
+              </w:rPr>
+              <w:t>name: "Test", price: 1, category_id: 1</w:t>
+            </w:r>
+          </w:p>
+        </w:tc>
+        <w:tc>
+          <w:tcPr>
+            <w:tcW w:w="1416" w:type="dxa"/>
+            <w:vAlign w:val="center"/>
+          </w:tcPr>
+          <w:p>
+            <w:pPr>
+              <w:rPr>
+                <w:rFonts w:ascii="Arial" w:hAnsi="Arial" w:cs="Arial"/>
+                <w:sz w:val="16"/>
+                <w:szCs w:val="16"/>
+              </w:rPr>
+            </w:pPr>
+            <w:r>
+              <w:rPr>
+                <w:rFonts w:ascii="Arial" w:hAnsi="Arial" w:cs="Arial"/>
+                <w:sz w:val="16"/>
+                <w:szCs w:val="16"/>
+              </w:rPr>
+              <w:t>Thêm sản phẩm thành công với giá nhỏ nhất hợp lệ (1 ₫).</w:t>
+            </w:r>
+          </w:p>
+        </w:tc>
+        <w:tc>
+          <w:tcPr>
+            <w:tcW w:w="1416" w:type="dxa"/>
+            <w:vAlign w:val="center"/>
+          </w:tcPr>
+          <w:p>
+            <w:pPr>
+              <w:rPr>
+                <w:rFonts w:ascii="Arial" w:hAnsi="Arial" w:cs="Arial"/>
+                <w:sz w:val="16"/>
+                <w:szCs w:val="16"/>
+              </w:rPr>
+            </w:pPr>
+            <w:r>
+              <w:rPr>
+                <w:rFonts w:ascii="Arial" w:hAnsi="Arial" w:cs="Arial"/>
+                <w:sz w:val="16"/>
+                <w:szCs w:val="16"/>
+              </w:rPr>
+              <w:t>Valid</w:t>
+            </w:r>
+          </w:p>
+        </w:tc>
+      </w:tr>
+      <w:tr>
+        <w:tc>
+          <w:tcPr>
+            <w:tcW w:w="1416" w:type="dxa"/>
+            <w:vAlign w:val="center"/>
+          </w:tcPr>
+          <w:p>
+            <w:pPr>
+              <w:rPr>
+                <w:rFonts w:ascii="Arial" w:hAnsi="Arial" w:cs="Arial"/>
+                <w:sz w:val="16"/>
+                <w:szCs w:val="16"/>
+              </w:rPr>
+            </w:pPr>
+            <w:r>
+              <w:rPr>
+                <w:rFonts w:ascii="Arial" w:hAnsi="Arial" w:cs="Arial"/>
+                <w:sz w:val="16"/>
+                <w:szCs w:val="16"/>
+              </w:rPr>
+              <w:t>BVA-FR15-10</w:t>
+            </w:r>
+          </w:p>
+        </w:tc>
+        <w:tc>
+          <w:tcPr>
+            <w:tcW w:w="1416" w:type="dxa"/>
+            <w:vAlign w:val="center"/>
+          </w:tcPr>
+          <w:p>
+            <w:pPr>
+              <w:rPr>
+                <w:rFonts w:ascii="Arial" w:hAnsi="Arial" w:cs="Arial"/>
+                <w:sz w:val="16"/>
+                <w:szCs w:val="16"/>
+              </w:rPr>
+            </w:pPr>
+            <w:r>
+              <w:rPr>
+                <w:rFonts w:ascii="Arial" w:hAnsi="Arial" w:cs="Arial"/>
+                <w:sz w:val="16"/>
+                <w:szCs w:val="16"/>
+              </w:rPr>
+              <w:t>price</w:t>
+            </w:r>
+          </w:p>
+        </w:tc>
+        <w:tc>
+          <w:tcPr>
+            <w:tcW w:w="1416" w:type="dxa"/>
+            <w:vAlign w:val="center"/>
+          </w:tcPr>
+          <w:p>
+            <w:pPr>
+              <w:rPr>
+                <w:rFonts w:ascii="Arial" w:hAnsi="Arial" w:cs="Arial"/>
+                <w:sz w:val="16"/>
+                <w:szCs w:val="16"/>
+              </w:rPr>
+            </w:pPr>
+            <w:r>
+              <w:rPr>
+                <w:rFonts w:ascii="Arial" w:hAnsi="Arial" w:cs="Arial"/>
+                <w:sz w:val="16"/>
+                <w:szCs w:val="16"/>
+              </w:rPr>
+              <w:t>Min</w:t>
+            </w:r>
+            <w:r>
+              <w:rPr>
+                <w:rFonts w:ascii="Arial" w:hAnsi="Arial" w:cs="Arial"/>
+                <w:sz w:val="16"/>
+                <w:szCs w:val="16"/>
+              </w:rPr>
+              <w:t xml:space="preserve"> + 1 (2)</w:t>
+            </w:r>
+          </w:p>
+        </w:tc>
+        <w:tc>
+          <w:tcPr>
+            <w:tcW w:w="1416" w:type="dxa"/>
+            <w:vAlign w:val="center"/>
+          </w:tcPr>
+          <w:p>
+            <w:pPr>
+              <w:rPr>
+                <w:rFonts w:ascii="Arial" w:hAnsi="Arial" w:cs="Arial"/>
+                <w:sz w:val="16"/>
+                <w:szCs w:val="16"/>
+              </w:rPr>
+            </w:pPr>
+            <w:r>
+              <w:rPr>
+                <w:rFonts w:ascii="Arial" w:hAnsi="Arial" w:cs="Arial"/>
+                <w:sz w:val="16"/>
+                <w:szCs w:val="16"/>
+              </w:rPr>
+              <w:t>name: "Test", price: 2, category_id: 1</w:t>
+            </w:r>
+          </w:p>
+        </w:tc>
+        <w:tc>
+          <w:tcPr>
+            <w:tcW w:w="1416" w:type="dxa"/>
+            <w:vAlign w:val="center"/>
+          </w:tcPr>
+          <w:p>
+            <w:pPr>
+              <w:rPr>
+                <w:rFonts w:ascii="Arial" w:hAnsi="Arial" w:cs="Arial"/>
+                <w:sz w:val="16"/>
+                <w:szCs w:val="16"/>
+              </w:rPr>
+            </w:pPr>
+            <w:r>
+              <w:rPr>
+                <w:rFonts w:ascii="Arial" w:hAnsi="Arial" w:cs="Arial"/>
+                <w:sz w:val="16"/>
+                <w:szCs w:val="16"/>
+              </w:rPr>
+              <w:t>Thêm sản phẩm thành công với giá 2 ₫.</w:t>
+            </w:r>
+          </w:p>
+        </w:tc>
+        <w:tc>
+          <w:tcPr>
+            <w:tcW w:w="1416" w:type="dxa"/>
+            <w:vAlign w:val="center"/>
+          </w:tcPr>
+          <w:p>
+            <w:pPr>
+              <w:rPr>
+                <w:rFonts w:ascii="Arial" w:hAnsi="Arial" w:cs="Arial"/>
+                <w:sz w:val="16"/>
+                <w:szCs w:val="16"/>
+              </w:rPr>
+            </w:pPr>
+            <w:r>
+              <w:rPr>
+                <w:rFonts w:ascii="Arial" w:hAnsi="Arial" w:cs="Arial"/>
+                <w:sz w:val="16"/>
+                <w:szCs w:val="16"/>
+              </w:rPr>
+              <w:t>Valid</w:t>
+            </w:r>
+          </w:p>
+        </w:tc>
+      </w:tr>
+      <w:tr>
+        <w:tc>
+          <w:tcPr>
+            <w:tcW w:w="1416" w:type="dxa"/>
+            <w:vAlign w:val="center"/>
+          </w:tcPr>
+          <w:p>
+            <w:pPr>
+              <w:rPr>
+                <w:rFonts w:ascii="Arial" w:hAnsi="Arial" w:cs="Arial"/>
+                <w:sz w:val="16"/>
+                <w:szCs w:val="16"/>
+              </w:rPr>
+            </w:pPr>
+            <w:r>
+              <w:rPr>
+                <w:rFonts w:ascii="Arial" w:hAnsi="Arial" w:cs="Arial"/>
+                <w:sz w:val="16"/>
+                <w:szCs w:val="16"/>
+              </w:rPr>
+              <w:t>BVA-FR15-11</w:t>
+            </w:r>
+          </w:p>
+        </w:tc>
+        <w:tc>
+          <w:tcPr>
+            <w:tcW w:w="1416" w:type="dxa"/>
+            <w:vAlign w:val="center"/>
+          </w:tcPr>
+          <w:p>
+            <w:pPr>
+              <w:rPr>
+                <w:rFonts w:ascii="Arial" w:hAnsi="Arial" w:cs="Arial"/>
+                <w:sz w:val="16"/>
+                <w:szCs w:val="16"/>
+              </w:rPr>
+            </w:pPr>
+            <w:r>
+              <w:rPr>
+                <w:rFonts w:ascii="Arial" w:hAnsi="Arial" w:cs="Arial"/>
+                <w:sz w:val="16"/>
+                <w:szCs w:val="16"/>
+              </w:rPr>
+              <w:t>category_id</w:t>
+            </w:r>
+          </w:p>
+        </w:tc>
+        <w:tc>
+          <w:tcPr>
+            <w:tcW w:w="1416" w:type="dxa"/>
+            <w:vAlign w:val="center"/>
+          </w:tcPr>
+          <w:p>
+            <w:pPr>
+              <w:rPr>
+                <w:rFonts w:ascii="Arial" w:hAnsi="Arial" w:cs="Arial"/>
+                <w:sz w:val="16"/>
+                <w:szCs w:val="16"/>
+              </w:rPr>
+            </w:pPr>
+            <w:r>
+              <w:rPr>
+                <w:rFonts w:ascii="Arial" w:hAnsi="Arial" w:cs="Arial"/>
+                <w:sz w:val="16"/>
+                <w:szCs w:val="16"/>
+              </w:rPr>
+              <w:t>Min</w:t>
+            </w:r>
+            <w:r>
+              <w:rPr>
+                <w:rFonts w:ascii="Arial" w:hAnsi="Arial" w:cs="Arial"/>
+                <w:sz w:val="16"/>
+                <w:szCs w:val="16"/>
+              </w:rPr>
+              <w:t xml:space="preserve"> - 1 (0)</w:t>
+            </w:r>
+          </w:p>
+        </w:tc>
+        <w:tc>
+          <w:tcPr>
+            <w:tcW w:w="1416" w:type="dxa"/>
+            <w:vAlign w:val="center"/>
+          </w:tcPr>
+          <w:p>
+            <w:pPr>
+              <w:rPr>
+                <w:rFonts w:ascii="Arial" w:hAnsi="Arial" w:cs="Arial"/>
+                <w:sz w:val="16"/>
+                <w:szCs w:val="16"/>
+              </w:rPr>
+            </w:pPr>
+            <w:r>
+              <w:rPr>
+                <w:rFonts w:ascii="Arial" w:hAnsi="Arial" w:cs="Arial"/>
+                <w:sz w:val="16"/>
+                <w:szCs w:val="16"/>
+              </w:rPr>
+              <w:t>name: "Test", price: 100000, category_id: 0</w:t>
+            </w:r>
+          </w:p>
+        </w:tc>
+        <w:tc>
+          <w:tcPr>
+            <w:tcW w:w="1416" w:type="dxa"/>
+            <w:vAlign w:val="center"/>
+          </w:tcPr>
+          <w:p>
+            <w:pPr>
+              <w:rPr>
+                <w:rFonts w:ascii="Arial" w:hAnsi="Arial" w:cs="Arial"/>
+                <w:sz w:val="16"/>
+                <w:szCs w:val="16"/>
+              </w:rPr>
+            </w:pPr>
+            <w:r>
+              <w:rPr>
+                <w:rFonts w:ascii="Arial" w:hAnsi="Arial" w:cs="Arial"/>
+                <w:sz w:val="16"/>
+                <w:szCs w:val="16"/>
+              </w:rPr>
+              <w:t>Hệ thống từ chối do category_id phải \ge 1 và tồn tại trong CSDL.</w:t>
+            </w:r>
+          </w:p>
+        </w:tc>
+        <w:tc>
+          <w:tcPr>
+            <w:tcW w:w="1416" w:type="dxa"/>
+            <w:vAlign w:val="center"/>
+          </w:tcPr>
+          <w:p>
+            <w:pPr>
+              <w:rPr>
+                <w:rFonts w:ascii="Arial" w:hAnsi="Arial" w:cs="Arial"/>
+                <w:sz w:val="16"/>
+                <w:szCs w:val="16"/>
+              </w:rPr>
+            </w:pPr>
+            <w:r>
+              <w:rPr>
+                <w:rFonts w:ascii="Arial" w:hAnsi="Arial" w:cs="Arial"/>
+                <w:sz w:val="16"/>
+                <w:szCs w:val="16"/>
+              </w:rPr>
+              <w:t>Invalid</w:t>
+            </w:r>
+          </w:p>
+        </w:tc>
+      </w:tr>
+      <w:tr>
+        <w:tc>
+          <w:tcPr>
+            <w:tcW w:w="1416" w:type="dxa"/>
+            <w:vAlign w:val="center"/>
+          </w:tcPr>
+          <w:p>
+            <w:pPr>
+              <w:rPr>
+                <w:rFonts w:ascii="Arial" w:hAnsi="Arial" w:cs="Arial"/>
+                <w:sz w:val="16"/>
+                <w:szCs w:val="16"/>
+              </w:rPr>
+            </w:pPr>
+            <w:r>
+              <w:rPr>
+                <w:rFonts w:ascii="Arial" w:hAnsi="Arial" w:cs="Arial"/>
+                <w:sz w:val="16"/>
+                <w:szCs w:val="16"/>
+              </w:rPr>
+              <w:t>BVA-FR15-12</w:t>
+            </w:r>
+          </w:p>
+        </w:tc>
+        <w:tc>
+          <w:tcPr>
+            <w:tcW w:w="1416" w:type="dxa"/>
+            <w:vAlign w:val="center"/>
+          </w:tcPr>
+          <w:p>
+            <w:pPr>
+              <w:rPr>
+                <w:rFonts w:ascii="Arial" w:hAnsi="Arial" w:cs="Arial"/>
+                <w:sz w:val="16"/>
+                <w:szCs w:val="16"/>
+              </w:rPr>
+            </w:pPr>
+            <w:r>
+              <w:rPr>
+                <w:rFonts w:ascii="Arial" w:hAnsi="Arial" w:cs="Arial"/>
+                <w:sz w:val="16"/>
+                <w:szCs w:val="16"/>
+              </w:rPr>
+              <w:t>category_id</w:t>
+            </w:r>
+          </w:p>
+        </w:tc>
+        <w:tc>
+          <w:tcPr>
+            <w:tcW w:w="1416" w:type="dxa"/>
+            <w:vAlign w:val="center"/>
+          </w:tcPr>
+          <w:p>
+            <w:pPr>
+              <w:rPr>
+                <w:rFonts w:ascii="Arial" w:hAnsi="Arial" w:cs="Arial"/>
+                <w:sz w:val="16"/>
+                <w:szCs w:val="16"/>
+              </w:rPr>
+            </w:pPr>
+            <w:r>
+              <w:rPr>
+                <w:rFonts w:ascii="Arial" w:hAnsi="Arial" w:cs="Arial"/>
+                <w:sz w:val="16"/>
+                <w:szCs w:val="16"/>
+              </w:rPr>
+              <w:t>Min</w:t>
+            </w:r>
+            <w:r>
+              <w:rPr>
+                <w:rFonts w:ascii="Arial" w:hAnsi="Arial" w:cs="Arial"/>
+                <w:sz w:val="16"/>
+                <w:szCs w:val="16"/>
+              </w:rPr>
+              <w:t xml:space="preserve"> (1)</w:t>
+            </w:r>
+          </w:p>
+        </w:tc>
+        <w:tc>
+          <w:tcPr>
+            <w:tcW w:w="1416" w:type="dxa"/>
+            <w:vAlign w:val="center"/>
+          </w:tcPr>
+          <w:p>
+            <w:pPr>
+              <w:rPr>
+                <w:rFonts w:ascii="Arial" w:hAnsi="Arial" w:cs="Arial"/>
+                <w:sz w:val="16"/>
+                <w:szCs w:val="16"/>
+              </w:rPr>
+            </w:pPr>
+            <w:r>
+              <w:rPr>
+                <w:rFonts w:ascii="Arial" w:hAnsi="Arial" w:cs="Arial"/>
+                <w:sz w:val="16"/>
+                <w:szCs w:val="16"/>
+              </w:rPr>
+              <w:t>name: "Test", price: 100000, category_id: 1 (Điện thoại)</w:t>
+            </w:r>
+          </w:p>
+        </w:tc>
+        <w:tc>
+          <w:tcPr>
+            <w:tcW w:w="1416" w:type="dxa"/>
+            <w:vAlign w:val="center"/>
+          </w:tcPr>
+          <w:p>
+            <w:pPr>
+              <w:rPr>
+                <w:rFonts w:ascii="Arial" w:hAnsi="Arial" w:cs="Arial"/>
+                <w:sz w:val="16"/>
+                <w:szCs w:val="16"/>
+              </w:rPr>
+            </w:pPr>
+            <w:r>
+              <w:rPr>
+                <w:rFonts w:ascii="Arial" w:hAnsi="Arial" w:cs="Arial"/>
+                <w:sz w:val="16"/>
+                <w:szCs w:val="16"/>
+              </w:rPr>
+              <w:t>Thêm sản phẩm thành công vào danh mục có ID = 1.</w:t>
+            </w:r>
+          </w:p>
+        </w:tc>
+        <w:tc>
+          <w:tcPr>
+            <w:tcW w:w="1416" w:type="dxa"/>
+            <w:vAlign w:val="center"/>
+          </w:tcPr>
+          <w:p>
+            <w:pPr>
+              <w:rPr>
+                <w:rFonts w:ascii="Arial" w:hAnsi="Arial" w:cs="Arial"/>
+                <w:sz w:val="16"/>
+                <w:szCs w:val="16"/>
+              </w:rPr>
+            </w:pPr>
+            <w:r>
+              <w:rPr>
+                <w:rFonts w:ascii="Arial" w:hAnsi="Arial" w:cs="Arial"/>
+                <w:sz w:val="16"/>
+                <w:szCs w:val="16"/>
+              </w:rPr>
+              <w:t>Valid</w:t>
+            </w:r>
+          </w:p>
+        </w:tc>
+      </w:tr>
+      <w:tr>
+        <w:tc>
+          <w:tcPr>
+            <w:tcW w:w="1416" w:type="dxa"/>
+            <w:vAlign w:val="center"/>
+          </w:tcPr>
+          <w:p>
+            <w:pPr>
+              <w:rPr>
+                <w:rFonts w:ascii="Arial" w:hAnsi="Arial" w:cs="Arial"/>
+                <w:sz w:val="16"/>
+                <w:szCs w:val="16"/>
+              </w:rPr>
+            </w:pPr>
+            <w:r>
+              <w:rPr>
+                <w:rFonts w:ascii="Arial" w:hAnsi="Arial" w:cs="Arial"/>
+                <w:sz w:val="16"/>
+                <w:szCs w:val="16"/>
+              </w:rPr>
+              <w:t>BVA-FR15-13</w:t>
+            </w:r>
+          </w:p>
+        </w:tc>
+        <w:tc>
+          <w:tcPr>
+            <w:tcW w:w="1416" w:type="dxa"/>
+            <w:vAlign w:val="center"/>
+          </w:tcPr>
+          <w:p>
+            <w:pPr>
+              <w:rPr>
+                <w:rFonts w:ascii="Arial" w:hAnsi="Arial" w:cs="Arial"/>
+                <w:sz w:val="16"/>
+                <w:szCs w:val="16"/>
+              </w:rPr>
+            </w:pPr>
+            <w:r>
+              <w:rPr>
+                <w:rFonts w:ascii="Arial" w:hAnsi="Arial" w:cs="Arial"/>
+                <w:sz w:val="16"/>
+                <w:szCs w:val="16"/>
+              </w:rPr>
+              <w:t>category_id</w:t>
+            </w:r>
+          </w:p>
+        </w:tc>
+        <w:tc>
+          <w:tcPr>
+            <w:tcW w:w="1416" w:type="dxa"/>
+            <w:vAlign w:val="center"/>
+          </w:tcPr>
+          <w:p>
+            <w:pPr>
+              <w:rPr>
+                <w:rFonts w:ascii="Arial" w:hAnsi="Arial" w:cs="Arial"/>
+                <w:sz w:val="16"/>
+                <w:szCs w:val="16"/>
+              </w:rPr>
+            </w:pPr>
+            <w:r>
+              <w:rPr>
+                <w:rFonts w:ascii="Arial" w:hAnsi="Arial" w:cs="Arial"/>
+                <w:sz w:val="16"/>
+                <w:szCs w:val="16"/>
+              </w:rPr>
+              <w:t>Min</w:t>
+            </w:r>
+            <w:r>
+              <w:rPr>
+                <w:rFonts w:ascii="Arial" w:hAnsi="Arial" w:cs="Arial"/>
+                <w:sz w:val="16"/>
+                <w:szCs w:val="16"/>
+              </w:rPr>
+              <w:t xml:space="preserve"> + 1 (2)</w:t>
+            </w:r>
+          </w:p>
+        </w:tc>
+        <w:tc>
+          <w:tcPr>
+            <w:tcW w:w="1416" w:type="dxa"/>
+            <w:vAlign w:val="center"/>
+          </w:tcPr>
+          <w:p>
+            <w:pPr>
+              <w:rPr>
+                <w:rFonts w:ascii="Arial" w:hAnsi="Arial" w:cs="Arial"/>
+                <w:sz w:val="16"/>
+                <w:szCs w:val="16"/>
+              </w:rPr>
+            </w:pPr>
+            <w:r>
+              <w:rPr>
+                <w:rFonts w:ascii="Arial" w:hAnsi="Arial" w:cs="Arial"/>
+                <w:sz w:val="16"/>
+                <w:szCs w:val="16"/>
+              </w:rPr>
+              <w:t>name: "Test", price: 100000, category_id: 2 (Laptop)</w:t>
+            </w:r>
+          </w:p>
+        </w:tc>
+        <w:tc>
+          <w:tcPr>
+            <w:tcW w:w="1416" w:type="dxa"/>
+            <w:vAlign w:val="center"/>
+          </w:tcPr>
+          <w:p>
+            <w:pPr>
+              <w:rPr>
+                <w:rFonts w:ascii="Arial" w:hAnsi="Arial" w:cs="Arial"/>
+                <w:sz w:val="16"/>
+                <w:szCs w:val="16"/>
+              </w:rPr>
+            </w:pPr>
+            <w:r>
+              <w:rPr>
+                <w:rFonts w:ascii="Arial" w:hAnsi="Arial" w:cs="Arial"/>
+                <w:sz w:val="16"/>
+                <w:szCs w:val="16"/>
+              </w:rPr>
+              <w:t>Thêm sản phẩm thành công vào danh mục có ID = 2.</w:t>
+            </w:r>
+          </w:p>
+        </w:tc>
+        <w:tc>
+          <w:tcPr>
+            <w:tcW w:w="1416" w:type="dxa"/>
+            <w:vAlign w:val="center"/>
+          </w:tcPr>
+          <w:p>
+            <w:pPr>
+              <w:rPr>
+                <w:rFonts w:ascii="Arial" w:hAnsi="Arial" w:cs="Arial"/>
+                <w:sz w:val="16"/>
+                <w:szCs w:val="16"/>
+              </w:rPr>
+            </w:pPr>
+            <w:r>
+              <w:rPr>
+                <w:rFonts w:ascii="Arial" w:hAnsi="Arial" w:cs="Arial"/>
+                <w:sz w:val="16"/>
+                <w:szCs w:val="16"/>
+              </w:rPr>
+              <w:t>Valid</w:t>
+            </w:r>
+          </w:p>
+        </w:tc>
+      </w:tr>
+    </w:tbl>
+    <w:p>
+      <w:pPr>
+        <w:ind w:left="360"/>
+        <w:rPr>
+          <w:rFonts w:ascii="Arial" w:hAnsi="Arial" w:cs="Arial"/>
+          <w:b/>
+          <w:sz w:val="20"/>
+          <w:szCs w:val="20"/>
+        </w:rPr>
+      </w:pPr>
+    </w:p>
+    <w:p>
+      <w:pPr>
+        <w:pStyle w:val="ListParagraph"/>
+        <w:numPr>
+          <w:ilvl w:val="0"/>
+          <w:numId w:val="50"/>
+        </w:numPr>
+        <w:rPr>
+          <w:rFonts w:ascii="Arial" w:hAnsi="Arial" w:cs="Arial"/>
+          <w:b/>
+          <w:sz w:val="20"/>
+          <w:szCs w:val="20"/>
+        </w:rPr>
+      </w:pPr>
+      <w:r>
+        <w:rPr>
+          <w:rFonts w:ascii="Arial" w:hAnsi="Arial" w:cs="Arial"/>
+          <w:b/>
+          <w:sz w:val="20"/>
+          <w:szCs w:val="20"/>
+        </w:rPr>
+        <w:t>Explaination</w:t>
       </w:r>
     </w:p>
     <w:p/>
@@ -16946,7 +19571,6 @@
         <w:rPr>
           <w:rFonts w:ascii="Arial" w:hAnsi="Arial" w:cs="Arial"/>
         </w:rPr>
-        <w:lastRenderedPageBreak/>
         <w:t>Self-assessment</w:t>
       </w:r>
       <w:bookmarkEnd w:id="3"/>
@@ -23042,7 +25666,7 @@
   <w:abstractNum w:abstractNumId="46" w15:restartNumberingAfterBreak="0">
     <w:nsid w:val="6AD127E2"/>
     <w:multiLevelType w:val="hybridMultilevel"/>
-    <w:tmpl w:val="8278994E"/>
+    <w:tmpl w:val="1D74476C"/>
     <w:lvl w:ilvl="0" w:tplc="04090001">
       <w:start w:val="1"/>
       <w:numFmt w:val="bullet"/>
@@ -35760,7 +38384,7 @@
 </file>
 
 <file path=customXml/itemProps1.xml><?xml version="1.0" encoding="utf-8"?>
-<ds:datastoreItem xmlns:ds="http://schemas.openxmlformats.org/officeDocument/2006/customXml" ds:itemID="{06922364-1D40-4D4C-83D6-21BAEA3D983C}">
+<ds:datastoreItem xmlns:ds="http://schemas.openxmlformats.org/officeDocument/2006/customXml" ds:itemID="{53E0F124-857E-46BF-873C-B561BB4CD634}">
   <ds:schemaRefs>
     <ds:schemaRef ds:uri="http://schemas.openxmlformats.org/officeDocument/2006/bibliography"/>
   </ds:schemaRefs>

</xml_diff>

<commit_message>
FR15, requirement 2 explaination
</commit_message>
<xml_diff>
--- a/MainReport.docx
+++ b/MainReport.docx
@@ -16159,15 +16159,7 @@
           <w:sz w:val="20"/>
           <w:szCs w:val="20"/>
         </w:rPr>
-        <w:t>ợc chia rõ thành các phân vùng Valid (hợp lệ theo đúng đặc tả) và Invalid (vi phạm ràng buộc về khoảng giá trị, kiểu dữ liệu, rỗng, hoặc không tồn tạ</w:t>
-      </w:r>
-      <w:r>
-        <w:rPr>
-          <w:rFonts w:ascii="Arial" w:hAnsi="Arial" w:cs="Arial"/>
-          <w:sz w:val="20"/>
-          <w:szCs w:val="20"/>
-        </w:rPr>
-        <w:t>i trong CSDL).</w:t>
+        <w:t>ợc chia rõ thành các phân vùng Valid (hợp lệ theo đúng đặc tả) và Invalid (vi phạm ràng buộc về khoảng giá trị, kiểu dữ liệu, rỗng, hoặc không tồn tại trong CSDL).</w:t>
       </w:r>
     </w:p>
     <w:p>
@@ -16205,149 +16197,150 @@
           <w:sz w:val="20"/>
           <w:szCs w:val="20"/>
         </w:rPr>
-        <w:t>ớc 2 (Ma trận kết hợ</w:t>
+        <w:t>ớc 2 (Ma trận kết hợp phân vùng):</w:t>
+      </w:r>
+    </w:p>
+    <w:p>
+      <w:pPr>
+        <w:rPr>
+          <w:rFonts w:ascii="Arial" w:hAnsi="Arial" w:cs="Arial"/>
+          <w:sz w:val="20"/>
+          <w:szCs w:val="20"/>
+        </w:rPr>
+      </w:pPr>
+      <w:r>
+        <w:rPr>
+          <w:rFonts w:ascii="Arial" w:hAnsi="Arial" w:cs="Arial"/>
+          <w:sz w:val="20"/>
+          <w:szCs w:val="20"/>
+        </w:rPr>
+        <w:t>Áp dụng chiến l</w:t>
       </w:r>
       <w:r>
+        <w:rPr>
+          <w:rFonts w:ascii="Arial" w:hAnsi="Arial" w:cs="Arial" w:hint="cs"/>
+          <w:sz w:val="20"/>
+          <w:szCs w:val="20"/>
+        </w:rPr>
+        <w:t>ư</w:t>
+      </w:r>
+      <w:r>
+        <w:rPr>
+          <w:rFonts w:ascii="Arial" w:hAnsi="Arial" w:cs="Arial"/>
+          <w:sz w:val="20"/>
+          <w:szCs w:val="20"/>
+        </w:rPr>
+        <w:t>ợc Base Choice Coverage: Lấy ca kiểm thử `M-01` làm gốc hoàn toàn hợp lệ (Valid Base). Sau đó, tiến hành xoay vòng thay đổi đ</w:t>
+      </w:r>
+      <w:r>
+        <w:rPr>
+          <w:rFonts w:ascii="Arial" w:hAnsi="Arial" w:cs="Arial" w:hint="cs"/>
+          <w:sz w:val="20"/>
+          <w:szCs w:val="20"/>
+        </w:rPr>
+        <w:t>ơ</w:t>
+      </w:r>
+      <w:r>
+        <w:rPr>
+          <w:rFonts w:ascii="Arial" w:hAnsi="Arial" w:cs="Arial"/>
+          <w:sz w:val="20"/>
+          <w:szCs w:val="20"/>
+        </w:rPr>
+        <w:t>n lẻ từng biến sang các trạng thái Invalid t</w:t>
+      </w:r>
+      <w:r>
+        <w:rPr>
+          <w:rFonts w:ascii="Arial" w:hAnsi="Arial" w:cs="Arial" w:hint="cs"/>
+          <w:sz w:val="20"/>
+          <w:szCs w:val="20"/>
+        </w:rPr>
+        <w:t>ươ</w:t>
+      </w:r>
+      <w:r>
+        <w:rPr>
+          <w:rFonts w:ascii="Arial" w:hAnsi="Arial" w:cs="Arial"/>
+          <w:sz w:val="20"/>
+          <w:szCs w:val="20"/>
+        </w:rPr>
+        <w:t xml:space="preserve">ng ứng (`M-02` đến `M-11`). Cách tiếp cận này giúp tối </w:t>
+      </w:r>
+      <w:r>
+        <w:rPr>
+          <w:rFonts w:ascii="Arial" w:hAnsi="Arial" w:cs="Arial" w:hint="cs"/>
+          <w:sz w:val="20"/>
+          <w:szCs w:val="20"/>
+        </w:rPr>
+        <w:t>ư</w:t>
+      </w:r>
+      <w:r>
+        <w:rPr>
+          <w:rFonts w:ascii="Arial" w:hAnsi="Arial" w:cs="Arial"/>
+          <w:sz w:val="20"/>
+          <w:szCs w:val="20"/>
+        </w:rPr>
+        <w:t>u số l</w:t>
+      </w:r>
+      <w:r>
+        <w:rPr>
+          <w:rFonts w:ascii="Arial" w:hAnsi="Arial" w:cs="Arial" w:hint="cs"/>
+          <w:sz w:val="20"/>
+          <w:szCs w:val="20"/>
+        </w:rPr>
+        <w:t>ư</w:t>
+      </w:r>
+      <w:r>
+        <w:rPr>
+          <w:rFonts w:ascii="Arial" w:hAnsi="Arial" w:cs="Arial"/>
+          <w:sz w:val="20"/>
+          <w:szCs w:val="20"/>
+        </w:rPr>
+        <w:t>ợng test case nh</w:t>
+      </w:r>
+      <w:r>
+        <w:rPr>
+          <w:rFonts w:ascii="Arial" w:hAnsi="Arial" w:cs="Arial" w:hint="cs"/>
+          <w:sz w:val="20"/>
+          <w:szCs w:val="20"/>
+        </w:rPr>
+        <w:t>ư</w:t>
+      </w:r>
+      <w:r>
+        <w:rPr>
+          <w:rFonts w:ascii="Arial" w:hAnsi="Arial" w:cs="Arial"/>
+          <w:sz w:val="20"/>
+          <w:szCs w:val="20"/>
+        </w:rPr>
+        <w:t>ng vẫn đảm bảo phủ kín toàn bộ các rủi ro nghiệp vụ của tính năng CRUD sản phẩm.</w:t>
+      </w:r>
+    </w:p>
+    <w:p>
+      <w:pPr>
+        <w:ind w:left="360"/>
         <w:rPr>
           <w:rFonts w:ascii="Arial" w:hAnsi="Arial" w:cs="Arial"/>
           <w:b/>
           <w:sz w:val="20"/>
           <w:szCs w:val="20"/>
         </w:rPr>
-        <w:t>p phân vùng):</w:t>
-      </w:r>
-    </w:p>
-    <w:p>
-      <w:pPr>
-        <w:rPr>
-          <w:rFonts w:ascii="Arial" w:hAnsi="Arial" w:cs="Arial"/>
-          <w:sz w:val="20"/>
-          <w:szCs w:val="20"/>
-        </w:rPr>
       </w:pPr>
       <w:r>
-        <w:rPr>
-          <w:rFonts w:ascii="Arial" w:hAnsi="Arial" w:cs="Arial"/>
-          <w:sz w:val="20"/>
-          <w:szCs w:val="20"/>
-        </w:rPr>
-        <w:t>Áp dụng chiến l</w:t>
-      </w:r>
-      <w:r>
-        <w:rPr>
-          <w:rFonts w:ascii="Arial" w:hAnsi="Arial" w:cs="Arial" w:hint="cs"/>
-          <w:sz w:val="20"/>
-          <w:szCs w:val="20"/>
-        </w:rPr>
-        <w:t>ư</w:t>
-      </w:r>
-      <w:r>
-        <w:rPr>
-          <w:rFonts w:ascii="Arial" w:hAnsi="Arial" w:cs="Arial"/>
-          <w:sz w:val="20"/>
-          <w:szCs w:val="20"/>
-        </w:rPr>
-        <w:t>ợc Base Choice Coverage: Lấy ca kiểm thử `M-01` làm gốc hoàn toàn hợp lệ (Valid Base). Sau đó, tiến hành xoay vòng thay đổi đ</w:t>
-      </w:r>
-      <w:r>
-        <w:rPr>
-          <w:rFonts w:ascii="Arial" w:hAnsi="Arial" w:cs="Arial" w:hint="cs"/>
-          <w:sz w:val="20"/>
-          <w:szCs w:val="20"/>
-        </w:rPr>
-        <w:t>ơ</w:t>
-      </w:r>
-      <w:r>
-        <w:rPr>
-          <w:rFonts w:ascii="Arial" w:hAnsi="Arial" w:cs="Arial"/>
-          <w:sz w:val="20"/>
-          <w:szCs w:val="20"/>
-        </w:rPr>
-        <w:t>n lẻ từng biến sang các trạng thái Invalid t</w:t>
-      </w:r>
-      <w:r>
-        <w:rPr>
-          <w:rFonts w:ascii="Arial" w:hAnsi="Arial" w:cs="Arial" w:hint="cs"/>
-          <w:sz w:val="20"/>
-          <w:szCs w:val="20"/>
-        </w:rPr>
-        <w:t>ươ</w:t>
-      </w:r>
-      <w:r>
-        <w:rPr>
-          <w:rFonts w:ascii="Arial" w:hAnsi="Arial" w:cs="Arial"/>
-          <w:sz w:val="20"/>
-          <w:szCs w:val="20"/>
-        </w:rPr>
-        <w:t xml:space="preserve">ng ứng (`M-02` đến `M-11`). Cách tiếp cận này giúp tối </w:t>
-      </w:r>
-      <w:r>
-        <w:rPr>
-          <w:rFonts w:ascii="Arial" w:hAnsi="Arial" w:cs="Arial" w:hint="cs"/>
-          <w:sz w:val="20"/>
-          <w:szCs w:val="20"/>
-        </w:rPr>
-        <w:t>ư</w:t>
-      </w:r>
-      <w:r>
-        <w:rPr>
-          <w:rFonts w:ascii="Arial" w:hAnsi="Arial" w:cs="Arial"/>
-          <w:sz w:val="20"/>
-          <w:szCs w:val="20"/>
-        </w:rPr>
-        <w:t>u số l</w:t>
-      </w:r>
-      <w:r>
-        <w:rPr>
-          <w:rFonts w:ascii="Arial" w:hAnsi="Arial" w:cs="Arial" w:hint="cs"/>
-          <w:sz w:val="20"/>
-          <w:szCs w:val="20"/>
-        </w:rPr>
-        <w:t>ư</w:t>
-      </w:r>
-      <w:r>
-        <w:rPr>
-          <w:rFonts w:ascii="Arial" w:hAnsi="Arial" w:cs="Arial"/>
-          <w:sz w:val="20"/>
-          <w:szCs w:val="20"/>
-        </w:rPr>
-        <w:t>ợng test case nh</w:t>
-      </w:r>
-      <w:r>
-        <w:rPr>
-          <w:rFonts w:ascii="Arial" w:hAnsi="Arial" w:cs="Arial" w:hint="cs"/>
-          <w:sz w:val="20"/>
-          <w:szCs w:val="20"/>
-        </w:rPr>
-        <w:t>ư</w:t>
-      </w:r>
-      <w:r>
-        <w:rPr>
-          <w:rFonts w:ascii="Arial" w:hAnsi="Arial" w:cs="Arial"/>
-          <w:sz w:val="20"/>
-          <w:szCs w:val="20"/>
-        </w:rPr>
-        <w:t>ng vẫn đảm bảo phủ kín toàn bộ các rủi ro nghiệp vụ của tính năng CRUD sản phẩ</w:t>
-      </w:r>
-      <w:r>
-        <w:rPr>
-          <w:rFonts w:ascii="Arial" w:hAnsi="Arial" w:cs="Arial"/>
-          <w:sz w:val="20"/>
-          <w:szCs w:val="20"/>
-        </w:rPr>
-        <w:t>m.</w:t>
-      </w:r>
-    </w:p>
-    <w:p>
-      <w:pPr>
-        <w:ind w:left="360"/>
         <w:rPr>
           <w:rFonts w:ascii="Arial" w:hAnsi="Arial" w:cs="Arial"/>
           <w:b/>
           <w:sz w:val="20"/>
           <w:szCs w:val="20"/>
         </w:rPr>
-      </w:pPr>
+        <w:t>B</w:t>
+      </w:r>
+      <w:r>
+        <w:rPr>
+          <w:rFonts w:ascii="Arial" w:hAnsi="Arial" w:cs="Arial" w:hint="cs"/>
+          <w:b/>
+          <w:sz w:val="20"/>
+          <w:szCs w:val="20"/>
+        </w:rPr>
+        <w:t>ư</w:t>
+      </w:r>
       <w:r>
         <w:rPr>
           <w:rFonts w:ascii="Arial" w:hAnsi="Arial" w:cs="Arial"/>
@@ -16355,12 +16348,28 @@
           <w:sz w:val="20"/>
           <w:szCs w:val="20"/>
         </w:rPr>
-        <w:t>B</w:t>
+        <w:t>ớc 3 (Xuất danh sách Test Case):</w:t>
+      </w:r>
+    </w:p>
+    <w:p>
+      <w:pPr>
+        <w:rPr>
+          <w:rFonts w:ascii="Arial" w:hAnsi="Arial" w:cs="Arial"/>
+          <w:sz w:val="20"/>
+          <w:szCs w:val="20"/>
+        </w:rPr>
+      </w:pPr>
+      <w:r>
+        <w:rPr>
+          <w:rFonts w:ascii="Arial" w:hAnsi="Arial" w:cs="Arial"/>
+          <w:sz w:val="20"/>
+          <w:szCs w:val="20"/>
+        </w:rPr>
+        <w:t>Danh sách 12 test cases đ</w:t>
       </w:r>
       <w:r>
         <w:rPr>
           <w:rFonts w:ascii="Arial" w:hAnsi="Arial" w:cs="Arial" w:hint="cs"/>
-          <w:b/>
           <w:sz w:val="20"/>
           <w:szCs w:val="20"/>
         </w:rPr>
@@ -16369,61 +16378,10 @@
       <w:r>
         <w:rPr>
           <w:rFonts w:ascii="Arial" w:hAnsi="Arial" w:cs="Arial"/>
-          <w:b/>
           <w:sz w:val="20"/>
           <w:szCs w:val="20"/>
         </w:rPr>
-        <w:t>ớc 3 (Xuấ</w:t>
-      </w:r>
-      <w:r>
-        <w:rPr>
-          <w:rFonts w:ascii="Arial" w:hAnsi="Arial" w:cs="Arial"/>
-          <w:b/>
-          <w:sz w:val="20"/>
-          <w:szCs w:val="20"/>
-        </w:rPr>
-        <w:t>t danh sách Test Case):</w:t>
-      </w:r>
-    </w:p>
-    <w:p>
-      <w:pPr>
-        <w:rPr>
-          <w:rFonts w:ascii="Arial" w:hAnsi="Arial" w:cs="Arial"/>
-          <w:sz w:val="20"/>
-          <w:szCs w:val="20"/>
-        </w:rPr>
-      </w:pPr>
-      <w:r>
-        <w:rPr>
-          <w:rFonts w:ascii="Arial" w:hAnsi="Arial" w:cs="Arial"/>
-          <w:sz w:val="20"/>
-          <w:szCs w:val="20"/>
-        </w:rPr>
-        <w:t>Danh sách 12 test cases đ</w:t>
-      </w:r>
-      <w:r>
-        <w:rPr>
-          <w:rFonts w:ascii="Arial" w:hAnsi="Arial" w:cs="Arial" w:hint="cs"/>
-          <w:sz w:val="20"/>
-          <w:szCs w:val="20"/>
-        </w:rPr>
-        <w:t>ư</w:t>
-      </w:r>
-      <w:r>
-        <w:rPr>
-          <w:rFonts w:ascii="Arial" w:hAnsi="Arial" w:cs="Arial"/>
-          <w:sz w:val="20"/>
-          <w:szCs w:val="20"/>
-        </w:rPr>
-        <w:t>ợc mô tả cụ thể với dữ liệu đầu vào (`Input Data`) và kết quả mong đợi (`Expected Output`) rõ ràng, bao gồm cả các kiểm tra về bảo mật phân quyền (Admin vs. User) và tính nguyên vẹn dữ liệu khi cập nhậ</w:t>
-      </w:r>
-      <w:r>
-        <w:rPr>
-          <w:rFonts w:ascii="Arial" w:hAnsi="Arial" w:cs="Arial"/>
-          <w:sz w:val="20"/>
-          <w:szCs w:val="20"/>
-        </w:rPr>
-        <w:t>t (`PUT`).</w:t>
+        <w:t>ợc mô tả cụ thể với dữ liệu đầu vào (`Input Data`) và kết quả mong đợi (`Expected Output`) rõ ràng, bao gồm cả các kiểm tra về bảo mật phân quyền (Admin vs. User) và tính nguyên vẹn dữ liệu khi cập nhật (`PUT`).</w:t>
       </w:r>
     </w:p>
     <w:p>
@@ -16570,8 +16528,6 @@
         </w:rPr>
         <w:t>Test cases</w:t>
       </w:r>
-      <w:bookmarkStart w:id="1" w:name="_GoBack"/>
-      <w:bookmarkEnd w:id="1"/>
     </w:p>
     <w:tbl>
       <w:tblPr>
@@ -18702,7 +18658,251 @@
         <w:t>Explaination</w:t>
       </w:r>
     </w:p>
-    <w:p/>
+    <w:p>
+      <w:pPr>
+        <w:rPr>
+          <w:rFonts w:ascii="Arial" w:hAnsi="Arial" w:cs="Arial"/>
+          <w:b/>
+          <w:sz w:val="20"/>
+          <w:szCs w:val="20"/>
+        </w:rPr>
+      </w:pPr>
+      <w:r>
+        <w:rPr>
+          <w:rFonts w:ascii="Arial" w:hAnsi="Arial" w:cs="Arial"/>
+          <w:b/>
+          <w:sz w:val="20"/>
+          <w:szCs w:val="20"/>
+        </w:rPr>
+        <w:t>Nhận diện chính xác thuộc tính có biên:</w:t>
+      </w:r>
+    </w:p>
+    <w:p>
+      <w:pPr>
+        <w:rPr>
+          <w:rFonts w:ascii="Arial" w:hAnsi="Arial" w:cs="Arial"/>
+          <w:sz w:val="20"/>
+          <w:szCs w:val="20"/>
+        </w:rPr>
+      </w:pPr>
+      <w:r>
+        <w:rPr>
+          <w:rFonts w:ascii="Arial" w:hAnsi="Arial" w:cs="Arial"/>
+          <w:sz w:val="20"/>
+          <w:szCs w:val="20"/>
+        </w:rPr>
+        <w:t xml:space="preserve">  - Trường `name` có biên độ dài ký tự</w:t>
+      </w:r>
+      <w:r>
+        <w:rPr>
+          <w:rFonts w:ascii="Arial" w:hAnsi="Arial" w:cs="Arial"/>
+          <w:sz w:val="20"/>
+          <w:szCs w:val="20"/>
+        </w:rPr>
+        <w:t xml:space="preserve"> rõ ràng (1 &lt; length &lt;</w:t>
+      </w:r>
+      <w:r>
+        <w:rPr>
+          <w:rFonts w:ascii="Arial" w:hAnsi="Arial" w:cs="Arial"/>
+          <w:sz w:val="20"/>
+          <w:szCs w:val="20"/>
+        </w:rPr>
+        <w:t xml:space="preserve"> 255$).</w:t>
+      </w:r>
+    </w:p>
+    <w:p>
+      <w:pPr>
+        <w:rPr>
+          <w:rFonts w:ascii="Arial" w:hAnsi="Arial" w:cs="Arial"/>
+          <w:sz w:val="20"/>
+          <w:szCs w:val="20"/>
+        </w:rPr>
+      </w:pPr>
+      <w:r>
+        <w:rPr>
+          <w:rFonts w:ascii="Arial" w:hAnsi="Arial" w:cs="Arial"/>
+          <w:sz w:val="20"/>
+          <w:szCs w:val="20"/>
+        </w:rPr>
+        <w:t xml:space="preserve">  - Trường `price` có biên giá trị dương </w:t>
+      </w:r>
+      <w:r>
+        <w:rPr>
+          <w:rFonts w:ascii="Arial" w:hAnsi="Arial" w:cs="Arial"/>
+          <w:sz w:val="20"/>
+          <w:szCs w:val="20"/>
+        </w:rPr>
+        <w:t>(price &gt; 0</w:t>
+      </w:r>
+      <w:bookmarkStart w:id="1" w:name="_GoBack"/>
+      <w:bookmarkEnd w:id="1"/>
+      <w:r>
+        <w:rPr>
+          <w:rFonts w:ascii="Arial" w:hAnsi="Arial" w:cs="Arial"/>
+          <w:sz w:val="20"/>
+          <w:szCs w:val="20"/>
+        </w:rPr>
+        <w:t>, ngăn cách bởi mốc 0).</w:t>
+      </w:r>
+    </w:p>
+    <w:p>
+      <w:pPr>
+        <w:rPr>
+          <w:rFonts w:ascii="Arial" w:hAnsi="Arial" w:cs="Arial"/>
+          <w:sz w:val="20"/>
+          <w:szCs w:val="20"/>
+        </w:rPr>
+      </w:pPr>
+      <w:r>
+        <w:rPr>
+          <w:rFonts w:ascii="Arial" w:hAnsi="Arial" w:cs="Arial"/>
+          <w:sz w:val="20"/>
+          <w:szCs w:val="20"/>
+        </w:rPr>
+        <w:t xml:space="preserve">  - Trường `category_id` có biên dưới bắt đầu từ 1 (dựa trên cấu trúc khóa chính SQLite AUTOINCREMENT).</w:t>
+      </w:r>
+    </w:p>
+    <w:p>
+      <w:pPr>
+        <w:rPr>
+          <w:rFonts w:ascii="Arial" w:hAnsi="Arial" w:cs="Arial"/>
+          <w:sz w:val="20"/>
+          <w:szCs w:val="20"/>
+        </w:rPr>
+      </w:pPr>
+    </w:p>
+    <w:p>
+      <w:pPr>
+        <w:rPr>
+          <w:rFonts w:ascii="Arial" w:hAnsi="Arial" w:cs="Arial"/>
+          <w:b/>
+          <w:sz w:val="20"/>
+          <w:szCs w:val="20"/>
+        </w:rPr>
+      </w:pPr>
+      <w:r>
+        <w:rPr>
+          <w:rFonts w:ascii="Arial" w:hAnsi="Arial" w:cs="Arial"/>
+          <w:b/>
+          <w:sz w:val="20"/>
+          <w:szCs w:val="20"/>
+        </w:rPr>
+        <w:t>Khai thác biên tường minh &amp; ngầm định:</w:t>
+      </w:r>
+    </w:p>
+    <w:p>
+      <w:pPr>
+        <w:rPr>
+          <w:rFonts w:ascii="Arial" w:hAnsi="Arial" w:cs="Arial"/>
+          <w:sz w:val="20"/>
+          <w:szCs w:val="20"/>
+        </w:rPr>
+      </w:pPr>
+      <w:r>
+        <w:rPr>
+          <w:rFonts w:ascii="Arial" w:hAnsi="Arial" w:cs="Arial"/>
+          <w:sz w:val="20"/>
+          <w:szCs w:val="20"/>
+        </w:rPr>
+        <w:t xml:space="preserve">  - Biên tường minh lấy từ đặc tả FR-15 (`max 255 ký tự`, `price &gt; 0`).</w:t>
+      </w:r>
+    </w:p>
+    <w:p>
+      <w:pPr>
+        <w:rPr>
+          <w:rFonts w:ascii="Arial" w:hAnsi="Arial" w:cs="Arial"/>
+          <w:sz w:val="20"/>
+          <w:szCs w:val="20"/>
+        </w:rPr>
+      </w:pPr>
+      <w:r>
+        <w:rPr>
+          <w:rFonts w:ascii="Arial" w:hAnsi="Arial" w:cs="Arial"/>
+          <w:sz w:val="20"/>
+          <w:szCs w:val="20"/>
+        </w:rPr>
+        <w:t xml:space="preserve">  - Biên ngầm định lấy từ kiến trúc cơ sở dữ liệu (`id &gt;= 1`).</w:t>
+      </w:r>
+    </w:p>
+    <w:p>
+      <w:pPr>
+        <w:rPr>
+          <w:rFonts w:ascii="Arial" w:hAnsi="Arial" w:cs="Arial"/>
+          <w:b/>
+          <w:sz w:val="20"/>
+          <w:szCs w:val="20"/>
+        </w:rPr>
+      </w:pPr>
+      <w:r>
+        <w:rPr>
+          <w:rFonts w:ascii="Arial" w:hAnsi="Arial" w:cs="Arial"/>
+          <w:b/>
+          <w:sz w:val="20"/>
+          <w:szCs w:val="20"/>
+        </w:rPr>
+        <w:t>Ứng dụng chuẩn 3-value BVA:</w:t>
+      </w:r>
+    </w:p>
+    <w:p>
+      <w:pPr>
+        <w:rPr>
+          <w:rFonts w:ascii="Arial" w:hAnsi="Arial" w:cs="Arial"/>
+          <w:sz w:val="20"/>
+          <w:szCs w:val="20"/>
+        </w:rPr>
+      </w:pPr>
+      <w:r>
+        <w:rPr>
+          <w:rFonts w:ascii="Arial" w:hAnsi="Arial" w:cs="Arial"/>
+          <w:sz w:val="20"/>
+          <w:szCs w:val="20"/>
+        </w:rPr>
+        <w:t xml:space="preserve">  - Với độ dài tên sản phẩm, bộ test cases kiểm tra kỹ lưỡng từ 0 ký tự (`Min-1`), 1 ký tự (`Min`), 2 ký tự (`Min+1`), đến cận trên 254 (`Max-1`), 255 (`Max`), và 256 (`Max+1`). Điều này giúp phát hiện chính xác nếu lập trình viên viết nhầm `length &lt; 255` thay vì `length &lt;= 255`.</w:t>
+      </w:r>
+    </w:p>
+    <w:p>
+      <w:pPr>
+        <w:rPr>
+          <w:rFonts w:ascii="Arial" w:hAnsi="Arial" w:cs="Arial"/>
+          <w:sz w:val="20"/>
+          <w:szCs w:val="20"/>
+        </w:rPr>
+      </w:pPr>
+      <w:r>
+        <w:rPr>
+          <w:rFonts w:ascii="Arial" w:hAnsi="Arial" w:cs="Arial"/>
+          <w:sz w:val="20"/>
+          <w:szCs w:val="20"/>
+        </w:rPr>
+        <w:t xml:space="preserve">  - Với giá sản phẩm, kiểm tra mốc nguy hiểm nhất là `0` và `-1` để đảm bảo hệ thống chặn đứng các sản phẩm giá 0 đồng hoặc âm.</w:t>
+      </w:r>
+    </w:p>
+    <w:p>
+      <w:pPr>
+        <w:rPr>
+          <w:rFonts w:ascii="Arial" w:hAnsi="Arial" w:cs="Arial"/>
+          <w:sz w:val="20"/>
+          <w:szCs w:val="20"/>
+        </w:rPr>
+      </w:pPr>
+      <w:r>
+        <w:rPr>
+          <w:rFonts w:ascii="Arial" w:hAnsi="Arial" w:cs="Arial"/>
+          <w:b/>
+          <w:sz w:val="20"/>
+          <w:szCs w:val="20"/>
+        </w:rPr>
+        <w:t>Cô lập biến:</w:t>
+      </w:r>
+      <w:r>
+        <w:rPr>
+          <w:rFonts w:ascii="Arial" w:hAnsi="Arial" w:cs="Arial"/>
+          <w:sz w:val="20"/>
+          <w:szCs w:val="20"/>
+        </w:rPr>
+        <w:t xml:space="preserve"> Mỗi test case chỉ thay đổi một biến số duy nhất tại giá trị biên tương ứng, giữ các trường thông tin khác ở trạng thái hợp lệ, giúp kết quả kiểm thử mang tính khách quan và chính xác tuyệt đối.</w:t>
+      </w:r>
+    </w:p>
     <w:p>
       <w:pPr>
         <w:rPr>
@@ -19571,6 +19771,7 @@
         <w:rPr>
           <w:rFonts w:ascii="Arial" w:hAnsi="Arial" w:cs="Arial"/>
         </w:rPr>
+        <w:lastRenderedPageBreak/>
         <w:t>Self-assessment</w:t>
       </w:r>
       <w:bookmarkEnd w:id="3"/>
@@ -38384,7 +38585,7 @@
 </file>
 
 <file path=customXml/itemProps1.xml><?xml version="1.0" encoding="utf-8"?>
-<ds:datastoreItem xmlns:ds="http://schemas.openxmlformats.org/officeDocument/2006/customXml" ds:itemID="{53E0F124-857E-46BF-873C-B561BB4CD634}">
+<ds:datastoreItem xmlns:ds="http://schemas.openxmlformats.org/officeDocument/2006/customXml" ds:itemID="{1E868D61-E99C-4FA7-9D3B-6275C07950F3}">
   <ds:schemaRefs>
     <ds:schemaRef ds:uri="http://schemas.openxmlformats.org/officeDocument/2006/bibliography"/>
   </ds:schemaRefs>

</xml_diff>